<commit_message>
FPGA figure and Slice-CLB relationship
</commit_message>
<xml_diff>
--- a/Paper/BDA_AES.docx
+++ b/Paper/BDA_AES.docx
@@ -27170,23 +27170,7 @@
           <w:sz w:val="24"/>
           <w:szCs w:val="24"/>
         </w:rPr>
-        <w:t>algoritmului. Prima cheie de rundă este reprezentată</w:t>
-      </w:r>
-      <w:r>
-        <w:rPr>
-          <w:rFonts w:ascii="Arial" w:hAnsi="Arial" w:cs="Arial"/>
-          <w:sz w:val="24"/>
-          <w:szCs w:val="24"/>
-        </w:rPr>
-        <w:t xml:space="preserve"> </w:t>
-      </w:r>
-      <w:r>
-        <w:rPr>
-          <w:rFonts w:ascii="Arial" w:hAnsi="Arial" w:cs="Arial"/>
-          <w:sz w:val="24"/>
-          <w:szCs w:val="24"/>
-        </w:rPr>
-        <w:t>de cheia inițială, iar următoarele zece sunt obținute recursiv prin aplicarea operațiilor descrise anterior.</w:t>
+        <w:t>algoritmului. Prima cheie de rundă este reprezentată de cheia inițială, iar următoarele zece sunt obținute recursiv prin aplicarea operațiilor descrise anterior.</w:t>
       </w:r>
     </w:p>
     <w:p>
@@ -36352,23 +36336,7 @@
           <w:sz w:val="24"/>
           <w:szCs w:val="24"/>
         </w:rPr>
-        <w:t>Dispozitivele FPGA</w:t>
-      </w:r>
-      <w:r>
-        <w:rPr>
-          <w:rFonts w:asciiTheme="minorBidi" w:hAnsiTheme="minorBidi"/>
-          <w:sz w:val="24"/>
-          <w:szCs w:val="24"/>
-        </w:rPr>
-        <w:t xml:space="preserve"> </w:t>
-      </w:r>
-      <w:r>
-        <w:rPr>
-          <w:rFonts w:asciiTheme="minorBidi" w:hAnsiTheme="minorBidi"/>
-          <w:sz w:val="24"/>
-          <w:szCs w:val="24"/>
-        </w:rPr>
-        <w:t>sunt circuite digitale reconfigurabile a căror funcționalitate poate fi stabilită după fabricație. Structura internă a acestora este compusă din resurse logice programabile, elemente de memorare și rețele de interconectare configurabile. Aceste resurse sunt organizate în blocuri logice configurabile (</w:t>
+        <w:t xml:space="preserve">Dispozitivele FPGA sunt circuite digitale reconfigurabile a căror funcționalitate poate fi definită după fabricație. Structura internă a acestora este alcătuită din resurse logice programabile, elemente de memorare și rețele de interconectare configurabile. Aceste resurse sunt organizate în </w:t>
       </w:r>
       <w:proofErr w:type="spellStart"/>
       <w:r>
@@ -36379,9 +36347,25 @@
           <w:sz w:val="24"/>
           <w:szCs w:val="24"/>
         </w:rPr>
-        <w:t>Configurable</w:t>
+        <w:t>slice</w:t>
       </w:r>
       <w:proofErr w:type="spellEnd"/>
+      <w:r>
+        <w:rPr>
+          <w:rFonts w:asciiTheme="minorBidi" w:hAnsiTheme="minorBidi"/>
+          <w:sz w:val="24"/>
+          <w:szCs w:val="24"/>
+        </w:rPr>
+        <w:t>-uri, care formează blocurile logice configurabile</w:t>
+      </w:r>
+      <w:r>
+        <w:rPr>
+          <w:rFonts w:asciiTheme="minorBidi" w:hAnsiTheme="minorBidi"/>
+          <w:sz w:val="24"/>
+          <w:szCs w:val="24"/>
+        </w:rPr>
+        <w:t xml:space="preserve"> (</w:t>
+      </w:r>
       <w:r>
         <w:rPr>
           <w:rFonts w:asciiTheme="minorBidi" w:hAnsiTheme="minorBidi"/>
@@ -36390,9 +36374,43 @@
           <w:sz w:val="24"/>
           <w:szCs w:val="24"/>
         </w:rPr>
-        <w:t xml:space="preserve"> Logic </w:t>
-      </w:r>
-      <w:proofErr w:type="spellStart"/>
+        <w:t>CLB</w:t>
+      </w:r>
+      <w:r>
+        <w:rPr>
+          <w:rFonts w:asciiTheme="minorBidi" w:hAnsiTheme="minorBidi"/>
+          <w:sz w:val="24"/>
+          <w:szCs w:val="24"/>
+        </w:rPr>
+        <w:t>)</w:t>
+      </w:r>
+      <w:r>
+        <w:rPr>
+          <w:rFonts w:asciiTheme="minorBidi" w:hAnsiTheme="minorBidi"/>
+          <w:sz w:val="24"/>
+          <w:szCs w:val="24"/>
+        </w:rPr>
+        <w:t xml:space="preserve"> ale dispozitivului [10].</w:t>
+      </w:r>
+    </w:p>
+    <w:p>
+      <w:pPr>
+        <w:ind w:firstLine="576"/>
+        <w:jc w:val="both"/>
+        <w:rPr>
+          <w:rFonts w:asciiTheme="minorBidi" w:hAnsiTheme="minorBidi"/>
+          <w:sz w:val="24"/>
+          <w:szCs w:val="24"/>
+        </w:rPr>
+      </w:pPr>
+      <w:r>
+        <w:rPr>
+          <w:rFonts w:asciiTheme="minorBidi" w:hAnsiTheme="minorBidi"/>
+          <w:sz w:val="24"/>
+          <w:szCs w:val="24"/>
+        </w:rPr>
+        <w:t xml:space="preserve">În cadrul logicii programabile a dispozitivelor </w:t>
+      </w:r>
       <w:r>
         <w:rPr>
           <w:rFonts w:asciiTheme="minorBidi" w:hAnsiTheme="minorBidi"/>
@@ -36401,7 +36419,24 @@
           <w:sz w:val="24"/>
           <w:szCs w:val="24"/>
         </w:rPr>
-        <w:t>Blocks</w:t>
+        <w:t>Zynq-7000</w:t>
+      </w:r>
+      <w:r>
+        <w:rPr>
+          <w:rFonts w:asciiTheme="minorBidi" w:hAnsiTheme="minorBidi"/>
+          <w:sz w:val="24"/>
+          <w:szCs w:val="24"/>
+        </w:rPr>
+        <w:t xml:space="preserve">, blocurile logice configurabile constituie principalele resurse utilizate pentru implementarea circuitelor </w:t>
+      </w:r>
+      <w:proofErr w:type="spellStart"/>
+      <w:r>
+        <w:rPr>
+          <w:rFonts w:asciiTheme="minorBidi" w:hAnsiTheme="minorBidi"/>
+          <w:sz w:val="24"/>
+          <w:szCs w:val="24"/>
+        </w:rPr>
+        <w:t>combinaționale</w:t>
       </w:r>
       <w:proofErr w:type="spellEnd"/>
       <w:r>
@@ -36410,23 +36445,7 @@
           <w:sz w:val="24"/>
           <w:szCs w:val="24"/>
         </w:rPr>
-        <w:t xml:space="preserve"> — CLB)</w:t>
-      </w:r>
-      <w:r>
-        <w:rPr>
-          <w:rFonts w:asciiTheme="minorBidi" w:hAnsiTheme="minorBidi"/>
-          <w:sz w:val="24"/>
-          <w:szCs w:val="24"/>
-        </w:rPr>
-        <w:t xml:space="preserve"> [10]</w:t>
-      </w:r>
-      <w:r>
-        <w:rPr>
-          <w:rFonts w:asciiTheme="minorBidi" w:hAnsiTheme="minorBidi"/>
-          <w:sz w:val="24"/>
-          <w:szCs w:val="24"/>
-        </w:rPr>
-        <w:t>.</w:t>
+        <w:t xml:space="preserve"> și secvențiale. Acestea integrează LUT-uri, elemente de memorare și logică dedicată operațiilor aritmetice [11].</w:t>
       </w:r>
     </w:p>
     <w:p>
@@ -36445,92 +36464,7 @@
           <w:sz w:val="24"/>
           <w:szCs w:val="24"/>
         </w:rPr>
-        <w:t xml:space="preserve">În cadrul </w:t>
-      </w:r>
-      <w:r>
-        <w:rPr>
-          <w:rFonts w:asciiTheme="minorBidi" w:hAnsiTheme="minorBidi"/>
-          <w:sz w:val="24"/>
-          <w:szCs w:val="24"/>
-        </w:rPr>
-        <w:t xml:space="preserve">logicii programabile a </w:t>
-      </w:r>
-      <w:r>
-        <w:rPr>
-          <w:rFonts w:asciiTheme="minorBidi" w:hAnsiTheme="minorBidi"/>
-          <w:sz w:val="24"/>
-          <w:szCs w:val="24"/>
-        </w:rPr>
-        <w:t>dispozitivelor</w:t>
-      </w:r>
-      <w:r>
-        <w:rPr>
-          <w:rFonts w:asciiTheme="minorBidi" w:hAnsiTheme="minorBidi"/>
-          <w:sz w:val="24"/>
-          <w:szCs w:val="24"/>
-        </w:rPr>
-        <w:t xml:space="preserve"> </w:t>
-      </w:r>
-      <w:r>
-        <w:rPr>
-          <w:rFonts w:asciiTheme="minorBidi" w:hAnsiTheme="minorBidi"/>
-          <w:i/>
-          <w:iCs/>
-          <w:sz w:val="24"/>
-          <w:szCs w:val="24"/>
-        </w:rPr>
-        <w:t>ZYNQ-7000</w:t>
-      </w:r>
-      <w:r>
-        <w:rPr>
-          <w:rFonts w:asciiTheme="minorBidi" w:hAnsiTheme="minorBidi"/>
-          <w:sz w:val="24"/>
-          <w:szCs w:val="24"/>
-        </w:rPr>
-        <w:t xml:space="preserve">, blocurile logice configurabile reprezintă principalele resurse utilizate pentru implementarea circuitelor </w:t>
-      </w:r>
-      <w:proofErr w:type="spellStart"/>
-      <w:r>
-        <w:rPr>
-          <w:rFonts w:asciiTheme="minorBidi" w:hAnsiTheme="minorBidi"/>
-          <w:sz w:val="24"/>
-          <w:szCs w:val="24"/>
-        </w:rPr>
-        <w:t>combinaționale</w:t>
-      </w:r>
-      <w:proofErr w:type="spellEnd"/>
-      <w:r>
-        <w:rPr>
-          <w:rFonts w:asciiTheme="minorBidi" w:hAnsiTheme="minorBidi"/>
-          <w:sz w:val="24"/>
-          <w:szCs w:val="24"/>
-        </w:rPr>
-        <w:t xml:space="preserve"> și secvențiale, acestea fiind alcătuite din LUT-uri, elemente de memorare și logică dedicată operațiilor aritmetice</w:t>
-      </w:r>
-      <w:r>
-        <w:rPr>
-          <w:rFonts w:asciiTheme="minorBidi" w:hAnsiTheme="minorBidi"/>
-          <w:sz w:val="24"/>
-          <w:szCs w:val="24"/>
-        </w:rPr>
-        <w:t xml:space="preserve"> </w:t>
-      </w:r>
-      <w:r>
-        <w:rPr>
-          <w:rFonts w:asciiTheme="minorBidi" w:hAnsiTheme="minorBidi"/>
-          <w:sz w:val="24"/>
-          <w:szCs w:val="24"/>
-          <w:lang w:val="en-US"/>
-        </w:rPr>
-        <w:t>[11]</w:t>
-      </w:r>
-      <w:r>
-        <w:rPr>
-          <w:rFonts w:asciiTheme="minorBidi" w:hAnsiTheme="minorBidi"/>
-          <w:sz w:val="24"/>
-          <w:szCs w:val="24"/>
-        </w:rPr>
-        <w:t>.</w:t>
+        <w:t>Rețeaua de interconectare programabilă asigură comunicația dintre diferitele resurse interne ale dispozitivului FPGA, prin stabilirea traseelor necesare propagării semnalelor. Configurarea acestor conexiuni este realizată, în mod obișnuit, automat, în etapa de implementare a proiectului.</w:t>
       </w:r>
     </w:p>
     <w:p>
@@ -36549,71 +36483,25 @@
           <w:sz w:val="24"/>
           <w:szCs w:val="24"/>
         </w:rPr>
-        <w:t>R</w:t>
-      </w:r>
+        <w:t xml:space="preserve">Deoarece atât elementele logice, cât și traseele de interconectare introduc întârzieri de propagare, performanța circuitului este influențată nu doar de structura sa logică, ci și de modul în care resursele sunt plasate și </w:t>
+      </w:r>
+      <w:proofErr w:type="spellStart"/>
       <w:r>
         <w:rPr>
           <w:rFonts w:asciiTheme="minorBidi" w:hAnsiTheme="minorBidi"/>
           <w:sz w:val="24"/>
           <w:szCs w:val="24"/>
         </w:rPr>
-        <w:t>ețeaua de interconectare programabilă are rolul de a realiza conexiunile dintre resursele logice ale dispozitivului FPGA</w:t>
-      </w:r>
+        <w:t>rutate</w:t>
+      </w:r>
+      <w:proofErr w:type="spellEnd"/>
       <w:r>
         <w:rPr>
           <w:rFonts w:asciiTheme="minorBidi" w:hAnsiTheme="minorBidi"/>
           <w:sz w:val="24"/>
           <w:szCs w:val="24"/>
         </w:rPr>
-        <w:t xml:space="preserve">. </w:t>
-      </w:r>
-      <w:r>
-        <w:rPr>
-          <w:rFonts w:asciiTheme="minorBidi" w:hAnsiTheme="minorBidi"/>
-          <w:sz w:val="24"/>
-          <w:szCs w:val="24"/>
-        </w:rPr>
-        <w:t>Configurația acestor trasee este stabilită</w:t>
-      </w:r>
-      <w:r>
-        <w:rPr>
-          <w:rFonts w:asciiTheme="minorBidi" w:hAnsiTheme="minorBidi"/>
-          <w:sz w:val="24"/>
-          <w:szCs w:val="24"/>
-        </w:rPr>
-        <w:t>, adesea în mod automa</w:t>
-      </w:r>
-      <w:r>
-        <w:rPr>
-          <w:rFonts w:asciiTheme="minorBidi" w:hAnsiTheme="minorBidi"/>
-          <w:sz w:val="24"/>
-          <w:szCs w:val="24"/>
-        </w:rPr>
-        <w:t>t,</w:t>
-      </w:r>
-      <w:r>
-        <w:rPr>
-          <w:rFonts w:asciiTheme="minorBidi" w:hAnsiTheme="minorBidi"/>
-          <w:sz w:val="24"/>
-          <w:szCs w:val="24"/>
-        </w:rPr>
-        <w:t xml:space="preserve"> în etapa de implementare</w:t>
-      </w:r>
-      <w:r>
-        <w:rPr>
-          <w:rFonts w:asciiTheme="minorBidi" w:hAnsiTheme="minorBidi"/>
-          <w:sz w:val="24"/>
-          <w:szCs w:val="24"/>
-        </w:rPr>
-        <w:t xml:space="preserve"> a procesului de dezvoltare</w:t>
-      </w:r>
-      <w:r>
-        <w:rPr>
-          <w:rFonts w:asciiTheme="minorBidi" w:hAnsiTheme="minorBidi"/>
-          <w:sz w:val="24"/>
-          <w:szCs w:val="24"/>
-        </w:rPr>
-        <w:t>.</w:t>
+        <w:t xml:space="preserve"> în interiorul dispozitivului. Din acest motiv, proiectarea trebuie realizată ținând cont de constrângerile de temporizare și de caracteristicile arhitecturii FPGA utilizate.</w:t>
       </w:r>
     </w:p>
     <w:p>
@@ -36632,14 +36520,287 @@
           <w:sz w:val="24"/>
           <w:szCs w:val="24"/>
         </w:rPr>
-        <w:t xml:space="preserve">Circuitele fizice prezintă o latență de propagare. Din această cauză, circuitul dezvoltat trebuie să fie proiectat ținând cont de metricile dispozitivului utilizat. </w:t>
-      </w:r>
+        <w:t xml:space="preserve">Structura logică simplificată a unui </w:t>
+      </w:r>
+      <w:proofErr w:type="spellStart"/>
+      <w:r>
+        <w:rPr>
+          <w:rFonts w:asciiTheme="minorBidi" w:hAnsiTheme="minorBidi"/>
+          <w:sz w:val="24"/>
+          <w:szCs w:val="24"/>
+        </w:rPr>
+        <w:t>slice</w:t>
+      </w:r>
+      <w:proofErr w:type="spellEnd"/>
+      <w:r>
+        <w:rPr>
+          <w:rFonts w:asciiTheme="minorBidi" w:hAnsiTheme="minorBidi"/>
+          <w:sz w:val="24"/>
+          <w:szCs w:val="24"/>
+        </w:rPr>
+        <w:t xml:space="preserve"> este prezentată în cadrul Figurii 4.1.</w:t>
+      </w:r>
+    </w:p>
+    <w:p>
+      <w:pPr>
+        <w:ind w:firstLine="576"/>
+        <w:jc w:val="both"/>
+        <w:rPr>
+          <w:rFonts w:asciiTheme="minorBidi" w:hAnsiTheme="minorBidi"/>
+          <w:sz w:val="24"/>
+          <w:szCs w:val="24"/>
+        </w:rPr>
+      </w:pPr>
+    </w:p>
+    <w:p>
+      <w:pPr>
+        <w:keepNext/>
+        <w:ind w:firstLine="576"/>
+        <w:jc w:val="center"/>
+      </w:pPr>
+      <w:r>
+        <w:rPr>
+          <w:rFonts w:asciiTheme="minorBidi" w:hAnsiTheme="minorBidi"/>
+          <w:noProof/>
+          <w:sz w:val="24"/>
+          <w:szCs w:val="24"/>
+        </w:rPr>
+        <w:drawing>
+          <wp:inline distT="0" distB="0" distL="0" distR="0" wp14:anchorId="2DDB8575" wp14:editId="71CFB7BF">
+            <wp:extent cx="5131558" cy="1577232"/>
+            <wp:effectExtent l="0" t="0" r="0" b="4445"/>
+            <wp:docPr id="545396808" name="Graphic 2"/>
+            <wp:cNvGraphicFramePr>
+              <a:graphicFrameLocks xmlns:a="http://schemas.openxmlformats.org/drawingml/2006/main" noChangeAspect="1"/>
+            </wp:cNvGraphicFramePr>
+            <a:graphic xmlns:a="http://schemas.openxmlformats.org/drawingml/2006/main">
+              <a:graphicData uri="http://schemas.openxmlformats.org/drawingml/2006/picture">
+                <pic:pic xmlns:pic="http://schemas.openxmlformats.org/drawingml/2006/picture">
+                  <pic:nvPicPr>
+                    <pic:cNvPr id="545396808" name="Graphic 545396808"/>
+                    <pic:cNvPicPr/>
+                  </pic:nvPicPr>
+                  <pic:blipFill>
+                    <a:blip r:embed="rId38">
+                      <a:extLst>
+                        <a:ext uri="{96DAC541-7B7A-43D3-8B79-37D633B846F1}">
+                          <asvg:svgBlip xmlns:asvg="http://schemas.microsoft.com/office/drawing/2016/SVG/main" r:embed="rId39"/>
+                        </a:ext>
+                      </a:extLst>
+                    </a:blip>
+                    <a:stretch>
+                      <a:fillRect/>
+                    </a:stretch>
+                  </pic:blipFill>
+                  <pic:spPr>
+                    <a:xfrm>
+                      <a:off x="0" y="0"/>
+                      <a:ext cx="5143916" cy="1581030"/>
+                    </a:xfrm>
+                    <a:prstGeom prst="rect">
+                      <a:avLst/>
+                    </a:prstGeom>
+                  </pic:spPr>
+                </pic:pic>
+              </a:graphicData>
+            </a:graphic>
+          </wp:inline>
+        </w:drawing>
+      </w:r>
+    </w:p>
+    <w:p>
+      <w:pPr>
+        <w:pStyle w:val="Caption"/>
+        <w:jc w:val="center"/>
+        <w:rPr>
+          <w:rFonts w:asciiTheme="minorBidi" w:hAnsiTheme="minorBidi"/>
+          <w:color w:val="auto"/>
+          <w:sz w:val="20"/>
+          <w:szCs w:val="20"/>
+        </w:rPr>
+      </w:pPr>
+      <w:r>
+        <w:rPr>
+          <w:rFonts w:asciiTheme="minorBidi" w:hAnsiTheme="minorBidi"/>
+          <w:color w:val="auto"/>
+          <w:sz w:val="20"/>
+          <w:szCs w:val="20"/>
+        </w:rPr>
+        <w:t xml:space="preserve">Figura </w:t>
+      </w:r>
+      <w:r>
+        <w:rPr>
+          <w:rFonts w:asciiTheme="minorBidi" w:hAnsiTheme="minorBidi"/>
+          <w:color w:val="auto"/>
+          <w:sz w:val="20"/>
+          <w:szCs w:val="20"/>
+        </w:rPr>
+        <w:fldChar w:fldCharType="begin"/>
+      </w:r>
+      <w:r>
+        <w:rPr>
+          <w:rFonts w:asciiTheme="minorBidi" w:hAnsiTheme="minorBidi"/>
+          <w:color w:val="auto"/>
+          <w:sz w:val="20"/>
+          <w:szCs w:val="20"/>
+        </w:rPr>
+        <w:instrText xml:space="preserve"> STYLEREF 1 \s </w:instrText>
+      </w:r>
+      <w:r>
+        <w:rPr>
+          <w:rFonts w:asciiTheme="minorBidi" w:hAnsiTheme="minorBidi"/>
+          <w:color w:val="auto"/>
+          <w:sz w:val="20"/>
+          <w:szCs w:val="20"/>
+        </w:rPr>
+        <w:fldChar w:fldCharType="separate"/>
+      </w:r>
+      <w:r>
+        <w:rPr>
+          <w:rFonts w:asciiTheme="minorBidi" w:hAnsiTheme="minorBidi"/>
+          <w:noProof/>
+          <w:color w:val="auto"/>
+          <w:sz w:val="20"/>
+          <w:szCs w:val="20"/>
+          <w:cs/>
+        </w:rPr>
+        <w:t>‎</w:t>
+      </w:r>
+      <w:r>
+        <w:rPr>
+          <w:rFonts w:asciiTheme="minorBidi" w:hAnsiTheme="minorBidi"/>
+          <w:noProof/>
+          <w:color w:val="auto"/>
+          <w:sz w:val="20"/>
+          <w:szCs w:val="20"/>
+        </w:rPr>
+        <w:t>4</w:t>
+      </w:r>
+      <w:r>
+        <w:rPr>
+          <w:rFonts w:asciiTheme="minorBidi" w:hAnsiTheme="minorBidi"/>
+          <w:color w:val="auto"/>
+          <w:sz w:val="20"/>
+          <w:szCs w:val="20"/>
+        </w:rPr>
+        <w:fldChar w:fldCharType="end"/>
+      </w:r>
+      <w:r>
+        <w:rPr>
+          <w:rFonts w:asciiTheme="minorBidi" w:hAnsiTheme="minorBidi"/>
+          <w:color w:val="auto"/>
+          <w:sz w:val="20"/>
+          <w:szCs w:val="20"/>
+        </w:rPr>
+        <w:t>.</w:t>
+      </w:r>
+      <w:r>
+        <w:rPr>
+          <w:rFonts w:asciiTheme="minorBidi" w:hAnsiTheme="minorBidi"/>
+          <w:color w:val="auto"/>
+          <w:sz w:val="20"/>
+          <w:szCs w:val="20"/>
+        </w:rPr>
+        <w:fldChar w:fldCharType="begin"/>
+      </w:r>
+      <w:r>
+        <w:rPr>
+          <w:rFonts w:asciiTheme="minorBidi" w:hAnsiTheme="minorBidi"/>
+          <w:color w:val="auto"/>
+          <w:sz w:val="20"/>
+          <w:szCs w:val="20"/>
+        </w:rPr>
+        <w:instrText xml:space="preserve"> SEQ Figura \* ARABIC \s 1 </w:instrText>
+      </w:r>
+      <w:r>
+        <w:rPr>
+          <w:rFonts w:asciiTheme="minorBidi" w:hAnsiTheme="minorBidi"/>
+          <w:color w:val="auto"/>
+          <w:sz w:val="20"/>
+          <w:szCs w:val="20"/>
+        </w:rPr>
+        <w:fldChar w:fldCharType="separate"/>
+      </w:r>
+      <w:r>
+        <w:rPr>
+          <w:rFonts w:asciiTheme="minorBidi" w:hAnsiTheme="minorBidi"/>
+          <w:noProof/>
+          <w:color w:val="auto"/>
+          <w:sz w:val="20"/>
+          <w:szCs w:val="20"/>
+        </w:rPr>
+        <w:t>1</w:t>
+      </w:r>
+      <w:r>
+        <w:rPr>
+          <w:rFonts w:asciiTheme="minorBidi" w:hAnsiTheme="minorBidi"/>
+          <w:color w:val="auto"/>
+          <w:sz w:val="20"/>
+          <w:szCs w:val="20"/>
+        </w:rPr>
+        <w:fldChar w:fldCharType="end"/>
+      </w:r>
+      <w:r>
+        <w:rPr>
+          <w:rFonts w:asciiTheme="minorBidi" w:hAnsiTheme="minorBidi"/>
+          <w:color w:val="auto"/>
+          <w:sz w:val="20"/>
+          <w:szCs w:val="20"/>
+        </w:rPr>
+        <w:t xml:space="preserve"> Structura </w:t>
+      </w:r>
+      <w:proofErr w:type="spellStart"/>
+      <w:r>
+        <w:rPr>
+          <w:rFonts w:asciiTheme="minorBidi" w:hAnsiTheme="minorBidi"/>
+          <w:color w:val="auto"/>
+          <w:sz w:val="20"/>
+          <w:szCs w:val="20"/>
+        </w:rPr>
+        <w:t>conceptulă</w:t>
+      </w:r>
+      <w:proofErr w:type="spellEnd"/>
+      <w:r>
+        <w:rPr>
+          <w:rFonts w:asciiTheme="minorBidi" w:hAnsiTheme="minorBidi"/>
+          <w:color w:val="auto"/>
+          <w:sz w:val="20"/>
+          <w:szCs w:val="20"/>
+        </w:rPr>
+        <w:t xml:space="preserve"> simplificată a unui </w:t>
+      </w:r>
+      <w:proofErr w:type="spellStart"/>
+      <w:r>
+        <w:rPr>
+          <w:rFonts w:asciiTheme="minorBidi" w:hAnsiTheme="minorBidi"/>
+          <w:color w:val="auto"/>
+          <w:sz w:val="20"/>
+          <w:szCs w:val="20"/>
+        </w:rPr>
+        <w:t>slice</w:t>
+      </w:r>
+      <w:proofErr w:type="spellEnd"/>
+    </w:p>
+    <w:p/>
+    <w:p/>
+    <w:p/>
+    <w:p/>
+    <w:p>
+      <w:pPr>
+        <w:ind w:firstLine="576"/>
+        <w:jc w:val="both"/>
+        <w:rPr>
+          <w:rFonts w:asciiTheme="minorBidi" w:hAnsiTheme="minorBidi"/>
+          <w:sz w:val="24"/>
+          <w:szCs w:val="24"/>
+        </w:rPr>
+      </w:pPr>
     </w:p>
     <w:sectPr>
-      <w:headerReference w:type="default" r:id="rId38"/>
-      <w:footerReference w:type="default" r:id="rId39"/>
-      <w:headerReference w:type="first" r:id="rId40"/>
-      <w:footerReference w:type="first" r:id="rId41"/>
+      <w:headerReference w:type="default" r:id="rId40"/>
+      <w:footerReference w:type="default" r:id="rId41"/>
+      <w:headerReference w:type="first" r:id="rId42"/>
+      <w:footerReference w:type="first" r:id="rId43"/>
       <w:pgSz w:w="11907" w:h="16840" w:code="9"/>
       <w:pgMar w:top="1418" w:right="1134" w:bottom="1134" w:left="1134" w:header="706" w:footer="778" w:gutter="0"/>
       <w:pgNumType w:start="0"/>
@@ -39696,6 +39857,8 @@
     <w:rsid w:val="0072317D"/>
     <w:rsid w:val="007B47C5"/>
     <w:rsid w:val="00844611"/>
+    <w:rsid w:val="009F1A76"/>
+    <w:rsid w:val="00A2322A"/>
     <w:rsid w:val="00CE3EC1"/>
     <w:rsid w:val="00EF4327"/>
     <w:rsid w:val="00F924A7"/>
@@ -40469,23 +40632,6 @@
 </file>
 
 <file path=customXml/item2.xml><?xml version="1.0" encoding="utf-8"?>
-<p:properties xmlns:p="http://schemas.microsoft.com/office/2006/metadata/properties" xmlns:xsi="http://www.w3.org/2001/XMLSchema-instance" xmlns:pc="http://schemas.microsoft.com/office/infopath/2007/PartnerControls">
-  <documentManagement>
-    <_activity xmlns="0a9abc3b-b67c-45af-b1d9-b0180db7a2c4" xsi:nil="true"/>
-  </documentManagement>
-</p:properties>
-</file>
-
-<file path=customXml/item3.xml><?xml version="1.0" encoding="utf-8"?>
-<?mso-contentType ?>
-<FormTemplates xmlns="http://schemas.microsoft.com/sharepoint/v3/contenttype/forms">
-  <Display>DocumentLibraryForm</Display>
-  <Edit>DocumentLibraryForm</Edit>
-  <New>DocumentLibraryForm</New>
-</FormTemplates>
-</file>
-
-<file path=customXml/item4.xml><?xml version="1.0" encoding="utf-8"?>
 <ct:contentTypeSchema xmlns:ct="http://schemas.microsoft.com/office/2006/metadata/contentType" xmlns:ma="http://schemas.microsoft.com/office/2006/metadata/properties/metaAttributes" ct:_="" ma:_="" ma:contentTypeName="Document" ma:contentTypeID="0x0101003BB3AC5C3772B84FA72474F3266239F5" ma:contentTypeVersion="12" ma:contentTypeDescription="Create a new document." ma:contentTypeScope="" ma:versionID="c00b3bd5dab29c181e82d78bf7c768e9">
   <xsd:schema xmlns:xsd="http://www.w3.org/2001/XMLSchema" xmlns:xs="http://www.w3.org/2001/XMLSchema" xmlns:p="http://schemas.microsoft.com/office/2006/metadata/properties" xmlns:ns3="0a9abc3b-b67c-45af-b1d9-b0180db7a2c4" targetNamespace="http://schemas.microsoft.com/office/2006/metadata/properties" ma:root="true" ma:fieldsID="8fdbe03ecd05bd2d54e87130612d2cc0" ns3:_="">
     <xsd:import namespace="0a9abc3b-b67c-45af-b1d9-b0180db7a2c4"/>
@@ -40681,6 +40827,23 @@
 </ct:contentTypeSchema>
 </file>
 
+<file path=customXml/item3.xml><?xml version="1.0" encoding="utf-8"?>
+<?mso-contentType ?>
+<FormTemplates xmlns="http://schemas.microsoft.com/sharepoint/v3/contenttype/forms">
+  <Display>DocumentLibraryForm</Display>
+  <Edit>DocumentLibraryForm</Edit>
+  <New>DocumentLibraryForm</New>
+</FormTemplates>
+</file>
+
+<file path=customXml/item4.xml><?xml version="1.0" encoding="utf-8"?>
+<p:properties xmlns:p="http://schemas.microsoft.com/office/2006/metadata/properties" xmlns:xsi="http://www.w3.org/2001/XMLSchema-instance" xmlns:pc="http://schemas.microsoft.com/office/infopath/2007/PartnerControls">
+  <documentManagement>
+    <_activity xmlns="0a9abc3b-b67c-45af-b1d9-b0180db7a2c4" xsi:nil="true"/>
+  </documentManagement>
+</p:properties>
+</file>
+
 <file path=customXml/itemProps1.xml><?xml version="1.0" encoding="utf-8"?>
 <ds:datastoreItem xmlns:ds="http://schemas.openxmlformats.org/officeDocument/2006/customXml" ds:itemID="{B7B95ABC-8616-4E1F-BA28-E2B2A6EEEEF5}">
   <ds:schemaRefs>
@@ -40690,24 +40853,6 @@
 </file>
 
 <file path=customXml/itemProps2.xml><?xml version="1.0" encoding="utf-8"?>
-<ds:datastoreItem xmlns:ds="http://schemas.openxmlformats.org/officeDocument/2006/customXml" ds:itemID="{AA8770D6-6886-410B-93B4-6D5D54BAD75D}">
-  <ds:schemaRefs>
-    <ds:schemaRef ds:uri="http://schemas.microsoft.com/office/2006/metadata/properties"/>
-    <ds:schemaRef ds:uri="http://schemas.microsoft.com/office/infopath/2007/PartnerControls"/>
-    <ds:schemaRef ds:uri="0a9abc3b-b67c-45af-b1d9-b0180db7a2c4"/>
-  </ds:schemaRefs>
-</ds:datastoreItem>
-</file>
-
-<file path=customXml/itemProps3.xml><?xml version="1.0" encoding="utf-8"?>
-<ds:datastoreItem xmlns:ds="http://schemas.openxmlformats.org/officeDocument/2006/customXml" ds:itemID="{AD193FD9-4DA5-46D1-B015-D7B972817297}">
-  <ds:schemaRefs>
-    <ds:schemaRef ds:uri="http://schemas.microsoft.com/sharepoint/v3/contenttype/forms"/>
-  </ds:schemaRefs>
-</ds:datastoreItem>
-</file>
-
-<file path=customXml/itemProps4.xml><?xml version="1.0" encoding="utf-8"?>
 <ds:datastoreItem xmlns:ds="http://schemas.openxmlformats.org/officeDocument/2006/customXml" ds:itemID="{22AE9436-BE9C-42D5-9883-32E1F9448477}">
   <ds:schemaRefs>
     <ds:schemaRef ds:uri="http://schemas.microsoft.com/office/2006/metadata/contentType"/>
@@ -40723,4 +40868,22 @@
     <ds:schemaRef ds:uri="http://schemas.microsoft.com/internal/obd"/>
   </ds:schemaRefs>
 </ds:datastoreItem>
+</file>
+
+<file path=customXml/itemProps3.xml><?xml version="1.0" encoding="utf-8"?>
+<ds:datastoreItem xmlns:ds="http://schemas.openxmlformats.org/officeDocument/2006/customXml" ds:itemID="{AD193FD9-4DA5-46D1-B015-D7B972817297}">
+  <ds:schemaRefs>
+    <ds:schemaRef ds:uri="http://schemas.microsoft.com/sharepoint/v3/contenttype/forms"/>
+  </ds:schemaRefs>
+</ds:datastoreItem>
+</file>
+
+<file path=customXml/itemProps4.xml><?xml version="1.0" encoding="utf-8"?>
+<ds:datastoreItem xmlns:ds="http://schemas.openxmlformats.org/officeDocument/2006/customXml" ds:itemID="{AA8770D6-6886-410B-93B4-6D5D54BAD75D}">
+  <ds:schemaRefs>
+    <ds:schemaRef ds:uri="http://schemas.microsoft.com/office/2006/metadata/properties"/>
+    <ds:schemaRef ds:uri="http://schemas.microsoft.com/office/infopath/2007/PartnerControls"/>
+    <ds:schemaRef ds:uri="0a9abc3b-b67c-45af-b1d9-b0180db7a2c4"/>
+  </ds:schemaRefs>
+</ds:datastoreItem>
 </file>
</xml_diff>

<commit_message>
AMBA AXI4 and AXI4-Lit
</commit_message>
<xml_diff>
--- a/Paper/BDA_AES.docx
+++ b/Paper/BDA_AES.docx
@@ -546,7 +546,6 @@
         </w:rPr>
         <w:t>ul AES (</w:t>
       </w:r>
-      <w:proofErr w:type="spellStart"/>
       <w:r>
         <w:rPr>
           <w:rFonts w:ascii="Arial" w:hAnsi="Arial" w:cs="Arial"/>
@@ -555,40 +554,7 @@
           <w:sz w:val="24"/>
           <w:szCs w:val="24"/>
         </w:rPr>
-        <w:t>Advanced</w:t>
-      </w:r>
-      <w:proofErr w:type="spellEnd"/>
-      <w:r>
-        <w:rPr>
-          <w:rFonts w:ascii="Arial" w:hAnsi="Arial" w:cs="Arial"/>
-          <w:i/>
-          <w:iCs/>
-          <w:sz w:val="24"/>
-          <w:szCs w:val="24"/>
-        </w:rPr>
-        <w:t xml:space="preserve"> </w:t>
-      </w:r>
-      <w:proofErr w:type="spellStart"/>
-      <w:r>
-        <w:rPr>
-          <w:rFonts w:ascii="Arial" w:hAnsi="Arial" w:cs="Arial"/>
-          <w:i/>
-          <w:iCs/>
-          <w:sz w:val="24"/>
-          <w:szCs w:val="24"/>
-        </w:rPr>
-        <w:t>Encryption</w:t>
-      </w:r>
-      <w:proofErr w:type="spellEnd"/>
-      <w:r>
-        <w:rPr>
-          <w:rFonts w:ascii="Arial" w:hAnsi="Arial" w:cs="Arial"/>
-          <w:i/>
-          <w:iCs/>
-          <w:sz w:val="24"/>
-          <w:szCs w:val="24"/>
-        </w:rPr>
-        <w:t xml:space="preserve"> Standard</w:t>
+        <w:t>Advanced Encryption Standard</w:t>
       </w:r>
       <w:r>
         <w:rPr>
@@ -5027,25 +4993,7 @@
           <w:sz w:val="24"/>
           <w:szCs w:val="24"/>
         </w:rPr>
-        <w:t xml:space="preserve"> Aceste lucruri fiind spuse, este greu de imaginat perspectiva în care o implementare hardware poate fi considerată superioară. Hardware-</w:t>
-      </w:r>
-      <w:proofErr w:type="spellStart"/>
-      <w:r>
-        <w:rPr>
-          <w:rFonts w:ascii="Arial" w:hAnsi="Arial" w:cs="Arial"/>
-          <w:sz w:val="24"/>
-          <w:szCs w:val="24"/>
-        </w:rPr>
-        <w:t>ul</w:t>
-      </w:r>
-      <w:proofErr w:type="spellEnd"/>
-      <w:r>
-        <w:rPr>
-          <w:rFonts w:ascii="Arial" w:hAnsi="Arial" w:cs="Arial"/>
-          <w:sz w:val="24"/>
-          <w:szCs w:val="24"/>
-        </w:rPr>
-        <w:t xml:space="preserve"> este dificil de proiectat și </w:t>
+        <w:t xml:space="preserve"> Aceste lucruri fiind spuse, este greu de imaginat perspectiva în care o implementare hardware poate fi considerată superioară. Hardware-ul este dificil de proiectat și </w:t>
       </w:r>
     </w:p>
     <w:p>
@@ -5177,43 +5125,7 @@
           <w:sz w:val="24"/>
           <w:szCs w:val="24"/>
         </w:rPr>
-        <w:t xml:space="preserve"> Hardware-</w:t>
-      </w:r>
-      <w:proofErr w:type="spellStart"/>
-      <w:r>
-        <w:rPr>
-          <w:rFonts w:ascii="Arial" w:hAnsi="Arial" w:cs="Arial"/>
-          <w:sz w:val="24"/>
-          <w:szCs w:val="24"/>
-        </w:rPr>
-        <w:t>ul</w:t>
-      </w:r>
-      <w:proofErr w:type="spellEnd"/>
-      <w:r>
-        <w:rPr>
-          <w:rFonts w:ascii="Arial" w:hAnsi="Arial" w:cs="Arial"/>
-          <w:sz w:val="24"/>
-          <w:szCs w:val="24"/>
-        </w:rPr>
-        <w:t xml:space="preserve"> implementează paralelismul într-un mod direct și structurat prin intermediul logicii </w:t>
-      </w:r>
-      <w:proofErr w:type="spellStart"/>
-      <w:r>
-        <w:rPr>
-          <w:rFonts w:ascii="Arial" w:hAnsi="Arial" w:cs="Arial"/>
-          <w:sz w:val="24"/>
-          <w:szCs w:val="24"/>
-        </w:rPr>
-        <w:t>combinaționale</w:t>
-      </w:r>
-      <w:proofErr w:type="spellEnd"/>
-      <w:r>
-        <w:rPr>
-          <w:rFonts w:ascii="Arial" w:hAnsi="Arial" w:cs="Arial"/>
-          <w:sz w:val="24"/>
-          <w:szCs w:val="24"/>
-        </w:rPr>
-        <w:t>, structurilor secvențiale, automatelor cu stări finite</w:t>
+        <w:t xml:space="preserve"> Hardware-ul implementează paralelismul într-un mod direct și structurat prin intermediul logicii combinaționale, structurilor secvențiale, automatelor cu stări finite</w:t>
       </w:r>
       <w:r>
         <w:rPr>
@@ -5603,7 +5515,6 @@
         </w:rPr>
         <w:t xml:space="preserve"> (</w:t>
       </w:r>
-      <w:proofErr w:type="spellStart"/>
       <w:r>
         <w:rPr>
           <w:rFonts w:ascii="Arial" w:hAnsi="Arial" w:cs="Arial"/>
@@ -5612,40 +5523,7 @@
           <w:sz w:val="24"/>
           <w:szCs w:val="24"/>
         </w:rPr>
-        <w:t>Application</w:t>
-      </w:r>
-      <w:proofErr w:type="spellEnd"/>
-      <w:r>
-        <w:rPr>
-          <w:rFonts w:ascii="Arial" w:hAnsi="Arial" w:cs="Arial"/>
-          <w:i/>
-          <w:iCs/>
-          <w:sz w:val="24"/>
-          <w:szCs w:val="24"/>
-        </w:rPr>
-        <w:t xml:space="preserve">-specific </w:t>
-      </w:r>
-      <w:proofErr w:type="spellStart"/>
-      <w:r>
-        <w:rPr>
-          <w:rFonts w:ascii="Arial" w:hAnsi="Arial" w:cs="Arial"/>
-          <w:i/>
-          <w:iCs/>
-          <w:sz w:val="24"/>
-          <w:szCs w:val="24"/>
-        </w:rPr>
-        <w:t>integrated</w:t>
-      </w:r>
-      <w:proofErr w:type="spellEnd"/>
-      <w:r>
-        <w:rPr>
-          <w:rFonts w:ascii="Arial" w:hAnsi="Arial" w:cs="Arial"/>
-          <w:i/>
-          <w:iCs/>
-          <w:sz w:val="24"/>
-          <w:szCs w:val="24"/>
-        </w:rPr>
-        <w:t xml:space="preserve"> circuit</w:t>
+        <w:t>Application-specific integrated circuit</w:t>
       </w:r>
       <w:r>
         <w:rPr>
@@ -5764,7 +5642,6 @@
         </w:rPr>
         <w:t>Una dintre soluțiile acestei probleme este reprezentată de circuitele digitale reconfigurabile de tip FPGA (</w:t>
       </w:r>
-      <w:proofErr w:type="spellStart"/>
       <w:r>
         <w:rPr>
           <w:rFonts w:ascii="Arial" w:hAnsi="Arial" w:cs="Arial"/>
@@ -5773,31 +5650,8 @@
           <w:sz w:val="24"/>
           <w:szCs w:val="24"/>
         </w:rPr>
-        <w:t>Field-Programmable</w:t>
-      </w:r>
-      <w:proofErr w:type="spellEnd"/>
-      <w:r>
-        <w:rPr>
-          <w:rFonts w:ascii="Arial" w:hAnsi="Arial" w:cs="Arial"/>
-          <w:i/>
-          <w:iCs/>
-          <w:sz w:val="24"/>
-          <w:szCs w:val="24"/>
-        </w:rPr>
-        <w:t xml:space="preserve"> Gate </w:t>
-      </w:r>
-      <w:proofErr w:type="spellStart"/>
-      <w:r>
-        <w:rPr>
-          <w:rFonts w:ascii="Arial" w:hAnsi="Arial" w:cs="Arial"/>
-          <w:i/>
-          <w:iCs/>
-          <w:sz w:val="24"/>
-          <w:szCs w:val="24"/>
-        </w:rPr>
-        <w:t>Array</w:t>
-      </w:r>
-      <w:proofErr w:type="spellEnd"/>
+        <w:t>Field-Programmable Gate Array</w:t>
+      </w:r>
       <w:r>
         <w:rPr>
           <w:rFonts w:ascii="Arial" w:hAnsi="Arial" w:cs="Arial"/>
@@ -6178,7 +6032,6 @@
         </w:rPr>
         <w:t>Pentru a menține un grad de corelare ridicat cu tehnologiile criptografice de actualitate, a fost selectat pentru implementare algoritmul AES (</w:t>
       </w:r>
-      <w:proofErr w:type="spellStart"/>
       <w:r>
         <w:rPr>
           <w:rFonts w:ascii="Arial" w:hAnsi="Arial" w:cs="Arial"/>
@@ -6187,40 +6040,7 @@
           <w:sz w:val="24"/>
           <w:szCs w:val="24"/>
         </w:rPr>
-        <w:t>Advanced</w:t>
-      </w:r>
-      <w:proofErr w:type="spellEnd"/>
-      <w:r>
-        <w:rPr>
-          <w:rFonts w:ascii="Arial" w:hAnsi="Arial" w:cs="Arial"/>
-          <w:i/>
-          <w:iCs/>
-          <w:sz w:val="24"/>
-          <w:szCs w:val="24"/>
-        </w:rPr>
-        <w:t xml:space="preserve"> </w:t>
-      </w:r>
-      <w:proofErr w:type="spellStart"/>
-      <w:r>
-        <w:rPr>
-          <w:rFonts w:ascii="Arial" w:hAnsi="Arial" w:cs="Arial"/>
-          <w:i/>
-          <w:iCs/>
-          <w:sz w:val="24"/>
-          <w:szCs w:val="24"/>
-        </w:rPr>
-        <w:t>Encryption</w:t>
-      </w:r>
-      <w:proofErr w:type="spellEnd"/>
-      <w:r>
-        <w:rPr>
-          <w:rFonts w:ascii="Arial" w:hAnsi="Arial" w:cs="Arial"/>
-          <w:i/>
-          <w:iCs/>
-          <w:sz w:val="24"/>
-          <w:szCs w:val="24"/>
-        </w:rPr>
-        <w:t xml:space="preserve"> Standard</w:t>
+        <w:t>Advanced Encryption Standard</w:t>
       </w:r>
       <w:r>
         <w:rPr>
@@ -6330,77 +6150,13 @@
           <w:szCs w:val="24"/>
         </w:rPr>
       </w:pPr>
-      <w:proofErr w:type="spellStart"/>
-      <w:r>
-        <w:rPr>
-          <w:rFonts w:ascii="Arial" w:hAnsi="Arial" w:cs="Arial"/>
-          <w:sz w:val="24"/>
-          <w:szCs w:val="24"/>
-        </w:rPr>
-        <w:t>Digilent</w:t>
-      </w:r>
-      <w:proofErr w:type="spellEnd"/>
-      <w:r>
-        <w:rPr>
-          <w:rFonts w:ascii="Arial" w:hAnsi="Arial" w:cs="Arial"/>
-          <w:sz w:val="24"/>
-          <w:szCs w:val="24"/>
-        </w:rPr>
-        <w:t xml:space="preserve"> </w:t>
-      </w:r>
-      <w:proofErr w:type="spellStart"/>
-      <w:r>
-        <w:rPr>
-          <w:rFonts w:ascii="Arial" w:hAnsi="Arial" w:cs="Arial"/>
-          <w:sz w:val="24"/>
-          <w:szCs w:val="24"/>
-        </w:rPr>
-        <w:t>Arty</w:t>
-      </w:r>
-      <w:proofErr w:type="spellEnd"/>
-      <w:r>
-        <w:rPr>
-          <w:rFonts w:ascii="Arial" w:hAnsi="Arial" w:cs="Arial"/>
-          <w:sz w:val="24"/>
-          <w:szCs w:val="24"/>
-        </w:rPr>
-        <w:t xml:space="preserve"> Z7-20 — </w:t>
-      </w:r>
-      <w:proofErr w:type="spellStart"/>
-      <w:r>
-        <w:rPr>
-          <w:rFonts w:ascii="Arial" w:hAnsi="Arial" w:cs="Arial"/>
-          <w:sz w:val="24"/>
-          <w:szCs w:val="24"/>
-        </w:rPr>
-        <w:t>SoC</w:t>
-      </w:r>
-      <w:proofErr w:type="spellEnd"/>
-      <w:r>
-        <w:rPr>
-          <w:rFonts w:ascii="Arial" w:hAnsi="Arial" w:cs="Arial"/>
-          <w:sz w:val="24"/>
-          <w:szCs w:val="24"/>
-        </w:rPr>
-        <w:t xml:space="preserve"> AMD/</w:t>
-      </w:r>
-      <w:proofErr w:type="spellStart"/>
-      <w:r>
-        <w:rPr>
-          <w:rFonts w:ascii="Arial" w:hAnsi="Arial" w:cs="Arial"/>
-          <w:sz w:val="24"/>
-          <w:szCs w:val="24"/>
-        </w:rPr>
-        <w:t>Xilinx</w:t>
-      </w:r>
-      <w:proofErr w:type="spellEnd"/>
-      <w:r>
-        <w:rPr>
-          <w:rFonts w:ascii="Arial" w:hAnsi="Arial" w:cs="Arial"/>
-          <w:sz w:val="24"/>
-          <w:szCs w:val="24"/>
-        </w:rPr>
-        <w:t xml:space="preserve"> Zynq-7000 XC7Z020</w:t>
+      <w:r>
+        <w:rPr>
+          <w:rFonts w:ascii="Arial" w:hAnsi="Arial" w:cs="Arial"/>
+          <w:sz w:val="24"/>
+          <w:szCs w:val="24"/>
+        </w:rPr>
+        <w:t>Digilent Arty Z7-20 — SoC AMD/Xilinx Zynq-7000 XC7Z020</w:t>
       </w:r>
     </w:p>
     <w:p>
@@ -6424,25 +6180,7 @@
           <w:sz w:val="24"/>
           <w:szCs w:val="24"/>
         </w:rPr>
-        <w:t xml:space="preserve">Mediul de dezvoltare </w:t>
-      </w:r>
-      <w:proofErr w:type="spellStart"/>
-      <w:r>
-        <w:rPr>
-          <w:rFonts w:ascii="Arial" w:hAnsi="Arial" w:cs="Arial"/>
-          <w:sz w:val="24"/>
-          <w:szCs w:val="24"/>
-        </w:rPr>
-        <w:t>Vivado</w:t>
-      </w:r>
-      <w:proofErr w:type="spellEnd"/>
-      <w:r>
-        <w:rPr>
-          <w:rFonts w:ascii="Arial" w:hAnsi="Arial" w:cs="Arial"/>
-          <w:sz w:val="24"/>
-          <w:szCs w:val="24"/>
-        </w:rPr>
-        <w:t>, versiunea 202</w:t>
+        <w:t>Mediul de dezvoltare Vivado, versiunea 202</w:t>
       </w:r>
       <w:r>
         <w:rPr>
@@ -6482,18 +6220,8 @@
           <w:sz w:val="24"/>
           <w:szCs w:val="24"/>
         </w:rPr>
-        <w:t xml:space="preserve">Mediul de dezvoltare </w:t>
-      </w:r>
-      <w:proofErr w:type="spellStart"/>
-      <w:r>
-        <w:rPr>
-          <w:rFonts w:ascii="Arial" w:hAnsi="Arial" w:cs="Arial"/>
-          <w:sz w:val="24"/>
-          <w:szCs w:val="24"/>
-        </w:rPr>
-        <w:t>Vitis</w:t>
-      </w:r>
-      <w:proofErr w:type="spellEnd"/>
+        <w:t>Mediul de dezvoltare Vitis</w:t>
+      </w:r>
       <w:r>
         <w:rPr>
           <w:rFonts w:ascii="Arial" w:hAnsi="Arial" w:cs="Arial"/>
@@ -6683,25 +6411,7 @@
           <w:sz w:val="24"/>
           <w:szCs w:val="24"/>
         </w:rPr>
-        <w:t xml:space="preserve"> același </w:t>
-      </w:r>
-      <w:proofErr w:type="spellStart"/>
-      <w:r>
-        <w:rPr>
-          <w:rFonts w:ascii="Arial" w:hAnsi="Arial" w:cs="Arial"/>
-          <w:sz w:val="24"/>
-          <w:szCs w:val="24"/>
-        </w:rPr>
-        <w:t>SoC</w:t>
-      </w:r>
-      <w:proofErr w:type="spellEnd"/>
-      <w:r>
-        <w:rPr>
-          <w:rFonts w:ascii="Arial" w:hAnsi="Arial" w:cs="Arial"/>
-          <w:sz w:val="24"/>
-          <w:szCs w:val="24"/>
-        </w:rPr>
-        <w:t>, în cazul de față Zynq-7000, pachetele de dezvoltare nu oferă mereu aceleași funcționalități și supr</w:t>
+        <w:t xml:space="preserve"> același SoC, în cazul de față Zynq-7000, pachetele de dezvoltare nu oferă mereu aceleași funcționalități și supr</w:t>
       </w:r>
       <w:r>
         <w:rPr>
@@ -6745,25 +6455,7 @@
           <w:sz w:val="24"/>
           <w:szCs w:val="24"/>
         </w:rPr>
-        <w:t xml:space="preserve">Avantajul sistemului </w:t>
-      </w:r>
-      <w:proofErr w:type="spellStart"/>
-      <w:r>
-        <w:rPr>
-          <w:rFonts w:ascii="Arial" w:hAnsi="Arial" w:cs="Arial"/>
-          <w:sz w:val="24"/>
-          <w:szCs w:val="24"/>
-        </w:rPr>
-        <w:t>SoC</w:t>
-      </w:r>
-      <w:proofErr w:type="spellEnd"/>
-      <w:r>
-        <w:rPr>
-          <w:rFonts w:ascii="Arial" w:hAnsi="Arial" w:cs="Arial"/>
-          <w:sz w:val="24"/>
-          <w:szCs w:val="24"/>
-        </w:rPr>
-        <w:t xml:space="preserve"> Zynq-7000 XC7Z020 este integrarea unui sistem de procesare (</w:t>
+        <w:t>Avantajul sistemului SoC Zynq-7000 XC7Z020 este integrarea unui sistem de procesare (</w:t>
       </w:r>
       <w:r>
         <w:rPr>
@@ -6773,9 +6465,32 @@
           <w:sz w:val="24"/>
           <w:szCs w:val="24"/>
         </w:rPr>
-        <w:t xml:space="preserve">PS – </w:t>
-      </w:r>
-      <w:proofErr w:type="spellStart"/>
+        <w:t>PS – Processing System</w:t>
+      </w:r>
+      <w:r>
+        <w:rPr>
+          <w:rFonts w:ascii="Arial" w:hAnsi="Arial" w:cs="Arial"/>
+          <w:sz w:val="24"/>
+          <w:szCs w:val="24"/>
+        </w:rPr>
+        <w:t>), reprezentat de microprocesorul ARM Cortex 9,</w:t>
+      </w:r>
+      <w:r>
+        <w:rPr>
+          <w:rFonts w:ascii="Arial" w:hAnsi="Arial" w:cs="Arial"/>
+          <w:sz w:val="24"/>
+          <w:szCs w:val="24"/>
+        </w:rPr>
+        <w:t xml:space="preserve"> împreună cu </w:t>
+      </w:r>
+      <w:r>
+        <w:rPr>
+          <w:rFonts w:ascii="Arial" w:hAnsi="Arial" w:cs="Arial"/>
+          <w:sz w:val="24"/>
+          <w:szCs w:val="24"/>
+        </w:rPr>
+        <w:t>logica programabilă (</w:t>
+      </w:r>
       <w:r>
         <w:rPr>
           <w:rFonts w:ascii="Arial" w:hAnsi="Arial" w:cs="Arial"/>
@@ -6784,86 +6499,7 @@
           <w:sz w:val="24"/>
           <w:szCs w:val="24"/>
         </w:rPr>
-        <w:t>Processing</w:t>
-      </w:r>
-      <w:proofErr w:type="spellEnd"/>
-      <w:r>
-        <w:rPr>
-          <w:rFonts w:ascii="Arial" w:hAnsi="Arial" w:cs="Arial"/>
-          <w:i/>
-          <w:iCs/>
-          <w:sz w:val="24"/>
-          <w:szCs w:val="24"/>
-        </w:rPr>
-        <w:t xml:space="preserve"> </w:t>
-      </w:r>
-      <w:proofErr w:type="spellStart"/>
-      <w:r>
-        <w:rPr>
-          <w:rFonts w:ascii="Arial" w:hAnsi="Arial" w:cs="Arial"/>
-          <w:i/>
-          <w:iCs/>
-          <w:sz w:val="24"/>
-          <w:szCs w:val="24"/>
-        </w:rPr>
-        <w:t>System</w:t>
-      </w:r>
-      <w:proofErr w:type="spellEnd"/>
-      <w:r>
-        <w:rPr>
-          <w:rFonts w:ascii="Arial" w:hAnsi="Arial" w:cs="Arial"/>
-          <w:sz w:val="24"/>
-          <w:szCs w:val="24"/>
-        </w:rPr>
-        <w:t>), reprezentat de microprocesorul ARM Cortex 9,</w:t>
-      </w:r>
-      <w:r>
-        <w:rPr>
-          <w:rFonts w:ascii="Arial" w:hAnsi="Arial" w:cs="Arial"/>
-          <w:sz w:val="24"/>
-          <w:szCs w:val="24"/>
-        </w:rPr>
-        <w:t xml:space="preserve"> împreună cu </w:t>
-      </w:r>
-      <w:r>
-        <w:rPr>
-          <w:rFonts w:ascii="Arial" w:hAnsi="Arial" w:cs="Arial"/>
-          <w:sz w:val="24"/>
-          <w:szCs w:val="24"/>
-        </w:rPr>
-        <w:t>logica programabilă (</w:t>
-      </w:r>
-      <w:r>
-        <w:rPr>
-          <w:rFonts w:ascii="Arial" w:hAnsi="Arial" w:cs="Arial"/>
-          <w:i/>
-          <w:iCs/>
-          <w:sz w:val="24"/>
-          <w:szCs w:val="24"/>
-        </w:rPr>
-        <w:t xml:space="preserve">PL – </w:t>
-      </w:r>
-      <w:proofErr w:type="spellStart"/>
-      <w:r>
-        <w:rPr>
-          <w:rFonts w:ascii="Arial" w:hAnsi="Arial" w:cs="Arial"/>
-          <w:i/>
-          <w:iCs/>
-          <w:sz w:val="24"/>
-          <w:szCs w:val="24"/>
-        </w:rPr>
-        <w:t>Programmable</w:t>
-      </w:r>
-      <w:proofErr w:type="spellEnd"/>
-      <w:r>
-        <w:rPr>
-          <w:rFonts w:ascii="Arial" w:hAnsi="Arial" w:cs="Arial"/>
-          <w:i/>
-          <w:iCs/>
-          <w:sz w:val="24"/>
-          <w:szCs w:val="24"/>
-        </w:rPr>
-        <w:t xml:space="preserve"> Logic</w:t>
+        <w:t>PL – Programmable Logic</w:t>
       </w:r>
       <w:r>
         <w:rPr>
@@ -7085,25 +6721,7 @@
           <w:sz w:val="24"/>
           <w:szCs w:val="24"/>
         </w:rPr>
-        <w:t xml:space="preserve"> a circuitului integrat. Mediul de dezvoltare </w:t>
-      </w:r>
-      <w:proofErr w:type="spellStart"/>
-      <w:r>
-        <w:rPr>
-          <w:rFonts w:ascii="Arial" w:hAnsi="Arial" w:cs="Arial"/>
-          <w:sz w:val="24"/>
-          <w:szCs w:val="24"/>
-        </w:rPr>
-        <w:t>Vivado</w:t>
-      </w:r>
-      <w:proofErr w:type="spellEnd"/>
-      <w:r>
-        <w:rPr>
-          <w:rFonts w:ascii="Arial" w:hAnsi="Arial" w:cs="Arial"/>
-          <w:sz w:val="24"/>
-          <w:szCs w:val="24"/>
-        </w:rPr>
-        <w:t>, împreună cu tehnologiile de analiză, sinteză și implementare asociate, va fi utilizat pentru verificarea, validarea și generarea</w:t>
+        <w:t xml:space="preserve"> a circuitului integrat. Mediul de dezvoltare Vivado, împreună cu tehnologiile de analiză, sinteză și implementare asociate, va fi utilizat pentru verificarea, validarea și generarea</w:t>
       </w:r>
       <w:r>
         <w:rPr>
@@ -7163,25 +6781,7 @@
           <w:sz w:val="24"/>
           <w:szCs w:val="24"/>
         </w:rPr>
-        <w:t xml:space="preserve">i logica programabila va fi efectuată prin dezvoltarea unui </w:t>
-      </w:r>
-      <w:proofErr w:type="spellStart"/>
-      <w:r>
-        <w:rPr>
-          <w:rFonts w:ascii="Arial" w:hAnsi="Arial" w:cs="Arial"/>
-          <w:sz w:val="24"/>
-          <w:szCs w:val="24"/>
-        </w:rPr>
-        <w:t>firmware</w:t>
-      </w:r>
-      <w:proofErr w:type="spellEnd"/>
-      <w:r>
-        <w:rPr>
-          <w:rFonts w:ascii="Arial" w:hAnsi="Arial" w:cs="Arial"/>
-          <w:sz w:val="24"/>
-          <w:szCs w:val="24"/>
-        </w:rPr>
-        <w:t xml:space="preserve">, </w:t>
+        <w:t xml:space="preserve">i logica programabila va fi efectuată prin dezvoltarea unui firmware, </w:t>
       </w:r>
       <w:r>
         <w:rPr>
@@ -7213,25 +6813,7 @@
           <w:sz w:val="24"/>
           <w:szCs w:val="24"/>
         </w:rPr>
-        <w:t xml:space="preserve">mediului de dezvoltare </w:t>
-      </w:r>
-      <w:proofErr w:type="spellStart"/>
-      <w:r>
-        <w:rPr>
-          <w:rFonts w:ascii="Arial" w:hAnsi="Arial" w:cs="Arial"/>
-          <w:sz w:val="24"/>
-          <w:szCs w:val="24"/>
-        </w:rPr>
-        <w:t>Vitis</w:t>
-      </w:r>
-      <w:proofErr w:type="spellEnd"/>
-      <w:r>
-        <w:rPr>
-          <w:rFonts w:ascii="Arial" w:hAnsi="Arial" w:cs="Arial"/>
-          <w:sz w:val="24"/>
-          <w:szCs w:val="24"/>
-        </w:rPr>
-        <w:t>.</w:t>
+        <w:t>mediului de dezvoltare Vitis.</w:t>
       </w:r>
     </w:p>
     <w:p>
@@ -7447,25 +7029,7 @@
           <w:sz w:val="24"/>
           <w:szCs w:val="24"/>
         </w:rPr>
-        <w:t xml:space="preserve">Implementarea algoritmului AES, la nivelul unui coprocesor criptografic, demistifică aparenta complexitate pe care operațiile hardware o pot dobândi. Ulterior, integrarea coprocesorului cu restul sistemului </w:t>
-      </w:r>
-      <w:proofErr w:type="spellStart"/>
-      <w:r>
-        <w:rPr>
-          <w:rFonts w:ascii="Arial" w:hAnsi="Arial" w:cs="Arial"/>
-          <w:sz w:val="24"/>
-          <w:szCs w:val="24"/>
-        </w:rPr>
-        <w:t>SoC</w:t>
-      </w:r>
-      <w:proofErr w:type="spellEnd"/>
-      <w:r>
-        <w:rPr>
-          <w:rFonts w:ascii="Arial" w:hAnsi="Arial" w:cs="Arial"/>
-          <w:sz w:val="24"/>
-          <w:szCs w:val="24"/>
-        </w:rPr>
-        <w:t xml:space="preserve"> Zynq-7000, prin utilizarea </w:t>
+        <w:t xml:space="preserve">Implementarea algoritmului AES, la nivelul unui coprocesor criptografic, demistifică aparenta complexitate pe care operațiile hardware o pot dobândi. Ulterior, integrarea coprocesorului cu restul sistemului SoC Zynq-7000, prin utilizarea </w:t>
       </w:r>
     </w:p>
     <w:p>
@@ -7527,25 +7091,7 @@
           <w:sz w:val="24"/>
           <w:szCs w:val="24"/>
         </w:rPr>
-        <w:t xml:space="preserve">atorită faptului că proiectul prevede și dezvoltarea unui </w:t>
-      </w:r>
-      <w:proofErr w:type="spellStart"/>
-      <w:r>
-        <w:rPr>
-          <w:rFonts w:ascii="Arial" w:hAnsi="Arial" w:cs="Arial"/>
-          <w:sz w:val="24"/>
-          <w:szCs w:val="24"/>
-        </w:rPr>
-        <w:t>firmware</w:t>
-      </w:r>
-      <w:proofErr w:type="spellEnd"/>
-      <w:r>
-        <w:rPr>
-          <w:rFonts w:ascii="Arial" w:hAnsi="Arial" w:cs="Arial"/>
-          <w:sz w:val="24"/>
-          <w:szCs w:val="24"/>
-        </w:rPr>
-        <w:t xml:space="preserve"> prin care se realize</w:t>
+        <w:t>atorită faptului că proiectul prevede și dezvoltarea unui firmware prin care se realize</w:t>
       </w:r>
       <w:r>
         <w:rPr>
@@ -7629,25 +7175,7 @@
           <w:sz w:val="24"/>
           <w:szCs w:val="24"/>
         </w:rPr>
-        <w:t xml:space="preserve">operațiilor matematice în structuri logice </w:t>
-      </w:r>
-      <w:proofErr w:type="spellStart"/>
-      <w:r>
-        <w:rPr>
-          <w:rFonts w:ascii="Arial" w:hAnsi="Arial" w:cs="Arial"/>
-          <w:sz w:val="24"/>
-          <w:szCs w:val="24"/>
-        </w:rPr>
-        <w:t>combinaționale</w:t>
-      </w:r>
-      <w:proofErr w:type="spellEnd"/>
-      <w:r>
-        <w:rPr>
-          <w:rFonts w:ascii="Arial" w:hAnsi="Arial" w:cs="Arial"/>
-          <w:sz w:val="24"/>
-          <w:szCs w:val="24"/>
-        </w:rPr>
-        <w:t xml:space="preserve"> și secvențiale, este necesară validarea funcțională a nucleului criptografic.</w:t>
+        <w:t>operațiilor matematice în structuri logice combinaționale și secvențiale, este necesară validarea funcțională a nucleului criptografic.</w:t>
       </w:r>
     </w:p>
     <w:p>
@@ -7709,51 +7237,7 @@
           <w:sz w:val="24"/>
           <w:szCs w:val="24"/>
         </w:rPr>
-        <w:t xml:space="preserve">National Institute of </w:t>
-      </w:r>
-      <w:proofErr w:type="spellStart"/>
-      <w:r>
-        <w:rPr>
-          <w:rFonts w:ascii="Arial" w:hAnsi="Arial" w:cs="Arial"/>
-          <w:i/>
-          <w:iCs/>
-          <w:sz w:val="24"/>
-          <w:szCs w:val="24"/>
-        </w:rPr>
-        <w:t>Standards</w:t>
-      </w:r>
-      <w:proofErr w:type="spellEnd"/>
-      <w:r>
-        <w:rPr>
-          <w:rFonts w:ascii="Arial" w:hAnsi="Arial" w:cs="Arial"/>
-          <w:i/>
-          <w:iCs/>
-          <w:sz w:val="24"/>
-          <w:szCs w:val="24"/>
-        </w:rPr>
-        <w:t xml:space="preserve"> </w:t>
-      </w:r>
-      <w:proofErr w:type="spellStart"/>
-      <w:r>
-        <w:rPr>
-          <w:rFonts w:ascii="Arial" w:hAnsi="Arial" w:cs="Arial"/>
-          <w:i/>
-          <w:iCs/>
-          <w:sz w:val="24"/>
-          <w:szCs w:val="24"/>
-        </w:rPr>
-        <w:t>and</w:t>
-      </w:r>
-      <w:proofErr w:type="spellEnd"/>
-      <w:r>
-        <w:rPr>
-          <w:rFonts w:ascii="Arial" w:hAnsi="Arial" w:cs="Arial"/>
-          <w:i/>
-          <w:iCs/>
-          <w:sz w:val="24"/>
-          <w:szCs w:val="24"/>
-        </w:rPr>
-        <w:t xml:space="preserve"> Technology</w:t>
+        <w:t>National Institute of Standards and Technology</w:t>
       </w:r>
       <w:r>
         <w:rPr>
@@ -7781,61 +7265,7 @@
           <w:sz w:val="24"/>
           <w:szCs w:val="24"/>
         </w:rPr>
-        <w:t>În urma procedeului de dezvoltare și validare, va fi analizată posibilitatea reconfigurării dinamice parțiale sau totale a coprocesorului, în baza mecanismelor DFX (</w:t>
-      </w:r>
-      <w:proofErr w:type="spellStart"/>
-      <w:r>
-        <w:rPr>
-          <w:rFonts w:ascii="Arial" w:hAnsi="Arial" w:cs="Arial"/>
-          <w:sz w:val="24"/>
-          <w:szCs w:val="24"/>
-        </w:rPr>
-        <w:t>Dynamic</w:t>
-      </w:r>
-      <w:proofErr w:type="spellEnd"/>
-      <w:r>
-        <w:rPr>
-          <w:rFonts w:ascii="Arial" w:hAnsi="Arial" w:cs="Arial"/>
-          <w:sz w:val="24"/>
-          <w:szCs w:val="24"/>
-        </w:rPr>
-        <w:t xml:space="preserve"> </w:t>
-      </w:r>
-      <w:proofErr w:type="spellStart"/>
-      <w:r>
-        <w:rPr>
-          <w:rFonts w:ascii="Arial" w:hAnsi="Arial" w:cs="Arial"/>
-          <w:sz w:val="24"/>
-          <w:szCs w:val="24"/>
-        </w:rPr>
-        <w:t>Function</w:t>
-      </w:r>
-      <w:proofErr w:type="spellEnd"/>
-      <w:r>
-        <w:rPr>
-          <w:rFonts w:ascii="Arial" w:hAnsi="Arial" w:cs="Arial"/>
-          <w:sz w:val="24"/>
-          <w:szCs w:val="24"/>
-        </w:rPr>
-        <w:t xml:space="preserve"> </w:t>
-      </w:r>
-      <w:proofErr w:type="spellStart"/>
-      <w:r>
-        <w:rPr>
-          <w:rFonts w:ascii="Arial" w:hAnsi="Arial" w:cs="Arial"/>
-          <w:sz w:val="24"/>
-          <w:szCs w:val="24"/>
-        </w:rPr>
-        <w:t>eXchange</w:t>
-      </w:r>
-      <w:proofErr w:type="spellEnd"/>
-      <w:r>
-        <w:rPr>
-          <w:rFonts w:ascii="Arial" w:hAnsi="Arial" w:cs="Arial"/>
-          <w:sz w:val="24"/>
-          <w:szCs w:val="24"/>
-        </w:rPr>
-        <w:t xml:space="preserve">) </w:t>
+        <w:t xml:space="preserve">În urma procedeului de dezvoltare și validare, va fi analizată posibilitatea reconfigurării dinamice parțiale sau totale a coprocesorului, în baza mecanismelor DFX (Dynamic Function eXchange) </w:t>
       </w:r>
       <w:r>
         <w:rPr>
@@ -7853,7 +7283,6 @@
         </w:rPr>
         <w:t>de către AMD/</w:t>
       </w:r>
-      <w:proofErr w:type="spellStart"/>
       <w:r>
         <w:rPr>
           <w:rFonts w:ascii="Arial" w:hAnsi="Arial" w:cs="Arial"/>
@@ -7862,7 +7291,6 @@
         </w:rPr>
         <w:t>Xilinx</w:t>
       </w:r>
-      <w:proofErr w:type="spellEnd"/>
       <w:r>
         <w:rPr>
           <w:rFonts w:ascii="Arial" w:hAnsi="Arial" w:cs="Arial"/>
@@ -8380,7 +7808,6 @@
         </w:rPr>
         <w:t xml:space="preserve">implementează o suită vastă de algoritmi. Dintre aceste librării putem aminti </w:t>
       </w:r>
-      <w:proofErr w:type="spellStart"/>
       <w:r>
         <w:rPr>
           <w:rFonts w:ascii="Arial" w:hAnsi="Arial" w:cs="Arial"/>
@@ -8391,7 +7818,6 @@
         </w:rPr>
         <w:t>OpenSSL</w:t>
       </w:r>
-      <w:proofErr w:type="spellEnd"/>
       <w:r>
         <w:rPr>
           <w:rFonts w:ascii="Arial" w:hAnsi="Arial" w:cs="Arial"/>
@@ -8776,9 +8202,64 @@
           <w:sz w:val="24"/>
           <w:szCs w:val="24"/>
         </w:rPr>
-        <w:t xml:space="preserve">task </w:t>
-      </w:r>
-      <w:proofErr w:type="spellStart"/>
+        <w:t>task scheduler</w:t>
+      </w:r>
+      <w:r>
+        <w:rPr>
+          <w:rFonts w:ascii="Arial" w:hAnsi="Arial" w:cs="Arial"/>
+          <w:sz w:val="24"/>
+          <w:szCs w:val="24"/>
+        </w:rPr>
+        <w:t>), operațiile criptografic</w:t>
+      </w:r>
+      <w:r>
+        <w:rPr>
+          <w:rFonts w:ascii="Arial" w:hAnsi="Arial" w:cs="Arial"/>
+          <w:sz w:val="24"/>
+          <w:szCs w:val="24"/>
+        </w:rPr>
+        <w:t>e</w:t>
+      </w:r>
+      <w:r>
+        <w:rPr>
+          <w:rFonts w:ascii="Arial" w:hAnsi="Arial" w:cs="Arial"/>
+          <w:sz w:val="24"/>
+          <w:szCs w:val="24"/>
+        </w:rPr>
+        <w:t xml:space="preserve"> sunt adesea executate într-un </w:t>
+      </w:r>
+      <w:r>
+        <w:rPr>
+          <w:rFonts w:ascii="Arial" w:hAnsi="Arial" w:cs="Arial"/>
+          <w:sz w:val="24"/>
+          <w:szCs w:val="24"/>
+        </w:rPr>
+        <w:t xml:space="preserve">mod </w:t>
+      </w:r>
+      <w:r>
+        <w:rPr>
+          <w:rFonts w:ascii="Arial" w:hAnsi="Arial" w:cs="Arial"/>
+          <w:sz w:val="24"/>
+          <w:szCs w:val="24"/>
+        </w:rPr>
+        <w:t xml:space="preserve">fragmentat, </w:t>
+      </w:r>
+      <w:r>
+        <w:rPr>
+          <w:rFonts w:ascii="Arial" w:hAnsi="Arial" w:cs="Arial"/>
+          <w:sz w:val="24"/>
+          <w:szCs w:val="24"/>
+        </w:rPr>
+        <w:t xml:space="preserve">ca urmare a </w:t>
+      </w:r>
+      <w:r>
+        <w:rPr>
+          <w:rFonts w:ascii="Arial" w:hAnsi="Arial" w:cs="Arial"/>
+          <w:sz w:val="24"/>
+          <w:szCs w:val="24"/>
+        </w:rPr>
+        <w:t>mecanismului de comutare între procese (</w:t>
+      </w:r>
       <w:r>
         <w:rPr>
           <w:rFonts w:ascii="Arial" w:hAnsi="Arial" w:cs="Arial"/>
@@ -8787,87 +8268,8 @@
           <w:sz w:val="24"/>
           <w:szCs w:val="24"/>
         </w:rPr>
-        <w:t>scheduler</w:t>
-      </w:r>
-      <w:proofErr w:type="spellEnd"/>
-      <w:r>
-        <w:rPr>
-          <w:rFonts w:ascii="Arial" w:hAnsi="Arial" w:cs="Arial"/>
-          <w:sz w:val="24"/>
-          <w:szCs w:val="24"/>
-        </w:rPr>
-        <w:t>), operațiile criptografic</w:t>
-      </w:r>
-      <w:r>
-        <w:rPr>
-          <w:rFonts w:ascii="Arial" w:hAnsi="Arial" w:cs="Arial"/>
-          <w:sz w:val="24"/>
-          <w:szCs w:val="24"/>
-        </w:rPr>
-        <w:t>e</w:t>
-      </w:r>
-      <w:r>
-        <w:rPr>
-          <w:rFonts w:ascii="Arial" w:hAnsi="Arial" w:cs="Arial"/>
-          <w:sz w:val="24"/>
-          <w:szCs w:val="24"/>
-        </w:rPr>
-        <w:t xml:space="preserve"> sunt adesea executate într-un </w:t>
-      </w:r>
-      <w:r>
-        <w:rPr>
-          <w:rFonts w:ascii="Arial" w:hAnsi="Arial" w:cs="Arial"/>
-          <w:sz w:val="24"/>
-          <w:szCs w:val="24"/>
-        </w:rPr>
-        <w:t xml:space="preserve">mod </w:t>
-      </w:r>
-      <w:r>
-        <w:rPr>
-          <w:rFonts w:ascii="Arial" w:hAnsi="Arial" w:cs="Arial"/>
-          <w:sz w:val="24"/>
-          <w:szCs w:val="24"/>
-        </w:rPr>
-        <w:t xml:space="preserve">fragmentat, </w:t>
-      </w:r>
-      <w:r>
-        <w:rPr>
-          <w:rFonts w:ascii="Arial" w:hAnsi="Arial" w:cs="Arial"/>
-          <w:sz w:val="24"/>
-          <w:szCs w:val="24"/>
-        </w:rPr>
-        <w:t xml:space="preserve">ca urmare a </w:t>
-      </w:r>
-      <w:r>
-        <w:rPr>
-          <w:rFonts w:ascii="Arial" w:hAnsi="Arial" w:cs="Arial"/>
-          <w:sz w:val="24"/>
-          <w:szCs w:val="24"/>
-        </w:rPr>
-        <w:t>mecanismului de comutare între procese (</w:t>
-      </w:r>
-      <w:r>
-        <w:rPr>
-          <w:rFonts w:ascii="Arial" w:hAnsi="Arial" w:cs="Arial"/>
-          <w:i/>
-          <w:iCs/>
-          <w:sz w:val="24"/>
-          <w:szCs w:val="24"/>
-        </w:rPr>
-        <w:t xml:space="preserve">task </w:t>
-      </w:r>
-      <w:proofErr w:type="spellStart"/>
-      <w:r>
-        <w:rPr>
-          <w:rFonts w:ascii="Arial" w:hAnsi="Arial" w:cs="Arial"/>
-          <w:i/>
-          <w:iCs/>
-          <w:sz w:val="24"/>
-          <w:szCs w:val="24"/>
-        </w:rPr>
-        <w:t>switching</w:t>
-      </w:r>
-      <w:proofErr w:type="spellEnd"/>
+        <w:t>task switching</w:t>
+      </w:r>
       <w:r>
         <w:rPr>
           <w:rFonts w:ascii="Arial" w:hAnsi="Arial" w:cs="Arial"/>
@@ -9110,25 +8512,7 @@
           <w:sz w:val="24"/>
           <w:szCs w:val="24"/>
         </w:rPr>
-        <w:t xml:space="preserve">Dezvoltatorii acestor sisteme criptografice pot gestiona direct modul în care resursele digitale și computaționale sunt alocate. În funcție de constrângerile impuse implementării, structurile secvențiale și </w:t>
-      </w:r>
-      <w:proofErr w:type="spellStart"/>
-      <w:r>
-        <w:rPr>
-          <w:rFonts w:ascii="Arial" w:hAnsi="Arial" w:cs="Arial"/>
-          <w:sz w:val="24"/>
-          <w:szCs w:val="24"/>
-        </w:rPr>
-        <w:t>combinaționale</w:t>
-      </w:r>
-      <w:proofErr w:type="spellEnd"/>
-      <w:r>
-        <w:rPr>
-          <w:rFonts w:ascii="Arial" w:hAnsi="Arial" w:cs="Arial"/>
-          <w:sz w:val="24"/>
-          <w:szCs w:val="24"/>
-        </w:rPr>
-        <w:t xml:space="preserve"> pot fi modificate, astfel încât totalitatea cerințelor să fie îndeplinite. </w:t>
+        <w:t xml:space="preserve">Dezvoltatorii acestor sisteme criptografice pot gestiona direct modul în care resursele digitale și computaționale sunt alocate. În funcție de constrângerile impuse implementării, structurile secvențiale și combinaționale pot fi modificate, astfel încât totalitatea cerințelor să fie îndeplinite. </w:t>
       </w:r>
     </w:p>
     <w:p>
@@ -9211,7 +8595,6 @@
         </w:rPr>
         <w:t xml:space="preserve"> (</w:t>
       </w:r>
-      <w:proofErr w:type="spellStart"/>
       <w:r>
         <w:rPr>
           <w:rFonts w:ascii="Arial" w:hAnsi="Arial" w:cs="Arial"/>
@@ -9222,7 +8605,6 @@
         </w:rPr>
         <w:t>unrolled</w:t>
       </w:r>
-      <w:proofErr w:type="spellEnd"/>
       <w:r>
         <w:rPr>
           <w:rFonts w:ascii="Arial" w:hAnsi="Arial" w:cs="Arial"/>
@@ -9277,25 +8659,7 @@
           <w:sz w:val="24"/>
           <w:szCs w:val="24"/>
         </w:rPr>
-        <w:t xml:space="preserve"> tuturor rundelor AES sunt implementate într-un mod concurent prin structuri </w:t>
-      </w:r>
-      <w:proofErr w:type="spellStart"/>
-      <w:r>
-        <w:rPr>
-          <w:rFonts w:ascii="Arial" w:hAnsi="Arial" w:cs="Arial"/>
-          <w:sz w:val="24"/>
-          <w:szCs w:val="24"/>
-        </w:rPr>
-        <w:t>combinaționale</w:t>
-      </w:r>
-      <w:proofErr w:type="spellEnd"/>
-      <w:r>
-        <w:rPr>
-          <w:rFonts w:ascii="Arial" w:hAnsi="Arial" w:cs="Arial"/>
-          <w:sz w:val="24"/>
-          <w:szCs w:val="24"/>
-        </w:rPr>
-        <w:t xml:space="preserve"> distincte. Eliminarea </w:t>
+        <w:t xml:space="preserve"> tuturor rundelor AES sunt implementate într-un mod concurent prin structuri combinaționale distincte. Eliminarea </w:t>
       </w:r>
       <w:r>
         <w:rPr>
@@ -9397,7 +8761,6 @@
         </w:rPr>
         <w:t xml:space="preserve">O extensie a acestei abordări este reprezentată de arhitecturile de tip </w:t>
       </w:r>
-      <w:proofErr w:type="spellStart"/>
       <w:r>
         <w:rPr>
           <w:rFonts w:ascii="Arial" w:hAnsi="Arial" w:cs="Arial"/>
@@ -9408,7 +8771,6 @@
         </w:rPr>
         <w:t>pipeline</w:t>
       </w:r>
-      <w:proofErr w:type="spellEnd"/>
       <w:r>
         <w:rPr>
           <w:rFonts w:ascii="Arial" w:hAnsi="Arial" w:cs="Arial"/>
@@ -9487,25 +8849,7 @@
           <w:sz w:val="24"/>
           <w:szCs w:val="24"/>
         </w:rPr>
-        <w:t xml:space="preserve"> de timp necesară procesării tuturor rundelor. Arhitectura </w:t>
-      </w:r>
-      <w:proofErr w:type="spellStart"/>
-      <w:r>
-        <w:rPr>
-          <w:rFonts w:ascii="Arial" w:hAnsi="Arial" w:cs="Arial"/>
-          <w:sz w:val="24"/>
-          <w:szCs w:val="24"/>
-        </w:rPr>
-        <w:t>pipeline</w:t>
-      </w:r>
-      <w:proofErr w:type="spellEnd"/>
-      <w:r>
-        <w:rPr>
-          <w:rFonts w:ascii="Arial" w:hAnsi="Arial" w:cs="Arial"/>
-          <w:sz w:val="24"/>
-          <w:szCs w:val="24"/>
-        </w:rPr>
-        <w:t xml:space="preserve"> procesează primul bloc al unui mesaj într-o perioad</w:t>
+        <w:t xml:space="preserve"> de timp necesară procesării tuturor rundelor. Arhitectura pipeline procesează primul bloc al unui mesaj într-o perioad</w:t>
       </w:r>
       <w:r>
         <w:rPr>
@@ -9585,25 +8929,7 @@
           <w:sz w:val="24"/>
           <w:szCs w:val="24"/>
         </w:rPr>
-        <w:t xml:space="preserve"> </w:t>
-      </w:r>
-      <w:proofErr w:type="spellStart"/>
-      <w:r>
-        <w:rPr>
-          <w:rFonts w:ascii="Arial" w:hAnsi="Arial" w:cs="Arial"/>
-          <w:sz w:val="24"/>
-          <w:szCs w:val="24"/>
-        </w:rPr>
-        <w:t>pipeline-ul</w:t>
-      </w:r>
-      <w:proofErr w:type="spellEnd"/>
-      <w:r>
-        <w:rPr>
-          <w:rFonts w:ascii="Arial" w:hAnsi="Arial" w:cs="Arial"/>
-          <w:sz w:val="24"/>
-          <w:szCs w:val="24"/>
-        </w:rPr>
-        <w:t xml:space="preserve"> se umple, acesta poate ajunge să furnizeze un bloc criptat la fiecare ciclu de tact.</w:t>
+        <w:t xml:space="preserve"> pipeline-ul se umple, acesta poate ajunge să furnizeze un bloc criptat la fiecare ciclu de tact.</w:t>
       </w:r>
     </w:p>
     <w:p>
@@ -9683,25 +9009,7 @@
           <w:sz w:val="24"/>
           <w:szCs w:val="24"/>
         </w:rPr>
-        <w:t xml:space="preserve"> O arhitectură iterativă favorizează economisirea resurselor, în timp ce o implementare </w:t>
-      </w:r>
-      <w:proofErr w:type="spellStart"/>
-      <w:r>
-        <w:rPr>
-          <w:rFonts w:ascii="Arial" w:hAnsi="Arial" w:cs="Arial"/>
-          <w:sz w:val="24"/>
-          <w:szCs w:val="24"/>
-        </w:rPr>
-        <w:t>pipeline</w:t>
-      </w:r>
-      <w:proofErr w:type="spellEnd"/>
-      <w:r>
-        <w:rPr>
-          <w:rFonts w:ascii="Arial" w:hAnsi="Arial" w:cs="Arial"/>
-          <w:sz w:val="24"/>
-          <w:szCs w:val="24"/>
-        </w:rPr>
-        <w:t xml:space="preserve"> favorize</w:t>
+        <w:t xml:space="preserve"> O arhitectură iterativă favorizează economisirea resurselor, în timp ce o implementare pipeline favorize</w:t>
       </w:r>
       <w:r>
         <w:rPr>
@@ -9791,25 +9099,7 @@
           <w:sz w:val="24"/>
           <w:szCs w:val="24"/>
         </w:rPr>
-        <w:t xml:space="preserve">Sistemele </w:t>
-      </w:r>
-      <w:proofErr w:type="spellStart"/>
-      <w:r>
-        <w:rPr>
-          <w:rFonts w:ascii="Arial" w:hAnsi="Arial" w:cs="Arial"/>
-          <w:sz w:val="24"/>
-          <w:szCs w:val="24"/>
-        </w:rPr>
-        <w:t>SoC</w:t>
-      </w:r>
-      <w:proofErr w:type="spellEnd"/>
-      <w:r>
-        <w:rPr>
-          <w:rFonts w:ascii="Arial" w:hAnsi="Arial" w:cs="Arial"/>
-          <w:sz w:val="24"/>
-          <w:szCs w:val="24"/>
-        </w:rPr>
-        <w:t xml:space="preserve"> FPGA combină într-un singur dispozitiv un sistem de procesare convențional cu o regiune de logică programabilă. O astfel de arhitectură permite asocierea flexibilității software-ului cu posibilitatea implementării unor acceleratoare hardware dedicate. Procesorul poate gestiona operațiile generale ale sistemului, în timp ce logica programabilă este utilizată pentru executarea funcțiilor care beneficiază de paralelism și specializare hardware.</w:t>
+        <w:t>Sistemele SoC FPGA combină într-un singur dispozitiv un sistem de procesare convențional cu o regiune de logică programabilă. O astfel de arhitectură permite asocierea flexibilității software-ului cu posibilitatea implementării unor acceleratoare hardware dedicate. Procesorul poate gestiona operațiile generale ale sistemului, în timp ce logica programabilă este utilizată pentru executarea funcțiilor care beneficiază de paralelism și specializare hardware.</w:t>
       </w:r>
     </w:p>
     <w:p>
@@ -9927,25 +9217,7 @@
           <w:sz w:val="24"/>
           <w:szCs w:val="24"/>
         </w:rPr>
-        <w:t xml:space="preserve">lucrări este bazată pe implementarea unui coprocesor criptografic AES-128 cu arhitectură iterativă. Alegerea acestei arhitecturi are la bază mai multe considerente. În primul rând, un circuit digital iterativ utilizează, în general, un volum mai redus de resurse comparativ cu variantele desfășurate sau de tip </w:t>
-      </w:r>
-      <w:proofErr w:type="spellStart"/>
-      <w:r>
-        <w:rPr>
-          <w:rFonts w:ascii="Arial" w:hAnsi="Arial" w:cs="Arial"/>
-          <w:sz w:val="24"/>
-          <w:szCs w:val="24"/>
-        </w:rPr>
-        <w:t>pipeline</w:t>
-      </w:r>
-      <w:proofErr w:type="spellEnd"/>
-      <w:r>
-        <w:rPr>
-          <w:rFonts w:ascii="Arial" w:hAnsi="Arial" w:cs="Arial"/>
-          <w:sz w:val="24"/>
-          <w:szCs w:val="24"/>
-        </w:rPr>
-        <w:t>. Reducerea complexității structurii logice facilitează atât procesul de proiectare, cât și etapele de verificare și validare.</w:t>
+        <w:t>lucrări este bazată pe implementarea unui coprocesor criptografic AES-128 cu arhitectură iterativă. Alegerea acestei arhitecturi are la bază mai multe considerente. În primul rând, un circuit digital iterativ utilizează, în general, un volum mai redus de resurse comparativ cu variantele desfășurate sau de tip pipeline. Reducerea complexității structurii logice facilitează atât procesul de proiectare, cât și etapele de verificare și validare.</w:t>
       </w:r>
     </w:p>
     <w:p>
@@ -10015,18 +9287,8 @@
           <w:sz w:val="24"/>
           <w:szCs w:val="24"/>
         </w:rPr>
-        <w:t xml:space="preserve">În al doilea rând, o astfel de arhitectură oferă un reper util pentru analizarea unor direcții viitoare de optimizare. Rezultatele obținute în ceea ce privește utilizarea resurselor, latența și debitul de procesare pot fi comparate ulterior cu cele ale unor implementări desfășurate sau de tip </w:t>
-      </w:r>
-      <w:proofErr w:type="spellStart"/>
-      <w:r>
-        <w:rPr>
-          <w:rFonts w:ascii="Arial" w:hAnsi="Arial" w:cs="Arial"/>
-          <w:sz w:val="24"/>
-          <w:szCs w:val="24"/>
-        </w:rPr>
-        <w:t>pipeline</w:t>
-      </w:r>
-      <w:proofErr w:type="spellEnd"/>
+        <w:t>În al doilea rând, o astfel de arhitectură oferă un reper util pentru analizarea unor direcții viitoare de optimizare. Rezultatele obținute în ceea ce privește utilizarea resurselor, latența și debitul de procesare pot fi comparate ulterior cu cele ale unor implementări desfășurate sau de tip pipeline</w:t>
+      </w:r>
       <w:r>
         <w:rPr>
           <w:rFonts w:ascii="Arial" w:hAnsi="Arial" w:cs="Arial"/>
@@ -10895,7 +10157,6 @@
         </w:rPr>
         <w:t xml:space="preserve">Operațiile de criptare și decriptare sunt utilizate pentru asigurarea confidențialității informației. Funcțiile </w:t>
       </w:r>
-      <w:proofErr w:type="spellStart"/>
       <w:r>
         <w:rPr>
           <w:rFonts w:ascii="Arial" w:hAnsi="Arial" w:cs="Arial"/>
@@ -10906,7 +10167,6 @@
         </w:rPr>
         <w:t>hash</w:t>
       </w:r>
-      <w:proofErr w:type="spellEnd"/>
       <w:r>
         <w:rPr>
           <w:rFonts w:ascii="Arial" w:hAnsi="Arial" w:cs="Arial"/>
@@ -11628,7 +10888,6 @@
         </w:rPr>
         <w:t>Algoritmi simetrici de tip cifru de flux (</w:t>
       </w:r>
-      <w:proofErr w:type="spellStart"/>
       <w:r>
         <w:rPr>
           <w:rFonts w:ascii="Arial" w:hAnsi="Arial" w:cs="Arial"/>
@@ -11637,31 +10896,8 @@
           <w:sz w:val="24"/>
           <w:szCs w:val="24"/>
         </w:rPr>
-        <w:t>stream</w:t>
-      </w:r>
-      <w:proofErr w:type="spellEnd"/>
-      <w:r>
-        <w:rPr>
-          <w:rFonts w:ascii="Arial" w:hAnsi="Arial" w:cs="Arial"/>
-          <w:i/>
-          <w:iCs/>
-          <w:sz w:val="24"/>
-          <w:szCs w:val="24"/>
-        </w:rPr>
-        <w:t xml:space="preserve"> </w:t>
-      </w:r>
-      <w:proofErr w:type="spellStart"/>
-      <w:r>
-        <w:rPr>
-          <w:rFonts w:ascii="Arial" w:hAnsi="Arial" w:cs="Arial"/>
-          <w:i/>
-          <w:iCs/>
-          <w:sz w:val="24"/>
-          <w:szCs w:val="24"/>
-        </w:rPr>
-        <w:t>cipher</w:t>
-      </w:r>
-      <w:proofErr w:type="spellEnd"/>
+        <w:t>stream cipher</w:t>
+      </w:r>
       <w:r>
         <w:rPr>
           <w:rFonts w:ascii="Arial" w:hAnsi="Arial" w:cs="Arial"/>
@@ -11693,7 +10929,6 @@
         </w:rPr>
         <w:t>Algoritmi simetrici de tip cifru bloc (</w:t>
       </w:r>
-      <w:proofErr w:type="spellStart"/>
       <w:r>
         <w:rPr>
           <w:rFonts w:ascii="Arial" w:hAnsi="Arial" w:cs="Arial"/>
@@ -11702,9 +10937,35 @@
           <w:sz w:val="24"/>
           <w:szCs w:val="24"/>
         </w:rPr>
-        <w:t>block</w:t>
-      </w:r>
-      <w:proofErr w:type="spellEnd"/>
+        <w:t>block cipher</w:t>
+      </w:r>
+      <w:r>
+        <w:rPr>
+          <w:rFonts w:ascii="Arial" w:hAnsi="Arial" w:cs="Arial"/>
+          <w:sz w:val="24"/>
+          <w:szCs w:val="24"/>
+        </w:rPr>
+        <w:t>)</w:t>
+      </w:r>
+    </w:p>
+    <w:p>
+      <w:pPr>
+        <w:ind w:firstLine="720"/>
+        <w:jc w:val="both"/>
+        <w:rPr>
+          <w:rFonts w:ascii="Arial" w:hAnsi="Arial" w:cs="Arial"/>
+          <w:sz w:val="24"/>
+          <w:szCs w:val="24"/>
+        </w:rPr>
+      </w:pPr>
+      <w:r>
+        <w:rPr>
+          <w:rFonts w:ascii="Arial" w:hAnsi="Arial" w:cs="Arial"/>
+          <w:sz w:val="24"/>
+          <w:szCs w:val="24"/>
+        </w:rPr>
+        <w:t>Cifrurile de flux (</w:t>
+      </w:r>
       <w:r>
         <w:rPr>
           <w:rFonts w:ascii="Arial" w:hAnsi="Arial" w:cs="Arial"/>
@@ -11713,9 +10974,48 @@
           <w:sz w:val="24"/>
           <w:szCs w:val="24"/>
         </w:rPr>
-        <w:t xml:space="preserve"> </w:t>
-      </w:r>
-      <w:proofErr w:type="spellStart"/>
+        <w:t>stream ciphers</w:t>
+      </w:r>
+      <w:r>
+        <w:rPr>
+          <w:rFonts w:ascii="Arial" w:hAnsi="Arial" w:cs="Arial"/>
+          <w:sz w:val="24"/>
+          <w:szCs w:val="24"/>
+        </w:rPr>
+        <w:t>) realizează criptarea prin procesarea individuală a biților sau octeților mesajului. În cazul cifrurilor de flux sincrone, un flux de biți pseudo</w:t>
+      </w:r>
+      <w:r>
+        <w:rPr>
+          <w:rFonts w:ascii="Arial" w:hAnsi="Arial" w:cs="Arial"/>
+          <w:sz w:val="24"/>
+          <w:szCs w:val="24"/>
+        </w:rPr>
+        <w:t>-</w:t>
+      </w:r>
+      <w:r>
+        <w:rPr>
+          <w:rFonts w:ascii="Arial" w:hAnsi="Arial" w:cs="Arial"/>
+          <w:sz w:val="24"/>
+          <w:szCs w:val="24"/>
+        </w:rPr>
+        <w:t>aleatori</w:t>
+      </w:r>
+      <w:r>
+        <w:rPr>
+          <w:rFonts w:ascii="Arial" w:hAnsi="Arial" w:cs="Arial"/>
+          <w:sz w:val="24"/>
+          <w:szCs w:val="24"/>
+        </w:rPr>
+        <w:t>u</w:t>
+      </w:r>
+      <w:r>
+        <w:rPr>
+          <w:rFonts w:ascii="Arial" w:hAnsi="Arial" w:cs="Arial"/>
+          <w:sz w:val="24"/>
+          <w:szCs w:val="24"/>
+        </w:rPr>
+        <w:t xml:space="preserve"> este generat pe baza cheii criptografice și este combinat cu biții textului în clar prin intermediul operației </w:t>
+      </w:r>
       <w:r>
         <w:rPr>
           <w:rFonts w:ascii="Arial" w:hAnsi="Arial" w:cs="Arial"/>
@@ -11724,16 +11024,33 @@
           <w:sz w:val="24"/>
           <w:szCs w:val="24"/>
         </w:rPr>
-        <w:t>cipher</w:t>
-      </w:r>
-      <w:proofErr w:type="spellEnd"/>
-      <w:r>
-        <w:rPr>
-          <w:rFonts w:ascii="Arial" w:hAnsi="Arial" w:cs="Arial"/>
-          <w:sz w:val="24"/>
-          <w:szCs w:val="24"/>
-        </w:rPr>
-        <w:t>)</w:t>
+        <w:t>sau exclusiv</w:t>
+      </w:r>
+      <w:r>
+        <w:rPr>
+          <w:rFonts w:ascii="Arial" w:hAnsi="Arial" w:cs="Arial"/>
+          <w:sz w:val="24"/>
+          <w:szCs w:val="24"/>
+        </w:rPr>
+        <w:t xml:space="preserve"> (</w:t>
+      </w:r>
+      <w:r>
+        <w:rPr>
+          <w:rFonts w:ascii="Arial" w:hAnsi="Arial" w:cs="Arial"/>
+          <w:i/>
+          <w:iCs/>
+          <w:sz w:val="24"/>
+          <w:szCs w:val="24"/>
+        </w:rPr>
+        <w:t>XOR</w:t>
+      </w:r>
+      <w:r>
+        <w:rPr>
+          <w:rFonts w:ascii="Arial" w:hAnsi="Arial" w:cs="Arial"/>
+          <w:sz w:val="24"/>
+          <w:szCs w:val="24"/>
+        </w:rPr>
+        <w:t>). În schimb, cifrurile de flux asincrone utilizează, pe lângă cheia inițială, și biți proveniți din criptotextul generat anterior pentru determinarea fluxului de cheie. Majoritatea cifrurilor de flux utilizate în practică adoptă o arhitectură sincronă.</w:t>
       </w:r>
     </w:p>
     <w:p>
@@ -11752,172 +11069,7 @@
           <w:sz w:val="24"/>
           <w:szCs w:val="24"/>
         </w:rPr>
-        <w:t>Cifrurile de flux (</w:t>
-      </w:r>
-      <w:proofErr w:type="spellStart"/>
-      <w:r>
-        <w:rPr>
-          <w:rFonts w:ascii="Arial" w:hAnsi="Arial" w:cs="Arial"/>
-          <w:i/>
-          <w:iCs/>
-          <w:sz w:val="24"/>
-          <w:szCs w:val="24"/>
-        </w:rPr>
-        <w:t>stream</w:t>
-      </w:r>
-      <w:proofErr w:type="spellEnd"/>
-      <w:r>
-        <w:rPr>
-          <w:rFonts w:ascii="Arial" w:hAnsi="Arial" w:cs="Arial"/>
-          <w:i/>
-          <w:iCs/>
-          <w:sz w:val="24"/>
-          <w:szCs w:val="24"/>
-        </w:rPr>
-        <w:t xml:space="preserve"> </w:t>
-      </w:r>
-      <w:proofErr w:type="spellStart"/>
-      <w:r>
-        <w:rPr>
-          <w:rFonts w:ascii="Arial" w:hAnsi="Arial" w:cs="Arial"/>
-          <w:i/>
-          <w:iCs/>
-          <w:sz w:val="24"/>
-          <w:szCs w:val="24"/>
-        </w:rPr>
-        <w:t>ciphers</w:t>
-      </w:r>
-      <w:proofErr w:type="spellEnd"/>
-      <w:r>
-        <w:rPr>
-          <w:rFonts w:ascii="Arial" w:hAnsi="Arial" w:cs="Arial"/>
-          <w:sz w:val="24"/>
-          <w:szCs w:val="24"/>
-        </w:rPr>
-        <w:t>) realizează criptarea prin procesarea individuală a biților sau octeților mesajului. În cazul cifrurilor de flux sincrone, un flux de biți pseudo</w:t>
-      </w:r>
-      <w:r>
-        <w:rPr>
-          <w:rFonts w:ascii="Arial" w:hAnsi="Arial" w:cs="Arial"/>
-          <w:sz w:val="24"/>
-          <w:szCs w:val="24"/>
-        </w:rPr>
-        <w:t>-</w:t>
-      </w:r>
-      <w:r>
-        <w:rPr>
-          <w:rFonts w:ascii="Arial" w:hAnsi="Arial" w:cs="Arial"/>
-          <w:sz w:val="24"/>
-          <w:szCs w:val="24"/>
-        </w:rPr>
-        <w:t>aleatori</w:t>
-      </w:r>
-      <w:r>
-        <w:rPr>
-          <w:rFonts w:ascii="Arial" w:hAnsi="Arial" w:cs="Arial"/>
-          <w:sz w:val="24"/>
-          <w:szCs w:val="24"/>
-        </w:rPr>
-        <w:t>u</w:t>
-      </w:r>
-      <w:r>
-        <w:rPr>
-          <w:rFonts w:ascii="Arial" w:hAnsi="Arial" w:cs="Arial"/>
-          <w:sz w:val="24"/>
-          <w:szCs w:val="24"/>
-        </w:rPr>
-        <w:t xml:space="preserve"> este generat pe baza cheii criptografice și este combinat cu biții textului în clar prin intermediul operației </w:t>
-      </w:r>
-      <w:r>
-        <w:rPr>
-          <w:rFonts w:ascii="Arial" w:hAnsi="Arial" w:cs="Arial"/>
-          <w:i/>
-          <w:iCs/>
-          <w:sz w:val="24"/>
-          <w:szCs w:val="24"/>
-        </w:rPr>
-        <w:t>sau exclusiv</w:t>
-      </w:r>
-      <w:r>
-        <w:rPr>
-          <w:rFonts w:ascii="Arial" w:hAnsi="Arial" w:cs="Arial"/>
-          <w:sz w:val="24"/>
-          <w:szCs w:val="24"/>
-        </w:rPr>
-        <w:t xml:space="preserve"> (</w:t>
-      </w:r>
-      <w:r>
-        <w:rPr>
-          <w:rFonts w:ascii="Arial" w:hAnsi="Arial" w:cs="Arial"/>
-          <w:i/>
-          <w:iCs/>
-          <w:sz w:val="24"/>
-          <w:szCs w:val="24"/>
-        </w:rPr>
-        <w:t>XOR</w:t>
-      </w:r>
-      <w:r>
-        <w:rPr>
-          <w:rFonts w:ascii="Arial" w:hAnsi="Arial" w:cs="Arial"/>
-          <w:sz w:val="24"/>
-          <w:szCs w:val="24"/>
-        </w:rPr>
-        <w:t xml:space="preserve">). În schimb, cifrurile de flux asincrone utilizează, pe lângă cheia inițială, și biți proveniți din </w:t>
-      </w:r>
-      <w:proofErr w:type="spellStart"/>
-      <w:r>
-        <w:rPr>
-          <w:rFonts w:ascii="Arial" w:hAnsi="Arial" w:cs="Arial"/>
-          <w:sz w:val="24"/>
-          <w:szCs w:val="24"/>
-        </w:rPr>
-        <w:t>criptotextul</w:t>
-      </w:r>
-      <w:proofErr w:type="spellEnd"/>
-      <w:r>
-        <w:rPr>
-          <w:rFonts w:ascii="Arial" w:hAnsi="Arial" w:cs="Arial"/>
-          <w:sz w:val="24"/>
-          <w:szCs w:val="24"/>
-        </w:rPr>
-        <w:t xml:space="preserve"> generat anterior pentru determinarea fluxului de cheie. Majoritatea cifrurilor de flux utilizate în practică adoptă o arhitectură sincronă.</w:t>
-      </w:r>
-    </w:p>
-    <w:p>
-      <w:pPr>
-        <w:ind w:firstLine="720"/>
-        <w:jc w:val="both"/>
-        <w:rPr>
-          <w:rFonts w:ascii="Arial" w:hAnsi="Arial" w:cs="Arial"/>
-          <w:sz w:val="24"/>
-          <w:szCs w:val="24"/>
-        </w:rPr>
-      </w:pPr>
-      <w:r>
-        <w:rPr>
-          <w:rFonts w:ascii="Arial" w:hAnsi="Arial" w:cs="Arial"/>
-          <w:sz w:val="24"/>
-          <w:szCs w:val="24"/>
-        </w:rPr>
-        <w:t xml:space="preserve">Structura fundamentală a unui cifru </w:t>
-      </w:r>
-      <w:proofErr w:type="spellStart"/>
-      <w:r>
-        <w:rPr>
-          <w:rFonts w:ascii="Arial" w:hAnsi="Arial" w:cs="Arial"/>
-          <w:sz w:val="24"/>
-          <w:szCs w:val="24"/>
-        </w:rPr>
-        <w:t>stream</w:t>
-      </w:r>
-      <w:proofErr w:type="spellEnd"/>
-      <w:r>
-        <w:rPr>
-          <w:rFonts w:ascii="Arial" w:hAnsi="Arial" w:cs="Arial"/>
-          <w:sz w:val="24"/>
-          <w:szCs w:val="24"/>
-        </w:rPr>
-        <w:t xml:space="preserve"> este prezentată la nivelul figurii </w:t>
+        <w:t xml:space="preserve">Structura fundamentală a unui cifru stream este prezentată la nivelul figurii </w:t>
       </w:r>
       <w:r>
         <w:rPr>
@@ -12124,27 +11276,7 @@
           <w:sz w:val="20"/>
           <w:szCs w:val="20"/>
         </w:rPr>
-        <w:t xml:space="preserve"> Structura unui cifru de tip </w:t>
-      </w:r>
-      <w:proofErr w:type="spellStart"/>
-      <w:r>
-        <w:rPr>
-          <w:rFonts w:ascii="Arial" w:hAnsi="Arial" w:cs="Arial"/>
-          <w:color w:val="auto"/>
-          <w:sz w:val="20"/>
-          <w:szCs w:val="20"/>
-        </w:rPr>
-        <w:t>stream</w:t>
-      </w:r>
-      <w:proofErr w:type="spellEnd"/>
-      <w:r>
-        <w:rPr>
-          <w:rFonts w:ascii="Arial" w:hAnsi="Arial" w:cs="Arial"/>
-          <w:color w:val="auto"/>
-          <w:sz w:val="20"/>
-          <w:szCs w:val="20"/>
-        </w:rPr>
-        <w:t xml:space="preserve"> [10]</w:t>
+        <w:t xml:space="preserve"> Structura unui cifru de tip stream [10]</w:t>
       </w:r>
     </w:p>
     <w:p>
@@ -12237,51 +11369,15 @@
           <w:sz w:val="24"/>
           <w:szCs w:val="24"/>
         </w:rPr>
-        <w:t xml:space="preserve">Securitatea cifrurilor </w:t>
-      </w:r>
-      <w:proofErr w:type="spellStart"/>
-      <w:r>
-        <w:rPr>
-          <w:rFonts w:ascii="Arial" w:hAnsi="Arial" w:cs="Arial"/>
-          <w:sz w:val="24"/>
-          <w:szCs w:val="24"/>
-        </w:rPr>
-        <w:t>stream</w:t>
-      </w:r>
-      <w:proofErr w:type="spellEnd"/>
-      <w:r>
-        <w:rPr>
-          <w:rFonts w:ascii="Arial" w:hAnsi="Arial" w:cs="Arial"/>
-          <w:sz w:val="24"/>
-          <w:szCs w:val="24"/>
-        </w:rPr>
-        <w:t xml:space="preserve"> este, în mod particular, dependentă de modul în care cheia de flux este generată [7].</w:t>
-      </w:r>
-      <w:r>
-        <w:rPr>
-          <w:rFonts w:ascii="Arial" w:hAnsi="Arial" w:cs="Arial"/>
-          <w:sz w:val="24"/>
-          <w:szCs w:val="24"/>
-        </w:rPr>
-        <w:t xml:space="preserve"> Mai mul decât atât, majoritatea resurselor computaționale ale unui cifru </w:t>
-      </w:r>
-      <w:proofErr w:type="spellStart"/>
-      <w:r>
-        <w:rPr>
-          <w:rFonts w:ascii="Arial" w:hAnsi="Arial" w:cs="Arial"/>
-          <w:sz w:val="24"/>
-          <w:szCs w:val="24"/>
-        </w:rPr>
-        <w:t>stream</w:t>
-      </w:r>
-      <w:proofErr w:type="spellEnd"/>
-      <w:r>
-        <w:rPr>
-          <w:rFonts w:ascii="Arial" w:hAnsi="Arial" w:cs="Arial"/>
-          <w:sz w:val="24"/>
-          <w:szCs w:val="24"/>
-        </w:rPr>
-        <w:t xml:space="preserve"> sunt alocate blocului de generare a cheii de flux. Scopul acestui bloc este de a genera biții care vor fi utilizați în procesul de criptare astfel încât aceștia să aibă aspectul unui flux de numere aleatoriu.</w:t>
+        <w:t>Securitatea cifrurilor stream este, în mod particular, dependentă de modul în care cheia de flux este generată [7].</w:t>
+      </w:r>
+      <w:r>
+        <w:rPr>
+          <w:rFonts w:ascii="Arial" w:hAnsi="Arial" w:cs="Arial"/>
+          <w:sz w:val="24"/>
+          <w:szCs w:val="24"/>
+        </w:rPr>
+        <w:t xml:space="preserve"> Mai mul decât atât, majoritatea resurselor computaționale ale unui cifru stream sunt alocate blocului de generare a cheii de flux. Scopul acestui bloc este de a genera biții care vor fi utilizați în procesul de criptare astfel încât aceștia să aibă aspectul unui flux de numere aleatoriu.</w:t>
       </w:r>
       <w:r>
         <w:rPr>
@@ -12612,25 +11708,7 @@
           <w:sz w:val="24"/>
           <w:szCs w:val="24"/>
         </w:rPr>
-        <w:t xml:space="preserve">Electronic </w:t>
-      </w:r>
-      <w:proofErr w:type="spellStart"/>
-      <w:r>
-        <w:rPr>
-          <w:rFonts w:ascii="Arial" w:hAnsi="Arial" w:cs="Arial"/>
-          <w:sz w:val="24"/>
-          <w:szCs w:val="24"/>
-        </w:rPr>
-        <w:t>Codebook</w:t>
-      </w:r>
-      <w:proofErr w:type="spellEnd"/>
-      <w:r>
-        <w:rPr>
-          <w:rFonts w:ascii="Arial" w:hAnsi="Arial" w:cs="Arial"/>
-          <w:sz w:val="24"/>
-          <w:szCs w:val="24"/>
-        </w:rPr>
-        <w:t xml:space="preserve"> (ECB)</w:t>
+        <w:t>Electronic Codebook (ECB)</w:t>
       </w:r>
     </w:p>
     <w:p>
@@ -12647,41 +11725,13 @@
           <w:szCs w:val="24"/>
         </w:rPr>
       </w:pPr>
-      <w:proofErr w:type="spellStart"/>
-      <w:r>
-        <w:rPr>
-          <w:rFonts w:ascii="Arial" w:hAnsi="Arial" w:cs="Arial"/>
-          <w:sz w:val="24"/>
-          <w:szCs w:val="24"/>
-        </w:rPr>
-        <w:t>Cipher</w:t>
-      </w:r>
-      <w:proofErr w:type="spellEnd"/>
-      <w:r>
-        <w:rPr>
-          <w:rFonts w:ascii="Arial" w:hAnsi="Arial" w:cs="Arial"/>
-          <w:sz w:val="24"/>
-          <w:szCs w:val="24"/>
-        </w:rPr>
-        <w:t xml:space="preserve"> Block </w:t>
-      </w:r>
-      <w:proofErr w:type="spellStart"/>
-      <w:r>
-        <w:rPr>
-          <w:rFonts w:ascii="Arial" w:hAnsi="Arial" w:cs="Arial"/>
-          <w:sz w:val="24"/>
-          <w:szCs w:val="24"/>
-        </w:rPr>
-        <w:t>Chaining</w:t>
-      </w:r>
-      <w:proofErr w:type="spellEnd"/>
-      <w:r>
-        <w:rPr>
-          <w:rFonts w:ascii="Arial" w:hAnsi="Arial" w:cs="Arial"/>
-          <w:sz w:val="24"/>
-          <w:szCs w:val="24"/>
-        </w:rPr>
-        <w:t xml:space="preserve"> (CBC)</w:t>
+      <w:r>
+        <w:rPr>
+          <w:rFonts w:ascii="Arial" w:hAnsi="Arial" w:cs="Arial"/>
+          <w:sz w:val="24"/>
+          <w:szCs w:val="24"/>
+        </w:rPr>
+        <w:t>Cipher Block Chaining (CBC)</w:t>
       </w:r>
     </w:p>
     <w:p>
@@ -12698,23 +11748,13 @@
           <w:szCs w:val="24"/>
         </w:rPr>
       </w:pPr>
-      <w:proofErr w:type="spellStart"/>
-      <w:r>
-        <w:rPr>
-          <w:rFonts w:ascii="Arial" w:hAnsi="Arial" w:cs="Arial"/>
-          <w:sz w:val="24"/>
-          <w:szCs w:val="24"/>
-        </w:rPr>
-        <w:t>Cipher</w:t>
-      </w:r>
-      <w:proofErr w:type="spellEnd"/>
-      <w:r>
-        <w:rPr>
-          <w:rFonts w:ascii="Arial" w:hAnsi="Arial" w:cs="Arial"/>
-          <w:sz w:val="24"/>
-          <w:szCs w:val="24"/>
-        </w:rPr>
-        <w:t xml:space="preserve"> Feedback (CFB)</w:t>
+      <w:r>
+        <w:rPr>
+          <w:rFonts w:ascii="Arial" w:hAnsi="Arial" w:cs="Arial"/>
+          <w:sz w:val="24"/>
+          <w:szCs w:val="24"/>
+        </w:rPr>
+        <w:t>Cipher Feedback (CFB)</w:t>
       </w:r>
     </w:p>
     <w:p>
@@ -12731,23 +11771,13 @@
           <w:szCs w:val="24"/>
         </w:rPr>
       </w:pPr>
-      <w:proofErr w:type="spellStart"/>
-      <w:r>
-        <w:rPr>
-          <w:rFonts w:ascii="Arial" w:hAnsi="Arial" w:cs="Arial"/>
-          <w:sz w:val="24"/>
-          <w:szCs w:val="24"/>
-        </w:rPr>
-        <w:t>Counter</w:t>
-      </w:r>
-      <w:proofErr w:type="spellEnd"/>
-      <w:r>
-        <w:rPr>
-          <w:rFonts w:ascii="Arial" w:hAnsi="Arial" w:cs="Arial"/>
-          <w:sz w:val="24"/>
-          <w:szCs w:val="24"/>
-        </w:rPr>
-        <w:t xml:space="preserve"> (CTR)</w:t>
+      <w:r>
+        <w:rPr>
+          <w:rFonts w:ascii="Arial" w:hAnsi="Arial" w:cs="Arial"/>
+          <w:sz w:val="24"/>
+          <w:szCs w:val="24"/>
+        </w:rPr>
+        <w:t>Counter (CTR)</w:t>
       </w:r>
     </w:p>
     <w:p>
@@ -12766,25 +11796,7 @@
           <w:sz w:val="24"/>
           <w:szCs w:val="24"/>
         </w:rPr>
-        <w:t xml:space="preserve">În lipsa utilizării unui mod adecvat de operare, anumite tipare prezente în datele inițiale pot persista în structura </w:t>
-      </w:r>
-      <w:proofErr w:type="spellStart"/>
-      <w:r>
-        <w:rPr>
-          <w:rFonts w:ascii="Arial" w:hAnsi="Arial" w:cs="Arial"/>
-          <w:sz w:val="24"/>
-          <w:szCs w:val="24"/>
-        </w:rPr>
-        <w:t>criptotextului</w:t>
-      </w:r>
-      <w:proofErr w:type="spellEnd"/>
-      <w:r>
-        <w:rPr>
-          <w:rFonts w:ascii="Arial" w:hAnsi="Arial" w:cs="Arial"/>
-          <w:sz w:val="24"/>
-          <w:szCs w:val="24"/>
-        </w:rPr>
-        <w:t>. Acest aspect este evident în cazul modului ECB (</w:t>
+        <w:t>În lipsa utilizării unui mod adecvat de operare, anumite tipare prezente în datele inițiale pot persista în structura criptotextului. Acest aspect este evident în cazul modului ECB (</w:t>
       </w:r>
       <w:r>
         <w:rPr>
@@ -12794,20 +11806,8 @@
           <w:sz w:val="24"/>
           <w:szCs w:val="24"/>
         </w:rPr>
-        <w:t xml:space="preserve">Electronic </w:t>
-      </w:r>
-      <w:proofErr w:type="spellStart"/>
-      <w:r>
-        <w:rPr>
-          <w:rFonts w:ascii="Arial" w:hAnsi="Arial" w:cs="Arial"/>
-          <w:i/>
-          <w:iCs/>
-          <w:sz w:val="24"/>
-          <w:szCs w:val="24"/>
-        </w:rPr>
-        <w:t>Codebook</w:t>
-      </w:r>
-      <w:proofErr w:type="spellEnd"/>
+        <w:t>Electronic Codebook</w:t>
+      </w:r>
       <w:r>
         <w:rPr>
           <w:rFonts w:ascii="Arial" w:hAnsi="Arial" w:cs="Arial"/>
@@ -14376,43 +13376,7 @@
           <w:sz w:val="24"/>
           <w:szCs w:val="24"/>
         </w:rPr>
-        <w:t xml:space="preserve">Majoritatea cifrurilor bloc moderne utilizează principiile de difuzie și confuzie prin intermediul unor structuri interne compuse din transformări de substituție, permutare și amestecare a datelor. Printre algoritmii reprezentativi din această categorie se numără DES, 3DES, AES, </w:t>
-      </w:r>
-      <w:proofErr w:type="spellStart"/>
-      <w:r>
-        <w:rPr>
-          <w:rFonts w:ascii="Arial" w:hAnsi="Arial" w:cs="Arial"/>
-          <w:sz w:val="24"/>
-          <w:szCs w:val="24"/>
-        </w:rPr>
-        <w:t>Blowfish</w:t>
-      </w:r>
-      <w:proofErr w:type="spellEnd"/>
-      <w:r>
-        <w:rPr>
-          <w:rFonts w:ascii="Arial" w:hAnsi="Arial" w:cs="Arial"/>
-          <w:sz w:val="24"/>
-          <w:szCs w:val="24"/>
-        </w:rPr>
-        <w:t xml:space="preserve"> și </w:t>
-      </w:r>
-      <w:proofErr w:type="spellStart"/>
-      <w:r>
-        <w:rPr>
-          <w:rFonts w:ascii="Arial" w:hAnsi="Arial" w:cs="Arial"/>
-          <w:sz w:val="24"/>
-          <w:szCs w:val="24"/>
-        </w:rPr>
-        <w:t>Twofish</w:t>
-      </w:r>
-      <w:proofErr w:type="spellEnd"/>
-      <w:r>
-        <w:rPr>
-          <w:rFonts w:ascii="Arial" w:hAnsi="Arial" w:cs="Arial"/>
-          <w:sz w:val="24"/>
-          <w:szCs w:val="24"/>
-        </w:rPr>
-        <w:t>.</w:t>
+        <w:t>Majoritatea cifrurilor bloc moderne utilizează principiile de difuzie și confuzie prin intermediul unor structuri interne compuse din transformări de substituție, permutare și amestecare a datelor. Printre algoritmii reprezentativi din această categorie se numără DES, 3DES, AES, Blowfish și Twofish.</w:t>
       </w:r>
     </w:p>
     <w:p>
@@ -14490,7 +13454,6 @@
         </w:rPr>
         <w:t xml:space="preserve">Institutul Național al standardelor din Statele Unite (NIST) a anunțat la începutul anului 1997 că urmează să organizeze o competiție pentru selectarea unui nou cifru bloc, numit </w:t>
       </w:r>
-      <w:proofErr w:type="spellStart"/>
       <w:r>
         <w:rPr>
           <w:rFonts w:ascii="Arial" w:hAnsi="Arial" w:cs="Arial"/>
@@ -14499,9 +13462,32 @@
           <w:sz w:val="24"/>
           <w:szCs w:val="24"/>
         </w:rPr>
-        <w:t>Advanced</w:t>
-      </w:r>
-      <w:proofErr w:type="spellEnd"/>
+        <w:t>Advanced Encryption Standard</w:t>
+      </w:r>
+      <w:r>
+        <w:rPr>
+          <w:rFonts w:ascii="Arial" w:hAnsi="Arial" w:cs="Arial"/>
+          <w:sz w:val="24"/>
+          <w:szCs w:val="24"/>
+        </w:rPr>
+        <w:t xml:space="preserve">. Scopul acestui nou cifru era înlocuirea standardului </w:t>
+      </w:r>
+      <w:r>
+        <w:rPr>
+          <w:rFonts w:ascii="Arial" w:hAnsi="Arial" w:cs="Arial"/>
+          <w:sz w:val="24"/>
+          <w:szCs w:val="24"/>
+        </w:rPr>
+        <w:t>învechit</w:t>
+      </w:r>
+      <w:r>
+        <w:rPr>
+          <w:rFonts w:ascii="Arial" w:hAnsi="Arial" w:cs="Arial"/>
+          <w:sz w:val="24"/>
+          <w:szCs w:val="24"/>
+        </w:rPr>
+        <w:t xml:space="preserve"> </w:t>
+      </w:r>
       <w:r>
         <w:rPr>
           <w:rFonts w:ascii="Arial" w:hAnsi="Arial" w:cs="Arial"/>
@@ -14510,98 +13496,8 @@
           <w:sz w:val="24"/>
           <w:szCs w:val="24"/>
         </w:rPr>
-        <w:t xml:space="preserve"> </w:t>
-      </w:r>
-      <w:proofErr w:type="spellStart"/>
-      <w:r>
-        <w:rPr>
-          <w:rFonts w:ascii="Arial" w:hAnsi="Arial" w:cs="Arial"/>
-          <w:i/>
-          <w:iCs/>
-          <w:sz w:val="24"/>
-          <w:szCs w:val="24"/>
-        </w:rPr>
-        <w:t>Encryption</w:t>
-      </w:r>
-      <w:proofErr w:type="spellEnd"/>
-      <w:r>
-        <w:rPr>
-          <w:rFonts w:ascii="Arial" w:hAnsi="Arial" w:cs="Arial"/>
-          <w:i/>
-          <w:iCs/>
-          <w:sz w:val="24"/>
-          <w:szCs w:val="24"/>
-        </w:rPr>
-        <w:t xml:space="preserve"> Standard</w:t>
-      </w:r>
-      <w:r>
-        <w:rPr>
-          <w:rFonts w:ascii="Arial" w:hAnsi="Arial" w:cs="Arial"/>
-          <w:sz w:val="24"/>
-          <w:szCs w:val="24"/>
-        </w:rPr>
-        <w:t xml:space="preserve">. Scopul acestui nou cifru era înlocuirea standardului </w:t>
-      </w:r>
-      <w:r>
-        <w:rPr>
-          <w:rFonts w:ascii="Arial" w:hAnsi="Arial" w:cs="Arial"/>
-          <w:sz w:val="24"/>
-          <w:szCs w:val="24"/>
-        </w:rPr>
-        <w:t>învechit</w:t>
-      </w:r>
-      <w:r>
-        <w:rPr>
-          <w:rFonts w:ascii="Arial" w:hAnsi="Arial" w:cs="Arial"/>
-          <w:sz w:val="24"/>
-          <w:szCs w:val="24"/>
-        </w:rPr>
-        <w:t xml:space="preserve"> </w:t>
-      </w:r>
-      <w:r>
-        <w:rPr>
-          <w:rFonts w:ascii="Arial" w:hAnsi="Arial" w:cs="Arial"/>
-          <w:i/>
-          <w:iCs/>
-          <w:sz w:val="24"/>
-          <w:szCs w:val="24"/>
-        </w:rPr>
-        <w:t xml:space="preserve">Data </w:t>
-      </w:r>
-      <w:proofErr w:type="spellStart"/>
-      <w:r>
-        <w:rPr>
-          <w:rFonts w:ascii="Arial" w:hAnsi="Arial" w:cs="Arial"/>
-          <w:i/>
-          <w:iCs/>
-          <w:sz w:val="24"/>
-          <w:szCs w:val="24"/>
-        </w:rPr>
-        <w:t>Encryption</w:t>
-      </w:r>
-      <w:proofErr w:type="spellEnd"/>
-      <w:r>
-        <w:rPr>
-          <w:rFonts w:ascii="Arial" w:hAnsi="Arial" w:cs="Arial"/>
-          <w:i/>
-          <w:iCs/>
-          <w:sz w:val="24"/>
-          <w:szCs w:val="24"/>
-        </w:rPr>
-        <w:t xml:space="preserve"> </w:t>
-      </w:r>
-      <w:proofErr w:type="spellStart"/>
-      <w:r>
-        <w:rPr>
-          <w:rFonts w:ascii="Arial" w:hAnsi="Arial" w:cs="Arial"/>
-          <w:i/>
-          <w:iCs/>
-          <w:sz w:val="24"/>
-          <w:szCs w:val="24"/>
-        </w:rPr>
-        <w:t>Stanadard</w:t>
-      </w:r>
-      <w:proofErr w:type="spellEnd"/>
+        <w:t>Data Encryption Stanadard</w:t>
+      </w:r>
       <w:r>
         <w:rPr>
           <w:rFonts w:ascii="Arial" w:hAnsi="Arial" w:cs="Arial"/>
@@ -14633,7 +13529,6 @@
           <w:szCs w:val="24"/>
         </w:rPr>
       </w:pPr>
-      <w:proofErr w:type="spellStart"/>
       <w:r>
         <w:rPr>
           <w:rFonts w:ascii="Arial" w:hAnsi="Arial" w:cs="Arial"/>
@@ -14642,7 +13537,6 @@
         </w:rPr>
         <w:t>Rijndael</w:t>
       </w:r>
-      <w:proofErr w:type="spellEnd"/>
     </w:p>
     <w:p>
       <w:pPr>
@@ -14681,7 +13575,6 @@
           <w:szCs w:val="24"/>
         </w:rPr>
       </w:pPr>
-      <w:proofErr w:type="spellStart"/>
       <w:r>
         <w:rPr>
           <w:rFonts w:ascii="Arial" w:hAnsi="Arial" w:cs="Arial"/>
@@ -14690,7 +13583,6 @@
         </w:rPr>
         <w:t>Twofish</w:t>
       </w:r>
-      <w:proofErr w:type="spellEnd"/>
     </w:p>
     <w:p>
       <w:pPr>
@@ -14754,25 +13646,7 @@
           <w:sz w:val="24"/>
           <w:szCs w:val="24"/>
         </w:rPr>
-        <w:t xml:space="preserve">Algoritmul </w:t>
-      </w:r>
-      <w:proofErr w:type="spellStart"/>
-      <w:r>
-        <w:rPr>
-          <w:rFonts w:ascii="Arial" w:hAnsi="Arial" w:cs="Arial"/>
-          <w:sz w:val="24"/>
-          <w:szCs w:val="24"/>
-        </w:rPr>
-        <w:t>Rijndael</w:t>
-      </w:r>
-      <w:proofErr w:type="spellEnd"/>
-      <w:r>
-        <w:rPr>
-          <w:rFonts w:ascii="Arial" w:hAnsi="Arial" w:cs="Arial"/>
-          <w:sz w:val="24"/>
-          <w:szCs w:val="24"/>
-        </w:rPr>
-        <w:t xml:space="preserve"> a fost desemnat câștigător al competiției. Deși niciuna dintre opțiunile anterior menționate nu prezenta vulnerabilități semnificative de securitate, </w:t>
+        <w:t xml:space="preserve">Algoritmul Rijndael a fost desemnat câștigător al competiției. Deși niciuna dintre opțiunile anterior menționate nu prezenta vulnerabilități semnificative de securitate, </w:t>
       </w:r>
     </w:p>
     <w:p>
@@ -14800,25 +13674,7 @@
           <w:sz w:val="24"/>
           <w:szCs w:val="24"/>
         </w:rPr>
-        <w:t xml:space="preserve">particularitățile de implementare ale cifrului </w:t>
-      </w:r>
-      <w:proofErr w:type="spellStart"/>
-      <w:r>
-        <w:rPr>
-          <w:rFonts w:ascii="Arial" w:hAnsi="Arial" w:cs="Arial"/>
-          <w:sz w:val="24"/>
-          <w:szCs w:val="24"/>
-        </w:rPr>
-        <w:t>Rijndael</w:t>
-      </w:r>
-      <w:proofErr w:type="spellEnd"/>
-      <w:r>
-        <w:rPr>
-          <w:rFonts w:ascii="Arial" w:hAnsi="Arial" w:cs="Arial"/>
-          <w:sz w:val="24"/>
-          <w:szCs w:val="24"/>
-        </w:rPr>
-        <w:t>, printre care se remarcau performanța în implementările hardware, eficiența și flexibilitatea arhitecturală, au favorizat selectarea acestuia.</w:t>
+        <w:t>particularitățile de implementare ale cifrului Rijndael, printre care se remarcau performanța în implementările hardware, eficiența și flexibilitatea arhitecturală, au favorizat selectarea acestuia.</w:t>
       </w:r>
     </w:p>
     <w:p>
@@ -14858,7 +13714,6 @@
         </w:rPr>
         <w:t xml:space="preserve">Spre deosebire de algoritmul pe care l-a înlocuit, și anume DES, arhitectura cifrului AES nu este bazată pe o rețea de tip </w:t>
       </w:r>
-      <w:proofErr w:type="spellStart"/>
       <w:r>
         <w:rPr>
           <w:rFonts w:ascii="Arial" w:hAnsi="Arial" w:cs="Arial"/>
@@ -14869,7 +13724,6 @@
         </w:rPr>
         <w:t>Feistel</w:t>
       </w:r>
-      <w:proofErr w:type="spellEnd"/>
       <w:r>
         <w:rPr>
           <w:rFonts w:ascii="Arial" w:hAnsi="Arial" w:cs="Arial"/>
@@ -14878,7 +13732,6 @@
         </w:rPr>
         <w:t xml:space="preserve">, ci pe o structură de tip </w:t>
       </w:r>
-      <w:proofErr w:type="spellStart"/>
       <w:r>
         <w:rPr>
           <w:rFonts w:ascii="Arial" w:hAnsi="Arial" w:cs="Arial"/>
@@ -14887,40 +13740,7 @@
           <w:sz w:val="24"/>
           <w:szCs w:val="24"/>
         </w:rPr>
-        <w:t>Substitution-Permutation</w:t>
-      </w:r>
-      <w:proofErr w:type="spellEnd"/>
-      <w:r>
-        <w:rPr>
-          <w:rFonts w:ascii="Arial" w:hAnsi="Arial" w:cs="Arial"/>
-          <w:i/>
-          <w:iCs/>
-          <w:sz w:val="24"/>
-          <w:szCs w:val="24"/>
-        </w:rPr>
-        <w:t xml:space="preserve"> </w:t>
-      </w:r>
-      <w:proofErr w:type="spellStart"/>
-      <w:r>
-        <w:rPr>
-          <w:rFonts w:ascii="Arial" w:hAnsi="Arial" w:cs="Arial"/>
-          <w:i/>
-          <w:iCs/>
-          <w:sz w:val="24"/>
-          <w:szCs w:val="24"/>
-        </w:rPr>
-        <w:t>Network</w:t>
-      </w:r>
-      <w:proofErr w:type="spellEnd"/>
-      <w:r>
-        <w:rPr>
-          <w:rFonts w:ascii="Arial" w:hAnsi="Arial" w:cs="Arial"/>
-          <w:i/>
-          <w:iCs/>
-          <w:sz w:val="24"/>
-          <w:szCs w:val="24"/>
-        </w:rPr>
-        <w:t xml:space="preserve"> </w:t>
+        <w:t xml:space="preserve">Substitution-Permutation Network </w:t>
       </w:r>
       <w:r>
         <w:rPr>
@@ -14979,25 +13799,7 @@
           <w:sz w:val="24"/>
           <w:szCs w:val="24"/>
         </w:rPr>
-        <w:t xml:space="preserve">Blocul de date de 128 de biți este reprezentat sub forma unei </w:t>
-      </w:r>
-      <w:proofErr w:type="spellStart"/>
-      <w:r>
-        <w:rPr>
-          <w:rFonts w:ascii="Arial" w:hAnsi="Arial" w:cs="Arial"/>
-          <w:sz w:val="24"/>
-          <w:szCs w:val="24"/>
-        </w:rPr>
-        <w:t>matrici</w:t>
-      </w:r>
-      <w:proofErr w:type="spellEnd"/>
-      <w:r>
-        <w:rPr>
-          <w:rFonts w:ascii="Arial" w:hAnsi="Arial" w:cs="Arial"/>
-          <w:sz w:val="24"/>
-          <w:szCs w:val="24"/>
-        </w:rPr>
-        <w:t xml:space="preserve"> de </w:t>
+        <w:t xml:space="preserve">Blocul de date de 128 de biți este reprezentat sub forma unei matrici de </w:t>
       </w:r>
       <m:oMath>
         <m:r>
@@ -15059,7 +13861,6 @@
         </w:rPr>
         <w:t>coloană (</w:t>
       </w:r>
-      <w:proofErr w:type="spellStart"/>
       <w:r>
         <w:rPr>
           <w:rFonts w:ascii="Arial" w:hAnsi="Arial" w:cs="Arial"/>
@@ -15068,31 +13869,8 @@
           <w:sz w:val="24"/>
           <w:szCs w:val="24"/>
         </w:rPr>
-        <w:t>column</w:t>
-      </w:r>
-      <w:proofErr w:type="spellEnd"/>
-      <w:r>
-        <w:rPr>
-          <w:rFonts w:ascii="Arial" w:hAnsi="Arial" w:cs="Arial"/>
-          <w:i/>
-          <w:iCs/>
-          <w:sz w:val="24"/>
-          <w:szCs w:val="24"/>
-        </w:rPr>
-        <w:t xml:space="preserve">-major </w:t>
-      </w:r>
-      <w:proofErr w:type="spellStart"/>
-      <w:r>
-        <w:rPr>
-          <w:rFonts w:ascii="Arial" w:hAnsi="Arial" w:cs="Arial"/>
-          <w:i/>
-          <w:iCs/>
-          <w:sz w:val="24"/>
-          <w:szCs w:val="24"/>
-        </w:rPr>
-        <w:t>order</w:t>
-      </w:r>
-      <w:proofErr w:type="spellEnd"/>
+        <w:t>column-major order</w:t>
+      </w:r>
       <w:r>
         <w:rPr>
           <w:rFonts w:ascii="Arial" w:hAnsi="Arial" w:cs="Arial"/>
@@ -15162,27 +13940,7 @@
           <w:sz w:val="24"/>
           <w:szCs w:val="24"/>
         </w:rPr>
-        <w:t xml:space="preserve">asupra </w:t>
-      </w:r>
-      <w:proofErr w:type="spellStart"/>
-      <w:r>
-        <w:rPr>
-          <w:rFonts w:ascii="Arial" w:hAnsi="Arial" w:cs="Arial"/>
-          <w:iCs/>
-          <w:sz w:val="24"/>
-          <w:szCs w:val="24"/>
-        </w:rPr>
-        <w:t>matricii</w:t>
-      </w:r>
-      <w:proofErr w:type="spellEnd"/>
-      <w:r>
-        <w:rPr>
-          <w:rFonts w:ascii="Arial" w:hAnsi="Arial" w:cs="Arial"/>
-          <w:iCs/>
-          <w:sz w:val="24"/>
-          <w:szCs w:val="24"/>
-        </w:rPr>
-        <w:t xml:space="preserve"> de stare, </w:t>
+        <w:t xml:space="preserve">asupra matricii de stare, </w:t>
       </w:r>
       <w:r>
         <w:rPr>
@@ -15425,25 +14183,7 @@
           <w:sz w:val="24"/>
           <w:szCs w:val="24"/>
         </w:rPr>
-        <w:t xml:space="preserve"> fiecare dintre cei 16 octeți ai </w:t>
-      </w:r>
-      <w:proofErr w:type="spellStart"/>
-      <w:r>
-        <w:rPr>
-          <w:rFonts w:ascii="Arial" w:hAnsi="Arial" w:cs="Arial"/>
-          <w:sz w:val="24"/>
-          <w:szCs w:val="24"/>
-        </w:rPr>
-        <w:t>matricii</w:t>
-      </w:r>
-      <w:proofErr w:type="spellEnd"/>
-      <w:r>
-        <w:rPr>
-          <w:rFonts w:ascii="Arial" w:hAnsi="Arial" w:cs="Arial"/>
-          <w:sz w:val="24"/>
-          <w:szCs w:val="24"/>
-        </w:rPr>
-        <w:t xml:space="preserve"> de stare</w:t>
+        <w:t xml:space="preserve"> fiecare dintre cei 16 octeți ai matricii de stare</w:t>
       </w:r>
       <w:r>
         <w:rPr>
@@ -15802,27 +14542,7 @@
           <w:sz w:val="24"/>
           <w:szCs w:val="24"/>
         </w:rPr>
-        <w:t>Indiferent de dimensiunea cheii utilizate, ultima rundă AES nu include operația de amestecare a coloanelor (</w:t>
-      </w:r>
-      <w:proofErr w:type="spellStart"/>
-      <w:r>
-        <w:rPr>
-          <w:rFonts w:ascii="Arial" w:hAnsi="Arial" w:cs="Arial"/>
-          <w:iCs/>
-          <w:sz w:val="24"/>
-          <w:szCs w:val="24"/>
-        </w:rPr>
-        <w:t>MixColumns</w:t>
-      </w:r>
-      <w:proofErr w:type="spellEnd"/>
-      <w:r>
-        <w:rPr>
-          <w:rFonts w:ascii="Arial" w:hAnsi="Arial" w:cs="Arial"/>
-          <w:iCs/>
-          <w:sz w:val="24"/>
-          <w:szCs w:val="24"/>
-        </w:rPr>
-        <w:t xml:space="preserve">). Această particularitate permite menținerea unei </w:t>
+        <w:t xml:space="preserve">Indiferent de dimensiunea cheii utilizate, ultima rundă AES nu include operația de amestecare a coloanelor (MixColumns). Această particularitate permite menținerea unei </w:t>
       </w:r>
       <w:r>
         <w:rPr>
@@ -16116,43 +14836,7 @@
           <w:sz w:val="24"/>
           <w:szCs w:val="24"/>
         </w:rPr>
-        <w:t xml:space="preserve">Varianta AES-128 a algoritmului </w:t>
-      </w:r>
-      <w:proofErr w:type="spellStart"/>
-      <w:r>
-        <w:rPr>
-          <w:rFonts w:ascii="Arial" w:hAnsi="Arial" w:cs="Arial"/>
-          <w:sz w:val="24"/>
-          <w:szCs w:val="24"/>
-        </w:rPr>
-        <w:t>Advanced</w:t>
-      </w:r>
-      <w:proofErr w:type="spellEnd"/>
-      <w:r>
-        <w:rPr>
-          <w:rFonts w:ascii="Arial" w:hAnsi="Arial" w:cs="Arial"/>
-          <w:sz w:val="24"/>
-          <w:szCs w:val="24"/>
-        </w:rPr>
-        <w:t xml:space="preserve"> </w:t>
-      </w:r>
-      <w:proofErr w:type="spellStart"/>
-      <w:r>
-        <w:rPr>
-          <w:rFonts w:ascii="Arial" w:hAnsi="Arial" w:cs="Arial"/>
-          <w:sz w:val="24"/>
-          <w:szCs w:val="24"/>
-        </w:rPr>
-        <w:t>Encryption</w:t>
-      </w:r>
-      <w:proofErr w:type="spellEnd"/>
-      <w:r>
-        <w:rPr>
-          <w:rFonts w:ascii="Arial" w:hAnsi="Arial" w:cs="Arial"/>
-          <w:sz w:val="24"/>
-          <w:szCs w:val="24"/>
-        </w:rPr>
-        <w:t xml:space="preserve"> Standard utilizează o cheie de criptare cu o lungime de 128 de biți și este compusă din 10 runde de transformări succesive. Procesul de criptare are la bază o structură de tip rețea de substituție și permutație, </w:t>
+        <w:t xml:space="preserve">Varianta AES-128 a algoritmului Advanced Encryption Standard utilizează o cheie de criptare cu o lungime de 128 de biți și este compusă din 10 runde de transformări succesive. Procesul de criptare are la bază o structură de tip rețea de substituție și permutație, </w:t>
       </w:r>
       <w:r>
         <w:rPr>
@@ -16179,108 +14863,8 @@
           <w:sz w:val="24"/>
           <w:szCs w:val="24"/>
         </w:rPr>
-        <w:t xml:space="preserve">Înaintea începerii rundelor propriu-zise este efectuată operația inițială </w:t>
-      </w:r>
-      <w:proofErr w:type="spellStart"/>
-      <w:r>
-        <w:rPr>
-          <w:rFonts w:ascii="Arial" w:hAnsi="Arial" w:cs="Arial"/>
-          <w:sz w:val="24"/>
-          <w:szCs w:val="24"/>
-        </w:rPr>
-        <w:t>AddRoundKey</w:t>
-      </w:r>
-      <w:proofErr w:type="spellEnd"/>
-      <w:r>
-        <w:rPr>
-          <w:rFonts w:ascii="Arial" w:hAnsi="Arial" w:cs="Arial"/>
-          <w:sz w:val="24"/>
-          <w:szCs w:val="24"/>
-        </w:rPr>
-        <w:t xml:space="preserve">, prin care blocul de intrare este combinat cu prima cheie de rundă. Ulterior, pentru primele nouă runde sunt aplicate succesiv transformările </w:t>
-      </w:r>
-      <w:proofErr w:type="spellStart"/>
-      <w:r>
-        <w:rPr>
-          <w:rFonts w:ascii="Arial" w:hAnsi="Arial" w:cs="Arial"/>
-          <w:sz w:val="24"/>
-          <w:szCs w:val="24"/>
-        </w:rPr>
-        <w:t>SubBytes</w:t>
-      </w:r>
-      <w:proofErr w:type="spellEnd"/>
-      <w:r>
-        <w:rPr>
-          <w:rFonts w:ascii="Arial" w:hAnsi="Arial" w:cs="Arial"/>
-          <w:sz w:val="24"/>
-          <w:szCs w:val="24"/>
-        </w:rPr>
-        <w:t xml:space="preserve">, </w:t>
-      </w:r>
-      <w:proofErr w:type="spellStart"/>
-      <w:r>
-        <w:rPr>
-          <w:rFonts w:ascii="Arial" w:hAnsi="Arial" w:cs="Arial"/>
-          <w:sz w:val="24"/>
-          <w:szCs w:val="24"/>
-        </w:rPr>
-        <w:t>ShiftRows</w:t>
-      </w:r>
-      <w:proofErr w:type="spellEnd"/>
-      <w:r>
-        <w:rPr>
-          <w:rFonts w:ascii="Arial" w:hAnsi="Arial" w:cs="Arial"/>
-          <w:sz w:val="24"/>
-          <w:szCs w:val="24"/>
-        </w:rPr>
-        <w:t xml:space="preserve">, </w:t>
-      </w:r>
-      <w:proofErr w:type="spellStart"/>
-      <w:r>
-        <w:rPr>
-          <w:rFonts w:ascii="Arial" w:hAnsi="Arial" w:cs="Arial"/>
-          <w:sz w:val="24"/>
-          <w:szCs w:val="24"/>
-        </w:rPr>
-        <w:t>MixColumns</w:t>
-      </w:r>
-      <w:proofErr w:type="spellEnd"/>
-      <w:r>
-        <w:rPr>
-          <w:rFonts w:ascii="Arial" w:hAnsi="Arial" w:cs="Arial"/>
-          <w:sz w:val="24"/>
-          <w:szCs w:val="24"/>
-        </w:rPr>
-        <w:t xml:space="preserve"> și </w:t>
-      </w:r>
-      <w:proofErr w:type="spellStart"/>
-      <w:r>
-        <w:rPr>
-          <w:rFonts w:ascii="Arial" w:hAnsi="Arial" w:cs="Arial"/>
-          <w:sz w:val="24"/>
-          <w:szCs w:val="24"/>
-        </w:rPr>
-        <w:t>AddRoundKey</w:t>
-      </w:r>
-      <w:proofErr w:type="spellEnd"/>
-      <w:r>
-        <w:rPr>
-          <w:rFonts w:ascii="Arial" w:hAnsi="Arial" w:cs="Arial"/>
-          <w:sz w:val="24"/>
-          <w:szCs w:val="24"/>
-        </w:rPr>
-        <w:t xml:space="preserve">. Ultima rundă diferă prin eliminarea operației </w:t>
-      </w:r>
-      <w:proofErr w:type="spellStart"/>
-      <w:r>
-        <w:rPr>
-          <w:rFonts w:ascii="Arial" w:hAnsi="Arial" w:cs="Arial"/>
-          <w:sz w:val="24"/>
-          <w:szCs w:val="24"/>
-        </w:rPr>
-        <w:t>MixColumns</w:t>
-      </w:r>
-      <w:proofErr w:type="spellEnd"/>
+        <w:t>Înaintea începerii rundelor propriu-zise este efectuată operația inițială AddRoundKey, prin care blocul de intrare este combinat cu prima cheie de rundă. Ulterior, pentru primele nouă runde sunt aplicate succesiv transformările SubBytes, ShiftRows, MixColumns și AddRoundKey. Ultima rundă diferă prin eliminarea operației MixColumns</w:t>
+      </w:r>
       <w:r>
         <w:rPr>
           <w:rFonts w:ascii="Arial" w:hAnsi="Arial" w:cs="Arial"/>
@@ -16826,43 +15410,7 @@
           <w:sz w:val="24"/>
           <w:szCs w:val="24"/>
         </w:rPr>
-        <w:t xml:space="preserve"> (</w:t>
-      </w:r>
-      <w:proofErr w:type="spellStart"/>
-      <w:r>
-        <w:rPr>
-          <w:rFonts w:ascii="Arial" w:hAnsi="Arial" w:cs="Arial"/>
-          <w:sz w:val="24"/>
-          <w:szCs w:val="24"/>
-        </w:rPr>
-        <w:t>Substitution</w:t>
-      </w:r>
-      <w:proofErr w:type="spellEnd"/>
-      <w:r>
-        <w:rPr>
-          <w:rFonts w:ascii="Arial" w:hAnsi="Arial" w:cs="Arial"/>
-          <w:sz w:val="24"/>
-          <w:szCs w:val="24"/>
-        </w:rPr>
-        <w:t xml:space="preserve"> Box). S-box-</w:t>
-      </w:r>
-      <w:proofErr w:type="spellStart"/>
-      <w:r>
-        <w:rPr>
-          <w:rFonts w:ascii="Arial" w:hAnsi="Arial" w:cs="Arial"/>
-          <w:sz w:val="24"/>
-          <w:szCs w:val="24"/>
-        </w:rPr>
-        <w:t>ul</w:t>
-      </w:r>
-      <w:proofErr w:type="spellEnd"/>
-      <w:r>
-        <w:rPr>
-          <w:rFonts w:ascii="Arial" w:hAnsi="Arial" w:cs="Arial"/>
-          <w:sz w:val="24"/>
-          <w:szCs w:val="24"/>
-        </w:rPr>
-        <w:t xml:space="preserve"> AES reprezintă o permutare bijectivă a tuturor valorilor posibile pe un octet, având dimensiunea </w:t>
+        <w:t xml:space="preserve"> (Substitution Box). S-box-ul AES reprezintă o permutare bijectivă a tuturor valorilor posibile pe un octet, având dimensiunea </w:t>
       </w:r>
       <w:r>
         <w:rPr>
@@ -17088,25 +15636,7 @@
           <w:sz w:val="24"/>
           <w:szCs w:val="24"/>
         </w:rPr>
-        <w:t>(</w:t>
-      </w:r>
-      <w:proofErr w:type="spellStart"/>
-      <w:r>
-        <w:rPr>
-          <w:rFonts w:ascii="Arial" w:hAnsi="Arial" w:cs="Arial"/>
-          <w:sz w:val="24"/>
-          <w:szCs w:val="24"/>
-        </w:rPr>
-        <w:t>Lookup</w:t>
-      </w:r>
-      <w:proofErr w:type="spellEnd"/>
-      <w:r>
-        <w:rPr>
-          <w:rFonts w:ascii="Arial" w:hAnsi="Arial" w:cs="Arial"/>
-          <w:sz w:val="24"/>
-          <w:szCs w:val="24"/>
-        </w:rPr>
-        <w:t xml:space="preserve"> table).</w:t>
+        <w:t>(Lookup table).</w:t>
       </w:r>
     </w:p>
     <w:p>
@@ -25591,9 +24121,8 @@
           <w:sz w:val="24"/>
           <w:szCs w:val="24"/>
         </w:rPr>
-        <w:t xml:space="preserve">sunt înmulțite </w:t>
-      </w:r>
-      <w:proofErr w:type="spellStart"/>
+        <w:t>sunt înmulțite modul</w:t>
+      </w:r>
       <w:r>
         <w:rPr>
           <w:rFonts w:ascii="Arial" w:hAnsi="Arial" w:cs="Arial"/>
@@ -25601,18 +24130,8 @@
           <w:sz w:val="24"/>
           <w:szCs w:val="24"/>
         </w:rPr>
-        <w:t>modul</w:t>
-      </w:r>
-      <w:r>
-        <w:rPr>
-          <w:rFonts w:ascii="Arial" w:hAnsi="Arial" w:cs="Arial"/>
-          <w:iCs/>
-          <w:sz w:val="24"/>
-          <w:szCs w:val="24"/>
-        </w:rPr>
         <w:t>o</w:t>
       </w:r>
-      <w:proofErr w:type="spellEnd"/>
       <w:r>
         <w:rPr>
           <w:rFonts w:ascii="Arial" w:hAnsi="Arial" w:cs="Arial"/>
@@ -36603,7 +35122,6 @@
         </w:rPr>
         <w:t xml:space="preserve">Dispozitivele FPGA sunt circuite digitale reconfigurabile a căror funcționalitate poate fi definită după fabricație. Structura internă a acestora este alcătuită din resurse logice programabile, elemente de memorare și rețele de interconectare configurabile. Aceste resurse sunt organizate în </w:t>
       </w:r>
-      <w:proofErr w:type="spellStart"/>
       <w:r>
         <w:rPr>
           <w:rFonts w:asciiTheme="minorBidi" w:hAnsiTheme="minorBidi"/>
@@ -36614,7 +35132,6 @@
         </w:rPr>
         <w:t>slice</w:t>
       </w:r>
-      <w:proofErr w:type="spellEnd"/>
       <w:r>
         <w:rPr>
           <w:rFonts w:asciiTheme="minorBidi" w:hAnsiTheme="minorBidi"/>
@@ -36692,25 +35209,7 @@
           <w:sz w:val="24"/>
           <w:szCs w:val="24"/>
         </w:rPr>
-        <w:t xml:space="preserve">, blocurile logice configurabile constituie principalele resurse utilizate pentru implementarea circuitelor </w:t>
-      </w:r>
-      <w:proofErr w:type="spellStart"/>
-      <w:r>
-        <w:rPr>
-          <w:rFonts w:asciiTheme="minorBidi" w:hAnsiTheme="minorBidi"/>
-          <w:sz w:val="24"/>
-          <w:szCs w:val="24"/>
-        </w:rPr>
-        <w:t>combinaționale</w:t>
-      </w:r>
-      <w:proofErr w:type="spellEnd"/>
-      <w:r>
-        <w:rPr>
-          <w:rFonts w:asciiTheme="minorBidi" w:hAnsiTheme="minorBidi"/>
-          <w:sz w:val="24"/>
-          <w:szCs w:val="24"/>
-        </w:rPr>
-        <w:t xml:space="preserve"> și secvențiale. Acestea integrează LUT-uri, elemente de memorare și logică dedicată operațiilor aritmetice [11].</w:t>
+        <w:t>, blocurile logice configurabile constituie principalele resurse utilizate pentru implementarea circuitelor combinaționale și secvențiale. Acestea integrează LUT-uri, elemente de memorare și logică dedicată operațiilor aritmetice [11].</w:t>
       </w:r>
     </w:p>
     <w:p>
@@ -36748,25 +35247,7 @@
           <w:sz w:val="24"/>
           <w:szCs w:val="24"/>
         </w:rPr>
-        <w:t xml:space="preserve">Deoarece atât elementele logice, cât și traseele de interconectare introduc întârzieri de propagare, performanța circuitului este influențată nu doar de structura sa logică, ci și de modul în care resursele sunt plasate și </w:t>
-      </w:r>
-      <w:proofErr w:type="spellStart"/>
-      <w:r>
-        <w:rPr>
-          <w:rFonts w:asciiTheme="minorBidi" w:hAnsiTheme="minorBidi"/>
-          <w:sz w:val="24"/>
-          <w:szCs w:val="24"/>
-        </w:rPr>
-        <w:t>rutate</w:t>
-      </w:r>
-      <w:proofErr w:type="spellEnd"/>
-      <w:r>
-        <w:rPr>
-          <w:rFonts w:asciiTheme="minorBidi" w:hAnsiTheme="minorBidi"/>
-          <w:sz w:val="24"/>
-          <w:szCs w:val="24"/>
-        </w:rPr>
-        <w:t xml:space="preserve"> în interiorul dispozitivului. Din acest motiv, proiectarea trebuie realizată ținând cont de constrângerile de temporizare și de caracteristicile arhitecturii FPGA utilizate.</w:t>
+        <w:t>Deoarece atât elementele logice, cât și traseele de interconectare introduc întârzieri de propagare, performanța circuitului este influențată nu doar de structura sa logică, ci și de modul în care resursele sunt plasate și rutate în interiorul dispozitivului. Din acest motiv, proiectarea trebuie realizată ținând cont de constrângerile de temporizare și de caracteristicile arhitecturii FPGA utilizate.</w:t>
       </w:r>
     </w:p>
     <w:p>
@@ -36785,25 +35266,7 @@
           <w:sz w:val="24"/>
           <w:szCs w:val="24"/>
         </w:rPr>
-        <w:t xml:space="preserve">Structura logică simplificată a unui </w:t>
-      </w:r>
-      <w:proofErr w:type="spellStart"/>
-      <w:r>
-        <w:rPr>
-          <w:rFonts w:asciiTheme="minorBidi" w:hAnsiTheme="minorBidi"/>
-          <w:sz w:val="24"/>
-          <w:szCs w:val="24"/>
-        </w:rPr>
-        <w:t>slice</w:t>
-      </w:r>
-      <w:proofErr w:type="spellEnd"/>
-      <w:r>
-        <w:rPr>
-          <w:rFonts w:asciiTheme="minorBidi" w:hAnsiTheme="minorBidi"/>
-          <w:sz w:val="24"/>
-          <w:szCs w:val="24"/>
-        </w:rPr>
-        <w:t xml:space="preserve"> este prezentată în cadrul Figurii 4.1.</w:t>
+        <w:t>Structura logică simplificată a unui slice este prezentată în cadrul Figurii 4.1.</w:t>
       </w:r>
     </w:p>
     <w:p>
@@ -37012,39 +35475,8 @@
           <w:sz w:val="20"/>
           <w:szCs w:val="20"/>
         </w:rPr>
-        <w:t xml:space="preserve"> Structura </w:t>
-      </w:r>
-      <w:proofErr w:type="spellStart"/>
-      <w:r>
-        <w:rPr>
-          <w:rFonts w:asciiTheme="minorBidi" w:hAnsiTheme="minorBidi"/>
-          <w:color w:val="auto"/>
-          <w:sz w:val="20"/>
-          <w:szCs w:val="20"/>
-        </w:rPr>
-        <w:t>conceptulă</w:t>
-      </w:r>
-      <w:proofErr w:type="spellEnd"/>
-      <w:r>
-        <w:rPr>
-          <w:rFonts w:asciiTheme="minorBidi" w:hAnsiTheme="minorBidi"/>
-          <w:color w:val="auto"/>
-          <w:sz w:val="20"/>
-          <w:szCs w:val="20"/>
-        </w:rPr>
-        <w:t xml:space="preserve"> simplificată a unui </w:t>
-      </w:r>
-      <w:proofErr w:type="spellStart"/>
-      <w:r>
-        <w:rPr>
-          <w:rFonts w:asciiTheme="minorBidi" w:hAnsiTheme="minorBidi"/>
-          <w:color w:val="auto"/>
-          <w:sz w:val="20"/>
-          <w:szCs w:val="20"/>
-        </w:rPr>
-        <w:t>slice</w:t>
-      </w:r>
-      <w:proofErr w:type="spellEnd"/>
+        <w:t xml:space="preserve"> Structura conceptulă simplificată a unui slice</w:t>
+      </w:r>
     </w:p>
     <w:p/>
     <w:p/>
@@ -37075,9 +35507,43 @@
           <w:sz w:val="24"/>
           <w:szCs w:val="24"/>
         </w:rPr>
-        <w:t xml:space="preserve">Block </w:t>
-      </w:r>
-      <w:proofErr w:type="spellStart"/>
+        <w:t>Block Random Access Memory</w:t>
+      </w:r>
+      <w:r>
+        <w:rPr>
+          <w:rFonts w:ascii="Arial" w:hAnsi="Arial" w:cs="Arial"/>
+          <w:sz w:val="24"/>
+          <w:szCs w:val="24"/>
+        </w:rPr>
+        <w:t>) oferă spațiu de stocare intern cu acces rapid și pot fi utilizate pentru implementarea registrelor extinse, a bufferelor sau a memoriilor locale necesare circuitelor digitale.</w:t>
+      </w:r>
+    </w:p>
+    <w:p>
+      <w:pPr>
+        <w:ind w:firstLine="720"/>
+        <w:jc w:val="both"/>
+        <w:rPr>
+          <w:rFonts w:ascii="Arial" w:hAnsi="Arial" w:cs="Arial"/>
+          <w:sz w:val="24"/>
+          <w:szCs w:val="24"/>
+        </w:rPr>
+      </w:pPr>
+      <w:r>
+        <w:rPr>
+          <w:rFonts w:ascii="Arial" w:hAnsi="Arial" w:cs="Arial"/>
+          <w:sz w:val="24"/>
+          <w:szCs w:val="24"/>
+        </w:rPr>
+        <w:t xml:space="preserve"> În mod similar, blocurile DSP</w:t>
+      </w:r>
+      <w:r>
+        <w:rPr>
+          <w:rFonts w:ascii="Arial" w:hAnsi="Arial" w:cs="Arial"/>
+          <w:sz w:val="24"/>
+          <w:szCs w:val="24"/>
+        </w:rPr>
+        <w:t xml:space="preserve"> (</w:t>
+      </w:r>
       <w:r>
         <w:rPr>
           <w:rFonts w:ascii="Arial" w:hAnsi="Arial" w:cs="Arial"/>
@@ -37086,56 +35552,31 @@
           <w:sz w:val="24"/>
           <w:szCs w:val="24"/>
         </w:rPr>
-        <w:t>Random</w:t>
-      </w:r>
-      <w:proofErr w:type="spellEnd"/>
-      <w:r>
-        <w:rPr>
-          <w:rFonts w:ascii="Arial" w:hAnsi="Arial" w:cs="Arial"/>
-          <w:i/>
-          <w:iCs/>
-          <w:sz w:val="24"/>
-          <w:szCs w:val="24"/>
-        </w:rPr>
-        <w:t xml:space="preserve"> Access </w:t>
-      </w:r>
-      <w:proofErr w:type="spellStart"/>
-      <w:r>
-        <w:rPr>
-          <w:rFonts w:ascii="Arial" w:hAnsi="Arial" w:cs="Arial"/>
-          <w:i/>
-          <w:iCs/>
-          <w:sz w:val="24"/>
-          <w:szCs w:val="24"/>
-        </w:rPr>
-        <w:t>Memory</w:t>
-      </w:r>
-      <w:proofErr w:type="spellEnd"/>
-      <w:r>
-        <w:rPr>
-          <w:rFonts w:ascii="Arial" w:hAnsi="Arial" w:cs="Arial"/>
-          <w:sz w:val="24"/>
-          <w:szCs w:val="24"/>
-        </w:rPr>
-        <w:t xml:space="preserve">) oferă spațiu de stocare intern cu acces rapid și pot fi utilizate pentru implementarea registrelor extinse, a </w:t>
-      </w:r>
-      <w:proofErr w:type="spellStart"/>
-      <w:r>
-        <w:rPr>
-          <w:rFonts w:ascii="Arial" w:hAnsi="Arial" w:cs="Arial"/>
-          <w:sz w:val="24"/>
-          <w:szCs w:val="24"/>
-        </w:rPr>
-        <w:t>bufferelor</w:t>
-      </w:r>
-      <w:proofErr w:type="spellEnd"/>
-      <w:r>
-        <w:rPr>
-          <w:rFonts w:ascii="Arial" w:hAnsi="Arial" w:cs="Arial"/>
-          <w:sz w:val="24"/>
-          <w:szCs w:val="24"/>
-        </w:rPr>
-        <w:t xml:space="preserve"> sau a memoriilor locale necesare circuitelor digitale.</w:t>
+        <w:t>digital signal processing</w:t>
+      </w:r>
+      <w:r>
+        <w:rPr>
+          <w:rFonts w:ascii="Arial" w:hAnsi="Arial" w:cs="Arial"/>
+          <w:sz w:val="24"/>
+          <w:szCs w:val="24"/>
+        </w:rPr>
+        <w:t>)</w:t>
+      </w:r>
+      <w:r>
+        <w:rPr>
+          <w:rFonts w:ascii="Arial" w:hAnsi="Arial" w:cs="Arial"/>
+          <w:sz w:val="24"/>
+          <w:szCs w:val="24"/>
+        </w:rPr>
+        <w:t xml:space="preserve"> sunt resurse hardware specializate pentru realizarea eficientă a operațiilor aritmetice, în special a înmulțirilor, acumulărilor și altor calcule numerice</w:t>
+      </w:r>
+      <w:r>
+        <w:rPr>
+          <w:rFonts w:ascii="Arial" w:hAnsi="Arial" w:cs="Arial"/>
+          <w:sz w:val="24"/>
+          <w:szCs w:val="24"/>
+        </w:rPr>
+        <w:t>.</w:t>
       </w:r>
     </w:p>
     <w:p>
@@ -37154,170 +35595,7 @@
           <w:sz w:val="24"/>
           <w:szCs w:val="24"/>
         </w:rPr>
-        <w:t xml:space="preserve"> În mod similar, blocurile DSP</w:t>
-      </w:r>
-      <w:r>
-        <w:rPr>
-          <w:rFonts w:ascii="Arial" w:hAnsi="Arial" w:cs="Arial"/>
-          <w:sz w:val="24"/>
-          <w:szCs w:val="24"/>
-        </w:rPr>
-        <w:t xml:space="preserve"> (</w:t>
-      </w:r>
-      <w:r>
-        <w:rPr>
-          <w:rFonts w:ascii="Arial" w:hAnsi="Arial" w:cs="Arial"/>
-          <w:i/>
-          <w:iCs/>
-          <w:sz w:val="24"/>
-          <w:szCs w:val="24"/>
-        </w:rPr>
-        <w:t xml:space="preserve">digital signal </w:t>
-      </w:r>
-      <w:proofErr w:type="spellStart"/>
-      <w:r>
-        <w:rPr>
-          <w:rFonts w:ascii="Arial" w:hAnsi="Arial" w:cs="Arial"/>
-          <w:i/>
-          <w:iCs/>
-          <w:sz w:val="24"/>
-          <w:szCs w:val="24"/>
-        </w:rPr>
-        <w:t>processing</w:t>
-      </w:r>
-      <w:proofErr w:type="spellEnd"/>
-      <w:r>
-        <w:rPr>
-          <w:rFonts w:ascii="Arial" w:hAnsi="Arial" w:cs="Arial"/>
-          <w:sz w:val="24"/>
-          <w:szCs w:val="24"/>
-        </w:rPr>
-        <w:t>)</w:t>
-      </w:r>
-      <w:r>
-        <w:rPr>
-          <w:rFonts w:ascii="Arial" w:hAnsi="Arial" w:cs="Arial"/>
-          <w:sz w:val="24"/>
-          <w:szCs w:val="24"/>
-        </w:rPr>
-        <w:t xml:space="preserve"> sunt resurse hardware specializate pentru realizarea eficientă a operațiilor aritmetice, în special a înmulțirilor, acumulărilor și altor calcule numerice</w:t>
-      </w:r>
-      <w:r>
-        <w:rPr>
-          <w:rFonts w:ascii="Arial" w:hAnsi="Arial" w:cs="Arial"/>
-          <w:sz w:val="24"/>
-          <w:szCs w:val="24"/>
-        </w:rPr>
-        <w:t>.</w:t>
-      </w:r>
-    </w:p>
-    <w:p>
-      <w:pPr>
-        <w:ind w:firstLine="720"/>
-        <w:jc w:val="both"/>
-        <w:rPr>
-          <w:rFonts w:ascii="Arial" w:hAnsi="Arial" w:cs="Arial"/>
-          <w:sz w:val="24"/>
-          <w:szCs w:val="24"/>
-        </w:rPr>
-      </w:pPr>
-      <w:r>
-        <w:rPr>
-          <w:rFonts w:ascii="Arial" w:hAnsi="Arial" w:cs="Arial"/>
-          <w:sz w:val="24"/>
-          <w:szCs w:val="24"/>
-        </w:rPr>
-        <w:t xml:space="preserve">Rețeaua de </w:t>
-      </w:r>
-      <w:proofErr w:type="spellStart"/>
-      <w:r>
-        <w:rPr>
-          <w:rFonts w:ascii="Arial" w:hAnsi="Arial" w:cs="Arial"/>
-          <w:sz w:val="24"/>
-          <w:szCs w:val="24"/>
-        </w:rPr>
-        <w:t>clock</w:t>
-      </w:r>
-      <w:proofErr w:type="spellEnd"/>
-      <w:r>
-        <w:rPr>
-          <w:rFonts w:ascii="Arial" w:hAnsi="Arial" w:cs="Arial"/>
-          <w:sz w:val="24"/>
-          <w:szCs w:val="24"/>
-        </w:rPr>
-        <w:t xml:space="preserve"> asigură distribuția semnalelor de tact către resursele secvențiale ale dispozitivului FPGA. Aceasta utilizează resurse dedicate de </w:t>
-      </w:r>
-      <w:proofErr w:type="spellStart"/>
-      <w:r>
-        <w:rPr>
-          <w:rFonts w:ascii="Arial" w:hAnsi="Arial" w:cs="Arial"/>
-          <w:sz w:val="24"/>
-          <w:szCs w:val="24"/>
-        </w:rPr>
-        <w:t>clocking</w:t>
-      </w:r>
-      <w:proofErr w:type="spellEnd"/>
-      <w:r>
-        <w:rPr>
-          <w:rFonts w:ascii="Arial" w:hAnsi="Arial" w:cs="Arial"/>
-          <w:sz w:val="24"/>
-          <w:szCs w:val="24"/>
-        </w:rPr>
-        <w:t>, printre care blocurile de management al tactului (</w:t>
-      </w:r>
-      <w:proofErr w:type="spellStart"/>
-      <w:r>
-        <w:rPr>
-          <w:rFonts w:ascii="Arial" w:hAnsi="Arial" w:cs="Arial"/>
-          <w:sz w:val="24"/>
-          <w:szCs w:val="24"/>
-        </w:rPr>
-        <w:t>Clock</w:t>
-      </w:r>
-      <w:proofErr w:type="spellEnd"/>
-      <w:r>
-        <w:rPr>
-          <w:rFonts w:ascii="Arial" w:hAnsi="Arial" w:cs="Arial"/>
-          <w:sz w:val="24"/>
-          <w:szCs w:val="24"/>
-        </w:rPr>
-        <w:t xml:space="preserve"> Management </w:t>
-      </w:r>
-      <w:proofErr w:type="spellStart"/>
-      <w:r>
-        <w:rPr>
-          <w:rFonts w:ascii="Arial" w:hAnsi="Arial" w:cs="Arial"/>
-          <w:sz w:val="24"/>
-          <w:szCs w:val="24"/>
-        </w:rPr>
-        <w:t>Tiles</w:t>
-      </w:r>
-      <w:proofErr w:type="spellEnd"/>
-      <w:r>
-        <w:rPr>
-          <w:rFonts w:ascii="Arial" w:hAnsi="Arial" w:cs="Arial"/>
-          <w:sz w:val="24"/>
-          <w:szCs w:val="24"/>
-        </w:rPr>
-        <w:t>), care permit sinteza frecvenței, compensarea diferențelor de fază (</w:t>
-      </w:r>
-      <w:proofErr w:type="spellStart"/>
-      <w:r>
-        <w:rPr>
-          <w:rFonts w:ascii="Arial" w:hAnsi="Arial" w:cs="Arial"/>
-          <w:sz w:val="24"/>
-          <w:szCs w:val="24"/>
-        </w:rPr>
-        <w:t>deskew</w:t>
-      </w:r>
-      <w:proofErr w:type="spellEnd"/>
-      <w:r>
-        <w:rPr>
-          <w:rFonts w:ascii="Arial" w:hAnsi="Arial" w:cs="Arial"/>
-          <w:sz w:val="24"/>
-          <w:szCs w:val="24"/>
-        </w:rPr>
-        <w:t>) și controlul jitter-ului</w:t>
+        <w:t>Rețeaua de clock asigură distribuția semnalelor de tact către resursele secvențiale ale dispozitivului FPGA. Aceasta utilizează resurse dedicate de clocking, printre care blocurile de management al tactului (Clock Management Tiles), care permit sinteza frecvenței, compensarea diferențelor de fază (deskew) și controlul jitter-ului</w:t>
       </w:r>
       <w:r>
         <w:rPr>
@@ -37669,7 +35947,6 @@
         </w:rPr>
         <w:t xml:space="preserve"> combină, în cadrul aceluiași circuit integrat, un sistem de procesare (</w:t>
       </w:r>
-      <w:proofErr w:type="spellStart"/>
       <w:r>
         <w:rPr>
           <w:rFonts w:ascii="Arial" w:hAnsi="Arial" w:cs="Arial"/>
@@ -37678,9 +35955,32 @@
           <w:sz w:val="24"/>
           <w:szCs w:val="24"/>
         </w:rPr>
-        <w:t>Processing</w:t>
-      </w:r>
-      <w:proofErr w:type="spellEnd"/>
+        <w:t>Processing System</w:t>
+      </w:r>
+      <w:r>
+        <w:rPr>
+          <w:rFonts w:ascii="Arial" w:hAnsi="Arial" w:cs="Arial"/>
+          <w:sz w:val="24"/>
+          <w:szCs w:val="24"/>
+        </w:rPr>
+        <w:t xml:space="preserve"> — PS) și o regiune de logică programabilă </w:t>
+      </w:r>
+      <w:r>
+        <w:rPr>
+          <w:rFonts w:ascii="Arial" w:hAnsi="Arial" w:cs="Arial"/>
+          <w:sz w:val="24"/>
+          <w:szCs w:val="24"/>
+        </w:rPr>
+        <w:t xml:space="preserve"> </w:t>
+      </w:r>
+      <w:r>
+        <w:rPr>
+          <w:rFonts w:ascii="Arial" w:hAnsi="Arial" w:cs="Arial"/>
+          <w:sz w:val="24"/>
+          <w:szCs w:val="24"/>
+        </w:rPr>
+        <w:t>(</w:t>
+      </w:r>
       <w:r>
         <w:rPr>
           <w:rFonts w:ascii="Arial" w:hAnsi="Arial" w:cs="Arial"/>
@@ -37689,9 +35989,176 @@
           <w:sz w:val="24"/>
           <w:szCs w:val="24"/>
         </w:rPr>
-        <w:t xml:space="preserve"> </w:t>
-      </w:r>
-      <w:proofErr w:type="spellStart"/>
+        <w:t>Programmable Logic</w:t>
+      </w:r>
+      <w:r>
+        <w:rPr>
+          <w:rFonts w:ascii="Arial" w:hAnsi="Arial" w:cs="Arial"/>
+          <w:sz w:val="24"/>
+          <w:szCs w:val="24"/>
+        </w:rPr>
+        <w:t xml:space="preserve"> — PL). Această structură permite dezvoltarea unor sisteme în care </w:t>
+      </w:r>
+    </w:p>
+    <w:p>
+      <w:pPr>
+        <w:jc w:val="both"/>
+        <w:rPr>
+          <w:rFonts w:ascii="Arial" w:hAnsi="Arial" w:cs="Arial"/>
+          <w:sz w:val="24"/>
+          <w:szCs w:val="24"/>
+        </w:rPr>
+      </w:pPr>
+    </w:p>
+    <w:p>
+      <w:pPr>
+        <w:jc w:val="both"/>
+        <w:rPr>
+          <w:rFonts w:ascii="Arial" w:hAnsi="Arial" w:cs="Arial"/>
+          <w:sz w:val="24"/>
+          <w:szCs w:val="24"/>
+        </w:rPr>
+      </w:pPr>
+      <w:r>
+        <w:rPr>
+          <w:rFonts w:ascii="Arial" w:hAnsi="Arial" w:cs="Arial"/>
+          <w:sz w:val="24"/>
+          <w:szCs w:val="24"/>
+        </w:rPr>
+        <w:t>funcțiile software sunt executate de procesoarele integrate, iar operațiile care beneficiază de paralelism sau accelerare hardware pot fi implementate la nivelul logicii programabile</w:t>
+      </w:r>
+      <w:r>
+        <w:rPr>
+          <w:rFonts w:ascii="Arial" w:hAnsi="Arial" w:cs="Arial"/>
+          <w:sz w:val="24"/>
+          <w:szCs w:val="24"/>
+        </w:rPr>
+        <w:t xml:space="preserve"> [11]</w:t>
+      </w:r>
+      <w:r>
+        <w:rPr>
+          <w:rFonts w:ascii="Arial" w:hAnsi="Arial" w:cs="Arial"/>
+          <w:sz w:val="24"/>
+          <w:szCs w:val="24"/>
+        </w:rPr>
+        <w:t>.</w:t>
+      </w:r>
+    </w:p>
+    <w:p>
+      <w:pPr>
+        <w:ind w:firstLine="576"/>
+        <w:jc w:val="both"/>
+        <w:rPr>
+          <w:rFonts w:ascii="Arial" w:hAnsi="Arial" w:cs="Arial"/>
+          <w:sz w:val="24"/>
+          <w:szCs w:val="24"/>
+        </w:rPr>
+      </w:pPr>
+      <w:r>
+        <w:rPr>
+          <w:rFonts w:ascii="Arial" w:hAnsi="Arial" w:cs="Arial"/>
+          <w:sz w:val="24"/>
+          <w:szCs w:val="24"/>
+        </w:rPr>
+        <w:t>Sistemul de procesare integrează o unitate de procesare bazată pe procesoare ARM Cortex-A9, împreună cu subsisteme de memorie, controlere de periferice și interfețe de comunicație.</w:t>
+      </w:r>
+    </w:p>
+    <w:p>
+      <w:pPr>
+        <w:ind w:firstLine="576"/>
+        <w:jc w:val="both"/>
+        <w:rPr>
+          <w:rFonts w:ascii="Arial" w:hAnsi="Arial" w:cs="Arial"/>
+          <w:sz w:val="24"/>
+          <w:szCs w:val="24"/>
+        </w:rPr>
+      </w:pPr>
+      <w:r>
+        <w:rPr>
+          <w:rFonts w:ascii="Arial" w:hAnsi="Arial" w:cs="Arial"/>
+          <w:sz w:val="24"/>
+          <w:szCs w:val="24"/>
+        </w:rPr>
+        <w:t xml:space="preserve"> În configurația utilizată de dispozitivele Zynq-7000 corespunzătoare familiei din care face parte Zynq-7020, unitatea de procesare include două nuclee Cortex-A9. Fiecare nucleu dispune de memorie cache de nivel L1, unitate de management al memoriei și suport pentru procesarea SIMD</w:t>
+      </w:r>
+      <w:r>
+        <w:rPr>
+          <w:rFonts w:ascii="Arial" w:hAnsi="Arial" w:cs="Arial"/>
+          <w:sz w:val="24"/>
+          <w:szCs w:val="24"/>
+        </w:rPr>
+        <w:t xml:space="preserve"> [11]</w:t>
+      </w:r>
+      <w:r>
+        <w:rPr>
+          <w:rFonts w:ascii="Arial" w:hAnsi="Arial" w:cs="Arial"/>
+          <w:sz w:val="24"/>
+          <w:szCs w:val="24"/>
+        </w:rPr>
+        <w:t>.</w:t>
+      </w:r>
+    </w:p>
+    <w:p>
+      <w:pPr>
+        <w:ind w:firstLine="576"/>
+        <w:jc w:val="both"/>
+        <w:rPr>
+          <w:rFonts w:ascii="Arial" w:hAnsi="Arial" w:cs="Arial"/>
+          <w:sz w:val="24"/>
+          <w:szCs w:val="24"/>
+        </w:rPr>
+      </w:pPr>
+      <w:r>
+        <w:rPr>
+          <w:rFonts w:ascii="Arial" w:hAnsi="Arial" w:cs="Arial"/>
+          <w:sz w:val="24"/>
+          <w:szCs w:val="24"/>
+        </w:rPr>
+        <w:t>R</w:t>
+      </w:r>
+      <w:r>
+        <w:rPr>
+          <w:rFonts w:ascii="Arial" w:hAnsi="Arial" w:cs="Arial"/>
+          <w:sz w:val="24"/>
+          <w:szCs w:val="24"/>
+        </w:rPr>
+        <w:t>egiunea PL reprezintă componenta FPGA a dispozitivului și permite implementarea unor structuri hardware personalizate utilizând resursele logice prezentate anterior. Din perspectiva unei arhitecturi de accelerare hardware, această separare permite procesorului să gestioneze logica aplicației și transferurile de date, în timp ce operațiile specializate pot fi executate de circuite implementate în PL.</w:t>
+      </w:r>
+    </w:p>
+    <w:p>
+      <w:pPr>
+        <w:ind w:firstLine="576"/>
+        <w:jc w:val="both"/>
+        <w:rPr>
+          <w:rFonts w:ascii="Arial" w:hAnsi="Arial" w:cs="Arial"/>
+          <w:sz w:val="24"/>
+          <w:szCs w:val="24"/>
+        </w:rPr>
+      </w:pPr>
+      <w:r>
+        <w:rPr>
+          <w:rFonts w:ascii="Arial" w:hAnsi="Arial" w:cs="Arial"/>
+          <w:sz w:val="24"/>
+          <w:szCs w:val="24"/>
+        </w:rPr>
+        <w:t xml:space="preserve">Comunicarea dintre PS și PL este realizată printr-un ansamblu de interfețe dedicate. Pe lângă semnalele de </w:t>
+      </w:r>
+      <w:r>
+        <w:rPr>
+          <w:rFonts w:ascii="Arial" w:hAnsi="Arial" w:cs="Arial"/>
+          <w:sz w:val="24"/>
+          <w:szCs w:val="24"/>
+        </w:rPr>
+        <w:t>ciclu de tact</w:t>
+      </w:r>
+      <w:r>
+        <w:rPr>
+          <w:rFonts w:ascii="Arial" w:hAnsi="Arial" w:cs="Arial"/>
+          <w:sz w:val="24"/>
+          <w:szCs w:val="24"/>
+        </w:rPr>
+        <w:t>, întreruperi, control DMA și interfețele de configurare, Zynq-7000 pune la dispoziție mai multe interfețe bazate pe protocolul AXI pentru transferul datelor între cele două regiuni. Acestea includ porturi de uz general (</w:t>
+      </w:r>
       <w:r>
         <w:rPr>
           <w:rFonts w:ascii="Arial" w:hAnsi="Arial" w:cs="Arial"/>
@@ -37700,34 +36167,16 @@
           <w:sz w:val="24"/>
           <w:szCs w:val="24"/>
         </w:rPr>
-        <w:t>System</w:t>
-      </w:r>
-      <w:proofErr w:type="spellEnd"/>
-      <w:r>
-        <w:rPr>
-          <w:rFonts w:ascii="Arial" w:hAnsi="Arial" w:cs="Arial"/>
-          <w:sz w:val="24"/>
-          <w:szCs w:val="24"/>
-        </w:rPr>
-        <w:t xml:space="preserve"> — PS) și o regiune de logică programabilă </w:t>
-      </w:r>
-      <w:r>
-        <w:rPr>
-          <w:rFonts w:ascii="Arial" w:hAnsi="Arial" w:cs="Arial"/>
-          <w:sz w:val="24"/>
-          <w:szCs w:val="24"/>
-        </w:rPr>
-        <w:t xml:space="preserve"> </w:t>
-      </w:r>
-      <w:r>
-        <w:rPr>
-          <w:rFonts w:ascii="Arial" w:hAnsi="Arial" w:cs="Arial"/>
-          <w:sz w:val="24"/>
-          <w:szCs w:val="24"/>
-        </w:rPr>
-        <w:t>(</w:t>
-      </w:r>
-      <w:proofErr w:type="spellStart"/>
+        <w:t>General Purpose</w:t>
+      </w:r>
+      <w:r>
+        <w:rPr>
+          <w:rFonts w:ascii="Arial" w:hAnsi="Arial" w:cs="Arial"/>
+          <w:sz w:val="24"/>
+          <w:szCs w:val="24"/>
+        </w:rPr>
+        <w:t>), porturi de înaltă performanță (</w:t>
+      </w:r>
       <w:r>
         <w:rPr>
           <w:rFonts w:ascii="Arial" w:hAnsi="Arial" w:cs="Arial"/>
@@ -37736,9 +36185,16 @@
           <w:sz w:val="24"/>
           <w:szCs w:val="24"/>
         </w:rPr>
-        <w:t>Programmable</w:t>
-      </w:r>
-      <w:proofErr w:type="spellEnd"/>
+        <w:t>High Performance</w:t>
+      </w:r>
+      <w:r>
+        <w:rPr>
+          <w:rFonts w:ascii="Arial" w:hAnsi="Arial" w:cs="Arial"/>
+          <w:sz w:val="24"/>
+          <w:szCs w:val="24"/>
+        </w:rPr>
+        <w:t xml:space="preserve">) și portul </w:t>
+      </w:r>
       <w:r>
         <w:rPr>
           <w:rFonts w:ascii="Arial" w:hAnsi="Arial" w:cs="Arial"/>
@@ -37747,267 +36203,7 @@
           <w:sz w:val="24"/>
           <w:szCs w:val="24"/>
         </w:rPr>
-        <w:t xml:space="preserve"> Logic</w:t>
-      </w:r>
-      <w:r>
-        <w:rPr>
-          <w:rFonts w:ascii="Arial" w:hAnsi="Arial" w:cs="Arial"/>
-          <w:sz w:val="24"/>
-          <w:szCs w:val="24"/>
-        </w:rPr>
-        <w:t xml:space="preserve"> — PL). Această structură permite dezvoltarea unor sisteme în care </w:t>
-      </w:r>
-    </w:p>
-    <w:p>
-      <w:pPr>
-        <w:jc w:val="both"/>
-        <w:rPr>
-          <w:rFonts w:ascii="Arial" w:hAnsi="Arial" w:cs="Arial"/>
-          <w:sz w:val="24"/>
-          <w:szCs w:val="24"/>
-        </w:rPr>
-      </w:pPr>
-    </w:p>
-    <w:p>
-      <w:pPr>
-        <w:jc w:val="both"/>
-        <w:rPr>
-          <w:rFonts w:ascii="Arial" w:hAnsi="Arial" w:cs="Arial"/>
-          <w:sz w:val="24"/>
-          <w:szCs w:val="24"/>
-        </w:rPr>
-      </w:pPr>
-      <w:r>
-        <w:rPr>
-          <w:rFonts w:ascii="Arial" w:hAnsi="Arial" w:cs="Arial"/>
-          <w:sz w:val="24"/>
-          <w:szCs w:val="24"/>
-        </w:rPr>
-        <w:t>funcțiile software sunt executate de procesoarele integrate, iar operațiile care beneficiază de paralelism sau accelerare hardware pot fi implementate la nivelul logicii programabile</w:t>
-      </w:r>
-      <w:r>
-        <w:rPr>
-          <w:rFonts w:ascii="Arial" w:hAnsi="Arial" w:cs="Arial"/>
-          <w:sz w:val="24"/>
-          <w:szCs w:val="24"/>
-        </w:rPr>
-        <w:t xml:space="preserve"> [11]</w:t>
-      </w:r>
-      <w:r>
-        <w:rPr>
-          <w:rFonts w:ascii="Arial" w:hAnsi="Arial" w:cs="Arial"/>
-          <w:sz w:val="24"/>
-          <w:szCs w:val="24"/>
-        </w:rPr>
-        <w:t>.</w:t>
-      </w:r>
-    </w:p>
-    <w:p>
-      <w:pPr>
-        <w:ind w:firstLine="576"/>
-        <w:jc w:val="both"/>
-        <w:rPr>
-          <w:rFonts w:ascii="Arial" w:hAnsi="Arial" w:cs="Arial"/>
-          <w:sz w:val="24"/>
-          <w:szCs w:val="24"/>
-        </w:rPr>
-      </w:pPr>
-      <w:r>
-        <w:rPr>
-          <w:rFonts w:ascii="Arial" w:hAnsi="Arial" w:cs="Arial"/>
-          <w:sz w:val="24"/>
-          <w:szCs w:val="24"/>
-        </w:rPr>
-        <w:t>Sistemul de procesare integrează o unitate de procesare bazată pe procesoare ARM Cortex-A9, împreună cu subsisteme de memorie, controlere de periferice și interfețe de comunicație.</w:t>
-      </w:r>
-    </w:p>
-    <w:p>
-      <w:pPr>
-        <w:ind w:firstLine="576"/>
-        <w:jc w:val="both"/>
-        <w:rPr>
-          <w:rFonts w:ascii="Arial" w:hAnsi="Arial" w:cs="Arial"/>
-          <w:sz w:val="24"/>
-          <w:szCs w:val="24"/>
-        </w:rPr>
-      </w:pPr>
-      <w:r>
-        <w:rPr>
-          <w:rFonts w:ascii="Arial" w:hAnsi="Arial" w:cs="Arial"/>
-          <w:sz w:val="24"/>
-          <w:szCs w:val="24"/>
-        </w:rPr>
-        <w:t xml:space="preserve"> În configurația utilizată de dispozitivele Zynq-7000 corespunzătoare familiei din care face parte Zynq-7020, unitatea de procesare include două nuclee Cortex-A9. Fiecare nucleu dispune de memorie cache de nivel L1, unitate de management al memoriei și suport pentru procesarea SIMD</w:t>
-      </w:r>
-      <w:r>
-        <w:rPr>
-          <w:rFonts w:ascii="Arial" w:hAnsi="Arial" w:cs="Arial"/>
-          <w:sz w:val="24"/>
-          <w:szCs w:val="24"/>
-        </w:rPr>
-        <w:t xml:space="preserve"> [11]</w:t>
-      </w:r>
-      <w:r>
-        <w:rPr>
-          <w:rFonts w:ascii="Arial" w:hAnsi="Arial" w:cs="Arial"/>
-          <w:sz w:val="24"/>
-          <w:szCs w:val="24"/>
-        </w:rPr>
-        <w:t>.</w:t>
-      </w:r>
-    </w:p>
-    <w:p>
-      <w:pPr>
-        <w:ind w:firstLine="576"/>
-        <w:jc w:val="both"/>
-        <w:rPr>
-          <w:rFonts w:ascii="Arial" w:hAnsi="Arial" w:cs="Arial"/>
-          <w:sz w:val="24"/>
-          <w:szCs w:val="24"/>
-        </w:rPr>
-      </w:pPr>
-      <w:r>
-        <w:rPr>
-          <w:rFonts w:ascii="Arial" w:hAnsi="Arial" w:cs="Arial"/>
-          <w:sz w:val="24"/>
-          <w:szCs w:val="24"/>
-        </w:rPr>
-        <w:t>R</w:t>
-      </w:r>
-      <w:r>
-        <w:rPr>
-          <w:rFonts w:ascii="Arial" w:hAnsi="Arial" w:cs="Arial"/>
-          <w:sz w:val="24"/>
-          <w:szCs w:val="24"/>
-        </w:rPr>
-        <w:t>egiunea PL reprezintă componenta FPGA a dispozitivului și permite implementarea unor structuri hardware personalizate utilizând resursele logice prezentate anterior. Din perspectiva unei arhitecturi de accelerare hardware, această separare permite procesorului să gestioneze logica aplicației și transferurile de date, în timp ce operațiile specializate pot fi executate de circuite implementate în PL.</w:t>
-      </w:r>
-    </w:p>
-    <w:p>
-      <w:pPr>
-        <w:ind w:firstLine="576"/>
-        <w:jc w:val="both"/>
-        <w:rPr>
-          <w:rFonts w:ascii="Arial" w:hAnsi="Arial" w:cs="Arial"/>
-          <w:sz w:val="24"/>
-          <w:szCs w:val="24"/>
-        </w:rPr>
-      </w:pPr>
-      <w:r>
-        <w:rPr>
-          <w:rFonts w:ascii="Arial" w:hAnsi="Arial" w:cs="Arial"/>
-          <w:sz w:val="24"/>
-          <w:szCs w:val="24"/>
-        </w:rPr>
-        <w:t xml:space="preserve">Comunicarea dintre PS și PL este realizată printr-un ansamblu de interfețe dedicate. Pe lângă semnalele de </w:t>
-      </w:r>
-      <w:r>
-        <w:rPr>
-          <w:rFonts w:ascii="Arial" w:hAnsi="Arial" w:cs="Arial"/>
-          <w:sz w:val="24"/>
-          <w:szCs w:val="24"/>
-        </w:rPr>
-        <w:t>ciclu de tact</w:t>
-      </w:r>
-      <w:r>
-        <w:rPr>
-          <w:rFonts w:ascii="Arial" w:hAnsi="Arial" w:cs="Arial"/>
-          <w:sz w:val="24"/>
-          <w:szCs w:val="24"/>
-        </w:rPr>
-        <w:t>, întreruperi, control DMA și interfețele de configurare, Zynq-7000 pune la dispoziție mai multe interfețe bazate pe protocolul AXI pentru transferul datelor între cele două regiuni. Acestea includ porturi de uz general (</w:t>
-      </w:r>
-      <w:r>
-        <w:rPr>
-          <w:rFonts w:ascii="Arial" w:hAnsi="Arial" w:cs="Arial"/>
-          <w:i/>
-          <w:iCs/>
-          <w:sz w:val="24"/>
-          <w:szCs w:val="24"/>
-        </w:rPr>
-        <w:t xml:space="preserve">General </w:t>
-      </w:r>
-      <w:proofErr w:type="spellStart"/>
-      <w:r>
-        <w:rPr>
-          <w:rFonts w:ascii="Arial" w:hAnsi="Arial" w:cs="Arial"/>
-          <w:i/>
-          <w:iCs/>
-          <w:sz w:val="24"/>
-          <w:szCs w:val="24"/>
-        </w:rPr>
-        <w:t>Purpose</w:t>
-      </w:r>
-      <w:proofErr w:type="spellEnd"/>
-      <w:r>
-        <w:rPr>
-          <w:rFonts w:ascii="Arial" w:hAnsi="Arial" w:cs="Arial"/>
-          <w:sz w:val="24"/>
-          <w:szCs w:val="24"/>
-        </w:rPr>
-        <w:t>), porturi de înaltă performanță (</w:t>
-      </w:r>
-      <w:proofErr w:type="spellStart"/>
-      <w:r>
-        <w:rPr>
-          <w:rFonts w:ascii="Arial" w:hAnsi="Arial" w:cs="Arial"/>
-          <w:i/>
-          <w:iCs/>
-          <w:sz w:val="24"/>
-          <w:szCs w:val="24"/>
-        </w:rPr>
-        <w:t>High</w:t>
-      </w:r>
-      <w:proofErr w:type="spellEnd"/>
-      <w:r>
-        <w:rPr>
-          <w:rFonts w:ascii="Arial" w:hAnsi="Arial" w:cs="Arial"/>
-          <w:i/>
-          <w:iCs/>
-          <w:sz w:val="24"/>
-          <w:szCs w:val="24"/>
-        </w:rPr>
-        <w:t xml:space="preserve"> Performance</w:t>
-      </w:r>
-      <w:r>
-        <w:rPr>
-          <w:rFonts w:ascii="Arial" w:hAnsi="Arial" w:cs="Arial"/>
-          <w:sz w:val="24"/>
-          <w:szCs w:val="24"/>
-        </w:rPr>
-        <w:t xml:space="preserve">) și portul </w:t>
-      </w:r>
-      <w:r>
-        <w:rPr>
-          <w:rFonts w:ascii="Arial" w:hAnsi="Arial" w:cs="Arial"/>
-          <w:i/>
-          <w:iCs/>
-          <w:sz w:val="24"/>
-          <w:szCs w:val="24"/>
-        </w:rPr>
-        <w:t xml:space="preserve">Accelerator </w:t>
-      </w:r>
-      <w:proofErr w:type="spellStart"/>
-      <w:r>
-        <w:rPr>
-          <w:rFonts w:ascii="Arial" w:hAnsi="Arial" w:cs="Arial"/>
-          <w:i/>
-          <w:iCs/>
-          <w:sz w:val="24"/>
-          <w:szCs w:val="24"/>
-        </w:rPr>
-        <w:t>Coherency</w:t>
-      </w:r>
-      <w:proofErr w:type="spellEnd"/>
-      <w:r>
-        <w:rPr>
-          <w:rFonts w:ascii="Arial" w:hAnsi="Arial" w:cs="Arial"/>
-          <w:i/>
-          <w:iCs/>
-          <w:sz w:val="24"/>
-          <w:szCs w:val="24"/>
-        </w:rPr>
-        <w:t xml:space="preserve"> Port</w:t>
+        <w:t>Accelerator Coherency Port</w:t>
       </w:r>
       <w:r>
         <w:rPr>
@@ -38246,27 +36442,7 @@
           <w:sz w:val="20"/>
           <w:szCs w:val="20"/>
         </w:rPr>
-        <w:t xml:space="preserve"> Diagrama structurală a </w:t>
-      </w:r>
-      <w:proofErr w:type="spellStart"/>
-      <w:r>
-        <w:rPr>
-          <w:rFonts w:ascii="Arial" w:hAnsi="Arial" w:cs="Arial"/>
-          <w:color w:val="auto"/>
-          <w:sz w:val="20"/>
-          <w:szCs w:val="20"/>
-        </w:rPr>
-        <w:t>SoC</w:t>
-      </w:r>
-      <w:proofErr w:type="spellEnd"/>
-      <w:r>
-        <w:rPr>
-          <w:rFonts w:ascii="Arial" w:hAnsi="Arial" w:cs="Arial"/>
-          <w:color w:val="auto"/>
-          <w:sz w:val="20"/>
-          <w:szCs w:val="20"/>
-        </w:rPr>
-        <w:t>-ului ZYNQ-7000 [13]</w:t>
+        <w:t xml:space="preserve"> Diagrama structurală a SoC-ului ZYNQ-7000 [13]</w:t>
       </w:r>
     </w:p>
     <w:p>
@@ -38282,6 +36458,15 @@
     </w:p>
     <w:p>
       <w:pPr>
+        <w:pStyle w:val="Heading2"/>
+      </w:pPr>
+      <w:r>
+        <w:t>PROTOCOLUL AXI4</w:t>
+      </w:r>
+    </w:p>
+    <w:p/>
+    <w:p>
+      <w:pPr>
         <w:ind w:firstLine="576"/>
         <w:jc w:val="both"/>
         <w:rPr>
@@ -38290,7 +36475,436 @@
           <w:szCs w:val="24"/>
         </w:rPr>
       </w:pPr>
-    </w:p>
+      <w:r>
+        <w:rPr>
+          <w:rFonts w:ascii="Arial" w:hAnsi="Arial" w:cs="Arial"/>
+          <w:sz w:val="24"/>
+          <w:szCs w:val="24"/>
+        </w:rPr>
+        <w:t>Protocolul AXI (</w:t>
+      </w:r>
+      <w:r>
+        <w:rPr>
+          <w:rFonts w:ascii="Arial" w:hAnsi="Arial" w:cs="Arial"/>
+          <w:i/>
+          <w:iCs/>
+          <w:sz w:val="24"/>
+          <w:szCs w:val="24"/>
+        </w:rPr>
+        <w:t>Advanced eXtensible Interface</w:t>
+      </w:r>
+      <w:r>
+        <w:rPr>
+          <w:rFonts w:ascii="Arial" w:hAnsi="Arial" w:cs="Arial"/>
+          <w:sz w:val="24"/>
+          <w:szCs w:val="24"/>
+        </w:rPr>
+        <w:t xml:space="preserve">) face parte din familia AMBA dezvoltată de ARM și este utilizat pentru realizarea comunicației dintre componente hardware. În cadrul platformelor Xilinx, protocolul AXI este utilizat pe scară largă pentru interconectarea nucleelor IP </w:t>
+      </w:r>
+      <w:r>
+        <w:rPr>
+          <w:rFonts w:ascii="Arial" w:hAnsi="Arial" w:cs="Arial"/>
+          <w:sz w:val="24"/>
+          <w:szCs w:val="24"/>
+        </w:rPr>
+        <w:t>(</w:t>
+      </w:r>
+      <w:r>
+        <w:rPr>
+          <w:rFonts w:ascii="Arial" w:hAnsi="Arial" w:cs="Arial"/>
+          <w:i/>
+          <w:iCs/>
+          <w:sz w:val="24"/>
+          <w:szCs w:val="24"/>
+        </w:rPr>
+        <w:t>Intellectual Property</w:t>
+      </w:r>
+      <w:r>
+        <w:rPr>
+          <w:rFonts w:ascii="Arial" w:hAnsi="Arial" w:cs="Arial"/>
+          <w:sz w:val="24"/>
+          <w:szCs w:val="24"/>
+        </w:rPr>
+        <w:t xml:space="preserve">) </w:t>
+      </w:r>
+      <w:r>
+        <w:rPr>
+          <w:rFonts w:ascii="Arial" w:hAnsi="Arial" w:cs="Arial"/>
+          <w:sz w:val="24"/>
+          <w:szCs w:val="24"/>
+        </w:rPr>
+        <w:t>și pentru comunicația dintre sistemul de procesare și logica programabilă</w:t>
+      </w:r>
+      <w:r>
+        <w:rPr>
+          <w:rFonts w:ascii="Arial" w:hAnsi="Arial" w:cs="Arial"/>
+          <w:sz w:val="24"/>
+          <w:szCs w:val="24"/>
+        </w:rPr>
+        <w:t xml:space="preserve"> [14]</w:t>
+      </w:r>
+      <w:r>
+        <w:rPr>
+          <w:rFonts w:ascii="Arial" w:hAnsi="Arial" w:cs="Arial"/>
+          <w:sz w:val="24"/>
+          <w:szCs w:val="24"/>
+        </w:rPr>
+        <w:t>.</w:t>
+      </w:r>
+    </w:p>
+    <w:p>
+      <w:pPr>
+        <w:ind w:firstLine="576"/>
+        <w:jc w:val="both"/>
+        <w:rPr>
+          <w:rFonts w:ascii="Arial" w:hAnsi="Arial" w:cs="Arial"/>
+          <w:sz w:val="24"/>
+          <w:szCs w:val="24"/>
+        </w:rPr>
+      </w:pPr>
+      <w:r>
+        <w:rPr>
+          <w:rFonts w:ascii="Arial" w:hAnsi="Arial" w:cs="Arial"/>
+          <w:sz w:val="24"/>
+          <w:szCs w:val="24"/>
+        </w:rPr>
+        <w:t>Familia AXI4 include trei variante principale: AXI4, destinat comunicațiilor memory-mapped cu cerințe ridicate de performanță, AXI4-Lite, destinat transferurilor simple și cu debit redus, și AXI4-Stream, utilizat pentru fluxuri continue de date.</w:t>
+      </w:r>
+    </w:p>
+    <w:p>
+      <w:pPr>
+        <w:ind w:firstLine="576"/>
+        <w:jc w:val="both"/>
+        <w:rPr>
+          <w:rFonts w:ascii="Arial" w:hAnsi="Arial" w:cs="Arial"/>
+          <w:sz w:val="24"/>
+          <w:szCs w:val="24"/>
+        </w:rPr>
+      </w:pPr>
+      <w:r>
+        <w:rPr>
+          <w:rFonts w:ascii="Arial" w:hAnsi="Arial" w:cs="Arial"/>
+          <w:sz w:val="24"/>
+          <w:szCs w:val="24"/>
+        </w:rPr>
+        <w:t xml:space="preserve">AXI4-Lite este destinat în principal accesului la registre de control și stare. Spre deosebire de AXI4, acesta nu suportă transferuri de tip </w:t>
+      </w:r>
+      <w:r>
+        <w:rPr>
+          <w:rFonts w:ascii="Arial" w:hAnsi="Arial" w:cs="Arial"/>
+          <w:i/>
+          <w:iCs/>
+          <w:sz w:val="24"/>
+          <w:szCs w:val="24"/>
+        </w:rPr>
+        <w:t>burst</w:t>
+      </w:r>
+      <w:r>
+        <w:rPr>
+          <w:rFonts w:ascii="Arial" w:hAnsi="Arial" w:cs="Arial"/>
+          <w:sz w:val="24"/>
+          <w:szCs w:val="24"/>
+        </w:rPr>
+        <w:t>, fiecare tranzacție fiind asociată unui singur transfer de date</w:t>
+      </w:r>
+      <w:r>
+        <w:rPr>
+          <w:rFonts w:ascii="Arial" w:hAnsi="Arial" w:cs="Arial"/>
+          <w:sz w:val="24"/>
+          <w:szCs w:val="24"/>
+        </w:rPr>
+        <w:t xml:space="preserve"> [14]</w:t>
+      </w:r>
+      <w:r>
+        <w:rPr>
+          <w:rFonts w:ascii="Arial" w:hAnsi="Arial" w:cs="Arial"/>
+          <w:sz w:val="24"/>
+          <w:szCs w:val="24"/>
+        </w:rPr>
+        <w:t>. Caracterul său simplificat conduce la o complexitate hardware redusă, făcându-l potrivit pentru controlul perifericelor și al acceleratoarelor hardware.</w:t>
+      </w:r>
+    </w:p>
+    <w:p>
+      <w:pPr>
+        <w:ind w:firstLine="576"/>
+        <w:jc w:val="both"/>
+        <w:rPr>
+          <w:rFonts w:ascii="Arial" w:hAnsi="Arial" w:cs="Arial"/>
+          <w:sz w:val="24"/>
+          <w:szCs w:val="24"/>
+        </w:rPr>
+      </w:pPr>
+      <w:r>
+        <w:rPr>
+          <w:rFonts w:ascii="Arial" w:hAnsi="Arial" w:cs="Arial"/>
+          <w:sz w:val="24"/>
+          <w:szCs w:val="24"/>
+        </w:rPr>
+        <w:t>Interfața AXI4-Lite este organizată în cinci canale independente: canalul de adresă pentru scriere, canalul de date pentru scriere, canalul de răspuns la scriere, canalul de adresă pentru citire și canalul de date pentru citire</w:t>
+      </w:r>
+      <w:r>
+        <w:rPr>
+          <w:rFonts w:ascii="Arial" w:hAnsi="Arial" w:cs="Arial"/>
+          <w:sz w:val="24"/>
+          <w:szCs w:val="24"/>
+        </w:rPr>
+        <w:t xml:space="preserve"> </w:t>
+      </w:r>
+      <w:r>
+        <w:rPr>
+          <w:rFonts w:ascii="Arial" w:hAnsi="Arial" w:cs="Arial"/>
+          <w:sz w:val="24"/>
+          <w:szCs w:val="24"/>
+          <w:lang w:val="en-US"/>
+        </w:rPr>
+        <w:t>[14]</w:t>
+      </w:r>
+      <w:r>
+        <w:rPr>
+          <w:rFonts w:ascii="Arial" w:hAnsi="Arial" w:cs="Arial"/>
+          <w:sz w:val="24"/>
+          <w:szCs w:val="24"/>
+        </w:rPr>
+        <w:t>.</w:t>
+      </w:r>
+      <w:r>
+        <w:rPr>
+          <w:rFonts w:ascii="Arial" w:hAnsi="Arial" w:cs="Arial"/>
+          <w:sz w:val="24"/>
+          <w:szCs w:val="24"/>
+        </w:rPr>
+        <w:t xml:space="preserve"> Această separare permite efectuarea în paralel a transferurilor de citire și scriere.</w:t>
+      </w:r>
+      <w:r>
+        <w:rPr>
+          <w:rFonts w:ascii="Arial" w:hAnsi="Arial" w:cs="Arial"/>
+          <w:sz w:val="24"/>
+          <w:szCs w:val="24"/>
+        </w:rPr>
+        <w:t xml:space="preserve"> </w:t>
+      </w:r>
+    </w:p>
+    <w:p>
+      <w:pPr>
+        <w:ind w:firstLine="576"/>
+        <w:jc w:val="both"/>
+        <w:rPr>
+          <w:rFonts w:ascii="Arial" w:hAnsi="Arial" w:cs="Arial"/>
+          <w:sz w:val="24"/>
+          <w:szCs w:val="24"/>
+        </w:rPr>
+      </w:pPr>
+      <w:r>
+        <w:rPr>
+          <w:rFonts w:ascii="Arial" w:hAnsi="Arial" w:cs="Arial"/>
+          <w:sz w:val="24"/>
+          <w:szCs w:val="24"/>
+        </w:rPr>
+        <w:t>Fiecare canal este asociat cu o conduită</w:t>
+      </w:r>
+      <w:r>
+        <w:rPr>
+          <w:rFonts w:ascii="Arial" w:hAnsi="Arial" w:cs="Arial"/>
+          <w:sz w:val="24"/>
+          <w:szCs w:val="24"/>
+        </w:rPr>
+        <w:t xml:space="preserve"> </w:t>
+      </w:r>
+      <w:r>
+        <w:rPr>
+          <w:rFonts w:ascii="Arial" w:hAnsi="Arial" w:cs="Arial"/>
+          <w:sz w:val="24"/>
+          <w:szCs w:val="24"/>
+        </w:rPr>
+        <w:t xml:space="preserve">reprezentată de semnalele </w:t>
+      </w:r>
+      <w:r>
+        <w:rPr>
+          <w:rFonts w:ascii="Arial" w:hAnsi="Arial" w:cs="Arial"/>
+          <w:i/>
+          <w:iCs/>
+          <w:sz w:val="24"/>
+          <w:szCs w:val="24"/>
+        </w:rPr>
+        <w:t>ready</w:t>
+      </w:r>
+      <w:r>
+        <w:rPr>
+          <w:rFonts w:ascii="Arial" w:hAnsi="Arial" w:cs="Arial"/>
+          <w:sz w:val="24"/>
+          <w:szCs w:val="24"/>
+        </w:rPr>
+        <w:t xml:space="preserve"> și </w:t>
+      </w:r>
+      <w:r>
+        <w:rPr>
+          <w:rFonts w:ascii="Arial" w:hAnsi="Arial" w:cs="Arial"/>
+          <w:i/>
+          <w:iCs/>
+          <w:sz w:val="24"/>
+          <w:szCs w:val="24"/>
+        </w:rPr>
+        <w:t>valid</w:t>
+      </w:r>
+      <w:r>
+        <w:rPr>
+          <w:rFonts w:ascii="Arial" w:hAnsi="Arial" w:cs="Arial"/>
+          <w:sz w:val="24"/>
+          <w:szCs w:val="24"/>
+        </w:rPr>
+        <w:t>.</w:t>
+      </w:r>
+      <w:r>
+        <w:rPr>
+          <w:rFonts w:ascii="Arial" w:hAnsi="Arial" w:cs="Arial"/>
+          <w:sz w:val="24"/>
+          <w:szCs w:val="24"/>
+        </w:rPr>
+        <w:t xml:space="preserve"> </w:t>
+      </w:r>
+      <w:r>
+        <w:rPr>
+          <w:rFonts w:ascii="Arial" w:hAnsi="Arial" w:cs="Arial"/>
+          <w:sz w:val="24"/>
+          <w:szCs w:val="24"/>
+        </w:rPr>
+        <w:t xml:space="preserve">Sursa semnalizează disponibilitatea informației prin activarea semnalului </w:t>
+      </w:r>
+      <w:r>
+        <w:rPr>
+          <w:rFonts w:ascii="Arial" w:hAnsi="Arial" w:cs="Arial"/>
+          <w:i/>
+          <w:iCs/>
+          <w:sz w:val="24"/>
+          <w:szCs w:val="24"/>
+        </w:rPr>
+        <w:t>valid</w:t>
+      </w:r>
+      <w:r>
+        <w:rPr>
+          <w:rFonts w:ascii="Arial" w:hAnsi="Arial" w:cs="Arial"/>
+          <w:sz w:val="24"/>
+          <w:szCs w:val="24"/>
+        </w:rPr>
+        <w:t xml:space="preserve">, iar destinația indică posibilitatea recepționării acesteia prin activarea semnalului </w:t>
+      </w:r>
+      <w:r>
+        <w:rPr>
+          <w:rFonts w:ascii="Arial" w:hAnsi="Arial" w:cs="Arial"/>
+          <w:i/>
+          <w:iCs/>
+          <w:sz w:val="24"/>
+          <w:szCs w:val="24"/>
+        </w:rPr>
+        <w:t>ready</w:t>
+      </w:r>
+      <w:r>
+        <w:rPr>
+          <w:rFonts w:ascii="Arial" w:hAnsi="Arial" w:cs="Arial"/>
+          <w:sz w:val="24"/>
+          <w:szCs w:val="24"/>
+        </w:rPr>
+        <w:t>. Transferul are loc atunci când cele două semnale sunt active simultan</w:t>
+      </w:r>
+      <w:r>
+        <w:rPr>
+          <w:rFonts w:ascii="Arial" w:hAnsi="Arial" w:cs="Arial"/>
+          <w:sz w:val="24"/>
+          <w:szCs w:val="24"/>
+        </w:rPr>
+        <w:t xml:space="preserve"> </w:t>
+      </w:r>
+      <w:r>
+        <w:rPr>
+          <w:rFonts w:ascii="Arial" w:hAnsi="Arial" w:cs="Arial"/>
+          <w:sz w:val="24"/>
+          <w:szCs w:val="24"/>
+          <w:lang w:val="en-US"/>
+        </w:rPr>
+        <w:t>[14]</w:t>
+      </w:r>
+      <w:r>
+        <w:rPr>
+          <w:rFonts w:ascii="Arial" w:hAnsi="Arial" w:cs="Arial"/>
+          <w:sz w:val="24"/>
+          <w:szCs w:val="24"/>
+        </w:rPr>
+        <w:t>.</w:t>
+      </w:r>
+    </w:p>
+    <w:p>
+      <w:pPr>
+        <w:ind w:firstLine="576"/>
+        <w:jc w:val="both"/>
+        <w:rPr>
+          <w:rFonts w:ascii="Arial" w:hAnsi="Arial" w:cs="Arial"/>
+          <w:sz w:val="24"/>
+          <w:szCs w:val="24"/>
+          <w:lang w:val="en-US"/>
+        </w:rPr>
+      </w:pPr>
+      <w:r>
+        <w:rPr>
+          <w:rFonts w:ascii="Arial" w:hAnsi="Arial" w:cs="Arial"/>
+          <w:sz w:val="24"/>
+          <w:szCs w:val="24"/>
+        </w:rPr>
+        <w:t>Fiind</w:t>
+      </w:r>
+      <w:r>
+        <w:rPr>
+          <w:rFonts w:ascii="Arial" w:hAnsi="Arial" w:cs="Arial"/>
+          <w:sz w:val="24"/>
+          <w:szCs w:val="24"/>
+        </w:rPr>
+        <w:t xml:space="preserve"> </w:t>
+      </w:r>
+      <w:r>
+        <w:rPr>
+          <w:rFonts w:ascii="Arial" w:hAnsi="Arial" w:cs="Arial"/>
+          <w:sz w:val="24"/>
+          <w:szCs w:val="24"/>
+        </w:rPr>
+        <w:t xml:space="preserve">este </w:t>
+      </w:r>
+      <w:r>
+        <w:rPr>
+          <w:rFonts w:ascii="Arial" w:hAnsi="Arial" w:cs="Arial"/>
+          <w:sz w:val="24"/>
+          <w:szCs w:val="24"/>
+        </w:rPr>
+        <w:t xml:space="preserve">un protocol de tip </w:t>
+      </w:r>
+      <w:r>
+        <w:rPr>
+          <w:rFonts w:ascii="Arial" w:hAnsi="Arial" w:cs="Arial"/>
+          <w:i/>
+          <w:iCs/>
+          <w:sz w:val="24"/>
+          <w:szCs w:val="24"/>
+        </w:rPr>
+        <w:t>memory-mapped</w:t>
+      </w:r>
+      <w:r>
+        <w:rPr>
+          <w:rFonts w:ascii="Arial" w:hAnsi="Arial" w:cs="Arial"/>
+          <w:sz w:val="24"/>
+          <w:szCs w:val="24"/>
+        </w:rPr>
+        <w:t>, AXI4-Lite permite asocierea registrelor unui nucleu IP cu adrese din spațiul de memorie al procesorului. Astfel, software-ul poate controla un accelerator hardware prin operații obișnuite de citire și scriere asupra registrelor asociate acestuia</w:t>
+      </w:r>
+      <w:r>
+        <w:rPr>
+          <w:rFonts w:ascii="Arial" w:hAnsi="Arial" w:cs="Arial"/>
+          <w:sz w:val="24"/>
+          <w:szCs w:val="24"/>
+        </w:rPr>
+        <w:t>.</w:t>
+      </w:r>
+    </w:p>
+    <w:p/>
+    <w:p/>
+    <w:p/>
     <w:sectPr>
       <w:headerReference w:type="default" r:id="rId43"/>
       <w:footerReference w:type="default" r:id="rId44"/>
@@ -38639,7 +37253,6 @@
         </wp:anchor>
       </w:drawing>
     </w:r>
-    <w:proofErr w:type="spellStart"/>
     <w:r>
       <w:rPr>
         <w:rFonts w:ascii="Arial" w:hAnsi="Arial" w:cs="Arial"/>
@@ -38647,27 +37260,7 @@
         <w:szCs w:val="24"/>
         <w:lang w:val="en-US"/>
       </w:rPr>
-      <w:t>Securitatea</w:t>
-    </w:r>
-    <w:proofErr w:type="spellEnd"/>
-    <w:r>
-      <w:rPr>
-        <w:rFonts w:ascii="Arial" w:hAnsi="Arial" w:cs="Arial"/>
-        <w:sz w:val="24"/>
-        <w:szCs w:val="24"/>
-        <w:lang w:val="en-US"/>
-      </w:rPr>
-      <w:t xml:space="preserve"> </w:t>
-    </w:r>
-    <w:proofErr w:type="spellStart"/>
-    <w:r>
-      <w:rPr>
-        <w:rFonts w:ascii="Arial" w:hAnsi="Arial" w:cs="Arial"/>
-        <w:sz w:val="24"/>
-        <w:szCs w:val="24"/>
-        <w:lang w:val="en-US"/>
-      </w:rPr>
-      <w:t>Infoma</w:t>
+      <w:t>Securitatea Infoma</w:t>
     </w:r>
     <w:r>
       <w:rPr>
@@ -38675,16 +37268,7 @@
         <w:sz w:val="24"/>
         <w:szCs w:val="24"/>
       </w:rPr>
-      <w:t>țiilor</w:t>
-    </w:r>
-    <w:proofErr w:type="spellEnd"/>
-    <w:r>
-      <w:rPr>
-        <w:rFonts w:ascii="Arial" w:hAnsi="Arial" w:cs="Arial"/>
-        <w:sz w:val="24"/>
-        <w:szCs w:val="24"/>
-      </w:rPr>
-      <w:t xml:space="preserve"> și a Sistemelor Cibernetice</w:t>
+      <w:t>țiilor și a Sistemelor Cibernetice</w:t>
     </w:r>
     <w:r>
       <w:rPr>
@@ -41347,9 +39931,9 @@
   </w:compat>
   <w:rsids>
     <w:rsidRoot w:val="00F924A7"/>
-    <w:rsid w:val="00114BC4"/>
     <w:rsid w:val="00192327"/>
     <w:rsid w:val="001D3BF4"/>
+    <w:rsid w:val="00640F0A"/>
     <w:rsid w:val="0072317D"/>
     <w:rsid w:val="007B47C5"/>
     <w:rsid w:val="00844611"/>

</xml_diff>

<commit_message>
General project structure diagram
</commit_message>
<xml_diff>
--- a/Paper/BDA_AES.docx
+++ b/Paper/BDA_AES.docx
@@ -40514,6 +40514,727 @@
         <w:pStyle w:val="Heading2"/>
       </w:pPr>
       <w:r>
+        <w:t>STRUCTURA PROIECTULUI VHDL</w:t>
+      </w:r>
+    </w:p>
+    <w:p>
+      <w:pPr>
+        <w:rPr>
+          <w:rFonts w:ascii="Arial" w:hAnsi="Arial" w:cs="Arial"/>
+          <w:sz w:val="24"/>
+          <w:szCs w:val="24"/>
+        </w:rPr>
+      </w:pPr>
+    </w:p>
+    <w:p>
+      <w:pPr>
+        <w:ind w:firstLine="576"/>
+        <w:jc w:val="both"/>
+        <w:rPr>
+          <w:rFonts w:ascii="Arial" w:hAnsi="Arial" w:cs="Arial"/>
+          <w:sz w:val="24"/>
+          <w:szCs w:val="24"/>
+        </w:rPr>
+      </w:pPr>
+      <w:r>
+        <w:rPr>
+          <w:rFonts w:ascii="Arial" w:hAnsi="Arial" w:cs="Arial"/>
+          <w:sz w:val="24"/>
+          <w:szCs w:val="24"/>
+        </w:rPr>
+        <w:t xml:space="preserve">Proiectul VHDL aferent nucleului criptografic a fost organizat într-o structură modulară, în care funcționalitățile principale sunt separate în fișiere și biblioteci </w:t>
+      </w:r>
+      <w:r>
+        <w:rPr>
+          <w:rFonts w:ascii="Arial" w:hAnsi="Arial" w:cs="Arial"/>
+          <w:sz w:val="24"/>
+          <w:szCs w:val="24"/>
+        </w:rPr>
+        <w:t>diferite</w:t>
+      </w:r>
+      <w:r>
+        <w:rPr>
+          <w:rFonts w:ascii="Arial" w:hAnsi="Arial" w:cs="Arial"/>
+          <w:sz w:val="24"/>
+          <w:szCs w:val="24"/>
+        </w:rPr>
+        <w:t xml:space="preserve">. Această abordare urmărește reducerea </w:t>
+      </w:r>
+      <w:r>
+        <w:rPr>
+          <w:rFonts w:ascii="Arial" w:hAnsi="Arial" w:cs="Arial"/>
+          <w:sz w:val="24"/>
+          <w:szCs w:val="24"/>
+        </w:rPr>
+        <w:t>interdependențelor modulare</w:t>
+      </w:r>
+      <w:r>
+        <w:rPr>
+          <w:rFonts w:ascii="Arial" w:hAnsi="Arial" w:cs="Arial"/>
+          <w:sz w:val="24"/>
+          <w:szCs w:val="24"/>
+        </w:rPr>
+        <w:t xml:space="preserve"> permite dezvoltarea, testarea</w:t>
+      </w:r>
+      <w:r>
+        <w:rPr>
+          <w:rFonts w:ascii="Arial" w:hAnsi="Arial" w:cs="Arial"/>
+          <w:sz w:val="24"/>
+          <w:szCs w:val="24"/>
+        </w:rPr>
+        <w:t xml:space="preserve">, respectiv </w:t>
+      </w:r>
+      <w:r>
+        <w:rPr>
+          <w:rFonts w:ascii="Arial" w:hAnsi="Arial" w:cs="Arial"/>
+          <w:sz w:val="24"/>
+          <w:szCs w:val="24"/>
+        </w:rPr>
+        <w:t xml:space="preserve">reutilizarea </w:t>
+      </w:r>
+      <w:r>
+        <w:rPr>
+          <w:rFonts w:ascii="Arial" w:hAnsi="Arial" w:cs="Arial"/>
+          <w:sz w:val="24"/>
+          <w:szCs w:val="24"/>
+        </w:rPr>
+        <w:t>componentelor</w:t>
+      </w:r>
+      <w:r>
+        <w:rPr>
+          <w:rFonts w:ascii="Arial" w:hAnsi="Arial" w:cs="Arial"/>
+          <w:sz w:val="24"/>
+          <w:szCs w:val="24"/>
+        </w:rPr>
+        <w:t xml:space="preserve"> hardware.</w:t>
+      </w:r>
+    </w:p>
+    <w:p>
+      <w:pPr>
+        <w:ind w:firstLine="576"/>
+        <w:jc w:val="both"/>
+        <w:rPr>
+          <w:rFonts w:ascii="Arial" w:hAnsi="Arial" w:cs="Arial"/>
+          <w:sz w:val="24"/>
+          <w:szCs w:val="24"/>
+        </w:rPr>
+      </w:pPr>
+      <w:r>
+        <w:rPr>
+          <w:rFonts w:ascii="Arial" w:hAnsi="Arial" w:cs="Arial"/>
+          <w:sz w:val="24"/>
+          <w:szCs w:val="24"/>
+        </w:rPr>
+        <w:t xml:space="preserve">În cadrul implementării realizate, </w:t>
+      </w:r>
+      <w:r>
+        <w:rPr>
+          <w:rFonts w:ascii="Arial" w:hAnsi="Arial" w:cs="Arial"/>
+          <w:sz w:val="24"/>
+          <w:szCs w:val="24"/>
+        </w:rPr>
+        <w:t>structurile auxiliare</w:t>
+      </w:r>
+      <w:r>
+        <w:rPr>
+          <w:rFonts w:ascii="Arial" w:hAnsi="Arial" w:cs="Arial"/>
+          <w:sz w:val="24"/>
+          <w:szCs w:val="24"/>
+        </w:rPr>
+        <w:t xml:space="preserve"> comune, precum tipurile de date, funcțiile de conversie și eventualele constante utilizate de mai multe module, sunt grupate într-o bibliotecă separată. Modulele care implementează transformările AES pot importa astfel doar resursele necesare</w:t>
+      </w:r>
+      <w:r>
+        <w:rPr>
+          <w:rFonts w:ascii="Arial" w:hAnsi="Arial" w:cs="Arial"/>
+          <w:sz w:val="24"/>
+          <w:szCs w:val="24"/>
+        </w:rPr>
+        <w:t>.</w:t>
+      </w:r>
+    </w:p>
+    <w:p>
+      <w:pPr>
+        <w:rPr>
+          <w:rFonts w:ascii="Arial" w:hAnsi="Arial" w:cs="Arial"/>
+          <w:sz w:val="24"/>
+          <w:szCs w:val="24"/>
+        </w:rPr>
+      </w:pPr>
+    </w:p>
+    <w:p>
+      <w:pPr>
+        <w:rPr>
+          <w:rFonts w:ascii="Arial" w:hAnsi="Arial" w:cs="Arial"/>
+          <w:sz w:val="24"/>
+          <w:szCs w:val="24"/>
+        </w:rPr>
+      </w:pPr>
+    </w:p>
+    <w:p>
+      <w:pPr>
+        <w:ind w:firstLine="576"/>
+        <w:jc w:val="both"/>
+        <w:rPr>
+          <w:rFonts w:ascii="Arial" w:hAnsi="Arial" w:cs="Arial"/>
+          <w:sz w:val="24"/>
+          <w:szCs w:val="24"/>
+        </w:rPr>
+      </w:pPr>
+      <w:r>
+        <w:rPr>
+          <w:rFonts w:ascii="Arial" w:hAnsi="Arial" w:cs="Arial"/>
+          <w:sz w:val="24"/>
+          <w:szCs w:val="24"/>
+        </w:rPr>
+        <w:t xml:space="preserve">Această separare contribuie și la procesul de verificare. Fiecare modul poate fi asociat unui </w:t>
+      </w:r>
+      <w:proofErr w:type="spellStart"/>
+      <w:r>
+        <w:rPr>
+          <w:rFonts w:ascii="Arial" w:hAnsi="Arial" w:cs="Arial"/>
+          <w:i/>
+          <w:iCs/>
+          <w:sz w:val="24"/>
+          <w:szCs w:val="24"/>
+        </w:rPr>
+        <w:t>testbench</w:t>
+      </w:r>
+      <w:proofErr w:type="spellEnd"/>
+      <w:r>
+        <w:rPr>
+          <w:rFonts w:ascii="Arial" w:hAnsi="Arial" w:cs="Arial"/>
+          <w:sz w:val="24"/>
+          <w:szCs w:val="24"/>
+        </w:rPr>
+        <w:t xml:space="preserve"> propriu, iar eventualele modificări efectuate asupra unei componente pot fi validate izolat înainte de integrarea în nucleul complet. În plus, păstrarea unei ierarhii clare facilitează interpretarea rezultatelor obținute în etapele </w:t>
+      </w:r>
+      <w:r>
+        <w:rPr>
+          <w:rFonts w:ascii="Arial" w:hAnsi="Arial" w:cs="Arial"/>
+          <w:sz w:val="24"/>
+          <w:szCs w:val="24"/>
+        </w:rPr>
+        <w:t xml:space="preserve">de </w:t>
+      </w:r>
+      <w:r>
+        <w:rPr>
+          <w:rFonts w:ascii="Arial" w:hAnsi="Arial" w:cs="Arial"/>
+          <w:sz w:val="24"/>
+          <w:szCs w:val="24"/>
+        </w:rPr>
+        <w:t>sinteză și implementare</w:t>
+      </w:r>
+      <w:r>
+        <w:rPr>
+          <w:rFonts w:ascii="Arial" w:hAnsi="Arial" w:cs="Arial"/>
+          <w:sz w:val="24"/>
+          <w:szCs w:val="24"/>
+        </w:rPr>
+        <w:t>.</w:t>
+      </w:r>
+    </w:p>
+    <w:p>
+      <w:pPr>
+        <w:ind w:firstLine="576"/>
+        <w:jc w:val="both"/>
+        <w:rPr>
+          <w:rFonts w:ascii="Arial" w:hAnsi="Arial" w:cs="Arial"/>
+          <w:sz w:val="24"/>
+          <w:szCs w:val="24"/>
+        </w:rPr>
+      </w:pPr>
+      <w:r>
+        <w:rPr>
+          <w:rFonts w:ascii="Arial" w:hAnsi="Arial" w:cs="Arial"/>
+          <w:sz w:val="24"/>
+          <w:szCs w:val="24"/>
+        </w:rPr>
+        <w:t xml:space="preserve">Componenta de </w:t>
+      </w:r>
+      <w:proofErr w:type="spellStart"/>
+      <w:r>
+        <w:rPr>
+          <w:rFonts w:ascii="Arial" w:hAnsi="Arial" w:cs="Arial"/>
+          <w:sz w:val="24"/>
+          <w:szCs w:val="24"/>
+        </w:rPr>
+        <w:t>firmware</w:t>
+      </w:r>
+      <w:proofErr w:type="spellEnd"/>
+      <w:r>
+        <w:rPr>
+          <w:rFonts w:ascii="Arial" w:hAnsi="Arial" w:cs="Arial"/>
+          <w:sz w:val="24"/>
+          <w:szCs w:val="24"/>
+        </w:rPr>
+        <w:t xml:space="preserve"> a proiectului este menținută separat, în cadrul mediului de dezvoltare </w:t>
+      </w:r>
+      <w:proofErr w:type="spellStart"/>
+      <w:r>
+        <w:rPr>
+          <w:rFonts w:ascii="Arial" w:hAnsi="Arial" w:cs="Arial"/>
+          <w:sz w:val="24"/>
+          <w:szCs w:val="24"/>
+        </w:rPr>
+        <w:t>Vitis</w:t>
+      </w:r>
+      <w:proofErr w:type="spellEnd"/>
+      <w:r>
+        <w:rPr>
+          <w:rFonts w:ascii="Arial" w:hAnsi="Arial" w:cs="Arial"/>
+          <w:sz w:val="24"/>
+          <w:szCs w:val="24"/>
+        </w:rPr>
+        <w:t>.</w:t>
+      </w:r>
+      <w:r>
+        <w:rPr>
+          <w:rFonts w:ascii="Arial" w:hAnsi="Arial" w:cs="Arial"/>
+          <w:sz w:val="24"/>
+          <w:szCs w:val="24"/>
+        </w:rPr>
+        <w:t xml:space="preserve"> Astfel, la nivelul acestuia a fost definită o platformă </w:t>
+      </w:r>
+      <w:r>
+        <w:rPr>
+          <w:rFonts w:ascii="Arial" w:hAnsi="Arial" w:cs="Arial"/>
+          <w:i/>
+          <w:iCs/>
+          <w:sz w:val="24"/>
+          <w:szCs w:val="24"/>
+        </w:rPr>
+        <w:t xml:space="preserve">hardware </w:t>
+      </w:r>
+      <w:r>
+        <w:rPr>
+          <w:rFonts w:ascii="Arial" w:hAnsi="Arial" w:cs="Arial"/>
+          <w:sz w:val="24"/>
+          <w:szCs w:val="24"/>
+        </w:rPr>
+        <w:t xml:space="preserve">care, prin intermediul unui un </w:t>
+      </w:r>
+      <w:r>
+        <w:rPr>
+          <w:rFonts w:ascii="Arial" w:hAnsi="Arial" w:cs="Arial"/>
+          <w:i/>
+          <w:iCs/>
+          <w:sz w:val="24"/>
+          <w:szCs w:val="24"/>
+        </w:rPr>
+        <w:t xml:space="preserve">board </w:t>
+      </w:r>
+      <w:proofErr w:type="spellStart"/>
+      <w:r>
+        <w:rPr>
+          <w:rFonts w:ascii="Arial" w:hAnsi="Arial" w:cs="Arial"/>
+          <w:i/>
+          <w:iCs/>
+          <w:sz w:val="24"/>
+          <w:szCs w:val="24"/>
+        </w:rPr>
+        <w:t>support</w:t>
+      </w:r>
+      <w:proofErr w:type="spellEnd"/>
+      <w:r>
+        <w:rPr>
+          <w:rFonts w:ascii="Arial" w:hAnsi="Arial" w:cs="Arial"/>
+          <w:i/>
+          <w:iCs/>
+          <w:sz w:val="24"/>
+          <w:szCs w:val="24"/>
+        </w:rPr>
+        <w:t xml:space="preserve"> </w:t>
+      </w:r>
+      <w:proofErr w:type="spellStart"/>
+      <w:r>
+        <w:rPr>
+          <w:rFonts w:ascii="Arial" w:hAnsi="Arial" w:cs="Arial"/>
+          <w:i/>
+          <w:iCs/>
+          <w:sz w:val="24"/>
+          <w:szCs w:val="24"/>
+        </w:rPr>
+        <w:t>package</w:t>
+      </w:r>
+      <w:proofErr w:type="spellEnd"/>
+      <w:r>
+        <w:rPr>
+          <w:rFonts w:ascii="Arial" w:hAnsi="Arial" w:cs="Arial"/>
+          <w:i/>
+          <w:iCs/>
+          <w:sz w:val="24"/>
+          <w:szCs w:val="24"/>
+        </w:rPr>
+        <w:t xml:space="preserve"> </w:t>
+      </w:r>
+      <w:r>
+        <w:rPr>
+          <w:rFonts w:ascii="Arial" w:hAnsi="Arial" w:cs="Arial"/>
+          <w:sz w:val="24"/>
+          <w:szCs w:val="24"/>
+        </w:rPr>
+        <w:t>(BSP), oferă facilitățile și secvențele de instrucțiuni necesare inițializării sistemului de procesare integrat.</w:t>
+      </w:r>
+    </w:p>
+    <w:p>
+      <w:pPr>
+        <w:ind w:firstLine="576"/>
+        <w:jc w:val="both"/>
+        <w:rPr>
+          <w:rFonts w:ascii="Arial" w:hAnsi="Arial" w:cs="Arial"/>
+          <w:sz w:val="24"/>
+          <w:szCs w:val="24"/>
+        </w:rPr>
+      </w:pPr>
+      <w:r>
+        <w:rPr>
+          <w:rFonts w:ascii="Arial" w:hAnsi="Arial" w:cs="Arial"/>
+          <w:sz w:val="24"/>
+          <w:szCs w:val="24"/>
+        </w:rPr>
+        <w:t xml:space="preserve"> În cazul </w:t>
+      </w:r>
+      <w:r>
+        <w:rPr>
+          <w:rFonts w:ascii="Arial" w:hAnsi="Arial" w:cs="Arial"/>
+          <w:sz w:val="24"/>
+          <w:szCs w:val="24"/>
+        </w:rPr>
+        <w:t>sistemului de față,</w:t>
+      </w:r>
+      <w:r>
+        <w:rPr>
+          <w:rFonts w:ascii="Arial" w:hAnsi="Arial" w:cs="Arial"/>
+          <w:sz w:val="24"/>
+          <w:szCs w:val="24"/>
+        </w:rPr>
+        <w:t xml:space="preserve"> pachetul nu va integra un sistem de operare, aplicație cât </w:t>
+      </w:r>
+      <w:r>
+        <w:rPr>
+          <w:rFonts w:ascii="Arial" w:hAnsi="Arial" w:cs="Arial"/>
+          <w:sz w:val="24"/>
+          <w:szCs w:val="24"/>
+        </w:rPr>
+        <w:t>ș</w:t>
+      </w:r>
+      <w:r>
+        <w:rPr>
+          <w:rFonts w:ascii="Arial" w:hAnsi="Arial" w:cs="Arial"/>
+          <w:sz w:val="24"/>
+          <w:szCs w:val="24"/>
+        </w:rPr>
+        <w:t xml:space="preserve">i </w:t>
+      </w:r>
+      <w:proofErr w:type="spellStart"/>
+      <w:r>
+        <w:rPr>
+          <w:rFonts w:ascii="Arial" w:hAnsi="Arial" w:cs="Arial"/>
+          <w:sz w:val="24"/>
+          <w:szCs w:val="24"/>
+        </w:rPr>
+        <w:t>firmware-ul</w:t>
+      </w:r>
+      <w:proofErr w:type="spellEnd"/>
+      <w:r>
+        <w:rPr>
+          <w:rFonts w:ascii="Arial" w:hAnsi="Arial" w:cs="Arial"/>
+          <w:sz w:val="24"/>
+          <w:szCs w:val="24"/>
+        </w:rPr>
+        <w:t xml:space="preserve"> vor rula într-un mediu </w:t>
+      </w:r>
+      <w:r>
+        <w:rPr>
+          <w:rFonts w:ascii="Arial" w:hAnsi="Arial" w:cs="Arial"/>
+          <w:i/>
+          <w:iCs/>
+          <w:sz w:val="24"/>
+          <w:szCs w:val="24"/>
+        </w:rPr>
+        <w:t>bare-metal</w:t>
+      </w:r>
+      <w:r>
+        <w:rPr>
+          <w:rFonts w:ascii="Arial" w:hAnsi="Arial" w:cs="Arial"/>
+          <w:sz w:val="24"/>
+          <w:szCs w:val="24"/>
+        </w:rPr>
+        <w:t>.</w:t>
+      </w:r>
+      <w:r>
+        <w:rPr>
+          <w:rFonts w:ascii="Arial" w:hAnsi="Arial" w:cs="Arial"/>
+          <w:sz w:val="24"/>
+          <w:szCs w:val="24"/>
+        </w:rPr>
+        <w:t xml:space="preserve"> Bineînțeles, utilizarea unui sistem de operare dedicat, precum </w:t>
+      </w:r>
+      <w:proofErr w:type="spellStart"/>
+      <w:r>
+        <w:rPr>
+          <w:rFonts w:ascii="Arial" w:hAnsi="Arial" w:cs="Arial"/>
+          <w:i/>
+          <w:iCs/>
+          <w:sz w:val="24"/>
+          <w:szCs w:val="24"/>
+        </w:rPr>
+        <w:t>PetaLinux</w:t>
+      </w:r>
+      <w:proofErr w:type="spellEnd"/>
+      <w:r>
+        <w:rPr>
+          <w:rFonts w:ascii="Arial" w:hAnsi="Arial" w:cs="Arial"/>
+          <w:sz w:val="24"/>
+          <w:szCs w:val="24"/>
+        </w:rPr>
+        <w:t xml:space="preserve"> este posibilă însă, un astfel de scop nu este vizat de proiectul dezvoltat.</w:t>
+      </w:r>
+    </w:p>
+    <w:p>
+      <w:pPr>
+        <w:rPr>
+          <w:rFonts w:ascii="Arial" w:hAnsi="Arial" w:cs="Arial"/>
+          <w:sz w:val="24"/>
+          <w:szCs w:val="24"/>
+        </w:rPr>
+      </w:pPr>
+      <w:r>
+        <w:rPr>
+          <w:rFonts w:ascii="Arial" w:hAnsi="Arial" w:cs="Arial"/>
+          <w:sz w:val="24"/>
+          <w:szCs w:val="24"/>
+        </w:rPr>
+        <w:tab/>
+        <w:t>Structura organizațională a proiectului este prezentată în cadrul Figurii 5.</w:t>
+      </w:r>
+      <w:r>
+        <w:rPr>
+          <w:rFonts w:ascii="Arial" w:hAnsi="Arial" w:cs="Arial"/>
+          <w:sz w:val="24"/>
+          <w:szCs w:val="24"/>
+        </w:rPr>
+        <w:t>2</w:t>
+      </w:r>
+      <w:r>
+        <w:rPr>
+          <w:rFonts w:ascii="Arial" w:hAnsi="Arial" w:cs="Arial"/>
+          <w:sz w:val="24"/>
+          <w:szCs w:val="24"/>
+        </w:rPr>
+        <w:t>.</w:t>
+      </w:r>
+    </w:p>
+    <w:p>
+      <w:pPr>
+        <w:rPr>
+          <w:rFonts w:ascii="Arial" w:hAnsi="Arial" w:cs="Arial"/>
+          <w:sz w:val="24"/>
+          <w:szCs w:val="24"/>
+        </w:rPr>
+      </w:pPr>
+    </w:p>
+    <w:p>
+      <w:pPr>
+        <w:keepNext/>
+        <w:jc w:val="center"/>
+      </w:pPr>
+      <w:r>
+        <w:rPr>
+          <w:rFonts w:ascii="Arial" w:hAnsi="Arial" w:cs="Arial"/>
+          <w:noProof/>
+          <w:sz w:val="24"/>
+          <w:szCs w:val="24"/>
+        </w:rPr>
+        <w:drawing>
+          <wp:inline distT="0" distB="0" distL="0" distR="0" wp14:anchorId="1D2D4F6E" wp14:editId="1D3009A5">
+            <wp:extent cx="3321170" cy="2202398"/>
+            <wp:effectExtent l="0" t="0" r="0" b="7620"/>
+            <wp:docPr id="1532425324" name="Graphic 14"/>
+            <wp:cNvGraphicFramePr>
+              <a:graphicFrameLocks xmlns:a="http://schemas.openxmlformats.org/drawingml/2006/main" noChangeAspect="1"/>
+            </wp:cNvGraphicFramePr>
+            <a:graphic xmlns:a="http://schemas.openxmlformats.org/drawingml/2006/main">
+              <a:graphicData uri="http://schemas.openxmlformats.org/drawingml/2006/picture">
+                <pic:pic xmlns:pic="http://schemas.openxmlformats.org/drawingml/2006/picture">
+                  <pic:nvPicPr>
+                    <pic:cNvPr id="1532425324" name="Graphic 1532425324"/>
+                    <pic:cNvPicPr/>
+                  </pic:nvPicPr>
+                  <pic:blipFill>
+                    <a:blip r:embed="rId46">
+                      <a:extLst>
+                        <a:ext uri="{96DAC541-7B7A-43D3-8B79-37D633B846F1}">
+                          <asvg:svgBlip xmlns:asvg="http://schemas.microsoft.com/office/drawing/2016/SVG/main" r:embed="rId47"/>
+                        </a:ext>
+                      </a:extLst>
+                    </a:blip>
+                    <a:stretch>
+                      <a:fillRect/>
+                    </a:stretch>
+                  </pic:blipFill>
+                  <pic:spPr>
+                    <a:xfrm>
+                      <a:off x="0" y="0"/>
+                      <a:ext cx="3362048" cy="2229506"/>
+                    </a:xfrm>
+                    <a:prstGeom prst="rect">
+                      <a:avLst/>
+                    </a:prstGeom>
+                  </pic:spPr>
+                </pic:pic>
+              </a:graphicData>
+            </a:graphic>
+          </wp:inline>
+        </w:drawing>
+      </w:r>
+    </w:p>
+    <w:p>
+      <w:pPr>
+        <w:pStyle w:val="Caption"/>
+        <w:jc w:val="center"/>
+        <w:rPr>
+          <w:rFonts w:ascii="Arial" w:hAnsi="Arial" w:cs="Arial"/>
+          <w:color w:val="auto"/>
+          <w:sz w:val="28"/>
+          <w:szCs w:val="28"/>
+        </w:rPr>
+      </w:pPr>
+      <w:r>
+        <w:rPr>
+          <w:rFonts w:ascii="Arial" w:hAnsi="Arial" w:cs="Arial"/>
+          <w:color w:val="auto"/>
+          <w:sz w:val="20"/>
+          <w:szCs w:val="20"/>
+        </w:rPr>
+        <w:t xml:space="preserve">Figura </w:t>
+      </w:r>
+      <w:r>
+        <w:rPr>
+          <w:rFonts w:ascii="Arial" w:hAnsi="Arial" w:cs="Arial"/>
+          <w:color w:val="auto"/>
+          <w:sz w:val="20"/>
+          <w:szCs w:val="20"/>
+        </w:rPr>
+        <w:fldChar w:fldCharType="begin"/>
+      </w:r>
+      <w:r>
+        <w:rPr>
+          <w:rFonts w:ascii="Arial" w:hAnsi="Arial" w:cs="Arial"/>
+          <w:color w:val="auto"/>
+          <w:sz w:val="20"/>
+          <w:szCs w:val="20"/>
+        </w:rPr>
+        <w:instrText xml:space="preserve"> STYLEREF 1 \s </w:instrText>
+      </w:r>
+      <w:r>
+        <w:rPr>
+          <w:rFonts w:ascii="Arial" w:hAnsi="Arial" w:cs="Arial"/>
+          <w:color w:val="auto"/>
+          <w:sz w:val="20"/>
+          <w:szCs w:val="20"/>
+        </w:rPr>
+        <w:fldChar w:fldCharType="separate"/>
+      </w:r>
+      <w:r>
+        <w:rPr>
+          <w:rFonts w:ascii="Arial" w:hAnsi="Arial" w:cs="Arial"/>
+          <w:noProof/>
+          <w:color w:val="auto"/>
+          <w:sz w:val="20"/>
+          <w:szCs w:val="20"/>
+        </w:rPr>
+        <w:t>5</w:t>
+      </w:r>
+      <w:r>
+        <w:rPr>
+          <w:rFonts w:ascii="Arial" w:hAnsi="Arial" w:cs="Arial"/>
+          <w:color w:val="auto"/>
+          <w:sz w:val="20"/>
+          <w:szCs w:val="20"/>
+        </w:rPr>
+        <w:fldChar w:fldCharType="end"/>
+      </w:r>
+      <w:r>
+        <w:rPr>
+          <w:rFonts w:ascii="Arial" w:hAnsi="Arial" w:cs="Arial"/>
+          <w:color w:val="auto"/>
+          <w:sz w:val="20"/>
+          <w:szCs w:val="20"/>
+        </w:rPr>
+        <w:t>.</w:t>
+      </w:r>
+      <w:r>
+        <w:rPr>
+          <w:rFonts w:ascii="Arial" w:hAnsi="Arial" w:cs="Arial"/>
+          <w:color w:val="auto"/>
+          <w:sz w:val="20"/>
+          <w:szCs w:val="20"/>
+        </w:rPr>
+        <w:fldChar w:fldCharType="begin"/>
+      </w:r>
+      <w:r>
+        <w:rPr>
+          <w:rFonts w:ascii="Arial" w:hAnsi="Arial" w:cs="Arial"/>
+          <w:color w:val="auto"/>
+          <w:sz w:val="20"/>
+          <w:szCs w:val="20"/>
+        </w:rPr>
+        <w:instrText xml:space="preserve"> SEQ Figura \* ARABIC \s 1 </w:instrText>
+      </w:r>
+      <w:r>
+        <w:rPr>
+          <w:rFonts w:ascii="Arial" w:hAnsi="Arial" w:cs="Arial"/>
+          <w:color w:val="auto"/>
+          <w:sz w:val="20"/>
+          <w:szCs w:val="20"/>
+        </w:rPr>
+        <w:fldChar w:fldCharType="separate"/>
+      </w:r>
+      <w:r>
+        <w:rPr>
+          <w:rFonts w:ascii="Arial" w:hAnsi="Arial" w:cs="Arial"/>
+          <w:noProof/>
+          <w:color w:val="auto"/>
+          <w:sz w:val="20"/>
+          <w:szCs w:val="20"/>
+        </w:rPr>
+        <w:t>2</w:t>
+      </w:r>
+      <w:r>
+        <w:rPr>
+          <w:rFonts w:ascii="Arial" w:hAnsi="Arial" w:cs="Arial"/>
+          <w:color w:val="auto"/>
+          <w:sz w:val="20"/>
+          <w:szCs w:val="20"/>
+        </w:rPr>
+        <w:fldChar w:fldCharType="end"/>
+      </w:r>
+      <w:r>
+        <w:rPr>
+          <w:rFonts w:ascii="Arial" w:hAnsi="Arial" w:cs="Arial"/>
+          <w:color w:val="auto"/>
+          <w:sz w:val="20"/>
+          <w:szCs w:val="20"/>
+        </w:rPr>
+        <w:t xml:space="preserve"> Structura generală a proiectului</w:t>
+      </w:r>
+    </w:p>
+    <w:p>
+      <w:pPr>
+        <w:jc w:val="center"/>
+        <w:rPr>
+          <w:rFonts w:ascii="Arial" w:hAnsi="Arial" w:cs="Arial"/>
+          <w:sz w:val="24"/>
+          <w:szCs w:val="24"/>
+        </w:rPr>
+      </w:pPr>
+    </w:p>
+    <w:p>
+      <w:pPr>
+        <w:pStyle w:val="Heading2"/>
+      </w:pPr>
+      <w:r>
         <w:t>REPREZENTAREA INTERNĂ A STĂRII</w:t>
       </w:r>
     </w:p>
@@ -40836,7 +41557,7 @@
                     <pic:cNvPicPr/>
                   </pic:nvPicPr>
                   <pic:blipFill>
-                    <a:blip r:embed="rId46">
+                    <a:blip r:embed="rId48">
                       <a:extLst>
                         <a:ext uri="{28A0092B-C50C-407E-A947-70E740481C1C}">
                           <a14:useLocalDpi xmlns:a14="http://schemas.microsoft.com/office/drawing/2010/main" val="0"/>
@@ -41448,7 +42169,7 @@
                     <pic:cNvPicPr/>
                   </pic:nvPicPr>
                   <pic:blipFill>
-                    <a:blip r:embed="rId47">
+                    <a:blip r:embed="rId49">
                       <a:extLst>
                         <a:ext uri="{28A0092B-C50C-407E-A947-70E740481C1C}">
                           <a14:useLocalDpi xmlns:a14="http://schemas.microsoft.com/office/drawing/2010/main" val="0"/>
@@ -41776,9 +42497,9 @@
           <w:szCs w:val="24"/>
         </w:rPr>
         <w:drawing>
-          <wp:inline distT="0" distB="0" distL="0" distR="0" wp14:anchorId="18CF195A" wp14:editId="183431C1">
+          <wp:inline distT="0" distB="0" distL="0" distR="0" wp14:anchorId="18CF195A" wp14:editId="5EE2BB96">
             <wp:extent cx="2830983" cy="3933021"/>
-            <wp:effectExtent l="0" t="0" r="7620" b="0"/>
+            <wp:effectExtent l="0" t="0" r="0" b="6985"/>
             <wp:docPr id="1345198752" name="Picture 4"/>
             <wp:cNvGraphicFramePr>
               <a:graphicFrameLocks xmlns:a="http://schemas.openxmlformats.org/drawingml/2006/main" noChangeAspect="1"/>
@@ -41791,7 +42512,7 @@
                     <pic:cNvPicPr/>
                   </pic:nvPicPr>
                   <pic:blipFill>
-                    <a:blip r:embed="rId48">
+                    <a:blip r:embed="rId50">
                       <a:extLst>
                         <a:ext uri="{28A0092B-C50C-407E-A947-70E740481C1C}">
                           <a14:useLocalDpi xmlns:a14="http://schemas.microsoft.com/office/drawing/2010/main" val="0"/>
@@ -41805,7 +42526,7 @@
                   <pic:spPr>
                     <a:xfrm>
                       <a:off x="0" y="0"/>
-                      <a:ext cx="2838373" cy="3943287"/>
+                      <a:ext cx="2830983" cy="3933021"/>
                     </a:xfrm>
                     <a:prstGeom prst="rect">
                       <a:avLst/>
@@ -42063,7 +42784,7 @@
                     <pic:cNvPicPr/>
                   </pic:nvPicPr>
                   <pic:blipFill>
-                    <a:blip r:embed="rId49">
+                    <a:blip r:embed="rId51">
                       <a:extLst>
                         <a:ext uri="{28A0092B-C50C-407E-A947-70E740481C1C}">
                           <a14:useLocalDpi xmlns:a14="http://schemas.microsoft.com/office/drawing/2010/main" val="0"/>
@@ -42378,7 +43099,7 @@
                     <pic:cNvPicPr/>
                   </pic:nvPicPr>
                   <pic:blipFill>
-                    <a:blip r:embed="rId50">
+                    <a:blip r:embed="rId52">
                       <a:extLst>
                         <a:ext uri="{28A0092B-C50C-407E-A947-70E740481C1C}">
                           <a14:useLocalDpi xmlns:a14="http://schemas.microsoft.com/office/drawing/2010/main" val="0"/>
@@ -42574,18 +43295,204 @@
     </w:p>
     <w:p>
       <w:pPr>
-        <w:rPr>
-          <w:rFonts w:ascii="Arial" w:hAnsi="Arial" w:cs="Arial"/>
-          <w:sz w:val="24"/>
-          <w:szCs w:val="24"/>
-        </w:rPr>
-      </w:pPr>
+        <w:keepNext/>
+        <w:jc w:val="center"/>
+      </w:pPr>
+      <w:r>
+        <w:rPr>
+          <w:rFonts w:ascii="Arial" w:hAnsi="Arial" w:cs="Arial"/>
+          <w:noProof/>
+          <w:sz w:val="24"/>
+          <w:szCs w:val="24"/>
+        </w:rPr>
+        <w:drawing>
+          <wp:inline distT="0" distB="0" distL="0" distR="0" wp14:anchorId="6A241E3A" wp14:editId="131FC5AA">
+            <wp:extent cx="3174797" cy="3774912"/>
+            <wp:effectExtent l="0" t="0" r="6985" b="0"/>
+            <wp:docPr id="848794412" name="Picture 8"/>
+            <wp:cNvGraphicFramePr>
+              <a:graphicFrameLocks xmlns:a="http://schemas.openxmlformats.org/drawingml/2006/main" noChangeAspect="1"/>
+            </wp:cNvGraphicFramePr>
+            <a:graphic xmlns:a="http://schemas.openxmlformats.org/drawingml/2006/main">
+              <a:graphicData uri="http://schemas.openxmlformats.org/drawingml/2006/picture">
+                <pic:pic xmlns:pic="http://schemas.openxmlformats.org/drawingml/2006/picture">
+                  <pic:nvPicPr>
+                    <pic:cNvPr id="848794412" name="Picture 848794412"/>
+                    <pic:cNvPicPr/>
+                  </pic:nvPicPr>
+                  <pic:blipFill>
+                    <a:blip r:embed="rId53">
+                      <a:extLst>
+                        <a:ext uri="{28A0092B-C50C-407E-A947-70E740481C1C}">
+                          <a14:useLocalDpi xmlns:a14="http://schemas.microsoft.com/office/drawing/2010/main" val="0"/>
+                        </a:ext>
+                      </a:extLst>
+                    </a:blip>
+                    <a:stretch>
+                      <a:fillRect/>
+                    </a:stretch>
+                  </pic:blipFill>
+                  <pic:spPr>
+                    <a:xfrm>
+                      <a:off x="0" y="0"/>
+                      <a:ext cx="3183393" cy="3785133"/>
+                    </a:xfrm>
+                    <a:prstGeom prst="rect">
+                      <a:avLst/>
+                    </a:prstGeom>
+                  </pic:spPr>
+                </pic:pic>
+              </a:graphicData>
+            </a:graphic>
+          </wp:inline>
+        </w:drawing>
+      </w:r>
+    </w:p>
+    <w:p>
+      <w:pPr>
+        <w:pStyle w:val="Caption"/>
+        <w:jc w:val="center"/>
+        <w:rPr>
+          <w:rFonts w:ascii="Arial" w:hAnsi="Arial" w:cs="Arial"/>
+          <w:color w:val="auto"/>
+          <w:sz w:val="20"/>
+          <w:szCs w:val="20"/>
+        </w:rPr>
+      </w:pPr>
+      <w:r>
+        <w:rPr>
+          <w:rFonts w:ascii="Arial" w:hAnsi="Arial" w:cs="Arial"/>
+          <w:color w:val="auto"/>
+          <w:sz w:val="20"/>
+          <w:szCs w:val="20"/>
+        </w:rPr>
+        <w:t xml:space="preserve">Secvența de cod </w:t>
+      </w:r>
+      <w:r>
+        <w:rPr>
+          <w:rFonts w:ascii="Arial" w:hAnsi="Arial" w:cs="Arial"/>
+          <w:color w:val="auto"/>
+          <w:sz w:val="20"/>
+          <w:szCs w:val="20"/>
+        </w:rPr>
+        <w:fldChar w:fldCharType="begin"/>
+      </w:r>
+      <w:r>
+        <w:rPr>
+          <w:rFonts w:ascii="Arial" w:hAnsi="Arial" w:cs="Arial"/>
+          <w:color w:val="auto"/>
+          <w:sz w:val="20"/>
+          <w:szCs w:val="20"/>
+        </w:rPr>
+        <w:instrText xml:space="preserve"> STYLEREF 1 \s </w:instrText>
+      </w:r>
+      <w:r>
+        <w:rPr>
+          <w:rFonts w:ascii="Arial" w:hAnsi="Arial" w:cs="Arial"/>
+          <w:color w:val="auto"/>
+          <w:sz w:val="20"/>
+          <w:szCs w:val="20"/>
+        </w:rPr>
+        <w:fldChar w:fldCharType="separate"/>
+      </w:r>
+      <w:r>
+        <w:rPr>
+          <w:rFonts w:ascii="Arial" w:hAnsi="Arial" w:cs="Arial"/>
+          <w:noProof/>
+          <w:color w:val="auto"/>
+          <w:sz w:val="20"/>
+          <w:szCs w:val="20"/>
+        </w:rPr>
+        <w:t>5</w:t>
+      </w:r>
+      <w:r>
+        <w:rPr>
+          <w:rFonts w:ascii="Arial" w:hAnsi="Arial" w:cs="Arial"/>
+          <w:color w:val="auto"/>
+          <w:sz w:val="20"/>
+          <w:szCs w:val="20"/>
+        </w:rPr>
+        <w:fldChar w:fldCharType="end"/>
+      </w:r>
+      <w:r>
+        <w:rPr>
+          <w:rFonts w:ascii="Arial" w:hAnsi="Arial" w:cs="Arial"/>
+          <w:color w:val="auto"/>
+          <w:sz w:val="20"/>
+          <w:szCs w:val="20"/>
+        </w:rPr>
+        <w:t>.</w:t>
+      </w:r>
+      <w:r>
+        <w:rPr>
+          <w:rFonts w:ascii="Arial" w:hAnsi="Arial" w:cs="Arial"/>
+          <w:color w:val="auto"/>
+          <w:sz w:val="20"/>
+          <w:szCs w:val="20"/>
+        </w:rPr>
+        <w:fldChar w:fldCharType="begin"/>
+      </w:r>
+      <w:r>
+        <w:rPr>
+          <w:rFonts w:ascii="Arial" w:hAnsi="Arial" w:cs="Arial"/>
+          <w:color w:val="auto"/>
+          <w:sz w:val="20"/>
+          <w:szCs w:val="20"/>
+        </w:rPr>
+        <w:instrText xml:space="preserve"> SEQ Secvența_de_cod \* ARABIC \s 1 </w:instrText>
+      </w:r>
+      <w:r>
+        <w:rPr>
+          <w:rFonts w:ascii="Arial" w:hAnsi="Arial" w:cs="Arial"/>
+          <w:color w:val="auto"/>
+          <w:sz w:val="20"/>
+          <w:szCs w:val="20"/>
+        </w:rPr>
+        <w:fldChar w:fldCharType="separate"/>
+      </w:r>
+      <w:r>
+        <w:rPr>
+          <w:rFonts w:ascii="Arial" w:hAnsi="Arial" w:cs="Arial"/>
+          <w:noProof/>
+          <w:color w:val="auto"/>
+          <w:sz w:val="20"/>
+          <w:szCs w:val="20"/>
+        </w:rPr>
+        <w:t>6</w:t>
+      </w:r>
+      <w:r>
+        <w:rPr>
+          <w:rFonts w:ascii="Arial" w:hAnsi="Arial" w:cs="Arial"/>
+          <w:color w:val="auto"/>
+          <w:sz w:val="20"/>
+          <w:szCs w:val="20"/>
+        </w:rPr>
+        <w:fldChar w:fldCharType="end"/>
+      </w:r>
+      <w:r>
+        <w:rPr>
+          <w:rFonts w:ascii="Arial" w:hAnsi="Arial" w:cs="Arial"/>
+          <w:color w:val="auto"/>
+          <w:sz w:val="20"/>
+          <w:szCs w:val="20"/>
+        </w:rPr>
+        <w:t xml:space="preserve"> Corpul funcției de conversie a matricei de stare</w:t>
+      </w:r>
+    </w:p>
+    <w:p/>
+    <w:p>
+      <w:pPr>
+        <w:pStyle w:val="Heading2"/>
+      </w:pPr>
+      <w:r>
+        <w:t>SUBSTITUȚIA OCTEȚILOR</w:t>
+      </w:r>
     </w:p>
     <w:sectPr>
-      <w:headerReference w:type="default" r:id="rId51"/>
-      <w:footerReference w:type="default" r:id="rId52"/>
-      <w:headerReference w:type="first" r:id="rId53"/>
-      <w:footerReference w:type="first" r:id="rId54"/>
+      <w:headerReference w:type="default" r:id="rId54"/>
+      <w:footerReference w:type="default" r:id="rId55"/>
+      <w:headerReference w:type="first" r:id="rId56"/>
+      <w:footerReference w:type="first" r:id="rId57"/>
       <w:pgSz w:w="11907" w:h="16840" w:code="9"/>
       <w:pgMar w:top="1418" w:right="1134" w:bottom="1134" w:left="1134" w:header="706" w:footer="778" w:gutter="0"/>
       <w:pgNumType w:start="0"/>
@@ -45639,11 +46546,11 @@
     <w:rsidRoot w:val="00F924A7"/>
     <w:rsid w:val="00192327"/>
     <w:rsid w:val="001D3BF4"/>
+    <w:rsid w:val="0024320B"/>
     <w:rsid w:val="00413C3B"/>
     <w:rsid w:val="0063133B"/>
     <w:rsid w:val="0072317D"/>
     <w:rsid w:val="007B47C5"/>
-    <w:rsid w:val="008130FA"/>
     <w:rsid w:val="00844611"/>
     <w:rsid w:val="009A561F"/>
     <w:rsid w:val="009F1A76"/>

</xml_diff>

<commit_message>
Shift Row and Inverse operation snapshots
</commit_message>
<xml_diff>
--- a/Paper/BDA_AES.docx
+++ b/Paper/BDA_AES.docx
@@ -45880,8 +45880,8 @@
         <w:rPr>
           <w:rFonts w:ascii="Arial" w:hAnsi="Arial" w:cs="Arial"/>
           <w:color w:val="auto"/>
-          <w:sz w:val="28"/>
-          <w:szCs w:val="28"/>
+          <w:sz w:val="20"/>
+          <w:szCs w:val="20"/>
         </w:rPr>
       </w:pPr>
       <w:r>
@@ -46015,6 +46015,17 @@
         <w:t xml:space="preserve"> Entitatea și arhitectura procesului de substituție inversă</w:t>
       </w:r>
     </w:p>
+    <w:p/>
+    <w:p>
+      <w:pPr>
+        <w:pStyle w:val="Heading2"/>
+      </w:pPr>
+      <w:r>
+        <w:t>DEPLASAREA COLOANELOR</w:t>
+      </w:r>
+    </w:p>
+    <w:p/>
+    <w:p/>
     <w:p>
       <w:pPr>
         <w:ind w:firstLine="720"/>
@@ -49109,7 +49120,6 @@
     <w:rsid w:val="0024320B"/>
     <w:rsid w:val="00413C3B"/>
     <w:rsid w:val="0063133B"/>
-    <w:rsid w:val="00715463"/>
     <w:rsid w:val="0072317D"/>
     <w:rsid w:val="007B47C5"/>
     <w:rsid w:val="00844611"/>
@@ -49118,6 +49128,7 @@
     <w:rsid w:val="00B8483B"/>
     <w:rsid w:val="00CE3EC1"/>
     <w:rsid w:val="00D050A3"/>
+    <w:rsid w:val="00D360BF"/>
     <w:rsid w:val="00EF4327"/>
     <w:rsid w:val="00F924A7"/>
   </w:rsids>

</xml_diff>

<commit_message>
Formatting changes and mixColumn subchapter
</commit_message>
<xml_diff>
--- a/Paper/BDA_AES.docx
+++ b/Paper/BDA_AES.docx
@@ -46288,7 +46288,17 @@
           <w:sz w:val="24"/>
           <w:szCs w:val="24"/>
         </w:rPr>
-        <w:t>mixRows</w:t>
+        <w:t>M</w:t>
+      </w:r>
+      <w:r>
+        <w:rPr>
+          <w:rFonts w:ascii="Arial" w:hAnsi="Arial" w:cs="Arial"/>
+          <w:i/>
+          <w:iCs/>
+          <w:sz w:val="24"/>
+          <w:szCs w:val="24"/>
+        </w:rPr>
+        <w:t>ixRows</w:t>
       </w:r>
       <w:proofErr w:type="spellEnd"/>
       <w:r>
@@ -46378,8 +46388,8 @@
           <w:szCs w:val="24"/>
         </w:rPr>
         <w:drawing>
-          <wp:inline distT="0" distB="0" distL="0" distR="0" wp14:anchorId="6DEAA119" wp14:editId="6CDA177D">
-            <wp:extent cx="2542256" cy="3914775"/>
+          <wp:inline distT="0" distB="0" distL="0" distR="0" wp14:anchorId="6DEAA119" wp14:editId="00E8EF6E">
+            <wp:extent cx="2676525" cy="4441372"/>
             <wp:effectExtent l="0" t="0" r="0" b="0"/>
             <wp:docPr id="66461347" name="Picture 5"/>
             <wp:cNvGraphicFramePr>
@@ -46407,7 +46417,7 @@
                   <pic:spPr>
                     <a:xfrm>
                       <a:off x="0" y="0"/>
-                      <a:ext cx="2552955" cy="3931251"/>
+                      <a:ext cx="2684378" cy="4454404"/>
                     </a:xfrm>
                     <a:prstGeom prst="rect">
                       <a:avLst/>
@@ -46562,20 +46572,23 @@
         <w:t xml:space="preserve"> Entitatea și arhitectura procedurii de deplasare a liniilor</w:t>
       </w:r>
     </w:p>
-    <w:p>
-      <w:pPr>
-        <w:ind w:firstLine="720"/>
+    <w:p/>
+    <w:p>
+      <w:pPr>
+        <w:pStyle w:val="Heading2"/>
+      </w:pPr>
+      <w:r>
+        <w:t>DEPLASAREA INVERSĂ A LINIILOR</w:t>
+      </w:r>
+    </w:p>
+    <w:p>
+      <w:pPr>
         <w:jc w:val="both"/>
-        <w:rPr>
-          <w:rFonts w:ascii="Arial" w:hAnsi="Arial" w:cs="Arial"/>
-          <w:sz w:val="24"/>
-          <w:szCs w:val="24"/>
-        </w:rPr>
-      </w:pPr>
-    </w:p>
-    <w:p>
-      <w:pPr>
-        <w:ind w:firstLine="720"/>
+      </w:pPr>
+    </w:p>
+    <w:p>
+      <w:pPr>
+        <w:ind w:firstLine="576"/>
         <w:jc w:val="both"/>
         <w:rPr>
           <w:rFonts w:ascii="Arial" w:hAnsi="Arial" w:cs="Arial"/>
@@ -46583,12 +46596,387 @@
           <w:szCs w:val="24"/>
         </w:rPr>
       </w:pPr>
-    </w:p>
+      <w:r>
+        <w:rPr>
+          <w:rFonts w:ascii="Arial" w:hAnsi="Arial" w:cs="Arial"/>
+          <w:sz w:val="24"/>
+          <w:szCs w:val="24"/>
+        </w:rPr>
+        <w:t xml:space="preserve">Deplasarea inversă a liniilor reprezintă operația inversă transformării </w:t>
+      </w:r>
+      <w:proofErr w:type="spellStart"/>
+      <w:r>
+        <w:rPr>
+          <w:rFonts w:ascii="Arial" w:hAnsi="Arial" w:cs="Arial"/>
+          <w:sz w:val="24"/>
+          <w:szCs w:val="24"/>
+        </w:rPr>
+        <w:t>ShiftRows</w:t>
+      </w:r>
+      <w:proofErr w:type="spellEnd"/>
+      <w:r>
+        <w:rPr>
+          <w:rFonts w:ascii="Arial" w:hAnsi="Arial" w:cs="Arial"/>
+          <w:sz w:val="24"/>
+          <w:szCs w:val="24"/>
+        </w:rPr>
+        <w:t xml:space="preserve"> și are rolul de a readuce octeții matricei de stare în pozițiile anterioare aplicării acesteia. Implementarea hardware păstrează aceeași complexitate redusă, fiind realizată prin reasocierea directă a octeților conform deplasărilor ciclice inverse. Astfel, prima linie rămâne nemodificată, iar următoarele trei linii sunt deplasate circular spre dreapta cu una, două, respectiv trei poziții.</w:t>
+      </w:r>
+    </w:p>
+    <w:p>
+      <w:pPr>
+        <w:ind w:firstLine="576"/>
+        <w:jc w:val="both"/>
+        <w:rPr>
+          <w:rFonts w:ascii="Arial" w:hAnsi="Arial" w:cs="Arial"/>
+          <w:sz w:val="24"/>
+          <w:szCs w:val="24"/>
+        </w:rPr>
+      </w:pPr>
+      <w:r>
+        <w:rPr>
+          <w:rFonts w:ascii="Arial" w:hAnsi="Arial" w:cs="Arial"/>
+          <w:sz w:val="24"/>
+          <w:szCs w:val="24"/>
+        </w:rPr>
+        <w:t xml:space="preserve">Entitatea </w:t>
+      </w:r>
+      <w:proofErr w:type="spellStart"/>
+      <w:r>
+        <w:rPr>
+          <w:rFonts w:ascii="Arial" w:hAnsi="Arial" w:cs="Arial"/>
+          <w:sz w:val="24"/>
+          <w:szCs w:val="24"/>
+        </w:rPr>
+        <w:t>Inv</w:t>
+      </w:r>
+      <w:r>
+        <w:rPr>
+          <w:rFonts w:ascii="Arial" w:hAnsi="Arial" w:cs="Arial"/>
+          <w:i/>
+          <w:iCs/>
+          <w:sz w:val="24"/>
+          <w:szCs w:val="24"/>
+        </w:rPr>
+        <w:t>Shift</w:t>
+      </w:r>
+      <w:r>
+        <w:rPr>
+          <w:rFonts w:ascii="Arial" w:hAnsi="Arial" w:cs="Arial"/>
+          <w:i/>
+          <w:iCs/>
+          <w:sz w:val="24"/>
+          <w:szCs w:val="24"/>
+        </w:rPr>
+        <w:t>Rows</w:t>
+      </w:r>
+      <w:proofErr w:type="spellEnd"/>
+      <w:r>
+        <w:rPr>
+          <w:rFonts w:ascii="Arial" w:hAnsi="Arial" w:cs="Arial"/>
+          <w:i/>
+          <w:iCs/>
+          <w:sz w:val="24"/>
+          <w:szCs w:val="24"/>
+        </w:rPr>
+        <w:t xml:space="preserve"> </w:t>
+      </w:r>
+      <w:r>
+        <w:rPr>
+          <w:rFonts w:ascii="Arial" w:hAnsi="Arial" w:cs="Arial"/>
+          <w:sz w:val="24"/>
+          <w:szCs w:val="24"/>
+        </w:rPr>
+        <w:t>și arhitectura aferentă sunt prezentate în cadrul secvenței de cod 5.1</w:t>
+      </w:r>
+      <w:r>
+        <w:rPr>
+          <w:rFonts w:ascii="Arial" w:hAnsi="Arial" w:cs="Arial"/>
+          <w:sz w:val="24"/>
+          <w:szCs w:val="24"/>
+        </w:rPr>
+        <w:t>2</w:t>
+      </w:r>
+      <w:r>
+        <w:rPr>
+          <w:rFonts w:ascii="Arial" w:hAnsi="Arial" w:cs="Arial"/>
+          <w:sz w:val="24"/>
+          <w:szCs w:val="24"/>
+        </w:rPr>
+        <w:t>.</w:t>
+      </w:r>
+      <w:r>
+        <w:rPr>
+          <w:rFonts w:ascii="Arial" w:hAnsi="Arial" w:cs="Arial"/>
+          <w:sz w:val="24"/>
+          <w:szCs w:val="24"/>
+        </w:rPr>
+        <w:t xml:space="preserve"> De asemenea, este important de menționat faptul că este posibilă utilizarea unei structuri semantice </w:t>
+      </w:r>
+      <w:r>
+        <w:rPr>
+          <w:rFonts w:ascii="Arial" w:hAnsi="Arial" w:cs="Arial"/>
+          <w:i/>
+          <w:iCs/>
+          <w:sz w:val="24"/>
+          <w:szCs w:val="24"/>
+        </w:rPr>
+        <w:t>for generate</w:t>
+      </w:r>
+      <w:r>
+        <w:rPr>
+          <w:rFonts w:ascii="Arial" w:hAnsi="Arial" w:cs="Arial"/>
+          <w:sz w:val="24"/>
+          <w:szCs w:val="24"/>
+        </w:rPr>
+        <w:t xml:space="preserve"> cu scopul de a evita utilizarea instrucțiunilor lingvistice repetitive de atribuire.</w:t>
+      </w:r>
+    </w:p>
+    <w:p>
+      <w:pPr>
+        <w:ind w:firstLine="576"/>
+        <w:jc w:val="both"/>
+        <w:rPr>
+          <w:rFonts w:ascii="Arial" w:hAnsi="Arial" w:cs="Arial"/>
+          <w:sz w:val="24"/>
+          <w:szCs w:val="24"/>
+        </w:rPr>
+      </w:pPr>
+    </w:p>
+    <w:p>
+      <w:pPr>
+        <w:jc w:val="both"/>
+        <w:rPr>
+          <w:rFonts w:ascii="Arial" w:hAnsi="Arial" w:cs="Arial"/>
+          <w:sz w:val="24"/>
+          <w:szCs w:val="24"/>
+        </w:rPr>
+      </w:pPr>
+    </w:p>
+    <w:p>
+      <w:pPr>
+        <w:jc w:val="both"/>
+        <w:rPr>
+          <w:rFonts w:ascii="Arial" w:hAnsi="Arial" w:cs="Arial"/>
+          <w:sz w:val="24"/>
+          <w:szCs w:val="24"/>
+        </w:rPr>
+      </w:pPr>
+    </w:p>
+    <w:p>
+      <w:pPr>
+        <w:keepNext/>
+        <w:ind w:firstLine="576"/>
+        <w:jc w:val="center"/>
+      </w:pPr>
+      <w:r>
+        <w:rPr>
+          <w:rFonts w:ascii="Arial" w:hAnsi="Arial" w:cs="Arial"/>
+          <w:noProof/>
+          <w:sz w:val="24"/>
+          <w:szCs w:val="24"/>
+        </w:rPr>
+        <w:drawing>
+          <wp:inline distT="0" distB="0" distL="0" distR="0" wp14:anchorId="625C7141" wp14:editId="39882A50">
+            <wp:extent cx="2553195" cy="4167144"/>
+            <wp:effectExtent l="0" t="0" r="0" b="5080"/>
+            <wp:docPr id="333675725" name="Picture 6"/>
+            <wp:cNvGraphicFramePr>
+              <a:graphicFrameLocks xmlns:a="http://schemas.openxmlformats.org/drawingml/2006/main" noChangeAspect="1"/>
+            </wp:cNvGraphicFramePr>
+            <a:graphic xmlns:a="http://schemas.openxmlformats.org/drawingml/2006/main">
+              <a:graphicData uri="http://schemas.openxmlformats.org/drawingml/2006/picture">
+                <pic:pic xmlns:pic="http://schemas.openxmlformats.org/drawingml/2006/picture">
+                  <pic:nvPicPr>
+                    <pic:cNvPr id="333675725" name="Picture 333675725"/>
+                    <pic:cNvPicPr/>
+                  </pic:nvPicPr>
+                  <pic:blipFill>
+                    <a:blip r:embed="rId59">
+                      <a:extLst>
+                        <a:ext uri="{28A0092B-C50C-407E-A947-70E740481C1C}">
+                          <a14:useLocalDpi xmlns:a14="http://schemas.microsoft.com/office/drawing/2010/main" val="0"/>
+                        </a:ext>
+                      </a:extLst>
+                    </a:blip>
+                    <a:stretch>
+                      <a:fillRect/>
+                    </a:stretch>
+                  </pic:blipFill>
+                  <pic:spPr>
+                    <a:xfrm>
+                      <a:off x="0" y="0"/>
+                      <a:ext cx="2573969" cy="4201050"/>
+                    </a:xfrm>
+                    <a:prstGeom prst="rect">
+                      <a:avLst/>
+                    </a:prstGeom>
+                  </pic:spPr>
+                </pic:pic>
+              </a:graphicData>
+            </a:graphic>
+          </wp:inline>
+        </w:drawing>
+      </w:r>
+    </w:p>
+    <w:p>
+      <w:pPr>
+        <w:pStyle w:val="Caption"/>
+        <w:jc w:val="center"/>
+        <w:rPr>
+          <w:rFonts w:ascii="Arial" w:hAnsi="Arial" w:cs="Arial"/>
+          <w:color w:val="auto"/>
+          <w:sz w:val="20"/>
+          <w:szCs w:val="20"/>
+        </w:rPr>
+      </w:pPr>
+      <w:r>
+        <w:rPr>
+          <w:rFonts w:ascii="Arial" w:hAnsi="Arial" w:cs="Arial"/>
+          <w:color w:val="auto"/>
+          <w:sz w:val="20"/>
+          <w:szCs w:val="20"/>
+        </w:rPr>
+        <w:t xml:space="preserve">      Secvența de cod </w:t>
+      </w:r>
+      <w:r>
+        <w:rPr>
+          <w:rFonts w:ascii="Arial" w:hAnsi="Arial" w:cs="Arial"/>
+          <w:color w:val="auto"/>
+          <w:sz w:val="20"/>
+          <w:szCs w:val="20"/>
+        </w:rPr>
+        <w:fldChar w:fldCharType="begin"/>
+      </w:r>
+      <w:r>
+        <w:rPr>
+          <w:rFonts w:ascii="Arial" w:hAnsi="Arial" w:cs="Arial"/>
+          <w:color w:val="auto"/>
+          <w:sz w:val="20"/>
+          <w:szCs w:val="20"/>
+        </w:rPr>
+        <w:instrText xml:space="preserve"> STYLEREF 1 \s </w:instrText>
+      </w:r>
+      <w:r>
+        <w:rPr>
+          <w:rFonts w:ascii="Arial" w:hAnsi="Arial" w:cs="Arial"/>
+          <w:color w:val="auto"/>
+          <w:sz w:val="20"/>
+          <w:szCs w:val="20"/>
+        </w:rPr>
+        <w:fldChar w:fldCharType="separate"/>
+      </w:r>
+      <w:r>
+        <w:rPr>
+          <w:rFonts w:ascii="Arial" w:hAnsi="Arial" w:cs="Arial"/>
+          <w:noProof/>
+          <w:color w:val="auto"/>
+          <w:sz w:val="20"/>
+          <w:szCs w:val="20"/>
+          <w:cs/>
+        </w:rPr>
+        <w:t>‎</w:t>
+      </w:r>
+      <w:r>
+        <w:rPr>
+          <w:rFonts w:ascii="Arial" w:hAnsi="Arial" w:cs="Arial"/>
+          <w:noProof/>
+          <w:color w:val="auto"/>
+          <w:sz w:val="20"/>
+          <w:szCs w:val="20"/>
+        </w:rPr>
+        <w:t>5</w:t>
+      </w:r>
+      <w:r>
+        <w:rPr>
+          <w:rFonts w:ascii="Arial" w:hAnsi="Arial" w:cs="Arial"/>
+          <w:color w:val="auto"/>
+          <w:sz w:val="20"/>
+          <w:szCs w:val="20"/>
+        </w:rPr>
+        <w:fldChar w:fldCharType="end"/>
+      </w:r>
+      <w:r>
+        <w:rPr>
+          <w:rFonts w:ascii="Arial" w:hAnsi="Arial" w:cs="Arial"/>
+          <w:color w:val="auto"/>
+          <w:sz w:val="20"/>
+          <w:szCs w:val="20"/>
+        </w:rPr>
+        <w:t>.</w:t>
+      </w:r>
+      <w:r>
+        <w:rPr>
+          <w:rFonts w:ascii="Arial" w:hAnsi="Arial" w:cs="Arial"/>
+          <w:color w:val="auto"/>
+          <w:sz w:val="20"/>
+          <w:szCs w:val="20"/>
+        </w:rPr>
+        <w:fldChar w:fldCharType="begin"/>
+      </w:r>
+      <w:r>
+        <w:rPr>
+          <w:rFonts w:ascii="Arial" w:hAnsi="Arial" w:cs="Arial"/>
+          <w:color w:val="auto"/>
+          <w:sz w:val="20"/>
+          <w:szCs w:val="20"/>
+        </w:rPr>
+        <w:instrText xml:space="preserve"> SEQ Secvența_de_cod \* ARABIC \s 1 </w:instrText>
+      </w:r>
+      <w:r>
+        <w:rPr>
+          <w:rFonts w:ascii="Arial" w:hAnsi="Arial" w:cs="Arial"/>
+          <w:color w:val="auto"/>
+          <w:sz w:val="20"/>
+          <w:szCs w:val="20"/>
+        </w:rPr>
+        <w:fldChar w:fldCharType="separate"/>
+      </w:r>
+      <w:r>
+        <w:rPr>
+          <w:rFonts w:ascii="Arial" w:hAnsi="Arial" w:cs="Arial"/>
+          <w:noProof/>
+          <w:color w:val="auto"/>
+          <w:sz w:val="20"/>
+          <w:szCs w:val="20"/>
+        </w:rPr>
+        <w:t>12</w:t>
+      </w:r>
+      <w:r>
+        <w:rPr>
+          <w:rFonts w:ascii="Arial" w:hAnsi="Arial" w:cs="Arial"/>
+          <w:color w:val="auto"/>
+          <w:sz w:val="20"/>
+          <w:szCs w:val="20"/>
+        </w:rPr>
+        <w:fldChar w:fldCharType="end"/>
+      </w:r>
+      <w:r>
+        <w:rPr>
+          <w:rFonts w:ascii="Arial" w:hAnsi="Arial" w:cs="Arial"/>
+          <w:color w:val="auto"/>
+          <w:sz w:val="20"/>
+          <w:szCs w:val="20"/>
+        </w:rPr>
+        <w:t xml:space="preserve"> Entitatea și arhitectura procedurii inverse de comutare a liniilor</w:t>
+      </w:r>
+    </w:p>
+    <w:p/>
+    <w:p>
+      <w:pPr>
+        <w:pStyle w:val="Heading2"/>
+      </w:pPr>
+      <w:r>
+        <w:t>AMESTECAREA COLOANELOR</w:t>
+      </w:r>
+    </w:p>
+    <w:p/>
+    <w:p/>
     <w:sectPr>
-      <w:headerReference w:type="default" r:id="rId59"/>
-      <w:footerReference w:type="default" r:id="rId60"/>
-      <w:headerReference w:type="first" r:id="rId61"/>
-      <w:footerReference w:type="first" r:id="rId62"/>
+      <w:headerReference w:type="default" r:id="rId60"/>
+      <w:footerReference w:type="default" r:id="rId61"/>
+      <w:headerReference w:type="first" r:id="rId62"/>
+      <w:footerReference w:type="first" r:id="rId63"/>
       <w:pgSz w:w="11907" w:h="16840" w:code="9"/>
       <w:pgMar w:top="1418" w:right="1134" w:bottom="1134" w:left="1134" w:header="706" w:footer="778" w:gutter="0"/>
       <w:pgNumType w:start="0"/>
@@ -49644,6 +50032,7 @@
     <w:rsid w:val="001D3BF4"/>
     <w:rsid w:val="0024320B"/>
     <w:rsid w:val="00413C3B"/>
+    <w:rsid w:val="005142A2"/>
     <w:rsid w:val="0063133B"/>
     <w:rsid w:val="0072317D"/>
     <w:rsid w:val="007B47C5"/>
@@ -49651,7 +50040,6 @@
     <w:rsid w:val="009A561F"/>
     <w:rsid w:val="009F1A76"/>
     <w:rsid w:val="00B8483B"/>
-    <w:rsid w:val="00CD04A6"/>
     <w:rsid w:val="00CE3EC1"/>
     <w:rsid w:val="00D050A3"/>
     <w:rsid w:val="00EF4327"/>

</xml_diff>

<commit_message>
Inverse Mix Column Operation Chapter
</commit_message>
<xml_diff>
--- a/Paper/BDA_AES.docx
+++ b/Paper/BDA_AES.docx
@@ -50730,7 +50730,25 @@
           <w:sz w:val="24"/>
           <w:szCs w:val="24"/>
         </w:rPr>
-        <w:t>, proces conform cu ecuația matriceală 3.</w:t>
+        <w:t>, proces co</w:t>
+      </w:r>
+      <w:proofErr w:type="spellStart"/>
+      <w:r>
+        <w:rPr>
+          <w:rFonts w:ascii="Arial" w:hAnsi="Arial" w:cs="Arial"/>
+          <w:sz w:val="24"/>
+          <w:szCs w:val="24"/>
+        </w:rPr>
+        <w:t>nform</w:t>
+      </w:r>
+      <w:proofErr w:type="spellEnd"/>
+      <w:r>
+        <w:rPr>
+          <w:rFonts w:ascii="Arial" w:hAnsi="Arial" w:cs="Arial"/>
+          <w:sz w:val="24"/>
+          <w:szCs w:val="24"/>
+        </w:rPr>
+        <w:t xml:space="preserve"> cu ecuația matriceală 3.</w:t>
       </w:r>
       <w:r>
         <w:rPr>
@@ -51320,6 +51338,7 @@
     </w:p>
     <w:p>
       <w:pPr>
+        <w:jc w:val="both"/>
         <w:rPr>
           <w:rFonts w:ascii="Arial" w:hAnsi="Arial" w:cs="Arial"/>
           <w:sz w:val="24"/>
@@ -51351,14 +51370,38 @@
         <w:t xml:space="preserve">, înainte de calcularea valorilor propriu-zise ale matricei de stare inversate, este necesară precalcularea valorilor rezultate în urma înmulțirii octetului </w:t>
       </w:r>
       <m:oMath>
-        <m:r>
-          <w:rPr>
-            <w:rFonts w:ascii="Cambria Math" w:hAnsi="Cambria Math" w:cs="Arial"/>
-            <w:sz w:val="24"/>
-            <w:szCs w:val="24"/>
-          </w:rPr>
-          <m:t>a</m:t>
-        </m:r>
+        <m:sSub>
+          <m:sSubPr>
+            <m:ctrlPr>
+              <w:rPr>
+                <w:rFonts w:ascii="Cambria Math" w:hAnsi="Cambria Math" w:cs="Arial"/>
+                <w:i/>
+                <w:sz w:val="24"/>
+                <w:szCs w:val="24"/>
+              </w:rPr>
+            </m:ctrlPr>
+          </m:sSubPr>
+          <m:e>
+            <m:r>
+              <w:rPr>
+                <w:rFonts w:ascii="Cambria Math" w:hAnsi="Cambria Math" w:cs="Arial"/>
+                <w:sz w:val="24"/>
+                <w:szCs w:val="24"/>
+              </w:rPr>
+              <m:t>s</m:t>
+            </m:r>
+          </m:e>
+          <m:sub>
+            <m:r>
+              <w:rPr>
+                <w:rFonts w:ascii="Cambria Math" w:hAnsi="Cambria Math" w:cs="Arial"/>
+                <w:sz w:val="24"/>
+                <w:szCs w:val="24"/>
+              </w:rPr>
+              <m:t>i,c</m:t>
+            </m:r>
+          </m:sub>
+        </m:sSub>
       </m:oMath>
       <w:r>
         <w:rPr>
@@ -51526,8 +51569,380 @@
           <w:sz w:val="24"/>
           <w:szCs w:val="24"/>
         </w:rPr>
-        <w:t>i de stare.</w:t>
-      </w:r>
+        <w:t>i de star</w:t>
+      </w:r>
+      <w:r>
+        <w:rPr>
+          <w:rFonts w:ascii="Arial" w:hAnsi="Arial" w:cs="Arial"/>
+          <w:sz w:val="24"/>
+          <w:szCs w:val="24"/>
+        </w:rPr>
+        <w:t>e.</w:t>
+      </w:r>
+    </w:p>
+    <w:p>
+      <w:pPr>
+        <w:ind w:firstLine="720"/>
+        <w:jc w:val="both"/>
+        <w:rPr>
+          <w:rFonts w:ascii="Arial" w:hAnsi="Arial" w:cs="Arial"/>
+          <w:sz w:val="24"/>
+          <w:szCs w:val="24"/>
+        </w:rPr>
+      </w:pPr>
+      <w:r>
+        <w:rPr>
+          <w:rFonts w:ascii="Arial" w:hAnsi="Arial" w:cs="Arial"/>
+          <w:sz w:val="24"/>
+          <w:szCs w:val="24"/>
+        </w:rPr>
+        <w:t xml:space="preserve">Valorile precalculate vor fi stocate la nivelul a trei matrice de date denumite </w:t>
+      </w:r>
+      <m:oMath>
+        <m:r>
+          <w:rPr>
+            <w:rFonts w:ascii="Cambria Math" w:hAnsi="Cambria Math" w:cs="Arial"/>
+            <w:sz w:val="24"/>
+            <w:szCs w:val="24"/>
+          </w:rPr>
+          <m:t>x2</m:t>
+        </m:r>
+      </m:oMath>
+      <w:r>
+        <w:rPr>
+          <w:rFonts w:ascii="Arial" w:hAnsi="Arial" w:cs="Arial"/>
+          <w:sz w:val="24"/>
+          <w:szCs w:val="24"/>
+        </w:rPr>
+        <w:t xml:space="preserve">, </w:t>
+      </w:r>
+      <m:oMath>
+        <m:r>
+          <w:rPr>
+            <w:rFonts w:ascii="Cambria Math" w:hAnsi="Cambria Math" w:cs="Arial"/>
+            <w:sz w:val="24"/>
+            <w:szCs w:val="24"/>
+          </w:rPr>
+          <m:t>x4</m:t>
+        </m:r>
+      </m:oMath>
+      <w:r>
+        <w:rPr>
+          <w:rFonts w:ascii="Arial" w:hAnsi="Arial" w:cs="Arial"/>
+          <w:sz w:val="24"/>
+          <w:szCs w:val="24"/>
+        </w:rPr>
+        <w:t xml:space="preserve">, respectiv </w:t>
+      </w:r>
+      <m:oMath>
+        <m:r>
+          <w:rPr>
+            <w:rFonts w:ascii="Cambria Math" w:hAnsi="Cambria Math" w:cs="Arial"/>
+            <w:sz w:val="24"/>
+            <w:szCs w:val="24"/>
+          </w:rPr>
+          <m:t>x8</m:t>
+        </m:r>
+      </m:oMath>
+      <w:r>
+        <w:rPr>
+          <w:rFonts w:ascii="Arial" w:hAnsi="Arial" w:cs="Arial"/>
+          <w:sz w:val="24"/>
+          <w:szCs w:val="24"/>
+        </w:rPr>
+        <w:t>. În urma ac</w:t>
+      </w:r>
+      <w:proofErr w:type="spellStart"/>
+      <w:r>
+        <w:rPr>
+          <w:rFonts w:ascii="Arial" w:hAnsi="Arial" w:cs="Arial"/>
+          <w:sz w:val="24"/>
+          <w:szCs w:val="24"/>
+        </w:rPr>
+        <w:t>estor</w:t>
+      </w:r>
+      <w:proofErr w:type="spellEnd"/>
+      <w:r>
+        <w:rPr>
+          <w:rFonts w:ascii="Arial" w:hAnsi="Arial" w:cs="Arial"/>
+          <w:sz w:val="24"/>
+          <w:szCs w:val="24"/>
+        </w:rPr>
+        <w:t xml:space="preserve"> calcule, valorile inversei matricei de stare vor fi determinate conform ecuației 3.8, în baza explicitării polinomiale definite la nivelul relațiilor 5.2.</w:t>
+      </w:r>
+    </w:p>
+    <w:p>
+      <w:pPr>
+        <w:ind w:firstLine="720"/>
+        <w:jc w:val="both"/>
+        <w:rPr>
+          <w:rFonts w:ascii="Arial" w:hAnsi="Arial" w:cs="Arial"/>
+          <w:sz w:val="24"/>
+          <w:szCs w:val="24"/>
+        </w:rPr>
+      </w:pPr>
+      <w:r>
+        <w:rPr>
+          <w:rFonts w:ascii="Arial" w:hAnsi="Arial" w:cs="Arial"/>
+          <w:sz w:val="24"/>
+          <w:szCs w:val="24"/>
+        </w:rPr>
+        <w:t>Structura entității cât și arhitectura sa sunt prezentate în cadrul secvenței de cod 5.17.</w:t>
+      </w:r>
+    </w:p>
+    <w:p>
+      <w:pPr>
+        <w:ind w:firstLine="720"/>
+        <w:rPr>
+          <w:rFonts w:ascii="Arial" w:hAnsi="Arial" w:cs="Arial"/>
+          <w:sz w:val="24"/>
+          <w:szCs w:val="24"/>
+        </w:rPr>
+      </w:pPr>
+    </w:p>
+    <w:p>
+      <w:pPr>
+        <w:ind w:firstLine="720"/>
+        <w:rPr>
+          <w:rFonts w:ascii="Arial" w:hAnsi="Arial" w:cs="Arial"/>
+          <w:sz w:val="24"/>
+          <w:szCs w:val="24"/>
+        </w:rPr>
+      </w:pPr>
+    </w:p>
+    <w:p>
+      <w:pPr>
+        <w:ind w:firstLine="720"/>
+        <w:rPr>
+          <w:rFonts w:ascii="Arial" w:hAnsi="Arial" w:cs="Arial"/>
+          <w:sz w:val="24"/>
+          <w:szCs w:val="24"/>
+        </w:rPr>
+      </w:pPr>
+    </w:p>
+    <w:p>
+      <w:pPr>
+        <w:ind w:firstLine="720"/>
+        <w:rPr>
+          <w:rFonts w:ascii="Arial" w:hAnsi="Arial" w:cs="Arial"/>
+          <w:sz w:val="24"/>
+          <w:szCs w:val="24"/>
+        </w:rPr>
+      </w:pPr>
+    </w:p>
+    <w:p>
+      <w:pPr>
+        <w:keepNext/>
+        <w:ind w:firstLine="720"/>
+      </w:pPr>
+      <w:r>
+        <w:rPr>
+          <w:rFonts w:ascii="Arial" w:hAnsi="Arial" w:cs="Arial"/>
+          <w:noProof/>
+          <w:sz w:val="24"/>
+          <w:szCs w:val="24"/>
+        </w:rPr>
+        <w:drawing>
+          <wp:inline distT="0" distB="0" distL="0" distR="0" wp14:anchorId="2E8255B4" wp14:editId="360BCFE6">
+            <wp:extent cx="5094788" cy="4029740"/>
+            <wp:effectExtent l="0" t="0" r="0" b="8890"/>
+            <wp:docPr id="353790853" name="Picture 17"/>
+            <wp:cNvGraphicFramePr>
+              <a:graphicFrameLocks xmlns:a="http://schemas.openxmlformats.org/drawingml/2006/main" noChangeAspect="1"/>
+            </wp:cNvGraphicFramePr>
+            <a:graphic xmlns:a="http://schemas.openxmlformats.org/drawingml/2006/main">
+              <a:graphicData uri="http://schemas.openxmlformats.org/drawingml/2006/picture">
+                <pic:pic xmlns:pic="http://schemas.openxmlformats.org/drawingml/2006/picture">
+                  <pic:nvPicPr>
+                    <pic:cNvPr id="353790853" name="Picture 353790853"/>
+                    <pic:cNvPicPr/>
+                  </pic:nvPicPr>
+                  <pic:blipFill>
+                    <a:blip r:embed="rId70">
+                      <a:extLst>
+                        <a:ext uri="{28A0092B-C50C-407E-A947-70E740481C1C}">
+                          <a14:useLocalDpi xmlns:a14="http://schemas.microsoft.com/office/drawing/2010/main" val="0"/>
+                        </a:ext>
+                      </a:extLst>
+                    </a:blip>
+                    <a:stretch>
+                      <a:fillRect/>
+                    </a:stretch>
+                  </pic:blipFill>
+                  <pic:spPr>
+                    <a:xfrm>
+                      <a:off x="0" y="0"/>
+                      <a:ext cx="5106526" cy="4039025"/>
+                    </a:xfrm>
+                    <a:prstGeom prst="rect">
+                      <a:avLst/>
+                    </a:prstGeom>
+                  </pic:spPr>
+                </pic:pic>
+              </a:graphicData>
+            </a:graphic>
+          </wp:inline>
+        </w:drawing>
+      </w:r>
+    </w:p>
+    <w:p>
+      <w:pPr>
+        <w:pStyle w:val="Caption"/>
+        <w:jc w:val="center"/>
+        <w:rPr>
+          <w:rFonts w:ascii="Arial" w:hAnsi="Arial" w:cs="Arial"/>
+          <w:sz w:val="24"/>
+          <w:szCs w:val="24"/>
+        </w:rPr>
+      </w:pPr>
+      <w:r>
+        <w:rPr>
+          <w:rFonts w:ascii="Arial" w:hAnsi="Arial" w:cs="Arial"/>
+          <w:color w:val="auto"/>
+          <w:sz w:val="20"/>
+          <w:szCs w:val="20"/>
+        </w:rPr>
+        <w:t xml:space="preserve">Secvența de cod </w:t>
+      </w:r>
+      <w:r>
+        <w:rPr>
+          <w:rFonts w:ascii="Arial" w:hAnsi="Arial" w:cs="Arial"/>
+          <w:color w:val="auto"/>
+          <w:sz w:val="20"/>
+          <w:szCs w:val="20"/>
+        </w:rPr>
+        <w:fldChar w:fldCharType="begin"/>
+      </w:r>
+      <w:r>
+        <w:rPr>
+          <w:rFonts w:ascii="Arial" w:hAnsi="Arial" w:cs="Arial"/>
+          <w:color w:val="auto"/>
+          <w:sz w:val="20"/>
+          <w:szCs w:val="20"/>
+        </w:rPr>
+        <w:instrText xml:space="preserve"> STYLEREF 1 \s </w:instrText>
+      </w:r>
+      <w:r>
+        <w:rPr>
+          <w:rFonts w:ascii="Arial" w:hAnsi="Arial" w:cs="Arial"/>
+          <w:color w:val="auto"/>
+          <w:sz w:val="20"/>
+          <w:szCs w:val="20"/>
+        </w:rPr>
+        <w:fldChar w:fldCharType="separate"/>
+      </w:r>
+      <w:r>
+        <w:rPr>
+          <w:rFonts w:ascii="Arial" w:hAnsi="Arial" w:cs="Arial"/>
+          <w:noProof/>
+          <w:color w:val="auto"/>
+          <w:sz w:val="20"/>
+          <w:szCs w:val="20"/>
+          <w:cs/>
+        </w:rPr>
+        <w:t>‎</w:t>
+      </w:r>
+      <w:r>
+        <w:rPr>
+          <w:rFonts w:ascii="Arial" w:hAnsi="Arial" w:cs="Arial"/>
+          <w:noProof/>
+          <w:color w:val="auto"/>
+          <w:sz w:val="20"/>
+          <w:szCs w:val="20"/>
+        </w:rPr>
+        <w:t>5</w:t>
+      </w:r>
+      <w:r>
+        <w:rPr>
+          <w:rFonts w:ascii="Arial" w:hAnsi="Arial" w:cs="Arial"/>
+          <w:color w:val="auto"/>
+          <w:sz w:val="20"/>
+          <w:szCs w:val="20"/>
+        </w:rPr>
+        <w:fldChar w:fldCharType="end"/>
+      </w:r>
+      <w:r>
+        <w:rPr>
+          <w:rFonts w:ascii="Arial" w:hAnsi="Arial" w:cs="Arial"/>
+          <w:color w:val="auto"/>
+          <w:sz w:val="20"/>
+          <w:szCs w:val="20"/>
+        </w:rPr>
+        <w:t>.</w:t>
+      </w:r>
+      <w:r>
+        <w:rPr>
+          <w:rFonts w:ascii="Arial" w:hAnsi="Arial" w:cs="Arial"/>
+          <w:color w:val="auto"/>
+          <w:sz w:val="20"/>
+          <w:szCs w:val="20"/>
+        </w:rPr>
+        <w:fldChar w:fldCharType="begin"/>
+      </w:r>
+      <w:r>
+        <w:rPr>
+          <w:rFonts w:ascii="Arial" w:hAnsi="Arial" w:cs="Arial"/>
+          <w:color w:val="auto"/>
+          <w:sz w:val="20"/>
+          <w:szCs w:val="20"/>
+        </w:rPr>
+        <w:instrText xml:space="preserve"> SEQ Secvența_de_cod \* ARABIC \s 1 </w:instrText>
+      </w:r>
+      <w:r>
+        <w:rPr>
+          <w:rFonts w:ascii="Arial" w:hAnsi="Arial" w:cs="Arial"/>
+          <w:color w:val="auto"/>
+          <w:sz w:val="20"/>
+          <w:szCs w:val="20"/>
+        </w:rPr>
+        <w:fldChar w:fldCharType="separate"/>
+      </w:r>
+      <w:r>
+        <w:rPr>
+          <w:rFonts w:ascii="Arial" w:hAnsi="Arial" w:cs="Arial"/>
+          <w:noProof/>
+          <w:color w:val="auto"/>
+          <w:sz w:val="20"/>
+          <w:szCs w:val="20"/>
+        </w:rPr>
+        <w:t>17</w:t>
+      </w:r>
+      <w:r>
+        <w:rPr>
+          <w:rFonts w:ascii="Arial" w:hAnsi="Arial" w:cs="Arial"/>
+          <w:color w:val="auto"/>
+          <w:sz w:val="20"/>
+          <w:szCs w:val="20"/>
+        </w:rPr>
+        <w:fldChar w:fldCharType="end"/>
+      </w:r>
+      <w:r>
+        <w:rPr>
+          <w:rFonts w:ascii="Arial" w:hAnsi="Arial" w:cs="Arial"/>
+          <w:color w:val="auto"/>
+          <w:sz w:val="20"/>
+          <w:szCs w:val="20"/>
+        </w:rPr>
+        <w:t xml:space="preserve"> Entitatea și arhitectura transformării inverse a coloanelor</w:t>
+      </w:r>
+    </w:p>
+    <w:p>
+      <w:pPr>
+        <w:rPr>
+          <w:rFonts w:ascii="Arial" w:hAnsi="Arial" w:cs="Arial"/>
+          <w:sz w:val="24"/>
+          <w:szCs w:val="24"/>
+        </w:rPr>
+      </w:pPr>
+    </w:p>
+    <w:p>
+      <w:pPr>
+        <w:rPr>
+          <w:rFonts w:ascii="Arial" w:hAnsi="Arial" w:cs="Arial"/>
+          <w:sz w:val="24"/>
+          <w:szCs w:val="24"/>
+        </w:rPr>
+      </w:pPr>
     </w:p>
     <w:p/>
     <w:p/>
@@ -51537,10 +51952,10 @@
     <w:p/>
     <w:p/>
     <w:sectPr>
-      <w:headerReference w:type="default" r:id="rId70"/>
-      <w:footerReference w:type="default" r:id="rId71"/>
-      <w:headerReference w:type="first" r:id="rId72"/>
-      <w:footerReference w:type="first" r:id="rId73"/>
+      <w:headerReference w:type="default" r:id="rId71"/>
+      <w:footerReference w:type="default" r:id="rId72"/>
+      <w:headerReference w:type="first" r:id="rId73"/>
+      <w:footerReference w:type="first" r:id="rId74"/>
       <w:pgSz w:w="11907" w:h="16840" w:code="9"/>
       <w:pgMar w:top="1418" w:right="1134" w:bottom="1134" w:left="1134" w:header="706" w:footer="778" w:gutter="0"/>
       <w:pgNumType w:start="0"/>
@@ -54602,10 +55017,10 @@
     <w:rsid w:val="00844611"/>
     <w:rsid w:val="009A561F"/>
     <w:rsid w:val="009F1A76"/>
-    <w:rsid w:val="00A979CE"/>
     <w:rsid w:val="00B8483B"/>
     <w:rsid w:val="00CE3EC1"/>
     <w:rsid w:val="00D050A3"/>
+    <w:rsid w:val="00E935AF"/>
     <w:rsid w:val="00EF4327"/>
     <w:rsid w:val="00F924A7"/>
   </w:rsids>

</xml_diff>

<commit_message>
Mix Column Inverse Operation
</commit_message>
<xml_diff>
--- a/Paper/BDA_AES.docx
+++ b/Paper/BDA_AES.docx
@@ -429,7 +429,11 @@
           <w:szCs w:val="32"/>
         </w:rPr>
       </w:pPr>
-      <w:r>
+    </w:p>
+    <w:p>
+      <w:pPr>
+        <w:spacing w:line="276" w:lineRule="auto"/>
+        <w:jc w:val="center"/>
         <w:rPr>
           <w:rFonts w:ascii="Arial" w:hAnsi="Arial" w:cs="Arial"/>
           <w:b/>
@@ -437,9 +441,7 @@
           <w:sz w:val="32"/>
           <w:szCs w:val="32"/>
         </w:rPr>
-        <w:lastRenderedPageBreak/>
-        <w:t>REZUMA</w:t>
-      </w:r>
+      </w:pPr>
       <w:r>
         <w:rPr>
           <w:rFonts w:ascii="Arial" w:hAnsi="Arial" w:cs="Arial"/>
@@ -448,13 +450,9 @@
           <w:sz w:val="32"/>
           <w:szCs w:val="32"/>
         </w:rPr>
-        <w:t>T</w:t>
-      </w:r>
-    </w:p>
-    <w:p>
-      <w:pPr>
-        <w:spacing w:line="276" w:lineRule="auto"/>
-        <w:jc w:val="center"/>
+        <w:t>REZUMA</w:t>
+      </w:r>
+      <w:r>
         <w:rPr>
           <w:rFonts w:ascii="Arial" w:hAnsi="Arial" w:cs="Arial"/>
           <w:b/>
@@ -462,7 +460,8 @@
           <w:sz w:val="32"/>
           <w:szCs w:val="32"/>
         </w:rPr>
-      </w:pPr>
+        <w:t>T</w:t>
+      </w:r>
     </w:p>
     <w:p>
       <w:pPr>
@@ -730,7 +729,7 @@
     <w:sdt>
       <w:sdtPr>
         <w:rPr>
-          <w:rFonts w:eastAsiaTheme="minorEastAsia" w:cs="Arial"/>
+          <w:rFonts w:asciiTheme="minorHAnsi" w:eastAsiaTheme="minorEastAsia" w:hAnsiTheme="minorHAnsi" w:cs="Arial"/>
           <w:b w:val="0"/>
           <w:bCs w:val="0"/>
           <w:smallCaps w:val="0"/>
@@ -44760,23 +44759,7 @@
           <w:sz w:val="24"/>
           <w:szCs w:val="24"/>
         </w:rPr>
-        <w:t xml:space="preserve"> poate conduce la utilizarea unui număr mai mare de resurse logice, în timp ce reprezentarea sub forma unui tabel de substituție permite</w:t>
-      </w:r>
-      <w:r>
-        <w:rPr>
-          <w:rFonts w:ascii="Arial" w:hAnsi="Arial" w:cs="Arial"/>
-          <w:sz w:val="24"/>
-          <w:szCs w:val="24"/>
-        </w:rPr>
-        <w:t xml:space="preserve"> sintezei</w:t>
-      </w:r>
-      <w:r>
-        <w:rPr>
-          <w:rFonts w:ascii="Arial" w:hAnsi="Arial" w:cs="Arial"/>
-          <w:sz w:val="24"/>
-          <w:szCs w:val="24"/>
-        </w:rPr>
-        <w:t xml:space="preserve"> să exploateze mai eficient resursele de memorie </w:t>
+        <w:t xml:space="preserve"> poate conduce la utilizarea unui număr mai mare de resurse logice, în timp ce reprezentarea sub forma unui tabel de substituție permite sintezei să exploateze mai eficient resursele de memorie </w:t>
       </w:r>
       <w:r>
         <w:rPr>
@@ -45380,23 +45363,7 @@
           <w:sz w:val="24"/>
           <w:szCs w:val="24"/>
         </w:rPr>
-        <w:t>.</w:t>
-      </w:r>
-      <w:r>
-        <w:rPr>
-          <w:rFonts w:ascii="Arial" w:hAnsi="Arial" w:cs="Arial"/>
-          <w:sz w:val="24"/>
-          <w:szCs w:val="24"/>
-        </w:rPr>
-        <w:t xml:space="preserve"> Cu scopul de a evita</w:t>
-      </w:r>
-      <w:r>
-        <w:rPr>
-          <w:rFonts w:ascii="Arial" w:hAnsi="Arial" w:cs="Arial"/>
-          <w:sz w:val="24"/>
-          <w:szCs w:val="24"/>
-        </w:rPr>
-        <w:t xml:space="preserve"> </w:t>
+        <w:t xml:space="preserve">. Cu scopul de a evita </w:t>
       </w:r>
       <w:proofErr w:type="spellStart"/>
       <w:r>
@@ -45414,23 +45381,7 @@
           <w:sz w:val="24"/>
           <w:szCs w:val="24"/>
         </w:rPr>
-        <w:t xml:space="preserve"> a 16 astfel de entități, structura definită primește și procesează direct întreaga matrice de stare. Datele de ieșire vor fi reprezentate de matricea octeților</w:t>
-      </w:r>
-      <w:r>
-        <w:rPr>
-          <w:rFonts w:ascii="Arial" w:hAnsi="Arial" w:cs="Arial"/>
-          <w:sz w:val="24"/>
-          <w:szCs w:val="24"/>
-        </w:rPr>
-        <w:t xml:space="preserve"> </w:t>
-      </w:r>
-      <w:r>
-        <w:rPr>
-          <w:rFonts w:ascii="Arial" w:hAnsi="Arial" w:cs="Arial"/>
-          <w:sz w:val="24"/>
-          <w:szCs w:val="24"/>
-        </w:rPr>
-        <w:t>înlocuiți.</w:t>
+        <w:t xml:space="preserve"> a 16 astfel de entități, structura definită primește și procesează direct întreaga matrice de stare. Datele de ieșire vor fi reprezentate de matricea octeților înlocuiți.</w:t>
       </w:r>
       <w:r>
         <w:rPr>
@@ -45860,15 +45811,7 @@
           <w:sz w:val="24"/>
           <w:szCs w:val="24"/>
         </w:rPr>
-        <w:t xml:space="preserve">. </w:t>
-      </w:r>
-      <w:r>
-        <w:rPr>
-          <w:rFonts w:ascii="Arial" w:hAnsi="Arial" w:cs="Arial"/>
-          <w:sz w:val="24"/>
-          <w:szCs w:val="24"/>
-        </w:rPr>
-        <w:t>Valorile</w:t>
+        <w:t>. Valorile</w:t>
       </w:r>
       <w:r>
         <w:rPr>
@@ -47975,15 +47918,7 @@
             <w:sz w:val="24"/>
             <w:szCs w:val="24"/>
           </w:rPr>
-          <m:t>0</m:t>
-        </m:r>
-        <m:r>
-          <w:rPr>
-            <w:rFonts w:ascii="Cambria Math" w:hAnsi="Cambria Math"/>
-            <w:sz w:val="24"/>
-            <w:szCs w:val="24"/>
-          </w:rPr>
-          <m:t>2</m:t>
+          <m:t>02</m:t>
         </m:r>
         <m:r>
           <m:rPr>
@@ -48024,15 +47959,7 @@
             <w:sz w:val="24"/>
             <w:szCs w:val="24"/>
           </w:rPr>
-          <m:t>0</m:t>
-        </m:r>
-        <m:r>
-          <w:rPr>
-            <w:rFonts w:ascii="Cambria Math" w:hAnsi="Cambria Math"/>
-            <w:sz w:val="24"/>
-            <w:szCs w:val="24"/>
-          </w:rPr>
-          <m:t>3</m:t>
+          <m:t>03</m:t>
         </m:r>
         <m:r>
           <m:rPr>
@@ -49908,16 +49835,7 @@
           <w:sz w:val="24"/>
           <w:szCs w:val="24"/>
         </w:rPr>
-        <w:t>calculul aritmetic</w:t>
-      </w:r>
-      <w:r>
-        <w:rPr>
-          <w:rFonts w:ascii="Arial" w:hAnsi="Arial" w:cs="Arial"/>
-          <w:iCs/>
-          <w:sz w:val="24"/>
-          <w:szCs w:val="24"/>
-        </w:rPr>
-        <w:t xml:space="preserve"> utilizează funcția </w:t>
+        <w:t xml:space="preserve">calculul aritmetic utilizează funcția </w:t>
       </w:r>
       <w:proofErr w:type="spellStart"/>
       <w:r>
@@ -50558,15 +50476,7 @@
             <w:sz w:val="24"/>
             <w:szCs w:val="24"/>
           </w:rPr>
-          <m:t>0</m:t>
-        </m:r>
-        <m:r>
-          <w:rPr>
-            <w:rFonts w:ascii="Cambria Math" w:hAnsi="Cambria Math"/>
-            <w:sz w:val="24"/>
-            <w:szCs w:val="24"/>
-          </w:rPr>
-          <m:t>E</m:t>
+          <m:t>0E</m:t>
         </m:r>
         <m:r>
           <m:rPr>
@@ -50606,15 +50516,7 @@
             <w:sz w:val="24"/>
             <w:szCs w:val="24"/>
           </w:rPr>
-          <m:t>0</m:t>
-        </m:r>
-        <m:r>
-          <w:rPr>
-            <w:rFonts w:ascii="Cambria Math" w:hAnsi="Cambria Math"/>
-            <w:sz w:val="24"/>
-            <w:szCs w:val="24"/>
-          </w:rPr>
-          <m:t>B</m:t>
+          <m:t>0B</m:t>
         </m:r>
         <m:r>
           <m:rPr>
@@ -50654,15 +50556,7 @@
             <w:sz w:val="24"/>
             <w:szCs w:val="24"/>
           </w:rPr>
-          <m:t>0</m:t>
-        </m:r>
-        <m:r>
-          <w:rPr>
-            <w:rFonts w:ascii="Cambria Math" w:hAnsi="Cambria Math"/>
-            <w:sz w:val="24"/>
-            <w:szCs w:val="24"/>
-          </w:rPr>
-          <m:t>D</m:t>
+          <m:t>0D</m:t>
         </m:r>
         <m:r>
           <m:rPr>
@@ -50702,15 +50596,7 @@
             <w:sz w:val="24"/>
             <w:szCs w:val="24"/>
           </w:rPr>
-          <m:t>0</m:t>
-        </m:r>
-        <m:r>
-          <w:rPr>
-            <w:rFonts w:ascii="Cambria Math" w:hAnsi="Cambria Math"/>
-            <w:sz w:val="24"/>
-            <w:szCs w:val="24"/>
-          </w:rPr>
-          <m:t>9</m:t>
+          <m:t>09</m:t>
         </m:r>
         <m:r>
           <m:rPr>
@@ -50730,25 +50616,7 @@
           <w:sz w:val="24"/>
           <w:szCs w:val="24"/>
         </w:rPr>
-        <w:t>, proces co</w:t>
-      </w:r>
-      <w:proofErr w:type="spellStart"/>
-      <w:r>
-        <w:rPr>
-          <w:rFonts w:ascii="Arial" w:hAnsi="Arial" w:cs="Arial"/>
-          <w:sz w:val="24"/>
-          <w:szCs w:val="24"/>
-        </w:rPr>
-        <w:t>nform</w:t>
-      </w:r>
-      <w:proofErr w:type="spellEnd"/>
-      <w:r>
-        <w:rPr>
-          <w:rFonts w:ascii="Arial" w:hAnsi="Arial" w:cs="Arial"/>
-          <w:sz w:val="24"/>
-          <w:szCs w:val="24"/>
-        </w:rPr>
-        <w:t xml:space="preserve"> cu ecuația matriceală 3.</w:t>
+        <w:t>, proces conform cu ecuația matriceală 3.</w:t>
       </w:r>
       <w:r>
         <w:rPr>
@@ -50791,14 +50659,6 @@
           <w:sz w:val="24"/>
           <w:szCs w:val="24"/>
         </w:rPr>
-        <w:t>,</w:t>
-      </w:r>
-      <w:r>
-        <w:rPr>
-          <w:rFonts w:ascii="Arial" w:hAnsi="Arial" w:cs="Arial"/>
-          <w:sz w:val="24"/>
-          <w:szCs w:val="24"/>
-        </w:rPr>
         <w:t xml:space="preserve"> și a menține un grad ridicat de asociativitate cu operația directă,</w:t>
       </w:r>
       <w:r>
@@ -50837,7 +50697,15 @@
           <w:sz w:val="24"/>
           <w:szCs w:val="24"/>
         </w:rPr>
-        <w:t xml:space="preserve"> de înmulțire cu </w:t>
+        <w:t xml:space="preserve"> de înmulțire cu</w:t>
+      </w:r>
+      <w:r>
+        <w:rPr>
+          <w:rFonts w:ascii="Arial" w:hAnsi="Arial" w:cs="Arial"/>
+          <w:sz w:val="24"/>
+          <w:szCs w:val="24"/>
+        </w:rPr>
+        <w:t xml:space="preserve"> polinomul </w:t>
       </w:r>
       <m:oMath>
         <m:r>
@@ -50857,15 +50725,7 @@
             <w:sz w:val="24"/>
             <w:szCs w:val="24"/>
           </w:rPr>
-          <m:t>0</m:t>
-        </m:r>
-        <m:r>
-          <w:rPr>
-            <w:rFonts w:ascii="Cambria Math" w:hAnsi="Cambria Math"/>
-            <w:sz w:val="24"/>
-            <w:szCs w:val="24"/>
-          </w:rPr>
-          <m:t>2</m:t>
+          <m:t>02</m:t>
         </m:r>
         <m:r>
           <m:rPr>
@@ -50885,6 +50745,72 @@
           <w:sz w:val="24"/>
           <w:szCs w:val="24"/>
         </w:rPr>
+        <w:t xml:space="preserve"> din corpul finit </w:t>
+      </w:r>
+      <m:oMath>
+        <m:r>
+          <w:rPr>
+            <w:rFonts w:ascii="Cambria Math" w:hAnsi="Cambria Math"/>
+            <w:sz w:val="24"/>
+            <w:szCs w:val="24"/>
+          </w:rPr>
+          <m:t>GF</m:t>
+        </m:r>
+        <m:d>
+          <m:dPr>
+            <m:ctrlPr>
+              <w:rPr>
+                <w:rFonts w:ascii="Cambria Math" w:hAnsi="Cambria Math"/>
+                <w:i/>
+                <w:iCs/>
+                <w:sz w:val="24"/>
+                <w:szCs w:val="24"/>
+              </w:rPr>
+            </m:ctrlPr>
+          </m:dPr>
+          <m:e>
+            <m:sSup>
+              <m:sSupPr>
+                <m:ctrlPr>
+                  <w:rPr>
+                    <w:rFonts w:ascii="Cambria Math" w:hAnsi="Cambria Math"/>
+                    <w:i/>
+                    <w:iCs/>
+                    <w:sz w:val="24"/>
+                    <w:szCs w:val="24"/>
+                  </w:rPr>
+                </m:ctrlPr>
+              </m:sSupPr>
+              <m:e>
+                <m:r>
+                  <w:rPr>
+                    <w:rFonts w:ascii="Cambria Math" w:hAnsi="Cambria Math"/>
+                    <w:sz w:val="24"/>
+                    <w:szCs w:val="24"/>
+                  </w:rPr>
+                  <m:t>2</m:t>
+                </m:r>
+              </m:e>
+              <m:sup>
+                <m:r>
+                  <w:rPr>
+                    <w:rFonts w:ascii="Cambria Math" w:hAnsi="Cambria Math"/>
+                    <w:sz w:val="24"/>
+                    <w:szCs w:val="24"/>
+                  </w:rPr>
+                  <m:t>8</m:t>
+                </m:r>
+              </m:sup>
+            </m:sSup>
+          </m:e>
+        </m:d>
+      </m:oMath>
+      <w:r>
+        <w:rPr>
+          <w:rFonts w:ascii="Arial" w:hAnsi="Arial" w:cs="Arial"/>
+          <w:sz w:val="24"/>
+          <w:szCs w:val="24"/>
+        </w:rPr>
         <w:t>.</w:t>
       </w:r>
       <w:r>
@@ -50909,7 +50835,15 @@
           <w:sz w:val="24"/>
           <w:szCs w:val="24"/>
         </w:rPr>
-        <w:t xml:space="preserve"> modul alternativ de descriere al coeficienților.</w:t>
+        <w:t xml:space="preserve"> modul alternativ de </w:t>
+      </w:r>
+      <w:r>
+        <w:rPr>
+          <w:rFonts w:ascii="Arial" w:hAnsi="Arial" w:cs="Arial"/>
+          <w:sz w:val="24"/>
+          <w:szCs w:val="24"/>
+        </w:rPr>
+        <w:t>calculare al relațiilor înmulțire polinomială.</w:t>
       </w:r>
     </w:p>
     <w:p>
@@ -51010,7 +50944,23 @@
           <w:sz w:val="24"/>
           <w:szCs w:val="24"/>
         </w:rPr>
-        <w:t xml:space="preserve">Operația de înmulțire polinomiala dintre </w:t>
+        <w:t>Operația de înmulțire</w:t>
+      </w:r>
+      <w:r>
+        <w:rPr>
+          <w:rFonts w:ascii="Arial" w:hAnsi="Arial" w:cs="Arial"/>
+          <w:sz w:val="24"/>
+          <w:szCs w:val="24"/>
+        </w:rPr>
+        <w:t xml:space="preserve"> </w:t>
+      </w:r>
+      <w:r>
+        <w:rPr>
+          <w:rFonts w:ascii="Arial" w:hAnsi="Arial" w:cs="Arial"/>
+          <w:sz w:val="24"/>
+          <w:szCs w:val="24"/>
+        </w:rPr>
+        <w:t xml:space="preserve">dintre </w:t>
       </w:r>
       <m:oMath>
         <m:r>
@@ -51030,15 +50980,7 @@
             <w:sz w:val="24"/>
             <w:szCs w:val="24"/>
           </w:rPr>
-          <m:t>0</m:t>
-        </m:r>
-        <m:r>
-          <w:rPr>
-            <w:rFonts w:ascii="Cambria Math" w:hAnsi="Cambria Math"/>
-            <w:sz w:val="24"/>
-            <w:szCs w:val="24"/>
-          </w:rPr>
-          <m:t>8</m:t>
+          <m:t>08</m:t>
         </m:r>
         <m:r>
           <m:rPr>
@@ -51086,15 +51028,7 @@
             <w:sz w:val="24"/>
             <w:szCs w:val="24"/>
           </w:rPr>
-          <m:t>0</m:t>
-        </m:r>
-        <m:r>
-          <w:rPr>
-            <w:rFonts w:ascii="Cambria Math" w:hAnsi="Cambria Math"/>
-            <w:sz w:val="24"/>
-            <w:szCs w:val="24"/>
-          </w:rPr>
-          <m:t>4</m:t>
+          <m:t>04</m:t>
         </m:r>
         <m:r>
           <m:rPr>
@@ -51172,7 +51106,7 @@
           <w:sz w:val="24"/>
           <w:szCs w:val="24"/>
         </w:rPr>
-        <w:t xml:space="preserve"> poate fi </w:t>
+        <w:t xml:space="preserve">poate fi </w:t>
       </w:r>
       <w:r>
         <w:rPr>
@@ -51181,6 +51115,14 @@
           <w:szCs w:val="24"/>
         </w:rPr>
         <w:t>efectuată</w:t>
+      </w:r>
+      <w:r>
+        <w:rPr>
+          <w:rFonts w:ascii="Arial" w:hAnsi="Arial" w:cs="Arial"/>
+          <w:sz w:val="24"/>
+          <w:szCs w:val="24"/>
+        </w:rPr>
+        <w:t xml:space="preserve"> alternativ</w:t>
       </w:r>
       <w:r>
         <w:rPr>
@@ -51208,15 +51150,7 @@
             <w:sz w:val="24"/>
             <w:szCs w:val="24"/>
           </w:rPr>
-          <m:t>0</m:t>
-        </m:r>
-        <m:r>
-          <w:rPr>
-            <w:rFonts w:ascii="Cambria Math" w:hAnsi="Cambria Math"/>
-            <w:sz w:val="24"/>
-            <w:szCs w:val="24"/>
-          </w:rPr>
-          <m:t>2</m:t>
+          <m:t>02</m:t>
         </m:r>
         <m:r>
           <m:rPr>
@@ -51429,15 +51363,7 @@
             <w:sz w:val="24"/>
             <w:szCs w:val="24"/>
           </w:rPr>
-          <m:t>0</m:t>
-        </m:r>
-        <m:r>
-          <w:rPr>
-            <w:rFonts w:ascii="Cambria Math" w:hAnsi="Cambria Math"/>
-            <w:sz w:val="24"/>
-            <w:szCs w:val="24"/>
-          </w:rPr>
-          <m:t>2</m:t>
+          <m:t>02</m:t>
         </m:r>
         <m:r>
           <m:rPr>
@@ -51477,15 +51403,7 @@
             <w:sz w:val="24"/>
             <w:szCs w:val="24"/>
           </w:rPr>
-          <m:t>0</m:t>
-        </m:r>
-        <m:r>
-          <w:rPr>
-            <w:rFonts w:ascii="Cambria Math" w:hAnsi="Cambria Math"/>
-            <w:sz w:val="24"/>
-            <w:szCs w:val="24"/>
-          </w:rPr>
-          <m:t>4</m:t>
+          <m:t>04</m:t>
         </m:r>
         <m:r>
           <m:rPr>
@@ -51525,15 +51443,7 @@
             <w:sz w:val="24"/>
             <w:szCs w:val="24"/>
           </w:rPr>
-          <m:t>0</m:t>
-        </m:r>
-        <m:r>
-          <w:rPr>
-            <w:rFonts w:ascii="Cambria Math" w:hAnsi="Cambria Math"/>
-            <w:sz w:val="24"/>
-            <w:szCs w:val="24"/>
-          </w:rPr>
-          <m:t>8</m:t>
+          <m:t>08</m:t>
         </m:r>
         <m:r>
           <m:rPr>
@@ -51553,15 +51463,7 @@
           <w:sz w:val="24"/>
           <w:szCs w:val="24"/>
         </w:rPr>
-        <w:t>.</w:t>
-      </w:r>
-      <w:r>
-        <w:rPr>
-          <w:rFonts w:ascii="Arial" w:hAnsi="Arial" w:cs="Arial"/>
-          <w:sz w:val="24"/>
-          <w:szCs w:val="24"/>
-        </w:rPr>
-        <w:t xml:space="preserve"> Aceste calcule vor fi efectuate pentru fiecare octet din componența matrice</w:t>
+        <w:t>. Aceste calcule vor fi efectuate pentru fiecare octet din componența matrice</w:t>
       </w:r>
       <w:r>
         <w:rPr>
@@ -51650,25 +51552,23 @@
           <w:sz w:val="24"/>
           <w:szCs w:val="24"/>
         </w:rPr>
-        <w:t>. În urma ac</w:t>
-      </w:r>
-      <w:proofErr w:type="spellStart"/>
-      <w:r>
-        <w:rPr>
-          <w:rFonts w:ascii="Arial" w:hAnsi="Arial" w:cs="Arial"/>
-          <w:sz w:val="24"/>
-          <w:szCs w:val="24"/>
-        </w:rPr>
-        <w:t>estor</w:t>
-      </w:r>
-      <w:proofErr w:type="spellEnd"/>
-      <w:r>
-        <w:rPr>
-          <w:rFonts w:ascii="Arial" w:hAnsi="Arial" w:cs="Arial"/>
-          <w:sz w:val="24"/>
-          <w:szCs w:val="24"/>
-        </w:rPr>
-        <w:t xml:space="preserve"> calcule, valorile inversei matricei de stare vor fi determinate conform ecuației 3.8, în baza explicitării polinomiale definite la nivelul relațiilor 5.2.</w:t>
+        <w:t>. În urma acestor calcule, valorile inversei matricei de stare vor fi determinate conform ecuației 3.8, în baza explicitării polinomiale definite la nivelul relațiilor 5.2.</w:t>
+      </w:r>
+      <w:r>
+        <w:rPr>
+          <w:rFonts w:ascii="Arial" w:hAnsi="Arial" w:cs="Arial"/>
+          <w:sz w:val="24"/>
+          <w:szCs w:val="24"/>
+        </w:rPr>
+        <w:t xml:space="preserve"> </w:t>
+      </w:r>
+      <w:r>
+        <w:rPr>
+          <w:rFonts w:ascii="Arial" w:hAnsi="Arial" w:cs="Arial"/>
+          <w:sz w:val="24"/>
+          <w:szCs w:val="24"/>
+        </w:rPr>
+        <w:t>Similar transformării directe, fiecare coloană poate fi procesată independent, ceea ce permite realizarea concurentă a operațiilor.</w:t>
       </w:r>
     </w:p>
     <w:p>
@@ -51687,42 +51587,68 @@
           <w:sz w:val="24"/>
           <w:szCs w:val="24"/>
         </w:rPr>
-        <w:t>Structura entității cât și arhitectura sa sunt prezentate în cadrul secvenței de cod 5.17.</w:t>
-      </w:r>
-    </w:p>
-    <w:p>
-      <w:pPr>
-        <w:ind w:firstLine="720"/>
-        <w:rPr>
-          <w:rFonts w:ascii="Arial" w:hAnsi="Arial" w:cs="Arial"/>
-          <w:sz w:val="24"/>
-          <w:szCs w:val="24"/>
-        </w:rPr>
-      </w:pPr>
-    </w:p>
-    <w:p>
-      <w:pPr>
-        <w:ind w:firstLine="720"/>
-        <w:rPr>
-          <w:rFonts w:ascii="Arial" w:hAnsi="Arial" w:cs="Arial"/>
-          <w:sz w:val="24"/>
-          <w:szCs w:val="24"/>
-        </w:rPr>
-      </w:pPr>
-    </w:p>
-    <w:p>
-      <w:pPr>
-        <w:ind w:firstLine="720"/>
-        <w:rPr>
-          <w:rFonts w:ascii="Arial" w:hAnsi="Arial" w:cs="Arial"/>
-          <w:sz w:val="24"/>
-          <w:szCs w:val="24"/>
-        </w:rPr>
-      </w:pPr>
-    </w:p>
-    <w:p>
-      <w:pPr>
-        <w:ind w:firstLine="720"/>
+        <w:t>Structura entității</w:t>
+      </w:r>
+      <w:r>
+        <w:rPr>
+          <w:rFonts w:ascii="Arial" w:hAnsi="Arial" w:cs="Arial"/>
+          <w:sz w:val="24"/>
+          <w:szCs w:val="24"/>
+        </w:rPr>
+        <w:t xml:space="preserve"> </w:t>
+      </w:r>
+      <w:r>
+        <w:rPr>
+          <w:rFonts w:ascii="Arial" w:hAnsi="Arial" w:cs="Arial"/>
+          <w:sz w:val="24"/>
+          <w:szCs w:val="24"/>
+        </w:rPr>
+        <w:t xml:space="preserve">și </w:t>
+      </w:r>
+      <w:r>
+        <w:rPr>
+          <w:rFonts w:ascii="Arial" w:hAnsi="Arial" w:cs="Arial"/>
+          <w:sz w:val="24"/>
+          <w:szCs w:val="24"/>
+        </w:rPr>
+        <w:t xml:space="preserve">a arhitecturii este </w:t>
+      </w:r>
+      <w:r>
+        <w:rPr>
+          <w:rFonts w:ascii="Arial" w:hAnsi="Arial" w:cs="Arial"/>
+          <w:sz w:val="24"/>
+          <w:szCs w:val="24"/>
+        </w:rPr>
+        <w:t>prezentat</w:t>
+      </w:r>
+      <w:r>
+        <w:rPr>
+          <w:rFonts w:ascii="Arial" w:hAnsi="Arial" w:cs="Arial"/>
+          <w:sz w:val="24"/>
+          <w:szCs w:val="24"/>
+        </w:rPr>
+        <w:t xml:space="preserve">ă </w:t>
+      </w:r>
+      <w:r>
+        <w:rPr>
+          <w:rFonts w:ascii="Arial" w:hAnsi="Arial" w:cs="Arial"/>
+          <w:sz w:val="24"/>
+          <w:szCs w:val="24"/>
+        </w:rPr>
+        <w:t>în cadrul secvenței de cod 5.17.</w:t>
+      </w:r>
+    </w:p>
+    <w:p>
+      <w:pPr>
+        <w:rPr>
+          <w:rFonts w:ascii="Arial" w:hAnsi="Arial" w:cs="Arial"/>
+          <w:sz w:val="24"/>
+          <w:szCs w:val="24"/>
+        </w:rPr>
+      </w:pPr>
+    </w:p>
+    <w:p>
+      <w:pPr>
         <w:rPr>
           <w:rFonts w:ascii="Arial" w:hAnsi="Arial" w:cs="Arial"/>
           <w:sz w:val="24"/>
@@ -51734,6 +51660,7 @@
       <w:pPr>
         <w:keepNext/>
         <w:ind w:firstLine="720"/>
+        <w:jc w:val="center"/>
       </w:pPr>
       <w:r>
         <w:rPr>
@@ -51743,9 +51670,9 @@
           <w:szCs w:val="24"/>
         </w:rPr>
         <w:drawing>
-          <wp:inline distT="0" distB="0" distL="0" distR="0" wp14:anchorId="2E8255B4" wp14:editId="360BCFE6">
-            <wp:extent cx="5094788" cy="4029740"/>
-            <wp:effectExtent l="0" t="0" r="0" b="8890"/>
+          <wp:inline distT="0" distB="0" distL="0" distR="0" wp14:anchorId="2E8255B4" wp14:editId="70EBED2F">
+            <wp:extent cx="4369981" cy="3456452"/>
+            <wp:effectExtent l="0" t="0" r="0" b="0"/>
             <wp:docPr id="353790853" name="Picture 17"/>
             <wp:cNvGraphicFramePr>
               <a:graphicFrameLocks xmlns:a="http://schemas.openxmlformats.org/drawingml/2006/main" noChangeAspect="1"/>
@@ -51772,7 +51699,7 @@
                   <pic:spPr>
                     <a:xfrm>
                       <a:off x="0" y="0"/>
-                      <a:ext cx="5106526" cy="4039025"/>
+                      <a:ext cx="4386433" cy="3469464"/>
                     </a:xfrm>
                     <a:prstGeom prst="rect">
                       <a:avLst/>
@@ -51788,11 +51715,13 @@
     <w:p>
       <w:pPr>
         <w:pStyle w:val="Caption"/>
+        <w:ind w:firstLine="720"/>
         <w:jc w:val="center"/>
         <w:rPr>
           <w:rFonts w:ascii="Arial" w:hAnsi="Arial" w:cs="Arial"/>
-          <w:sz w:val="24"/>
-          <w:szCs w:val="24"/>
+          <w:color w:val="auto"/>
+          <w:sz w:val="20"/>
+          <w:szCs w:val="20"/>
         </w:rPr>
       </w:pPr>
       <w:r>
@@ -51925,6 +51854,149 @@
         </w:rPr>
         <w:t xml:space="preserve"> Entitatea și arhitectura transformării inverse a coloanelor</w:t>
       </w:r>
+    </w:p>
+    <w:p/>
+    <w:p>
+      <w:pPr>
+        <w:ind w:firstLine="720"/>
+        <w:jc w:val="both"/>
+        <w:rPr>
+          <w:rFonts w:ascii="Arial" w:hAnsi="Arial" w:cs="Arial"/>
+          <w:sz w:val="24"/>
+          <w:szCs w:val="24"/>
+        </w:rPr>
+      </w:pPr>
+      <w:r>
+        <w:rPr>
+          <w:rFonts w:ascii="Arial" w:hAnsi="Arial" w:cs="Arial"/>
+          <w:sz w:val="24"/>
+          <w:szCs w:val="24"/>
+        </w:rPr>
+        <w:t xml:space="preserve">Arhitectura entității este împărțită în două secvențe funcționale, </w:t>
+      </w:r>
+      <w:r>
+        <w:rPr>
+          <w:rFonts w:ascii="Arial" w:hAnsi="Arial" w:cs="Arial"/>
+          <w:i/>
+          <w:iCs/>
+          <w:sz w:val="24"/>
+          <w:szCs w:val="24"/>
+        </w:rPr>
+        <w:t>GEN_MUL</w:t>
+      </w:r>
+      <w:r>
+        <w:rPr>
+          <w:rFonts w:ascii="Arial" w:hAnsi="Arial" w:cs="Arial"/>
+          <w:sz w:val="24"/>
+          <w:szCs w:val="24"/>
+        </w:rPr>
+        <w:t xml:space="preserve">, respectiv </w:t>
+      </w:r>
+      <w:r>
+        <w:rPr>
+          <w:rFonts w:ascii="Arial" w:hAnsi="Arial" w:cs="Arial"/>
+          <w:i/>
+          <w:iCs/>
+          <w:sz w:val="24"/>
+          <w:szCs w:val="24"/>
+        </w:rPr>
+        <w:t>GEN_INVERT_COLUMN</w:t>
+      </w:r>
+      <w:r>
+        <w:rPr>
+          <w:rFonts w:ascii="Arial" w:hAnsi="Arial" w:cs="Arial"/>
+          <w:sz w:val="24"/>
+          <w:szCs w:val="24"/>
+        </w:rPr>
+        <w:t>. Prima secvență coincide cu precalcularea multiplicativă a valorilor coeficienților polinomului. Cea de a doua</w:t>
+      </w:r>
+      <w:r>
+        <w:rPr>
+          <w:rFonts w:ascii="Arial" w:hAnsi="Arial" w:cs="Arial"/>
+          <w:sz w:val="24"/>
+          <w:szCs w:val="24"/>
+        </w:rPr>
+        <w:t xml:space="preserve"> serie de instrucțiuni </w:t>
+      </w:r>
+      <w:r>
+        <w:rPr>
+          <w:rFonts w:ascii="Arial" w:hAnsi="Arial" w:cs="Arial"/>
+          <w:sz w:val="24"/>
+          <w:szCs w:val="24"/>
+        </w:rPr>
+        <w:t>constă în calcularea octeților propriu-ziși ai matricei de stare.</w:t>
+      </w:r>
+      <w:r>
+        <w:rPr>
+          <w:rFonts w:ascii="Arial" w:hAnsi="Arial" w:cs="Arial"/>
+          <w:sz w:val="24"/>
+          <w:szCs w:val="24"/>
+        </w:rPr>
+        <w:t xml:space="preserve"> Valorile sunt calculate în baza unor operații logice </w:t>
+      </w:r>
+      <w:proofErr w:type="spellStart"/>
+      <w:r>
+        <w:rPr>
+          <w:rFonts w:ascii="Arial" w:hAnsi="Arial" w:cs="Arial"/>
+          <w:sz w:val="24"/>
+          <w:szCs w:val="24"/>
+        </w:rPr>
+        <w:t>combinaționale</w:t>
+      </w:r>
+      <w:proofErr w:type="spellEnd"/>
+      <w:r>
+        <w:rPr>
+          <w:rFonts w:ascii="Arial" w:hAnsi="Arial" w:cs="Arial"/>
+          <w:sz w:val="24"/>
+          <w:szCs w:val="24"/>
+        </w:rPr>
+        <w:t>,</w:t>
+      </w:r>
+      <w:r>
+        <w:rPr>
+          <w:rFonts w:ascii="Arial" w:hAnsi="Arial" w:cs="Arial"/>
+          <w:sz w:val="24"/>
+          <w:szCs w:val="24"/>
+        </w:rPr>
+        <w:t xml:space="preserve"> generate iterativ prin intermediul instrucțiunii </w:t>
+      </w:r>
+      <w:r>
+        <w:rPr>
+          <w:rFonts w:ascii="Arial" w:hAnsi="Arial" w:cs="Arial"/>
+          <w:i/>
+          <w:iCs/>
+          <w:sz w:val="24"/>
+          <w:szCs w:val="24"/>
+        </w:rPr>
+        <w:t>for generate</w:t>
+      </w:r>
+      <w:r>
+        <w:rPr>
+          <w:rFonts w:ascii="Arial" w:hAnsi="Arial" w:cs="Arial"/>
+          <w:sz w:val="24"/>
+          <w:szCs w:val="24"/>
+        </w:rPr>
+        <w:t>,</w:t>
+      </w:r>
+      <w:r>
+        <w:rPr>
+          <w:rFonts w:ascii="Arial" w:hAnsi="Arial" w:cs="Arial"/>
+          <w:sz w:val="24"/>
+          <w:szCs w:val="24"/>
+        </w:rPr>
+        <w:t xml:space="preserve"> pentru fiecare dintre cei patru octeți din componența unei coloane.</w:t>
+      </w:r>
+    </w:p>
+    <w:p>
+      <w:pPr>
+        <w:ind w:firstLine="720"/>
+        <w:jc w:val="both"/>
+        <w:rPr>
+          <w:rFonts w:ascii="Arial" w:hAnsi="Arial" w:cs="Arial"/>
+          <w:sz w:val="24"/>
+          <w:szCs w:val="24"/>
+        </w:rPr>
+      </w:pPr>
     </w:p>
     <w:p>
       <w:pPr>
@@ -55007,6 +55079,7 @@
   </w:compat>
   <w:rsids>
     <w:rsidRoot w:val="00F924A7"/>
+    <w:rsid w:val="001541B8"/>
     <w:rsid w:val="00192327"/>
     <w:rsid w:val="001D3BF4"/>
     <w:rsid w:val="0024320B"/>
@@ -55020,6 +55093,7 @@
     <w:rsid w:val="00B8483B"/>
     <w:rsid w:val="00CE3EC1"/>
     <w:rsid w:val="00D050A3"/>
+    <w:rsid w:val="00E430ED"/>
     <w:rsid w:val="00E935AF"/>
     <w:rsid w:val="00EF4327"/>
     <w:rsid w:val="00F924A7"/>
@@ -55789,6 +55863,14 @@
 </file>
 
 <file path=customXml/item1.xml><?xml version="1.0" encoding="utf-8"?>
+<p:properties xmlns:p="http://schemas.microsoft.com/office/2006/metadata/properties" xmlns:xsi="http://www.w3.org/2001/XMLSchema-instance" xmlns:pc="http://schemas.microsoft.com/office/infopath/2007/PartnerControls">
+  <documentManagement>
+    <_activity xmlns="0a9abc3b-b67c-45af-b1d9-b0180db7a2c4" xsi:nil="true"/>
+  </documentManagement>
+</p:properties>
+</file>
+
+<file path=customXml/item2.xml><?xml version="1.0" encoding="utf-8"?>
 <ct:contentTypeSchema xmlns:ct="http://schemas.microsoft.com/office/2006/metadata/contentType" xmlns:ma="http://schemas.microsoft.com/office/2006/metadata/properties/metaAttributes" ct:_="" ma:_="" ma:contentTypeName="Document" ma:contentTypeID="0x0101003BB3AC5C3772B84FA72474F3266239F5" ma:contentTypeVersion="12" ma:contentTypeDescription="Create a new document." ma:contentTypeScope="" ma:versionID="c00b3bd5dab29c181e82d78bf7c768e9">
   <xsd:schema xmlns:xsd="http://www.w3.org/2001/XMLSchema" xmlns:xs="http://www.w3.org/2001/XMLSchema" xmlns:p="http://schemas.microsoft.com/office/2006/metadata/properties" xmlns:ns3="0a9abc3b-b67c-45af-b1d9-b0180db7a2c4" targetNamespace="http://schemas.microsoft.com/office/2006/metadata/properties" ma:root="true" ma:fieldsID="8fdbe03ecd05bd2d54e87130612d2cc0" ns3:_="">
     <xsd:import namespace="0a9abc3b-b67c-45af-b1d9-b0180db7a2c4"/>
@@ -55984,7 +56066,11 @@
 </ct:contentTypeSchema>
 </file>
 
-<file path=customXml/item2.xml><?xml version="1.0" encoding="utf-8"?>
+<file path=customXml/item3.xml><?xml version="1.0" encoding="utf-8"?>
+<b:Sources xmlns:b="http://schemas.openxmlformats.org/officeDocument/2006/bibliography" xmlns="http://schemas.openxmlformats.org/officeDocument/2006/bibliography" SelectedStyle="\APASixthEditionOfficeOnline.xsl" StyleName="APA" Version="6"/>
+</file>
+
+<file path=customXml/item4.xml><?xml version="1.0" encoding="utf-8"?>
 <?mso-contentType ?>
 <FormTemplates xmlns="http://schemas.microsoft.com/sharepoint/v3/contenttype/forms">
   <Display>DocumentLibraryForm</Display>
@@ -55993,19 +56079,17 @@
 </FormTemplates>
 </file>
 
-<file path=customXml/item3.xml><?xml version="1.0" encoding="utf-8"?>
-<p:properties xmlns:p="http://schemas.microsoft.com/office/2006/metadata/properties" xmlns:xsi="http://www.w3.org/2001/XMLSchema-instance" xmlns:pc="http://schemas.microsoft.com/office/infopath/2007/PartnerControls">
-  <documentManagement>
-    <_activity xmlns="0a9abc3b-b67c-45af-b1d9-b0180db7a2c4" xsi:nil="true"/>
-  </documentManagement>
-</p:properties>
+<file path=customXml/itemProps1.xml><?xml version="1.0" encoding="utf-8"?>
+<ds:datastoreItem xmlns:ds="http://schemas.openxmlformats.org/officeDocument/2006/customXml" ds:itemID="{AA8770D6-6886-410B-93B4-6D5D54BAD75D}">
+  <ds:schemaRefs>
+    <ds:schemaRef ds:uri="http://schemas.microsoft.com/office/2006/metadata/properties"/>
+    <ds:schemaRef ds:uri="http://schemas.microsoft.com/office/infopath/2007/PartnerControls"/>
+    <ds:schemaRef ds:uri="0a9abc3b-b67c-45af-b1d9-b0180db7a2c4"/>
+  </ds:schemaRefs>
+</ds:datastoreItem>
 </file>
 
-<file path=customXml/item4.xml><?xml version="1.0" encoding="utf-8"?>
-<b:Sources xmlns:b="http://schemas.openxmlformats.org/officeDocument/2006/bibliography" xmlns="http://schemas.openxmlformats.org/officeDocument/2006/bibliography" SelectedStyle="\APASixthEditionOfficeOnline.xsl" StyleName="APA" Version="6"/>
-</file>
-
-<file path=customXml/itemProps1.xml><?xml version="1.0" encoding="utf-8"?>
+<file path=customXml/itemProps2.xml><?xml version="1.0" encoding="utf-8"?>
 <ds:datastoreItem xmlns:ds="http://schemas.openxmlformats.org/officeDocument/2006/customXml" ds:itemID="{22AE9436-BE9C-42D5-9883-32E1F9448477}">
   <ds:schemaRefs>
     <ds:schemaRef ds:uri="http://schemas.microsoft.com/office/2006/metadata/contentType"/>
@@ -56023,28 +56107,18 @@
 </ds:datastoreItem>
 </file>
 
-<file path=customXml/itemProps2.xml><?xml version="1.0" encoding="utf-8"?>
+<file path=customXml/itemProps3.xml><?xml version="1.0" encoding="utf-8"?>
+<ds:datastoreItem xmlns:ds="http://schemas.openxmlformats.org/officeDocument/2006/customXml" ds:itemID="{B7B95ABC-8616-4E1F-BA28-E2B2A6EEEEF5}">
+  <ds:schemaRefs>
+    <ds:schemaRef ds:uri="http://schemas.openxmlformats.org/officeDocument/2006/bibliography"/>
+  </ds:schemaRefs>
+</ds:datastoreItem>
+</file>
+
+<file path=customXml/itemProps4.xml><?xml version="1.0" encoding="utf-8"?>
 <ds:datastoreItem xmlns:ds="http://schemas.openxmlformats.org/officeDocument/2006/customXml" ds:itemID="{AD193FD9-4DA5-46D1-B015-D7B972817297}">
   <ds:schemaRefs>
     <ds:schemaRef ds:uri="http://schemas.microsoft.com/sharepoint/v3/contenttype/forms"/>
   </ds:schemaRefs>
 </ds:datastoreItem>
-</file>
-
-<file path=customXml/itemProps3.xml><?xml version="1.0" encoding="utf-8"?>
-<ds:datastoreItem xmlns:ds="http://schemas.openxmlformats.org/officeDocument/2006/customXml" ds:itemID="{AA8770D6-6886-410B-93B4-6D5D54BAD75D}">
-  <ds:schemaRefs>
-    <ds:schemaRef ds:uri="http://schemas.microsoft.com/office/2006/metadata/properties"/>
-    <ds:schemaRef ds:uri="http://schemas.microsoft.com/office/infopath/2007/PartnerControls"/>
-    <ds:schemaRef ds:uri="0a9abc3b-b67c-45af-b1d9-b0180db7a2c4"/>
-  </ds:schemaRefs>
-</ds:datastoreItem>
-</file>
-
-<file path=customXml/itemProps4.xml><?xml version="1.0" encoding="utf-8"?>
-<ds:datastoreItem xmlns:ds="http://schemas.openxmlformats.org/officeDocument/2006/customXml" ds:itemID="{B7B95ABC-8616-4E1F-BA28-E2B2A6EEEEF5}">
-  <ds:schemaRefs>
-    <ds:schemaRef ds:uri="http://schemas.openxmlformats.org/officeDocument/2006/bibliography"/>
-  </ds:schemaRefs>
-</ds:datastoreItem>
 </file>
</xml_diff>

<commit_message>
Add Round Key Transformation
</commit_message>
<xml_diff>
--- a/Paper/BDA_AES.docx
+++ b/Paper/BDA_AES.docx
@@ -1804,7 +1804,7 @@
                 <w:noProof/>
                 <w:webHidden/>
               </w:rPr>
-              <w:t>12</w:t>
+              <w:t>11</w:t>
             </w:r>
             <w:r>
               <w:rPr>
@@ -2464,7 +2464,7 @@
                 <w:noProof/>
                 <w:webHidden/>
               </w:rPr>
-              <w:t>21</w:t>
+              <w:t>20</w:t>
             </w:r>
             <w:r>
               <w:rPr>
@@ -2748,7 +2748,7 @@
                 <w:noProof/>
                 <w:webHidden/>
               </w:rPr>
-              <w:t>23</w:t>
+              <w:t>22</w:t>
             </w:r>
             <w:r>
               <w:rPr>
@@ -2936,7 +2936,7 @@
                 <w:noProof/>
                 <w:webHidden/>
               </w:rPr>
-              <w:t>25</w:t>
+              <w:t>24</w:t>
             </w:r>
             <w:r>
               <w:rPr>
@@ -3218,7 +3218,7 @@
                 <w:noProof/>
                 <w:webHidden/>
               </w:rPr>
-              <w:t>27</w:t>
+              <w:t>26</w:t>
             </w:r>
             <w:r>
               <w:rPr>
@@ -3594,7 +3594,7 @@
                 <w:noProof/>
                 <w:webHidden/>
               </w:rPr>
-              <w:t>30</w:t>
+              <w:t>29</w:t>
             </w:r>
             <w:r>
               <w:rPr>
@@ -4067,7 +4067,7 @@
                 <w:noProof/>
                 <w:webHidden/>
               </w:rPr>
-              <w:t>35</w:t>
+              <w:t>34</w:t>
             </w:r>
             <w:r>
               <w:rPr>
@@ -4161,7 +4161,7 @@
                 <w:noProof/>
                 <w:webHidden/>
               </w:rPr>
-              <w:t>36</w:t>
+              <w:t>35</w:t>
             </w:r>
             <w:r>
               <w:rPr>
@@ -4255,7 +4255,7 @@
                 <w:noProof/>
                 <w:webHidden/>
               </w:rPr>
-              <w:t>40</w:t>
+              <w:t>39</w:t>
             </w:r>
             <w:r>
               <w:rPr>
@@ -4347,7 +4347,7 @@
                 <w:noProof/>
                 <w:webHidden/>
               </w:rPr>
-              <w:t>42</w:t>
+              <w:t>41</w:t>
             </w:r>
             <w:r>
               <w:rPr>
@@ -4439,7 +4439,7 @@
                 <w:noProof/>
                 <w:webHidden/>
               </w:rPr>
-              <w:t>43</w:t>
+              <w:t>42</w:t>
             </w:r>
             <w:r>
               <w:rPr>
@@ -4531,7 +4531,7 @@
                 <w:noProof/>
                 <w:webHidden/>
               </w:rPr>
-              <w:t>44</w:t>
+              <w:t>43</w:t>
             </w:r>
             <w:r>
               <w:rPr>
@@ -4623,7 +4623,7 @@
                 <w:noProof/>
                 <w:webHidden/>
               </w:rPr>
-              <w:t>45</w:t>
+              <w:t>44</w:t>
             </w:r>
             <w:r>
               <w:rPr>
@@ -4715,7 +4715,7 @@
                 <w:noProof/>
                 <w:webHidden/>
               </w:rPr>
-              <w:t>48</w:t>
+              <w:t>47</w:t>
             </w:r>
             <w:r>
               <w:rPr>
@@ -12411,6 +12411,17 @@
           <w:color w:val="auto"/>
           <w:sz w:val="20"/>
           <w:szCs w:val="20"/>
+          <w:cs/>
+        </w:rPr>
+        <w:t>‎</w:t>
+      </w:r>
+      <w:r>
+        <w:rPr>
+          <w:rFonts w:ascii="Arial" w:hAnsi="Arial" w:cs="Arial"/>
+          <w:noProof/>
+          <w:color w:val="auto"/>
+          <w:sz w:val="20"/>
+          <w:szCs w:val="20"/>
         </w:rPr>
         <w:t>3</w:t>
       </w:r>
@@ -13054,6 +13065,17 @@
           <w:color w:val="auto"/>
           <w:sz w:val="20"/>
           <w:szCs w:val="20"/>
+          <w:cs/>
+        </w:rPr>
+        <w:t>‎</w:t>
+      </w:r>
+      <w:r>
+        <w:rPr>
+          <w:rFonts w:ascii="Arial" w:hAnsi="Arial" w:cs="Arial"/>
+          <w:noProof/>
+          <w:color w:val="auto"/>
+          <w:sz w:val="20"/>
+          <w:szCs w:val="20"/>
         </w:rPr>
         <w:t>3</w:t>
       </w:r>
@@ -13435,6 +13457,17 @@
           <w:szCs w:val="20"/>
         </w:rPr>
         <w:fldChar w:fldCharType="separate"/>
+      </w:r>
+      <w:r>
+        <w:rPr>
+          <w:rFonts w:ascii="Arial" w:hAnsi="Arial" w:cs="Arial"/>
+          <w:noProof/>
+          <w:color w:val="auto"/>
+          <w:sz w:val="20"/>
+          <w:szCs w:val="20"/>
+          <w:cs/>
+        </w:rPr>
+        <w:t>‎</w:t>
       </w:r>
       <w:r>
         <w:rPr>
@@ -17011,6 +17044,18 @@
       <w:r>
         <w:rPr>
           <w:rFonts w:ascii="Arial" w:hAnsi="Arial" w:cs="Arial"/>
+          <w:noProof/>
+          <w:color w:val="auto"/>
+          <w:sz w:val="20"/>
+          <w:szCs w:val="20"/>
+          <w:cs/>
+        </w:rPr>
+        <w:t>‎</w:t>
+      </w:r>
+      <w:r>
+        <w:rPr>
+          <w:rFonts w:ascii="Arial" w:hAnsi="Arial" w:cs="Arial"/>
+          <w:noProof/>
           <w:color w:val="auto"/>
           <w:sz w:val="20"/>
           <w:szCs w:val="20"/>
@@ -17699,6 +17744,18 @@
       <w:r>
         <w:rPr>
           <w:rFonts w:ascii="Arial" w:hAnsi="Arial" w:cs="Arial"/>
+          <w:noProof/>
+          <w:color w:val="auto"/>
+          <w:sz w:val="20"/>
+          <w:szCs w:val="20"/>
+          <w:cs/>
+        </w:rPr>
+        <w:t>‎</w:t>
+      </w:r>
+      <w:r>
+        <w:rPr>
+          <w:rFonts w:ascii="Arial" w:hAnsi="Arial" w:cs="Arial"/>
+          <w:noProof/>
           <w:color w:val="auto"/>
           <w:sz w:val="20"/>
           <w:szCs w:val="20"/>
@@ -18218,6 +18275,17 @@
           <w:szCs w:val="20"/>
         </w:rPr>
         <w:fldChar w:fldCharType="separate"/>
+      </w:r>
+      <w:r>
+        <w:rPr>
+          <w:rFonts w:ascii="Arial" w:hAnsi="Arial" w:cs="Arial"/>
+          <w:noProof/>
+          <w:color w:val="auto"/>
+          <w:sz w:val="20"/>
+          <w:szCs w:val="20"/>
+          <w:cs/>
+        </w:rPr>
+        <w:t>‎</w:t>
       </w:r>
       <w:r>
         <w:rPr>
@@ -25965,6 +26033,17 @@
           <w:color w:val="auto"/>
           <w:sz w:val="20"/>
           <w:szCs w:val="20"/>
+          <w:cs/>
+        </w:rPr>
+        <w:t>‎</w:t>
+      </w:r>
+      <w:r>
+        <w:rPr>
+          <w:rFonts w:ascii="Arial" w:hAnsi="Arial" w:cs="Arial"/>
+          <w:noProof/>
+          <w:color w:val="auto"/>
+          <w:sz w:val="20"/>
+          <w:szCs w:val="20"/>
         </w:rPr>
         <w:t>3</w:t>
       </w:r>
@@ -27688,6 +27767,17 @@
           <w:color w:val="auto"/>
           <w:sz w:val="20"/>
           <w:szCs w:val="20"/>
+          <w:cs/>
+        </w:rPr>
+        <w:t>‎</w:t>
+      </w:r>
+      <w:r>
+        <w:rPr>
+          <w:rFonts w:ascii="Arial" w:hAnsi="Arial" w:cs="Arial"/>
+          <w:noProof/>
+          <w:color w:val="auto"/>
+          <w:sz w:val="20"/>
+          <w:szCs w:val="20"/>
         </w:rPr>
         <w:t>3</w:t>
       </w:r>
@@ -28567,6 +28657,17 @@
           <w:color w:val="auto"/>
           <w:sz w:val="20"/>
           <w:szCs w:val="20"/>
+          <w:cs/>
+        </w:rPr>
+        <w:t>‎</w:t>
+      </w:r>
+      <w:r>
+        <w:rPr>
+          <w:rFonts w:ascii="Arial" w:hAnsi="Arial" w:cs="Arial"/>
+          <w:noProof/>
+          <w:color w:val="auto"/>
+          <w:sz w:val="20"/>
+          <w:szCs w:val="20"/>
         </w:rPr>
         <w:t>3</w:t>
       </w:r>
@@ -29040,6 +29141,17 @@
           <w:color w:val="auto"/>
           <w:sz w:val="20"/>
           <w:szCs w:val="20"/>
+          <w:cs/>
+        </w:rPr>
+        <w:t>‎</w:t>
+      </w:r>
+      <w:r>
+        <w:rPr>
+          <w:rFonts w:ascii="Arial" w:hAnsi="Arial" w:cs="Arial"/>
+          <w:noProof/>
+          <w:color w:val="auto"/>
+          <w:sz w:val="20"/>
+          <w:szCs w:val="20"/>
         </w:rPr>
         <w:t>3</w:t>
       </w:r>
@@ -36772,6 +36884,17 @@
           <w:color w:val="auto"/>
           <w:sz w:val="20"/>
           <w:szCs w:val="20"/>
+          <w:cs/>
+        </w:rPr>
+        <w:t>‎</w:t>
+      </w:r>
+      <w:r>
+        <w:rPr>
+          <w:rFonts w:ascii="Arial" w:hAnsi="Arial" w:cs="Arial"/>
+          <w:noProof/>
+          <w:color w:val="auto"/>
+          <w:sz w:val="20"/>
+          <w:szCs w:val="20"/>
         </w:rPr>
         <w:t>3</w:t>
       </w:r>
@@ -38049,6 +38172,17 @@
           <w:color w:val="auto"/>
           <w:sz w:val="20"/>
           <w:szCs w:val="20"/>
+          <w:cs/>
+        </w:rPr>
+        <w:t>‎</w:t>
+      </w:r>
+      <w:r>
+        <w:rPr>
+          <w:rFonts w:ascii="Arial" w:hAnsi="Arial" w:cs="Arial"/>
+          <w:noProof/>
+          <w:color w:val="auto"/>
+          <w:sz w:val="20"/>
+          <w:szCs w:val="20"/>
         </w:rPr>
         <w:t>4</w:t>
       </w:r>
@@ -38611,6 +38745,17 @@
           <w:szCs w:val="20"/>
         </w:rPr>
         <w:fldChar w:fldCharType="separate"/>
+      </w:r>
+      <w:r>
+        <w:rPr>
+          <w:rFonts w:ascii="Arial" w:hAnsi="Arial" w:cs="Arial"/>
+          <w:noProof/>
+          <w:color w:val="auto"/>
+          <w:sz w:val="20"/>
+          <w:szCs w:val="20"/>
+          <w:cs/>
+        </w:rPr>
+        <w:t>‎</w:t>
       </w:r>
       <w:r>
         <w:rPr>
@@ -39250,6 +39395,17 @@
           <w:color w:val="auto"/>
           <w:sz w:val="20"/>
           <w:szCs w:val="20"/>
+          <w:cs/>
+        </w:rPr>
+        <w:t>‎</w:t>
+      </w:r>
+      <w:r>
+        <w:rPr>
+          <w:rFonts w:ascii="Arial" w:hAnsi="Arial" w:cs="Arial"/>
+          <w:noProof/>
+          <w:color w:val="auto"/>
+          <w:sz w:val="20"/>
+          <w:szCs w:val="20"/>
         </w:rPr>
         <w:t>4</w:t>
       </w:r>
@@ -39992,6 +40148,17 @@
           <w:color w:val="auto"/>
           <w:sz w:val="20"/>
           <w:szCs w:val="20"/>
+          <w:cs/>
+        </w:rPr>
+        <w:t>‎</w:t>
+      </w:r>
+      <w:r>
+        <w:rPr>
+          <w:rFonts w:ascii="Arial" w:hAnsi="Arial" w:cs="Arial"/>
+          <w:noProof/>
+          <w:color w:val="auto"/>
+          <w:sz w:val="20"/>
+          <w:szCs w:val="20"/>
         </w:rPr>
         <w:t>4</w:t>
       </w:r>
@@ -41450,6 +41617,17 @@
           <w:color w:val="auto"/>
           <w:sz w:val="20"/>
           <w:szCs w:val="20"/>
+          <w:cs/>
+        </w:rPr>
+        <w:t>‎</w:t>
+      </w:r>
+      <w:r>
+        <w:rPr>
+          <w:rFonts w:ascii="Arial" w:hAnsi="Arial" w:cs="Arial"/>
+          <w:noProof/>
+          <w:color w:val="auto"/>
+          <w:sz w:val="20"/>
+          <w:szCs w:val="20"/>
         </w:rPr>
         <w:t>5</w:t>
       </w:r>
@@ -42183,6 +42361,17 @@
           <w:szCs w:val="20"/>
         </w:rPr>
         <w:fldChar w:fldCharType="separate"/>
+      </w:r>
+      <w:r>
+        <w:rPr>
+          <w:rFonts w:ascii="Arial" w:hAnsi="Arial" w:cs="Arial"/>
+          <w:noProof/>
+          <w:color w:val="auto"/>
+          <w:sz w:val="20"/>
+          <w:szCs w:val="20"/>
+          <w:cs/>
+        </w:rPr>
+        <w:t>‎</w:t>
       </w:r>
       <w:r>
         <w:rPr>
@@ -47980,27 +48169,7 @@
           <w:sz w:val="24"/>
           <w:szCs w:val="24"/>
         </w:rPr>
-        <w:t xml:space="preserve"> necesită reducerea rezultatului </w:t>
-      </w:r>
-      <w:proofErr w:type="spellStart"/>
-      <w:r>
-        <w:rPr>
-          <w:rFonts w:asciiTheme="minorBidi" w:hAnsiTheme="minorBidi"/>
-          <w:iCs/>
-          <w:sz w:val="24"/>
-          <w:szCs w:val="24"/>
-        </w:rPr>
-        <w:t>modulo</w:t>
-      </w:r>
-      <w:proofErr w:type="spellEnd"/>
-      <w:r>
-        <w:rPr>
-          <w:rFonts w:asciiTheme="minorBidi" w:hAnsiTheme="minorBidi"/>
-          <w:iCs/>
-          <w:sz w:val="24"/>
-          <w:szCs w:val="24"/>
-        </w:rPr>
-        <w:t xml:space="preserve"> </w:t>
+        <w:t xml:space="preserve"> necesită reducerea rezultatului modulo </w:t>
       </w:r>
       <m:oMath>
         <m:r>
@@ -52000,6 +52169,1110 @@
     </w:p>
     <w:p>
       <w:pPr>
+        <w:pStyle w:val="Heading2"/>
+      </w:pPr>
+      <w:r>
+        <w:t>ADĂUGAREA CHEII DE RUNDĂ</w:t>
+      </w:r>
+    </w:p>
+    <w:p/>
+    <w:p>
+      <w:pPr>
+        <w:ind w:firstLine="576"/>
+        <w:jc w:val="both"/>
+        <w:rPr>
+          <w:rFonts w:ascii="Arial" w:hAnsi="Arial" w:cs="Arial"/>
+          <w:sz w:val="24"/>
+          <w:szCs w:val="24"/>
+        </w:rPr>
+      </w:pPr>
+      <w:r>
+        <w:rPr>
+          <w:rFonts w:ascii="Arial" w:hAnsi="Arial" w:cs="Arial"/>
+          <w:sz w:val="24"/>
+          <w:szCs w:val="24"/>
+        </w:rPr>
+        <w:t xml:space="preserve">Adăugarea cheii de rundă este construită în jurul unei simple operații </w:t>
+      </w:r>
+      <w:r>
+        <w:rPr>
+          <w:rFonts w:ascii="Arial" w:hAnsi="Arial" w:cs="Arial"/>
+          <w:i/>
+          <w:iCs/>
+          <w:sz w:val="24"/>
+          <w:szCs w:val="24"/>
+        </w:rPr>
+        <w:t>sau-exclusiv</w:t>
+      </w:r>
+      <w:r>
+        <w:rPr>
+          <w:rFonts w:ascii="Arial" w:hAnsi="Arial" w:cs="Arial"/>
+          <w:sz w:val="24"/>
+          <w:szCs w:val="24"/>
+        </w:rPr>
+        <w:t xml:space="preserve"> între matricea stării curente și cea a cheii de rund</w:t>
+      </w:r>
+      <w:r>
+        <w:rPr>
+          <w:rFonts w:ascii="Arial" w:hAnsi="Arial" w:cs="Arial"/>
+          <w:sz w:val="24"/>
+          <w:szCs w:val="24"/>
+        </w:rPr>
+        <w:t>ă.</w:t>
+      </w:r>
+      <w:r>
+        <w:t xml:space="preserve"> </w:t>
+      </w:r>
+      <w:r>
+        <w:rPr>
+          <w:rFonts w:ascii="Arial" w:hAnsi="Arial" w:cs="Arial"/>
+          <w:sz w:val="24"/>
+          <w:szCs w:val="24"/>
+        </w:rPr>
+        <w:t>Din punct de vedere hardware, această transformare are o complexitate redusă, nefiind necesare operații aritmetice suplimentare sau elemente de memorare dedicate.</w:t>
+      </w:r>
+    </w:p>
+    <w:p>
+      <w:pPr>
+        <w:ind w:firstLine="576"/>
+        <w:jc w:val="both"/>
+        <w:rPr>
+          <w:rFonts w:ascii="Arial" w:hAnsi="Arial" w:cs="Arial"/>
+          <w:sz w:val="24"/>
+          <w:szCs w:val="24"/>
+        </w:rPr>
+      </w:pPr>
+      <w:r>
+        <w:rPr>
+          <w:rFonts w:ascii="Arial" w:hAnsi="Arial" w:cs="Arial"/>
+          <w:sz w:val="24"/>
+          <w:szCs w:val="24"/>
+        </w:rPr>
+        <w:t xml:space="preserve">Implementarea poate fi realizată complet </w:t>
+      </w:r>
+      <w:proofErr w:type="spellStart"/>
+      <w:r>
+        <w:rPr>
+          <w:rFonts w:ascii="Arial" w:hAnsi="Arial" w:cs="Arial"/>
+          <w:sz w:val="24"/>
+          <w:szCs w:val="24"/>
+        </w:rPr>
+        <w:t>combinațional</w:t>
+      </w:r>
+      <w:proofErr w:type="spellEnd"/>
+      <w:r>
+        <w:rPr>
+          <w:rFonts w:ascii="Arial" w:hAnsi="Arial" w:cs="Arial"/>
+          <w:sz w:val="24"/>
+          <w:szCs w:val="24"/>
+        </w:rPr>
+        <w:t>, fiecare octet al stării fiind combinat cu octetul corespunzător al cheii de rundă. Datorită independenței dintre aceste operații, toate cele 16 operații XOR pot fi efectuate în paralel.</w:t>
+      </w:r>
+    </w:p>
+    <w:p>
+      <w:pPr>
+        <w:ind w:firstLine="576"/>
+        <w:jc w:val="both"/>
+        <w:rPr>
+          <w:rFonts w:ascii="Arial" w:hAnsi="Arial" w:cs="Arial"/>
+          <w:sz w:val="24"/>
+          <w:szCs w:val="24"/>
+        </w:rPr>
+      </w:pPr>
+      <w:r>
+        <w:rPr>
+          <w:rFonts w:ascii="Arial" w:hAnsi="Arial" w:cs="Arial"/>
+          <w:sz w:val="24"/>
+          <w:szCs w:val="24"/>
+        </w:rPr>
+        <w:t xml:space="preserve">Drept consecință pentru faptul că stările interne sunt reprezentate prin intermediul tipului de date compus </w:t>
+      </w:r>
+      <w:proofErr w:type="spellStart"/>
+      <w:r>
+        <w:rPr>
+          <w:rFonts w:ascii="Arial" w:hAnsi="Arial" w:cs="Arial"/>
+          <w:i/>
+          <w:iCs/>
+          <w:sz w:val="24"/>
+          <w:szCs w:val="24"/>
+        </w:rPr>
+        <w:t>byte_matrix</w:t>
+      </w:r>
+      <w:proofErr w:type="spellEnd"/>
+      <w:r>
+        <w:rPr>
+          <w:rFonts w:ascii="Arial" w:hAnsi="Arial" w:cs="Arial"/>
+          <w:sz w:val="24"/>
+          <w:szCs w:val="24"/>
+        </w:rPr>
+        <w:t xml:space="preserve">, este necesară dezvoltarea unei simple funcții care să efectueze operație logică </w:t>
+      </w:r>
+      <w:r>
+        <w:rPr>
+          <w:rFonts w:ascii="Arial" w:hAnsi="Arial" w:cs="Arial"/>
+          <w:i/>
+          <w:iCs/>
+          <w:sz w:val="24"/>
+          <w:szCs w:val="24"/>
+        </w:rPr>
+        <w:t>sau-exclusiv</w:t>
+      </w:r>
+      <w:r>
+        <w:rPr>
+          <w:rFonts w:ascii="Arial" w:hAnsi="Arial" w:cs="Arial"/>
+          <w:sz w:val="24"/>
+          <w:szCs w:val="24"/>
+        </w:rPr>
+        <w:t xml:space="preserve"> la nivelul fiecărui octet.</w:t>
+      </w:r>
+    </w:p>
+    <w:p>
+      <w:pPr>
+        <w:ind w:firstLine="576"/>
+        <w:jc w:val="both"/>
+        <w:rPr>
+          <w:rFonts w:ascii="Arial" w:hAnsi="Arial" w:cs="Arial"/>
+          <w:sz w:val="24"/>
+          <w:szCs w:val="24"/>
+        </w:rPr>
+      </w:pPr>
+    </w:p>
+    <w:p>
+      <w:pPr>
+        <w:ind w:firstLine="576"/>
+        <w:rPr>
+          <w:rFonts w:ascii="Arial" w:hAnsi="Arial" w:cs="Arial"/>
+          <w:sz w:val="24"/>
+          <w:szCs w:val="24"/>
+        </w:rPr>
+      </w:pPr>
+      <w:r>
+        <w:rPr>
+          <w:rFonts w:ascii="Arial" w:hAnsi="Arial" w:cs="Arial"/>
+          <w:sz w:val="24"/>
+          <w:szCs w:val="24"/>
+        </w:rPr>
+        <w:t xml:space="preserve">Această funcție poartă denumirea sugestivă </w:t>
+      </w:r>
+      <w:proofErr w:type="spellStart"/>
+      <w:r>
+        <w:rPr>
+          <w:rFonts w:ascii="Arial" w:hAnsi="Arial" w:cs="Arial"/>
+          <w:i/>
+          <w:iCs/>
+          <w:sz w:val="24"/>
+          <w:szCs w:val="24"/>
+        </w:rPr>
+        <w:t>matrix_xor</w:t>
+      </w:r>
+      <w:proofErr w:type="spellEnd"/>
+      <w:r>
+        <w:rPr>
+          <w:rFonts w:ascii="Arial" w:hAnsi="Arial" w:cs="Arial"/>
+          <w:sz w:val="24"/>
+          <w:szCs w:val="24"/>
+        </w:rPr>
+        <w:t xml:space="preserve">. Secvența de cod 5.18 prezintă definiția funcției, precum apare aceasta în cadrul librăriei </w:t>
+      </w:r>
+      <w:proofErr w:type="spellStart"/>
+      <w:r>
+        <w:rPr>
+          <w:rFonts w:ascii="Arial" w:hAnsi="Arial" w:cs="Arial"/>
+          <w:i/>
+          <w:iCs/>
+          <w:sz w:val="24"/>
+          <w:szCs w:val="24"/>
+        </w:rPr>
+        <w:t>aes_utilities</w:t>
+      </w:r>
+      <w:proofErr w:type="spellEnd"/>
+      <w:r>
+        <w:rPr>
+          <w:rFonts w:ascii="Arial" w:hAnsi="Arial" w:cs="Arial"/>
+          <w:sz w:val="24"/>
+          <w:szCs w:val="24"/>
+        </w:rPr>
+        <w:t>.</w:t>
+      </w:r>
+    </w:p>
+    <w:p>
+      <w:pPr>
+        <w:ind w:firstLine="576"/>
+        <w:jc w:val="both"/>
+        <w:rPr>
+          <w:rFonts w:ascii="Arial" w:hAnsi="Arial" w:cs="Arial"/>
+          <w:sz w:val="24"/>
+          <w:szCs w:val="24"/>
+        </w:rPr>
+      </w:pPr>
+    </w:p>
+    <w:p>
+      <w:pPr>
+        <w:keepNext/>
+        <w:ind w:firstLine="576"/>
+        <w:jc w:val="center"/>
+        <w:rPr>
+          <w:rFonts w:ascii="Arial" w:hAnsi="Arial" w:cs="Arial"/>
+        </w:rPr>
+      </w:pPr>
+      <w:r>
+        <w:rPr>
+          <w:rFonts w:ascii="Arial" w:hAnsi="Arial" w:cs="Arial"/>
+          <w:noProof/>
+          <w:sz w:val="24"/>
+          <w:szCs w:val="24"/>
+        </w:rPr>
+        <w:drawing>
+          <wp:inline distT="0" distB="0" distL="0" distR="0" wp14:anchorId="44DAC755" wp14:editId="2FBE70F4">
+            <wp:extent cx="2924583" cy="733527"/>
+            <wp:effectExtent l="0" t="0" r="9525" b="9525"/>
+            <wp:docPr id="172206111" name="Picture 1"/>
+            <wp:cNvGraphicFramePr>
+              <a:graphicFrameLocks xmlns:a="http://schemas.openxmlformats.org/drawingml/2006/main" noChangeAspect="1"/>
+            </wp:cNvGraphicFramePr>
+            <a:graphic xmlns:a="http://schemas.openxmlformats.org/drawingml/2006/main">
+              <a:graphicData uri="http://schemas.openxmlformats.org/drawingml/2006/picture">
+                <pic:pic xmlns:pic="http://schemas.openxmlformats.org/drawingml/2006/picture">
+                  <pic:nvPicPr>
+                    <pic:cNvPr id="172206111" name="Picture 172206111"/>
+                    <pic:cNvPicPr/>
+                  </pic:nvPicPr>
+                  <pic:blipFill>
+                    <a:blip r:embed="rId71">
+                      <a:extLst>
+                        <a:ext uri="{28A0092B-C50C-407E-A947-70E740481C1C}">
+                          <a14:useLocalDpi xmlns:a14="http://schemas.microsoft.com/office/drawing/2010/main" val="0"/>
+                        </a:ext>
+                      </a:extLst>
+                    </a:blip>
+                    <a:stretch>
+                      <a:fillRect/>
+                    </a:stretch>
+                  </pic:blipFill>
+                  <pic:spPr>
+                    <a:xfrm>
+                      <a:off x="0" y="0"/>
+                      <a:ext cx="2924583" cy="733527"/>
+                    </a:xfrm>
+                    <a:prstGeom prst="rect">
+                      <a:avLst/>
+                    </a:prstGeom>
+                  </pic:spPr>
+                </pic:pic>
+              </a:graphicData>
+            </a:graphic>
+          </wp:inline>
+        </w:drawing>
+      </w:r>
+    </w:p>
+    <w:p>
+      <w:pPr>
+        <w:pStyle w:val="Caption"/>
+        <w:jc w:val="center"/>
+        <w:rPr>
+          <w:rFonts w:ascii="Arial" w:hAnsi="Arial" w:cs="Arial"/>
+          <w:color w:val="auto"/>
+          <w:sz w:val="20"/>
+          <w:szCs w:val="20"/>
+        </w:rPr>
+      </w:pPr>
+      <w:r>
+        <w:rPr>
+          <w:rFonts w:ascii="Arial" w:hAnsi="Arial" w:cs="Arial"/>
+          <w:color w:val="auto"/>
+          <w:sz w:val="20"/>
+          <w:szCs w:val="20"/>
+        </w:rPr>
+        <w:t xml:space="preserve">Secvența de cod </w:t>
+      </w:r>
+      <w:r>
+        <w:rPr>
+          <w:rFonts w:ascii="Arial" w:hAnsi="Arial" w:cs="Arial"/>
+          <w:color w:val="auto"/>
+          <w:sz w:val="20"/>
+          <w:szCs w:val="20"/>
+        </w:rPr>
+        <w:fldChar w:fldCharType="begin"/>
+      </w:r>
+      <w:r>
+        <w:rPr>
+          <w:rFonts w:ascii="Arial" w:hAnsi="Arial" w:cs="Arial"/>
+          <w:color w:val="auto"/>
+          <w:sz w:val="20"/>
+          <w:szCs w:val="20"/>
+        </w:rPr>
+        <w:instrText xml:space="preserve"> STYLEREF 1 \s </w:instrText>
+      </w:r>
+      <w:r>
+        <w:rPr>
+          <w:rFonts w:ascii="Arial" w:hAnsi="Arial" w:cs="Arial"/>
+          <w:color w:val="auto"/>
+          <w:sz w:val="20"/>
+          <w:szCs w:val="20"/>
+        </w:rPr>
+        <w:fldChar w:fldCharType="separate"/>
+      </w:r>
+      <w:r>
+        <w:rPr>
+          <w:rFonts w:ascii="Arial" w:hAnsi="Arial" w:cs="Arial"/>
+          <w:noProof/>
+          <w:color w:val="auto"/>
+          <w:sz w:val="20"/>
+          <w:szCs w:val="20"/>
+          <w:cs/>
+        </w:rPr>
+        <w:t>‎</w:t>
+      </w:r>
+      <w:r>
+        <w:rPr>
+          <w:rFonts w:ascii="Arial" w:hAnsi="Arial" w:cs="Arial"/>
+          <w:noProof/>
+          <w:color w:val="auto"/>
+          <w:sz w:val="20"/>
+          <w:szCs w:val="20"/>
+        </w:rPr>
+        <w:t>5</w:t>
+      </w:r>
+      <w:r>
+        <w:rPr>
+          <w:rFonts w:ascii="Arial" w:hAnsi="Arial" w:cs="Arial"/>
+          <w:color w:val="auto"/>
+          <w:sz w:val="20"/>
+          <w:szCs w:val="20"/>
+        </w:rPr>
+        <w:fldChar w:fldCharType="end"/>
+      </w:r>
+      <w:r>
+        <w:rPr>
+          <w:rFonts w:ascii="Arial" w:hAnsi="Arial" w:cs="Arial"/>
+          <w:color w:val="auto"/>
+          <w:sz w:val="20"/>
+          <w:szCs w:val="20"/>
+        </w:rPr>
+        <w:t>.</w:t>
+      </w:r>
+      <w:r>
+        <w:rPr>
+          <w:rFonts w:ascii="Arial" w:hAnsi="Arial" w:cs="Arial"/>
+          <w:color w:val="auto"/>
+          <w:sz w:val="20"/>
+          <w:szCs w:val="20"/>
+        </w:rPr>
+        <w:fldChar w:fldCharType="begin"/>
+      </w:r>
+      <w:r>
+        <w:rPr>
+          <w:rFonts w:ascii="Arial" w:hAnsi="Arial" w:cs="Arial"/>
+          <w:color w:val="auto"/>
+          <w:sz w:val="20"/>
+          <w:szCs w:val="20"/>
+        </w:rPr>
+        <w:instrText xml:space="preserve"> SEQ Secvența_de_cod \* ARABIC \s 1 </w:instrText>
+      </w:r>
+      <w:r>
+        <w:rPr>
+          <w:rFonts w:ascii="Arial" w:hAnsi="Arial" w:cs="Arial"/>
+          <w:color w:val="auto"/>
+          <w:sz w:val="20"/>
+          <w:szCs w:val="20"/>
+        </w:rPr>
+        <w:fldChar w:fldCharType="separate"/>
+      </w:r>
+      <w:r>
+        <w:rPr>
+          <w:rFonts w:ascii="Arial" w:hAnsi="Arial" w:cs="Arial"/>
+          <w:noProof/>
+          <w:color w:val="auto"/>
+          <w:sz w:val="20"/>
+          <w:szCs w:val="20"/>
+        </w:rPr>
+        <w:t>18</w:t>
+      </w:r>
+      <w:r>
+        <w:rPr>
+          <w:rFonts w:ascii="Arial" w:hAnsi="Arial" w:cs="Arial"/>
+          <w:color w:val="auto"/>
+          <w:sz w:val="20"/>
+          <w:szCs w:val="20"/>
+        </w:rPr>
+        <w:fldChar w:fldCharType="end"/>
+      </w:r>
+      <w:r>
+        <w:rPr>
+          <w:rFonts w:ascii="Arial" w:hAnsi="Arial" w:cs="Arial"/>
+          <w:color w:val="auto"/>
+          <w:sz w:val="20"/>
+          <w:szCs w:val="20"/>
+        </w:rPr>
+        <w:t xml:space="preserve"> Declararea funcției </w:t>
+      </w:r>
+      <w:proofErr w:type="spellStart"/>
+      <w:r>
+        <w:rPr>
+          <w:rFonts w:ascii="Arial" w:hAnsi="Arial" w:cs="Arial"/>
+          <w:color w:val="auto"/>
+          <w:sz w:val="20"/>
+          <w:szCs w:val="20"/>
+        </w:rPr>
+        <w:t>matrix_xor</w:t>
+      </w:r>
+      <w:proofErr w:type="spellEnd"/>
+      <w:r>
+        <w:rPr>
+          <w:rFonts w:ascii="Arial" w:hAnsi="Arial" w:cs="Arial"/>
+          <w:color w:val="auto"/>
+          <w:sz w:val="20"/>
+          <w:szCs w:val="20"/>
+        </w:rPr>
+        <w:t xml:space="preserve"> în cadrul librăriei </w:t>
+      </w:r>
+      <w:proofErr w:type="spellStart"/>
+      <w:r>
+        <w:rPr>
+          <w:rFonts w:ascii="Arial" w:hAnsi="Arial" w:cs="Arial"/>
+          <w:color w:val="auto"/>
+          <w:sz w:val="20"/>
+          <w:szCs w:val="20"/>
+        </w:rPr>
+        <w:t>aes_utilities</w:t>
+      </w:r>
+      <w:proofErr w:type="spellEnd"/>
+    </w:p>
+    <w:p>
+      <w:pPr>
+        <w:rPr>
+          <w:rFonts w:ascii="Arial" w:hAnsi="Arial" w:cs="Arial"/>
+        </w:rPr>
+      </w:pPr>
+    </w:p>
+    <w:p>
+      <w:pPr>
+        <w:ind w:firstLine="720"/>
+        <w:jc w:val="both"/>
+        <w:rPr>
+          <w:rFonts w:ascii="Arial" w:hAnsi="Arial" w:cs="Arial"/>
+          <w:sz w:val="24"/>
+          <w:szCs w:val="24"/>
+        </w:rPr>
+      </w:pPr>
+      <w:r>
+        <w:rPr>
+          <w:rFonts w:ascii="Arial" w:hAnsi="Arial" w:cs="Arial"/>
+          <w:sz w:val="24"/>
+          <w:szCs w:val="24"/>
+        </w:rPr>
+        <w:t>Corpul fun</w:t>
+      </w:r>
+      <w:r>
+        <w:rPr>
+          <w:rFonts w:ascii="Arial" w:hAnsi="Arial" w:cs="Arial"/>
+          <w:sz w:val="24"/>
+          <w:szCs w:val="24"/>
+        </w:rPr>
+        <w:t xml:space="preserve">cției este prezentat </w:t>
+      </w:r>
+      <w:r>
+        <w:rPr>
+          <w:rFonts w:ascii="Arial" w:hAnsi="Arial" w:cs="Arial"/>
+          <w:sz w:val="24"/>
+          <w:szCs w:val="24"/>
+        </w:rPr>
+        <w:t xml:space="preserve">în cadrul </w:t>
+      </w:r>
+      <w:r>
+        <w:rPr>
+          <w:rFonts w:ascii="Arial" w:hAnsi="Arial" w:cs="Arial"/>
+          <w:sz w:val="24"/>
+          <w:szCs w:val="24"/>
+        </w:rPr>
+        <w:t>secvenței de cod 5.19</w:t>
+      </w:r>
+      <w:r>
+        <w:rPr>
+          <w:rFonts w:ascii="Arial" w:hAnsi="Arial" w:cs="Arial"/>
+          <w:sz w:val="24"/>
+          <w:szCs w:val="24"/>
+        </w:rPr>
+        <w:t xml:space="preserve">. </w:t>
+      </w:r>
+      <w:r>
+        <w:rPr>
+          <w:rFonts w:ascii="Arial" w:hAnsi="Arial" w:cs="Arial"/>
+          <w:sz w:val="24"/>
+          <w:szCs w:val="24"/>
+        </w:rPr>
+        <w:t xml:space="preserve">Operația </w:t>
+      </w:r>
+      <w:r>
+        <w:rPr>
+          <w:rFonts w:ascii="Arial" w:hAnsi="Arial" w:cs="Arial"/>
+          <w:sz w:val="24"/>
+          <w:szCs w:val="24"/>
+        </w:rPr>
+        <w:t>logică este efectuată explicit și succesiv la nivelul fiecărei coloane.</w:t>
+      </w:r>
+      <w:r>
+        <w:rPr>
+          <w:rFonts w:ascii="Arial" w:hAnsi="Arial" w:cs="Arial"/>
+          <w:sz w:val="24"/>
+          <w:szCs w:val="24"/>
+        </w:rPr>
+        <w:t xml:space="preserve"> </w:t>
+      </w:r>
+      <w:r>
+        <w:rPr>
+          <w:rFonts w:ascii="Arial" w:hAnsi="Arial" w:cs="Arial"/>
+          <w:sz w:val="24"/>
+          <w:szCs w:val="24"/>
+        </w:rPr>
+        <w:t>În mod similar cu funcțiile anterior prezentate, o</w:t>
+      </w:r>
+      <w:r>
+        <w:rPr>
+          <w:rFonts w:ascii="Arial" w:hAnsi="Arial" w:cs="Arial"/>
+          <w:sz w:val="24"/>
+          <w:szCs w:val="24"/>
+        </w:rPr>
+        <w:t xml:space="preserve"> alternativă a acestei definiții constă în utilizarea structurii </w:t>
+      </w:r>
+      <w:proofErr w:type="spellStart"/>
+      <w:r>
+        <w:rPr>
+          <w:rFonts w:ascii="Arial" w:hAnsi="Arial" w:cs="Arial"/>
+          <w:sz w:val="24"/>
+          <w:szCs w:val="24"/>
+        </w:rPr>
+        <w:t>combinaționale</w:t>
+      </w:r>
+      <w:proofErr w:type="spellEnd"/>
+      <w:r>
+        <w:rPr>
+          <w:rFonts w:ascii="Arial" w:hAnsi="Arial" w:cs="Arial"/>
+          <w:sz w:val="24"/>
+          <w:szCs w:val="24"/>
+        </w:rPr>
+        <w:t xml:space="preserve"> generative </w:t>
+      </w:r>
+      <w:r>
+        <w:rPr>
+          <w:rFonts w:ascii="Arial" w:hAnsi="Arial" w:cs="Arial"/>
+          <w:i/>
+          <w:iCs/>
+          <w:sz w:val="24"/>
+          <w:szCs w:val="24"/>
+        </w:rPr>
+        <w:t>for generate</w:t>
+      </w:r>
+      <w:r>
+        <w:rPr>
+          <w:rFonts w:ascii="Arial" w:hAnsi="Arial" w:cs="Arial"/>
+          <w:sz w:val="24"/>
+          <w:szCs w:val="24"/>
+        </w:rPr>
+        <w:t>.</w:t>
+      </w:r>
+    </w:p>
+    <w:p>
+      <w:pPr>
+        <w:ind w:firstLine="720"/>
+        <w:jc w:val="both"/>
+        <w:rPr>
+          <w:rFonts w:ascii="Arial" w:hAnsi="Arial" w:cs="Arial"/>
+          <w:sz w:val="24"/>
+          <w:szCs w:val="24"/>
+        </w:rPr>
+      </w:pPr>
+    </w:p>
+    <w:p>
+      <w:pPr>
+        <w:keepNext/>
+        <w:ind w:firstLine="720"/>
+        <w:jc w:val="center"/>
+      </w:pPr>
+      <w:r>
+        <w:rPr>
+          <w:rFonts w:ascii="Arial" w:hAnsi="Arial" w:cs="Arial"/>
+          <w:noProof/>
+          <w:sz w:val="24"/>
+          <w:szCs w:val="24"/>
+        </w:rPr>
+        <w:drawing>
+          <wp:inline distT="0" distB="0" distL="0" distR="0" wp14:anchorId="68D82EC1" wp14:editId="6AC60A97">
+            <wp:extent cx="2990850" cy="4354554"/>
+            <wp:effectExtent l="0" t="0" r="0" b="8255"/>
+            <wp:docPr id="1159889992" name="Picture 2"/>
+            <wp:cNvGraphicFramePr>
+              <a:graphicFrameLocks xmlns:a="http://schemas.openxmlformats.org/drawingml/2006/main" noChangeAspect="1"/>
+            </wp:cNvGraphicFramePr>
+            <a:graphic xmlns:a="http://schemas.openxmlformats.org/drawingml/2006/main">
+              <a:graphicData uri="http://schemas.openxmlformats.org/drawingml/2006/picture">
+                <pic:pic xmlns:pic="http://schemas.openxmlformats.org/drawingml/2006/picture">
+                  <pic:nvPicPr>
+                    <pic:cNvPr id="1159889992" name="Picture 1159889992"/>
+                    <pic:cNvPicPr/>
+                  </pic:nvPicPr>
+                  <pic:blipFill>
+                    <a:blip r:embed="rId72">
+                      <a:extLst>
+                        <a:ext uri="{28A0092B-C50C-407E-A947-70E740481C1C}">
+                          <a14:useLocalDpi xmlns:a14="http://schemas.microsoft.com/office/drawing/2010/main" val="0"/>
+                        </a:ext>
+                      </a:extLst>
+                    </a:blip>
+                    <a:stretch>
+                      <a:fillRect/>
+                    </a:stretch>
+                  </pic:blipFill>
+                  <pic:spPr>
+                    <a:xfrm>
+                      <a:off x="0" y="0"/>
+                      <a:ext cx="2991895" cy="4356076"/>
+                    </a:xfrm>
+                    <a:prstGeom prst="rect">
+                      <a:avLst/>
+                    </a:prstGeom>
+                  </pic:spPr>
+                </pic:pic>
+              </a:graphicData>
+            </a:graphic>
+          </wp:inline>
+        </w:drawing>
+      </w:r>
+    </w:p>
+    <w:p>
+      <w:pPr>
+        <w:pStyle w:val="Caption"/>
+        <w:jc w:val="center"/>
+        <w:rPr>
+          <w:rFonts w:ascii="Arial" w:hAnsi="Arial" w:cs="Arial"/>
+          <w:color w:val="auto"/>
+          <w:sz w:val="20"/>
+          <w:szCs w:val="20"/>
+        </w:rPr>
+      </w:pPr>
+      <w:r>
+        <w:rPr>
+          <w:rFonts w:ascii="Arial" w:hAnsi="Arial" w:cs="Arial"/>
+          <w:color w:val="auto"/>
+          <w:sz w:val="20"/>
+          <w:szCs w:val="20"/>
+        </w:rPr>
+        <w:t xml:space="preserve">                  Secvența de cod </w:t>
+      </w:r>
+      <w:r>
+        <w:rPr>
+          <w:rFonts w:ascii="Arial" w:hAnsi="Arial" w:cs="Arial"/>
+          <w:color w:val="auto"/>
+          <w:sz w:val="20"/>
+          <w:szCs w:val="20"/>
+        </w:rPr>
+        <w:fldChar w:fldCharType="begin"/>
+      </w:r>
+      <w:r>
+        <w:rPr>
+          <w:rFonts w:ascii="Arial" w:hAnsi="Arial" w:cs="Arial"/>
+          <w:color w:val="auto"/>
+          <w:sz w:val="20"/>
+          <w:szCs w:val="20"/>
+        </w:rPr>
+        <w:instrText xml:space="preserve"> STYLEREF 1 \s </w:instrText>
+      </w:r>
+      <w:r>
+        <w:rPr>
+          <w:rFonts w:ascii="Arial" w:hAnsi="Arial" w:cs="Arial"/>
+          <w:color w:val="auto"/>
+          <w:sz w:val="20"/>
+          <w:szCs w:val="20"/>
+        </w:rPr>
+        <w:fldChar w:fldCharType="separate"/>
+      </w:r>
+      <w:r>
+        <w:rPr>
+          <w:rFonts w:ascii="Arial" w:hAnsi="Arial" w:cs="Arial"/>
+          <w:noProof/>
+          <w:color w:val="auto"/>
+          <w:sz w:val="20"/>
+          <w:szCs w:val="20"/>
+          <w:cs/>
+        </w:rPr>
+        <w:t>‎</w:t>
+      </w:r>
+      <w:r>
+        <w:rPr>
+          <w:rFonts w:ascii="Arial" w:hAnsi="Arial" w:cs="Arial"/>
+          <w:noProof/>
+          <w:color w:val="auto"/>
+          <w:sz w:val="20"/>
+          <w:szCs w:val="20"/>
+        </w:rPr>
+        <w:t>5</w:t>
+      </w:r>
+      <w:r>
+        <w:rPr>
+          <w:rFonts w:ascii="Arial" w:hAnsi="Arial" w:cs="Arial"/>
+          <w:color w:val="auto"/>
+          <w:sz w:val="20"/>
+          <w:szCs w:val="20"/>
+        </w:rPr>
+        <w:fldChar w:fldCharType="end"/>
+      </w:r>
+      <w:r>
+        <w:rPr>
+          <w:rFonts w:ascii="Arial" w:hAnsi="Arial" w:cs="Arial"/>
+          <w:color w:val="auto"/>
+          <w:sz w:val="20"/>
+          <w:szCs w:val="20"/>
+        </w:rPr>
+        <w:t>.</w:t>
+      </w:r>
+      <w:r>
+        <w:rPr>
+          <w:rFonts w:ascii="Arial" w:hAnsi="Arial" w:cs="Arial"/>
+          <w:color w:val="auto"/>
+          <w:sz w:val="20"/>
+          <w:szCs w:val="20"/>
+        </w:rPr>
+        <w:fldChar w:fldCharType="begin"/>
+      </w:r>
+      <w:r>
+        <w:rPr>
+          <w:rFonts w:ascii="Arial" w:hAnsi="Arial" w:cs="Arial"/>
+          <w:color w:val="auto"/>
+          <w:sz w:val="20"/>
+          <w:szCs w:val="20"/>
+        </w:rPr>
+        <w:instrText xml:space="preserve"> SEQ Secvența_de_cod \* ARABIC \s 1 </w:instrText>
+      </w:r>
+      <w:r>
+        <w:rPr>
+          <w:rFonts w:ascii="Arial" w:hAnsi="Arial" w:cs="Arial"/>
+          <w:color w:val="auto"/>
+          <w:sz w:val="20"/>
+          <w:szCs w:val="20"/>
+        </w:rPr>
+        <w:fldChar w:fldCharType="separate"/>
+      </w:r>
+      <w:r>
+        <w:rPr>
+          <w:rFonts w:ascii="Arial" w:hAnsi="Arial" w:cs="Arial"/>
+          <w:noProof/>
+          <w:color w:val="auto"/>
+          <w:sz w:val="20"/>
+          <w:szCs w:val="20"/>
+        </w:rPr>
+        <w:t>19</w:t>
+      </w:r>
+      <w:r>
+        <w:rPr>
+          <w:rFonts w:ascii="Arial" w:hAnsi="Arial" w:cs="Arial"/>
+          <w:color w:val="auto"/>
+          <w:sz w:val="20"/>
+          <w:szCs w:val="20"/>
+        </w:rPr>
+        <w:fldChar w:fldCharType="end"/>
+      </w:r>
+      <w:r>
+        <w:rPr>
+          <w:rFonts w:ascii="Arial" w:hAnsi="Arial" w:cs="Arial"/>
+          <w:color w:val="auto"/>
+          <w:sz w:val="20"/>
+          <w:szCs w:val="20"/>
+        </w:rPr>
+        <w:t xml:space="preserve"> Corpul funcției </w:t>
+      </w:r>
+      <w:proofErr w:type="spellStart"/>
+      <w:r>
+        <w:rPr>
+          <w:rFonts w:ascii="Arial" w:hAnsi="Arial" w:cs="Arial"/>
+          <w:color w:val="auto"/>
+          <w:sz w:val="20"/>
+          <w:szCs w:val="20"/>
+        </w:rPr>
+        <w:t>matrix_xor</w:t>
+      </w:r>
+      <w:proofErr w:type="spellEnd"/>
+    </w:p>
+    <w:p/>
+    <w:p/>
+    <w:p>
+      <w:pPr>
+        <w:ind w:firstLine="720"/>
+        <w:jc w:val="both"/>
+        <w:rPr>
+          <w:rFonts w:ascii="Arial" w:hAnsi="Arial" w:cs="Arial"/>
+          <w:sz w:val="24"/>
+          <w:szCs w:val="24"/>
+        </w:rPr>
+      </w:pPr>
+      <w:r>
+        <w:rPr>
+          <w:rFonts w:ascii="Arial" w:hAnsi="Arial" w:cs="Arial"/>
+          <w:sz w:val="24"/>
+          <w:szCs w:val="24"/>
+        </w:rPr>
+        <w:t>Entitatea ș</w:t>
+      </w:r>
+      <w:r>
+        <w:rPr>
+          <w:rFonts w:ascii="Arial" w:hAnsi="Arial" w:cs="Arial"/>
+          <w:sz w:val="24"/>
+          <w:szCs w:val="24"/>
+        </w:rPr>
+        <w:t>i</w:t>
+      </w:r>
+      <w:r>
+        <w:rPr>
+          <w:rFonts w:ascii="Arial" w:hAnsi="Arial" w:cs="Arial"/>
+          <w:sz w:val="24"/>
+          <w:szCs w:val="24"/>
+        </w:rPr>
+        <w:t xml:space="preserve"> arhitectura asociată au o structură relativ simplă față de operațiile anterior prezentate, această este prezentată în cadrul secvenței de cod 5.20.</w:t>
+      </w:r>
+    </w:p>
+    <w:p>
+      <w:pPr>
+        <w:ind w:firstLine="720"/>
+        <w:jc w:val="both"/>
+        <w:rPr>
+          <w:rFonts w:ascii="Arial" w:hAnsi="Arial" w:cs="Arial"/>
+          <w:sz w:val="24"/>
+          <w:szCs w:val="24"/>
+        </w:rPr>
+      </w:pPr>
+    </w:p>
+    <w:p>
+      <w:pPr>
+        <w:keepNext/>
+        <w:ind w:firstLine="720"/>
+        <w:jc w:val="center"/>
+      </w:pPr>
+      <w:r>
+        <w:rPr>
+          <w:rFonts w:ascii="Arial" w:hAnsi="Arial" w:cs="Arial"/>
+          <w:noProof/>
+          <w:sz w:val="24"/>
+          <w:szCs w:val="24"/>
+        </w:rPr>
+        <w:drawing>
+          <wp:inline distT="0" distB="0" distL="0" distR="0" wp14:anchorId="1EF5DE3F" wp14:editId="2ACD0637">
+            <wp:extent cx="3591426" cy="2200582"/>
+            <wp:effectExtent l="0" t="0" r="9525" b="9525"/>
+            <wp:docPr id="1922632609" name="Picture 3"/>
+            <wp:cNvGraphicFramePr>
+              <a:graphicFrameLocks xmlns:a="http://schemas.openxmlformats.org/drawingml/2006/main" noChangeAspect="1"/>
+            </wp:cNvGraphicFramePr>
+            <a:graphic xmlns:a="http://schemas.openxmlformats.org/drawingml/2006/main">
+              <a:graphicData uri="http://schemas.openxmlformats.org/drawingml/2006/picture">
+                <pic:pic xmlns:pic="http://schemas.openxmlformats.org/drawingml/2006/picture">
+                  <pic:nvPicPr>
+                    <pic:cNvPr id="1922632609" name="Picture 1922632609"/>
+                    <pic:cNvPicPr/>
+                  </pic:nvPicPr>
+                  <pic:blipFill>
+                    <a:blip r:embed="rId73">
+                      <a:extLst>
+                        <a:ext uri="{28A0092B-C50C-407E-A947-70E740481C1C}">
+                          <a14:useLocalDpi xmlns:a14="http://schemas.microsoft.com/office/drawing/2010/main" val="0"/>
+                        </a:ext>
+                      </a:extLst>
+                    </a:blip>
+                    <a:stretch>
+                      <a:fillRect/>
+                    </a:stretch>
+                  </pic:blipFill>
+                  <pic:spPr>
+                    <a:xfrm>
+                      <a:off x="0" y="0"/>
+                      <a:ext cx="3591426" cy="2200582"/>
+                    </a:xfrm>
+                    <a:prstGeom prst="rect">
+                      <a:avLst/>
+                    </a:prstGeom>
+                  </pic:spPr>
+                </pic:pic>
+              </a:graphicData>
+            </a:graphic>
+          </wp:inline>
+        </w:drawing>
+      </w:r>
+    </w:p>
+    <w:p>
+      <w:pPr>
+        <w:pStyle w:val="Caption"/>
+        <w:jc w:val="center"/>
+        <w:rPr>
+          <w:rFonts w:ascii="Arial" w:hAnsi="Arial" w:cs="Arial"/>
+          <w:color w:val="auto"/>
+          <w:sz w:val="28"/>
+          <w:szCs w:val="28"/>
+        </w:rPr>
+      </w:pPr>
+      <w:r>
+        <w:rPr>
+          <w:rFonts w:ascii="Arial" w:hAnsi="Arial" w:cs="Arial"/>
+          <w:color w:val="auto"/>
+          <w:sz w:val="20"/>
+          <w:szCs w:val="20"/>
+        </w:rPr>
+        <w:t xml:space="preserve">Secvența de cod </w:t>
+      </w:r>
+      <w:r>
+        <w:rPr>
+          <w:rFonts w:ascii="Arial" w:hAnsi="Arial" w:cs="Arial"/>
+          <w:color w:val="auto"/>
+          <w:sz w:val="20"/>
+          <w:szCs w:val="20"/>
+        </w:rPr>
+        <w:fldChar w:fldCharType="begin"/>
+      </w:r>
+      <w:r>
+        <w:rPr>
+          <w:rFonts w:ascii="Arial" w:hAnsi="Arial" w:cs="Arial"/>
+          <w:color w:val="auto"/>
+          <w:sz w:val="20"/>
+          <w:szCs w:val="20"/>
+        </w:rPr>
+        <w:instrText xml:space="preserve"> STYLEREF 1 \s </w:instrText>
+      </w:r>
+      <w:r>
+        <w:rPr>
+          <w:rFonts w:ascii="Arial" w:hAnsi="Arial" w:cs="Arial"/>
+          <w:color w:val="auto"/>
+          <w:sz w:val="20"/>
+          <w:szCs w:val="20"/>
+        </w:rPr>
+        <w:fldChar w:fldCharType="separate"/>
+      </w:r>
+      <w:r>
+        <w:rPr>
+          <w:rFonts w:ascii="Arial" w:hAnsi="Arial" w:cs="Arial"/>
+          <w:noProof/>
+          <w:color w:val="auto"/>
+          <w:sz w:val="20"/>
+          <w:szCs w:val="20"/>
+          <w:cs/>
+        </w:rPr>
+        <w:t>‎</w:t>
+      </w:r>
+      <w:r>
+        <w:rPr>
+          <w:rFonts w:ascii="Arial" w:hAnsi="Arial" w:cs="Arial"/>
+          <w:noProof/>
+          <w:color w:val="auto"/>
+          <w:sz w:val="20"/>
+          <w:szCs w:val="20"/>
+        </w:rPr>
+        <w:t>5</w:t>
+      </w:r>
+      <w:r>
+        <w:rPr>
+          <w:rFonts w:ascii="Arial" w:hAnsi="Arial" w:cs="Arial"/>
+          <w:color w:val="auto"/>
+          <w:sz w:val="20"/>
+          <w:szCs w:val="20"/>
+        </w:rPr>
+        <w:fldChar w:fldCharType="end"/>
+      </w:r>
+      <w:r>
+        <w:rPr>
+          <w:rFonts w:ascii="Arial" w:hAnsi="Arial" w:cs="Arial"/>
+          <w:color w:val="auto"/>
+          <w:sz w:val="20"/>
+          <w:szCs w:val="20"/>
+        </w:rPr>
+        <w:t>.</w:t>
+      </w:r>
+      <w:r>
+        <w:rPr>
+          <w:rFonts w:ascii="Arial" w:hAnsi="Arial" w:cs="Arial"/>
+          <w:color w:val="auto"/>
+          <w:sz w:val="20"/>
+          <w:szCs w:val="20"/>
+        </w:rPr>
+        <w:fldChar w:fldCharType="begin"/>
+      </w:r>
+      <w:r>
+        <w:rPr>
+          <w:rFonts w:ascii="Arial" w:hAnsi="Arial" w:cs="Arial"/>
+          <w:color w:val="auto"/>
+          <w:sz w:val="20"/>
+          <w:szCs w:val="20"/>
+        </w:rPr>
+        <w:instrText xml:space="preserve"> SEQ Secvența_de_cod \* ARABIC \s 1 </w:instrText>
+      </w:r>
+      <w:r>
+        <w:rPr>
+          <w:rFonts w:ascii="Arial" w:hAnsi="Arial" w:cs="Arial"/>
+          <w:color w:val="auto"/>
+          <w:sz w:val="20"/>
+          <w:szCs w:val="20"/>
+        </w:rPr>
+        <w:fldChar w:fldCharType="separate"/>
+      </w:r>
+      <w:r>
+        <w:rPr>
+          <w:rFonts w:ascii="Arial" w:hAnsi="Arial" w:cs="Arial"/>
+          <w:noProof/>
+          <w:color w:val="auto"/>
+          <w:sz w:val="20"/>
+          <w:szCs w:val="20"/>
+        </w:rPr>
+        <w:t>20</w:t>
+      </w:r>
+      <w:r>
+        <w:rPr>
+          <w:rFonts w:ascii="Arial" w:hAnsi="Arial" w:cs="Arial"/>
+          <w:color w:val="auto"/>
+          <w:sz w:val="20"/>
+          <w:szCs w:val="20"/>
+        </w:rPr>
+        <w:fldChar w:fldCharType="end"/>
+      </w:r>
+      <w:r>
+        <w:rPr>
+          <w:rFonts w:ascii="Arial" w:hAnsi="Arial" w:cs="Arial"/>
+          <w:color w:val="auto"/>
+          <w:sz w:val="20"/>
+          <w:szCs w:val="20"/>
+        </w:rPr>
+        <w:t xml:space="preserve"> Entitatea și arhitectura operației de adăugare a cheii</w:t>
+      </w:r>
+    </w:p>
+    <w:p>
+      <w:pPr>
+        <w:ind w:firstLine="720"/>
+        <w:jc w:val="both"/>
+        <w:rPr>
+          <w:rFonts w:ascii="Arial" w:hAnsi="Arial" w:cs="Arial"/>
+          <w:sz w:val="24"/>
+          <w:szCs w:val="24"/>
+        </w:rPr>
+      </w:pPr>
+    </w:p>
+    <w:p>
+      <w:pPr>
+        <w:ind w:firstLine="720"/>
+        <w:jc w:val="both"/>
+        <w:rPr>
+          <w:rFonts w:ascii="Arial" w:hAnsi="Arial" w:cs="Arial"/>
+          <w:sz w:val="28"/>
+          <w:szCs w:val="28"/>
+        </w:rPr>
+      </w:pPr>
+    </w:p>
+    <w:p>
+      <w:pPr>
+        <w:ind w:firstLine="720"/>
+        <w:jc w:val="both"/>
+        <w:rPr>
+          <w:rFonts w:ascii="Arial" w:hAnsi="Arial" w:cs="Arial"/>
+          <w:sz w:val="24"/>
+          <w:szCs w:val="24"/>
+        </w:rPr>
+      </w:pPr>
+    </w:p>
+    <w:p>
+      <w:pPr>
         <w:rPr>
           <w:rFonts w:ascii="Arial" w:hAnsi="Arial" w:cs="Arial"/>
           <w:sz w:val="24"/>
@@ -52024,10 +53297,10 @@
     <w:p/>
     <w:p/>
     <w:sectPr>
-      <w:headerReference w:type="default" r:id="rId71"/>
-      <w:footerReference w:type="default" r:id="rId72"/>
-      <w:headerReference w:type="first" r:id="rId73"/>
-      <w:footerReference w:type="first" r:id="rId74"/>
+      <w:headerReference w:type="default" r:id="rId74"/>
+      <w:footerReference w:type="default" r:id="rId75"/>
+      <w:headerReference w:type="first" r:id="rId76"/>
+      <w:footerReference w:type="first" r:id="rId77"/>
       <w:pgSz w:w="11907" w:h="16840" w:code="9"/>
       <w:pgMar w:top="1418" w:right="1134" w:bottom="1134" w:left="1134" w:header="706" w:footer="778" w:gutter="0"/>
       <w:pgNumType w:start="0"/>
@@ -55088,12 +56361,12 @@
     <w:rsid w:val="0072317D"/>
     <w:rsid w:val="007B47C5"/>
     <w:rsid w:val="00844611"/>
+    <w:rsid w:val="0097631B"/>
     <w:rsid w:val="009A561F"/>
     <w:rsid w:val="009F1A76"/>
     <w:rsid w:val="00B8483B"/>
     <w:rsid w:val="00CE3EC1"/>
     <w:rsid w:val="00D050A3"/>
-    <w:rsid w:val="00E430ED"/>
     <w:rsid w:val="00E935AF"/>
     <w:rsid w:val="00EF4327"/>
     <w:rsid w:val="00F924A7"/>

</xml_diff>